<commit_message>
Doku Einleitung, Anforderungen und Planung geschrieben
</commit_message>
<xml_diff>
--- a/Doc/Aufgabenstellung/Dokumentation/Case Study Doku.docx
+++ b/Doc/Aufgabenstellung/Dokumentation/Case Study Doku.docx
@@ -118,7 +118,7 @@
               <w:sz w:val="36"/>
               <w:szCs w:val="36"/>
             </w:rPr>
-            <w:t>MCP-Abschlussarbeit</w:t>
+            <w:t>Case Study STT2</w:t>
           </w:r>
         </w:p>
         <w:p>
@@ -140,9 +140,17 @@
               <w:sz w:val="36"/>
               <w:szCs w:val="36"/>
             </w:rPr>
-            <w:t>A</w:t>
+            <w:t>Aufzugssteuerung</w:t>
           </w:r>
-          <w:r>
+        </w:p>
+        <w:p>
+          <w:pPr>
+            <w:jc w:val="center"/>
+          </w:pPr>
+        </w:p>
+        <w:p>
+          <w:pPr>
+            <w:jc w:val="center"/>
             <w:rPr>
               <w:rFonts w:cs="Arial"/>
               <w:b/>
@@ -150,38 +158,7 @@
               <w:sz w:val="36"/>
               <w:szCs w:val="36"/>
             </w:rPr>
-            <w:t xml:space="preserve">dafruit </w:t>
-          </w:r>
-          <w:r>
-            <w:rPr>
-              <w:rFonts w:cs="Arial"/>
-              <w:b/>
-              <w:bCs/>
-              <w:sz w:val="36"/>
-              <w:szCs w:val="36"/>
-            </w:rPr>
-            <w:t>S</w:t>
-          </w:r>
-          <w:r>
-            <w:rPr>
-              <w:rFonts w:cs="Arial"/>
-              <w:b/>
-              <w:bCs/>
-              <w:sz w:val="36"/>
-              <w:szCs w:val="36"/>
-            </w:rPr>
-            <w:t xml:space="preserve">imon </w:t>
-          </w:r>
-          <w:r>
-            <w:rPr>
-              <w:rFonts w:cs="Arial"/>
-              <w:b/>
-              <w:bCs/>
-              <w:sz w:val="36"/>
-              <w:szCs w:val="36"/>
-            </w:rPr>
-            <w:t>Says</w:t>
-          </w:r>
+          </w:pPr>
         </w:p>
       </w:sdtContent>
     </w:sdt>
@@ -360,6 +337,61 @@
           <w:szCs w:val="28"/>
         </w:rPr>
       </w:pPr>
+    </w:p>
+    <w:p>
+      <w:pPr>
+        <w:rPr>
+          <w:rFonts w:cs="Arial"/>
+          <w:b/>
+          <w:bCs/>
+          <w:sz w:val="28"/>
+          <w:szCs w:val="28"/>
+        </w:rPr>
+      </w:pPr>
+    </w:p>
+    <w:p>
+      <w:pPr>
+        <w:rPr>
+          <w:rFonts w:cs="Arial"/>
+          <w:b/>
+          <w:bCs/>
+          <w:sz w:val="28"/>
+          <w:szCs w:val="28"/>
+        </w:rPr>
+      </w:pPr>
+    </w:p>
+    <w:p>
+      <w:pPr>
+        <w:rPr>
+          <w:rFonts w:cs="Arial"/>
+          <w:b/>
+          <w:bCs/>
+          <w:sz w:val="28"/>
+          <w:szCs w:val="28"/>
+        </w:rPr>
+      </w:pPr>
+    </w:p>
+    <w:p>
+      <w:pPr>
+        <w:rPr>
+          <w:rFonts w:cs="Arial"/>
+          <w:b/>
+          <w:bCs/>
+          <w:sz w:val="28"/>
+          <w:szCs w:val="28"/>
+        </w:rPr>
+      </w:pPr>
+    </w:p>
+    <w:p>
+      <w:pPr>
+        <w:rPr>
+          <w:rFonts w:cs="Arial"/>
+          <w:b/>
+          <w:bCs/>
+          <w:sz w:val="28"/>
+          <w:szCs w:val="28"/>
+        </w:rPr>
+      </w:pPr>
       <w:r>
         <w:rPr>
           <w:rFonts w:cs="Arial"/>
@@ -584,9 +616,15 @@
         <w:p>
           <w:pPr>
             <w:pStyle w:val="Inhaltsverzeichnisberschrift"/>
+            <w:rPr>
+              <w:b/>
+              <w:bCs/>
+            </w:rPr>
           </w:pPr>
           <w:r>
             <w:rPr>
+              <w:b/>
+              <w:bCs/>
               <w:lang w:val="de-DE"/>
             </w:rPr>
             <w:t>Inhalt</w:t>
@@ -618,11 +656,10 @@
           <w:r>
             <w:fldChar w:fldCharType="separate"/>
           </w:r>
-          <w:hyperlink w:anchor="_Toc230804009" w:history="1">
+          <w:hyperlink w:anchor="_Toc231318002" w:history="1">
             <w:r>
               <w:rPr>
                 <w:rStyle w:val="Hyperlink"/>
-                <w:bCs/>
                 <w:noProof/>
               </w:rPr>
               <w:t>1.</w:t>
@@ -644,7 +681,7 @@
                 <w:rStyle w:val="Hyperlink"/>
                 <w:noProof/>
               </w:rPr>
-              <w:t>Ausgangslage und Problemstellung</w:t>
+              <w:t>Einleitung</w:t>
             </w:r>
             <w:r>
               <w:rPr>
@@ -665,7 +702,7 @@
                 <w:noProof/>
                 <w:webHidden/>
               </w:rPr>
-              <w:instrText xml:space="preserve"> PAGEREF _Toc230804009 \h </w:instrText>
+              <w:instrText xml:space="preserve"> PAGEREF _Toc231318002 \h </w:instrText>
             </w:r>
             <w:r>
               <w:rPr>
@@ -713,11 +750,10 @@
               <w14:ligatures w14:val="standardContextual"/>
             </w:rPr>
           </w:pPr>
-          <w:hyperlink w:anchor="_Toc230804010" w:history="1">
+          <w:hyperlink w:anchor="_Toc231318003" w:history="1">
             <w:r>
               <w:rPr>
                 <w:rStyle w:val="Hyperlink"/>
-                <w:bCs/>
                 <w:noProof/>
               </w:rPr>
               <w:t>2.</w:t>
@@ -739,7 +775,7 @@
                 <w:rStyle w:val="Hyperlink"/>
                 <w:noProof/>
               </w:rPr>
-              <w:t>Ziele, Anforderungen und Abgrenzungen</w:t>
+              <w:t>Anforderungen und Ziele</w:t>
             </w:r>
             <w:r>
               <w:rPr>
@@ -760,7 +796,7 @@
                 <w:noProof/>
                 <w:webHidden/>
               </w:rPr>
-              <w:instrText xml:space="preserve"> PAGEREF _Toc230804010 \h </w:instrText>
+              <w:instrText xml:space="preserve"> PAGEREF _Toc231318003 \h </w:instrText>
             </w:r>
             <w:r>
               <w:rPr>
@@ -793,9 +829,9 @@
         </w:p>
         <w:p>
           <w:pPr>
-            <w:pStyle w:val="Verzeichnis1"/>
+            <w:pStyle w:val="Verzeichnis2"/>
             <w:tabs>
-              <w:tab w:val="left" w:pos="480"/>
+              <w:tab w:val="left" w:pos="960"/>
               <w:tab w:val="right" w:leader="dot" w:pos="9628"/>
             </w:tabs>
             <w:rPr>
@@ -808,14 +844,13 @@
               <w14:ligatures w14:val="standardContextual"/>
             </w:rPr>
           </w:pPr>
-          <w:hyperlink w:anchor="_Toc230804011" w:history="1">
+          <w:hyperlink w:anchor="_Toc231318004" w:history="1">
             <w:r>
               <w:rPr>
                 <w:rStyle w:val="Hyperlink"/>
-                <w:bCs/>
-                <w:noProof/>
-              </w:rPr>
-              <w:t>3.</w:t>
+                <w:noProof/>
+              </w:rPr>
+              <w:t>2.1.</w:t>
             </w:r>
             <w:r>
               <w:rPr>
@@ -834,7 +869,7 @@
                 <w:rStyle w:val="Hyperlink"/>
                 <w:noProof/>
               </w:rPr>
-              <w:t>Vorgehensweise und Methoden bei der Bearbeitung</w:t>
+              <w:t>Muss-Ziele</w:t>
             </w:r>
             <w:r>
               <w:rPr>
@@ -855,7 +890,7 @@
                 <w:noProof/>
                 <w:webHidden/>
               </w:rPr>
-              <w:instrText xml:space="preserve"> PAGEREF _Toc230804011 \h </w:instrText>
+              <w:instrText xml:space="preserve"> PAGEREF _Toc231318004 \h </w:instrText>
             </w:r>
             <w:r>
               <w:rPr>
@@ -888,9 +923,9 @@
         </w:p>
         <w:p>
           <w:pPr>
-            <w:pStyle w:val="Verzeichnis1"/>
+            <w:pStyle w:val="Verzeichnis2"/>
             <w:tabs>
-              <w:tab w:val="left" w:pos="480"/>
+              <w:tab w:val="left" w:pos="960"/>
               <w:tab w:val="right" w:leader="dot" w:pos="9628"/>
             </w:tabs>
             <w:rPr>
@@ -903,14 +938,13 @@
               <w14:ligatures w14:val="standardContextual"/>
             </w:rPr>
           </w:pPr>
-          <w:hyperlink w:anchor="_Toc230804012" w:history="1">
+          <w:hyperlink w:anchor="_Toc231318005" w:history="1">
             <w:r>
               <w:rPr>
                 <w:rStyle w:val="Hyperlink"/>
-                <w:bCs/>
-                <w:noProof/>
-              </w:rPr>
-              <w:t>4.</w:t>
+                <w:noProof/>
+              </w:rPr>
+              <w:t>2.2.</w:t>
             </w:r>
             <w:r>
               <w:rPr>
@@ -929,7 +963,7 @@
                 <w:rStyle w:val="Hyperlink"/>
                 <w:noProof/>
               </w:rPr>
-              <w:t>Analyse und Test der Komponenten</w:t>
+              <w:t>Kann-Ziele / Bonus-Ziele</w:t>
             </w:r>
             <w:r>
               <w:rPr>
@@ -950,7 +984,7 @@
                 <w:noProof/>
                 <w:webHidden/>
               </w:rPr>
-              <w:instrText xml:space="preserve"> PAGEREF _Toc230804012 \h </w:instrText>
+              <w:instrText xml:space="preserve"> PAGEREF _Toc231318005 \h </w:instrText>
             </w:r>
             <w:r>
               <w:rPr>
@@ -971,386 +1005,6 @@
                 <w:webHidden/>
               </w:rPr>
               <w:t>2</w:t>
-            </w:r>
-            <w:r>
-              <w:rPr>
-                <w:noProof/>
-                <w:webHidden/>
-              </w:rPr>
-              <w:fldChar w:fldCharType="end"/>
-            </w:r>
-          </w:hyperlink>
-        </w:p>
-        <w:p>
-          <w:pPr>
-            <w:pStyle w:val="Verzeichnis1"/>
-            <w:tabs>
-              <w:tab w:val="left" w:pos="480"/>
-              <w:tab w:val="right" w:leader="dot" w:pos="9628"/>
-            </w:tabs>
-            <w:rPr>
-              <w:rFonts w:asciiTheme="minorHAnsi" w:eastAsiaTheme="minorEastAsia" w:hAnsiTheme="minorHAnsi"/>
-              <w:noProof/>
-              <w:kern w:val="2"/>
-              <w:sz w:val="24"/>
-              <w:szCs w:val="24"/>
-              <w:lang w:eastAsia="ja-JP"/>
-              <w14:ligatures w14:val="standardContextual"/>
-            </w:rPr>
-          </w:pPr>
-          <w:hyperlink w:anchor="_Toc230804013" w:history="1">
-            <w:r>
-              <w:rPr>
-                <w:rStyle w:val="Hyperlink"/>
-                <w:bCs/>
-                <w:noProof/>
-              </w:rPr>
-              <w:t>5.</w:t>
-            </w:r>
-            <w:r>
-              <w:rPr>
-                <w:rFonts w:asciiTheme="minorHAnsi" w:eastAsiaTheme="minorEastAsia" w:hAnsiTheme="minorHAnsi"/>
-                <w:noProof/>
-                <w:kern w:val="2"/>
-                <w:sz w:val="24"/>
-                <w:szCs w:val="24"/>
-                <w:lang w:eastAsia="ja-JP"/>
-                <w14:ligatures w14:val="standardContextual"/>
-              </w:rPr>
-              <w:tab/>
-            </w:r>
-            <w:r>
-              <w:rPr>
-                <w:rStyle w:val="Hyperlink"/>
-                <w:noProof/>
-              </w:rPr>
-              <w:t>Softwarearchitektur Statemachine</w:t>
-            </w:r>
-            <w:r>
-              <w:rPr>
-                <w:noProof/>
-                <w:webHidden/>
-              </w:rPr>
-              <w:tab/>
-            </w:r>
-            <w:r>
-              <w:rPr>
-                <w:noProof/>
-                <w:webHidden/>
-              </w:rPr>
-              <w:fldChar w:fldCharType="begin"/>
-            </w:r>
-            <w:r>
-              <w:rPr>
-                <w:noProof/>
-                <w:webHidden/>
-              </w:rPr>
-              <w:instrText xml:space="preserve"> PAGEREF _Toc230804013 \h </w:instrText>
-            </w:r>
-            <w:r>
-              <w:rPr>
-                <w:noProof/>
-                <w:webHidden/>
-              </w:rPr>
-            </w:r>
-            <w:r>
-              <w:rPr>
-                <w:noProof/>
-                <w:webHidden/>
-              </w:rPr>
-              <w:fldChar w:fldCharType="separate"/>
-            </w:r>
-            <w:r>
-              <w:rPr>
-                <w:noProof/>
-                <w:webHidden/>
-              </w:rPr>
-              <w:t>4</w:t>
-            </w:r>
-            <w:r>
-              <w:rPr>
-                <w:noProof/>
-                <w:webHidden/>
-              </w:rPr>
-              <w:fldChar w:fldCharType="end"/>
-            </w:r>
-          </w:hyperlink>
-        </w:p>
-        <w:p>
-          <w:pPr>
-            <w:pStyle w:val="Verzeichnis1"/>
-            <w:tabs>
-              <w:tab w:val="left" w:pos="480"/>
-              <w:tab w:val="right" w:leader="dot" w:pos="9628"/>
-            </w:tabs>
-            <w:rPr>
-              <w:rFonts w:asciiTheme="minorHAnsi" w:eastAsiaTheme="minorEastAsia" w:hAnsiTheme="minorHAnsi"/>
-              <w:noProof/>
-              <w:kern w:val="2"/>
-              <w:sz w:val="24"/>
-              <w:szCs w:val="24"/>
-              <w:lang w:eastAsia="ja-JP"/>
-              <w14:ligatures w14:val="standardContextual"/>
-            </w:rPr>
-          </w:pPr>
-          <w:hyperlink w:anchor="_Toc230804014" w:history="1">
-            <w:r>
-              <w:rPr>
-                <w:rStyle w:val="Hyperlink"/>
-                <w:bCs/>
-                <w:noProof/>
-              </w:rPr>
-              <w:t>6.</w:t>
-            </w:r>
-            <w:r>
-              <w:rPr>
-                <w:rFonts w:asciiTheme="minorHAnsi" w:eastAsiaTheme="minorEastAsia" w:hAnsiTheme="minorHAnsi"/>
-                <w:noProof/>
-                <w:kern w:val="2"/>
-                <w:sz w:val="24"/>
-                <w:szCs w:val="24"/>
-                <w:lang w:eastAsia="ja-JP"/>
-                <w14:ligatures w14:val="standardContextual"/>
-              </w:rPr>
-              <w:tab/>
-            </w:r>
-            <w:r>
-              <w:rPr>
-                <w:rStyle w:val="Hyperlink"/>
-                <w:noProof/>
-              </w:rPr>
-              <w:t>Umsetzung der Software</w:t>
-            </w:r>
-            <w:r>
-              <w:rPr>
-                <w:noProof/>
-                <w:webHidden/>
-              </w:rPr>
-              <w:tab/>
-            </w:r>
-            <w:r>
-              <w:rPr>
-                <w:noProof/>
-                <w:webHidden/>
-              </w:rPr>
-              <w:fldChar w:fldCharType="begin"/>
-            </w:r>
-            <w:r>
-              <w:rPr>
-                <w:noProof/>
-                <w:webHidden/>
-              </w:rPr>
-              <w:instrText xml:space="preserve"> PAGEREF _Toc230804014 \h </w:instrText>
-            </w:r>
-            <w:r>
-              <w:rPr>
-                <w:noProof/>
-                <w:webHidden/>
-              </w:rPr>
-            </w:r>
-            <w:r>
-              <w:rPr>
-                <w:noProof/>
-                <w:webHidden/>
-              </w:rPr>
-              <w:fldChar w:fldCharType="separate"/>
-            </w:r>
-            <w:r>
-              <w:rPr>
-                <w:noProof/>
-                <w:webHidden/>
-              </w:rPr>
-              <w:t>5</w:t>
-            </w:r>
-            <w:r>
-              <w:rPr>
-                <w:noProof/>
-                <w:webHidden/>
-              </w:rPr>
-              <w:fldChar w:fldCharType="end"/>
-            </w:r>
-          </w:hyperlink>
-        </w:p>
-        <w:p>
-          <w:pPr>
-            <w:pStyle w:val="Verzeichnis1"/>
-            <w:tabs>
-              <w:tab w:val="left" w:pos="480"/>
-              <w:tab w:val="right" w:leader="dot" w:pos="9628"/>
-            </w:tabs>
-            <w:rPr>
-              <w:rFonts w:asciiTheme="minorHAnsi" w:eastAsiaTheme="minorEastAsia" w:hAnsiTheme="minorHAnsi"/>
-              <w:noProof/>
-              <w:kern w:val="2"/>
-              <w:sz w:val="24"/>
-              <w:szCs w:val="24"/>
-              <w:lang w:eastAsia="ja-JP"/>
-              <w14:ligatures w14:val="standardContextual"/>
-            </w:rPr>
-          </w:pPr>
-          <w:hyperlink w:anchor="_Toc230804015" w:history="1">
-            <w:r>
-              <w:rPr>
-                <w:rStyle w:val="Hyperlink"/>
-                <w:bCs/>
-                <w:noProof/>
-              </w:rPr>
-              <w:t>7.</w:t>
-            </w:r>
-            <w:r>
-              <w:rPr>
-                <w:rFonts w:asciiTheme="minorHAnsi" w:eastAsiaTheme="minorEastAsia" w:hAnsiTheme="minorHAnsi"/>
-                <w:noProof/>
-                <w:kern w:val="2"/>
-                <w:sz w:val="24"/>
-                <w:szCs w:val="24"/>
-                <w:lang w:eastAsia="ja-JP"/>
-                <w14:ligatures w14:val="standardContextual"/>
-              </w:rPr>
-              <w:tab/>
-            </w:r>
-            <w:r>
-              <w:rPr>
-                <w:rStyle w:val="Hyperlink"/>
-                <w:noProof/>
-              </w:rPr>
-              <w:t>Anleitung</w:t>
-            </w:r>
-            <w:r>
-              <w:rPr>
-                <w:noProof/>
-                <w:webHidden/>
-              </w:rPr>
-              <w:tab/>
-            </w:r>
-            <w:r>
-              <w:rPr>
-                <w:noProof/>
-                <w:webHidden/>
-              </w:rPr>
-              <w:fldChar w:fldCharType="begin"/>
-            </w:r>
-            <w:r>
-              <w:rPr>
-                <w:noProof/>
-                <w:webHidden/>
-              </w:rPr>
-              <w:instrText xml:space="preserve"> PAGEREF _Toc230804015 \h </w:instrText>
-            </w:r>
-            <w:r>
-              <w:rPr>
-                <w:noProof/>
-                <w:webHidden/>
-              </w:rPr>
-            </w:r>
-            <w:r>
-              <w:rPr>
-                <w:noProof/>
-                <w:webHidden/>
-              </w:rPr>
-              <w:fldChar w:fldCharType="separate"/>
-            </w:r>
-            <w:r>
-              <w:rPr>
-                <w:noProof/>
-                <w:webHidden/>
-              </w:rPr>
-              <w:t>5</w:t>
-            </w:r>
-            <w:r>
-              <w:rPr>
-                <w:noProof/>
-                <w:webHidden/>
-              </w:rPr>
-              <w:fldChar w:fldCharType="end"/>
-            </w:r>
-          </w:hyperlink>
-        </w:p>
-        <w:p>
-          <w:pPr>
-            <w:pStyle w:val="Verzeichnis1"/>
-            <w:tabs>
-              <w:tab w:val="left" w:pos="480"/>
-              <w:tab w:val="right" w:leader="dot" w:pos="9628"/>
-            </w:tabs>
-            <w:rPr>
-              <w:rFonts w:asciiTheme="minorHAnsi" w:eastAsiaTheme="minorEastAsia" w:hAnsiTheme="minorHAnsi"/>
-              <w:noProof/>
-              <w:kern w:val="2"/>
-              <w:sz w:val="24"/>
-              <w:szCs w:val="24"/>
-              <w:lang w:eastAsia="ja-JP"/>
-              <w14:ligatures w14:val="standardContextual"/>
-            </w:rPr>
-          </w:pPr>
-          <w:hyperlink w:anchor="_Toc230804016" w:history="1">
-            <w:r>
-              <w:rPr>
-                <w:rStyle w:val="Hyperlink"/>
-                <w:bCs/>
-                <w:noProof/>
-              </w:rPr>
-              <w:t>8.</w:t>
-            </w:r>
-            <w:r>
-              <w:rPr>
-                <w:rFonts w:asciiTheme="minorHAnsi" w:eastAsiaTheme="minorEastAsia" w:hAnsiTheme="minorHAnsi"/>
-                <w:noProof/>
-                <w:kern w:val="2"/>
-                <w:sz w:val="24"/>
-                <w:szCs w:val="24"/>
-                <w:lang w:eastAsia="ja-JP"/>
-                <w14:ligatures w14:val="standardContextual"/>
-              </w:rPr>
-              <w:tab/>
-            </w:r>
-            <w:r>
-              <w:rPr>
-                <w:rStyle w:val="Hyperlink"/>
-                <w:noProof/>
-              </w:rPr>
-              <w:t>Akzeptanztest</w:t>
-            </w:r>
-            <w:r>
-              <w:rPr>
-                <w:noProof/>
-                <w:webHidden/>
-              </w:rPr>
-              <w:tab/>
-            </w:r>
-            <w:r>
-              <w:rPr>
-                <w:noProof/>
-                <w:webHidden/>
-              </w:rPr>
-              <w:fldChar w:fldCharType="begin"/>
-            </w:r>
-            <w:r>
-              <w:rPr>
-                <w:noProof/>
-                <w:webHidden/>
-              </w:rPr>
-              <w:instrText xml:space="preserve"> PAGEREF _Toc230804016 \h </w:instrText>
-            </w:r>
-            <w:r>
-              <w:rPr>
-                <w:noProof/>
-                <w:webHidden/>
-              </w:rPr>
-            </w:r>
-            <w:r>
-              <w:rPr>
-                <w:noProof/>
-                <w:webHidden/>
-              </w:rPr>
-              <w:fldChar w:fldCharType="separate"/>
-            </w:r>
-            <w:r>
-              <w:rPr>
-                <w:noProof/>
-                <w:webHidden/>
-              </w:rPr>
-              <w:t>6</w:t>
             </w:r>
             <w:r>
               <w:rPr>
@@ -1377,13 +1031,13 @@
               <w14:ligatures w14:val="standardContextual"/>
             </w:rPr>
           </w:pPr>
-          <w:hyperlink w:anchor="_Toc230804017" w:history="1">
+          <w:hyperlink w:anchor="_Toc231318006" w:history="1">
             <w:r>
               <w:rPr>
                 <w:rStyle w:val="Hyperlink"/>
                 <w:noProof/>
               </w:rPr>
-              <w:t>Schlussteil</w:t>
+              <w:t>Selbständigkeitserklärung</w:t>
             </w:r>
             <w:r>
               <w:rPr>
@@ -1404,7 +1058,7 @@
                 <w:noProof/>
                 <w:webHidden/>
               </w:rPr>
-              <w:instrText xml:space="preserve"> PAGEREF _Toc230804017 \h </w:instrText>
+              <w:instrText xml:space="preserve"> PAGEREF _Toc231318006 \h </w:instrText>
             </w:r>
             <w:r>
               <w:rPr>
@@ -1424,7 +1078,7 @@
                 <w:noProof/>
                 <w:webHidden/>
               </w:rPr>
-              <w:t>7</w:t>
+              <w:t>4</w:t>
             </w:r>
             <w:r>
               <w:rPr>
@@ -1451,13 +1105,13 @@
               <w14:ligatures w14:val="standardContextual"/>
             </w:rPr>
           </w:pPr>
-          <w:hyperlink w:anchor="_Toc230804018" w:history="1">
+          <w:hyperlink w:anchor="_Toc231318007" w:history="1">
             <w:r>
               <w:rPr>
                 <w:rStyle w:val="Hyperlink"/>
                 <w:noProof/>
               </w:rPr>
-              <w:t>Selbständigkeitserklärung</w:t>
+              <w:t>Quellenverzeichnis</w:t>
             </w:r>
             <w:r>
               <w:rPr>
@@ -1478,7 +1132,7 @@
                 <w:noProof/>
                 <w:webHidden/>
               </w:rPr>
-              <w:instrText xml:space="preserve"> PAGEREF _Toc230804018 \h </w:instrText>
+              <w:instrText xml:space="preserve"> PAGEREF _Toc231318007 \h </w:instrText>
             </w:r>
             <w:r>
               <w:rPr>
@@ -1498,7 +1152,7 @@
                 <w:noProof/>
                 <w:webHidden/>
               </w:rPr>
-              <w:t>8</w:t>
+              <w:t>5</w:t>
             </w:r>
             <w:r>
               <w:rPr>
@@ -1525,13 +1179,13 @@
               <w14:ligatures w14:val="standardContextual"/>
             </w:rPr>
           </w:pPr>
-          <w:hyperlink w:anchor="_Toc230804019" w:history="1">
+          <w:hyperlink w:anchor="_Toc231318008" w:history="1">
             <w:r>
               <w:rPr>
                 <w:rStyle w:val="Hyperlink"/>
                 <w:noProof/>
               </w:rPr>
-              <w:t>Quellenverzeichnis</w:t>
+              <w:t>Einsatz von KI-Tools</w:t>
             </w:r>
             <w:r>
               <w:rPr>
@@ -1552,7 +1206,7 @@
                 <w:noProof/>
                 <w:webHidden/>
               </w:rPr>
-              <w:instrText xml:space="preserve"> PAGEREF _Toc230804019 \h </w:instrText>
+              <w:instrText xml:space="preserve"> PAGEREF _Toc231318008 \h </w:instrText>
             </w:r>
             <w:r>
               <w:rPr>
@@ -1572,81 +1226,7 @@
                 <w:noProof/>
                 <w:webHidden/>
               </w:rPr>
-              <w:t>9</w:t>
-            </w:r>
-            <w:r>
-              <w:rPr>
-                <w:noProof/>
-                <w:webHidden/>
-              </w:rPr>
-              <w:fldChar w:fldCharType="end"/>
-            </w:r>
-          </w:hyperlink>
-        </w:p>
-        <w:p>
-          <w:pPr>
-            <w:pStyle w:val="Verzeichnis1"/>
-            <w:tabs>
-              <w:tab w:val="right" w:leader="dot" w:pos="9628"/>
-            </w:tabs>
-            <w:rPr>
-              <w:rFonts w:asciiTheme="minorHAnsi" w:eastAsiaTheme="minorEastAsia" w:hAnsiTheme="minorHAnsi"/>
-              <w:noProof/>
-              <w:kern w:val="2"/>
-              <w:sz w:val="24"/>
-              <w:szCs w:val="24"/>
-              <w:lang w:eastAsia="ja-JP"/>
-              <w14:ligatures w14:val="standardContextual"/>
-            </w:rPr>
-          </w:pPr>
-          <w:hyperlink w:anchor="_Toc230804020" w:history="1">
-            <w:r>
-              <w:rPr>
-                <w:rStyle w:val="Hyperlink"/>
-                <w:noProof/>
-              </w:rPr>
-              <w:t>Einsatz von KI-Tools</w:t>
-            </w:r>
-            <w:r>
-              <w:rPr>
-                <w:noProof/>
-                <w:webHidden/>
-              </w:rPr>
-              <w:tab/>
-            </w:r>
-            <w:r>
-              <w:rPr>
-                <w:noProof/>
-                <w:webHidden/>
-              </w:rPr>
-              <w:fldChar w:fldCharType="begin"/>
-            </w:r>
-            <w:r>
-              <w:rPr>
-                <w:noProof/>
-                <w:webHidden/>
-              </w:rPr>
-              <w:instrText xml:space="preserve"> PAGEREF _Toc230804020 \h </w:instrText>
-            </w:r>
-            <w:r>
-              <w:rPr>
-                <w:noProof/>
-                <w:webHidden/>
-              </w:rPr>
-            </w:r>
-            <w:r>
-              <w:rPr>
-                <w:noProof/>
-                <w:webHidden/>
-              </w:rPr>
-              <w:fldChar w:fldCharType="separate"/>
-            </w:r>
-            <w:r>
-              <w:rPr>
-                <w:noProof/>
-                <w:webHidden/>
-              </w:rPr>
-              <w:t>9</w:t>
+              <w:t>5</w:t>
             </w:r>
             <w:r>
               <w:rPr>
@@ -1664,13 +1244,15 @@
               <w:tab w:val="right" w:leader="dot" w:pos="9615"/>
             </w:tabs>
             <w:ind w:left="0"/>
+          </w:pPr>
+          <w:r>
+            <w:fldChar w:fldCharType="end"/>
+          </w:r>
+        </w:p>
+        <w:p>
+          <w:pPr>
             <w:rPr>
-              <w:noProof/>
-              <w:color w:val="0563C1" w:themeColor="hyperlink"/>
-              <w:kern w:val="2"/>
-              <w:u w:val="single"/>
               <w:lang w:eastAsia="de-CH"/>
-              <w14:ligatures w14:val="standardContextual"/>
             </w:rPr>
             <w:sectPr>
               <w:pgSz w:w="11906" w:h="16838"/>
@@ -1680,12 +1262,222 @@
               <w:docGrid w:linePitch="360"/>
             </w:sectPr>
           </w:pPr>
-          <w:r>
-            <w:fldChar w:fldCharType="end"/>
-          </w:r>
         </w:p>
       </w:sdtContent>
     </w:sdt>
+    <w:p>
+      <w:pPr>
+        <w:pStyle w:val="berschrift1"/>
+      </w:pPr>
+      <w:bookmarkStart w:id="0" w:name="_Toc231318002"/>
+      <w:r>
+        <w:lastRenderedPageBreak/>
+        <w:t>Einleitung</w:t>
+      </w:r>
+      <w:bookmarkEnd w:id="0"/>
+    </w:p>
+    <w:p>
+      <w:r>
+        <w:t>Im Rahmen der Case Study 4 im Modul Steuerungstechnik 2 entwickeln wir eine Aufzugsteuerung. Zu Beginn haben wir verschiedene mögliche Aufgabenstellungen diskutiert und überlegt, welches Projekt für uns technisch sinnvoll und interessant ist. Dabei war uns wichtig, dass die Aufgabe einen praktischen Bezug hat und wir die vorhandenen Komponenten der Steuerung sinnvoll einsetzen können.</w:t>
+      </w:r>
+    </w:p>
+    <w:p/>
+    <w:p>
+      <w:r>
+        <w:t>Wir haben uns gezielt für eine Aufzugsteuerung entschieden, da wir in diesem Projekt mit Motoren, digitalen Eingängen, Ausgängen und einer logischen Ablaufsteuerung arbeiten können. Ein Aufzug eignet sich sehr gut, um typische Elemente der Steuerungstechnik umzusetzen, wie zum Beispiel Zustände, Verriegelungen, Fahrbefehle, Endlagen und Sicherheitsbedingungen. Dadurch können wir unser Wissen aus dem Unterricht praktisch anwenden und vertiefen.</w:t>
+      </w:r>
+    </w:p>
+    <w:p/>
+    <w:p>
+      <w:r>
+        <w:t>Ziel dieser Case Study ist es, eine funktionierende Steuerung für einen Aufzug zu entwickeln, zu programmieren und zu testen. Dabei soll der Aufzug je nach Eingabe korrekt reagieren, die gewünschte Position anfahren und die Abläufe nachvollziehbar darstellen. Zusätzlich soll die Umsetzung so aufgebaut sein, dass sie verständlich dokumentiert und bei Bedarf erweitert werden kann.</w:t>
+      </w:r>
+    </w:p>
+    <w:p>
+      <w:pPr>
+        <w:pStyle w:val="berschrift1"/>
+      </w:pPr>
+      <w:bookmarkStart w:id="1" w:name="_Toc231318003"/>
+      <w:r>
+        <w:t>Anforderungen und Ziele</w:t>
+      </w:r>
+      <w:bookmarkEnd w:id="1"/>
+    </w:p>
+    <w:p>
+      <w:r>
+        <w:t>In dieser Case Study wird eine Aufzugsteuerung mit vier Etagen simuliert. Die Anlage soll typische Funktionen eines einfachen Aufzugs abbilden und dabei mit zwei physischen Antrieben arbeiten. Ein Antrieb wird für die Bewegung des Aufzugs zwischen den Etagen verwendet. Der zweite Antrieb dient als Türantrieb zum Öffnen und Schliessen der Aufzugtür.</w:t>
+      </w:r>
+    </w:p>
+    <w:p/>
+    <w:p>
+      <w:r>
+        <w:t>Die Bedienung der Aufzuganlage erfolgt über digitale Eingänge sowie über das HMI. Die vier Wahltaster beziehungsweise Schalter werden verwendet, um den Aufzug von den einzelnen Etagen aus zu bestellen. Dadurch wird eine Aussenbedienung im Treppenhaus simuliert. Wird eine Etage bestellt, soll der Aufzug diese Anforderung erkennen und die entsprechende Etage anfahren.</w:t>
+      </w:r>
+    </w:p>
+    <w:p/>
+    <w:p>
+      <w:r>
+        <w:t>Zusätzlich werden digitale Taster für die Funktionen „Tür auf“ und „Tür zu“ verwendet. Damit kann die Tür manuell geöffnet oder geschlossen werden. Diese Bedienung soll nur dann möglich sein, wenn sich der Aufzug in einem sicheren Zustand befindet, zum Beispiel im Stillstand an einer Etage.</w:t>
+      </w:r>
+    </w:p>
+    <w:p/>
+    <w:p>
+      <w:r>
+        <w:lastRenderedPageBreak/>
+        <w:t>Das HMI dient zur übersichtlichen Darstellung und zusätzlichen Bedienung der Anlage. Auf dem HMI sollen vier Taster für die Auswahl der Zieletage vorhanden sein. Damit kann im HMI bestätigt beziehungsweise ausgewählt werden, in welche Etage der Aufzug fahren soll. Zusätzlich sollen auf dem HMI ebenfalls die Funktionen „Tür auf“ und „Tür zu“ vorhanden sein. Wichtige Zustände wie aktuelle Etage, Zieletage, Fahrtrichtung und Türzustand sollen auf dem HMI ersichtlich dargestellt werden.</w:t>
+      </w:r>
+    </w:p>
+    <w:p>
+      <w:pPr>
+        <w:pStyle w:val="berschrift2"/>
+        <w:rPr>
+          <w:b/>
+          <w:bCs/>
+        </w:rPr>
+      </w:pPr>
+      <w:bookmarkStart w:id="2" w:name="_Toc231318004"/>
+      <w:r>
+        <w:rPr>
+          <w:b/>
+          <w:bCs/>
+        </w:rPr>
+        <w:t>Muss-Ziele</w:t>
+      </w:r>
+      <w:bookmarkEnd w:id="2"/>
+    </w:p>
+    <w:p>
+      <w:r>
+        <w:t>Die Aufzugsteuerung muss vier Etagen verwalten können. Jede Etage soll über einen eigenen Wahltaster beziehungsweise Schalter bestellt werden können. Diese Schalter simulieren die Aussenbedienung des Aufzugs im Treppenhaus.</w:t>
+      </w:r>
+    </w:p>
+    <w:p/>
+    <w:p>
+      <w:r>
+        <w:t>Der Aufzug muss eine erkannte Etagenanforderung verarbeiten und zur entsprechenden Etage fahren können. Der Aufzugsantrieb muss abhängig von der aktuellen Position und der gewählten Zieletage in die richtige Richtung angesteuert werden. Befindet sich die Zieletage oberhalb der aktuellen Etage, soll der Aufzug nach oben fahren. Befindet sich die Zieletage unterhalb der aktuellen Etage, soll der Aufzug nach unten fahren. Sobald die gewünschte Etage erreicht ist, muss der Aufzug stoppen.</w:t>
+      </w:r>
+    </w:p>
+    <w:p/>
+    <w:p>
+      <w:r>
+        <w:t>Der Türantrieb muss in die Steuerung integriert werden. Die Tür soll über digitale Taster sowie über das HMI geöffnet und geschlossen werden können. Während der Fahrt darf die Tür nicht geöffnet werden. Der Aufzug darf nur fahren, wenn die Tür geschlossen ist.</w:t>
+      </w:r>
+    </w:p>
+    <w:p/>
+    <w:p>
+      <w:r>
+        <w:t>Das HMI muss die Aufzuganlage verständlich darstellen. Dazu gehören mindestens die Anzeige der aktuellen Etage, die Anzeige der gewählten Zieletage, der Fahrzustand des Aufzugs und der Zustand der Tür. Zusätzlich sollen auf dem HMI vier Etagentaster sowie die Taster „Tür auf“ und „Tür zu“ vorhanden sein.</w:t>
+      </w:r>
+    </w:p>
+    <w:p/>
+    <w:p>
+      <w:r>
+        <w:t>Das SPS-Programm soll klar strukturiert sein. Die wichtigsten Zustände der Anlage sollen eindeutig abgebildet werden. Dazu gehören Stillstand, Fahrt nach oben, Fahrt nach unten, Tür öffnen, Tür offen und Tür schliessen.</w:t>
+      </w:r>
+    </w:p>
+    <w:p/>
+    <w:p>
+      <w:pPr>
+        <w:pStyle w:val="berschrift2"/>
+        <w:rPr>
+          <w:b/>
+          <w:bCs/>
+        </w:rPr>
+      </w:pPr>
+      <w:bookmarkStart w:id="3" w:name="_Toc231318005"/>
+      <w:r>
+        <w:rPr>
+          <w:b/>
+          <w:bCs/>
+        </w:rPr>
+        <w:t>Kann-Ziele / Bonus-Ziele</w:t>
+      </w:r>
+      <w:bookmarkEnd w:id="3"/>
+    </w:p>
+    <w:p>
+      <w:r>
+        <w:t>Als Bonus soll eine Notstopp-Funktion umgesetzt werden. Diese kann über einen Notstopptaster oder über eine simulierte Lichtschranke ausgelöst werden. Wird der Notstopp betätigt, muss die Anlage sofort stoppen und in einen sicheren Zustand wechseln.</w:t>
+      </w:r>
+    </w:p>
+    <w:p/>
+    <w:p>
+      <w:r>
+        <w:lastRenderedPageBreak/>
+        <w:t>Zusätzlich kann eine Sicherheitsfunktion über eine Lichtschranke umgesetzt werden. Wird die Lichtschranke während des Schliessens der Tür unterbrochen, soll die Tür nicht weiter schliessen. Stattdessen soll die Tür wieder öffnen oder im geöffneten Zustand bleiben.</w:t>
+      </w:r>
+    </w:p>
+    <w:p/>
+    <w:p>
+      <w:r>
+        <w:t>Ein weiteres Bonus-Ziel ist eine erweiterte Darstellung am HMI. Dabei sollen die Etagen, die aktuelle Position des Aufzugs, die gewählte Zieletage, die Türbewegung und mögliche Störungen möglichst übersichtlich visualisiert werden.</w:t>
+      </w:r>
+    </w:p>
+    <w:p/>
+    <w:p>
+      <w:r>
+        <w:t>Falls genügend Zeit vorhanden ist, kann die Steuerung erweitert werden, sodass mehrere Etagenanforderungen nacheinander verarbeitet werden. Dadurch würde die Simulation näher an eine reale Aufzugsteuerung herankommen.</w:t>
+      </w:r>
+    </w:p>
+    <w:p>
+      <w:pPr>
+        <w:pStyle w:val="berschrift1"/>
+      </w:pPr>
+      <w:r>
+        <w:t>Planen und Konzipieren</w:t>
+      </w:r>
+    </w:p>
+    <w:p>
+      <w:r>
+        <w:t xml:space="preserve">Nachdem wir die Anforderungen sowie die Muss- und </w:t>
+      </w:r>
+      <w:proofErr w:type="spellStart"/>
+      <w:r>
+        <w:t>Kannziele</w:t>
+      </w:r>
+      <w:proofErr w:type="spellEnd"/>
+      <w:r>
+        <w:t xml:space="preserve"> definiert hatten, begannen wir mit der Planungs- und Konzeptionsphase. In diesem Schritt ging es darum, unsere Ideen zu strukturieren und eine klare Grundlage für die spätere Umsetzung der Aufzugssteuerung zu schaffen.</w:t>
+      </w:r>
+    </w:p>
+    <w:p/>
+    <w:p>
+      <w:r>
+        <w:t>Zu Beginn entschieden wir uns, ein Flow-Diagramm zu erstellen. Dafür verwendeten wir Draw.io, da sich damit Abläufe übersichtlich und verständlich darstellen lassen. Das Flow-Diagramm half uns dabei, die einzelnen Zustände und Entscheidungen der Steuerung besser zu erkennen. So konnten wir beispielsweise festlegen, wie der Aufzug auf Tasteneingaben reagiert, wann er sich bewegen soll und unter welchen Bedingungen die Türen geöffnet oder geschlossen werden.</w:t>
+      </w:r>
+    </w:p>
+    <w:p/>
+    <w:p>
+      <w:r>
+        <w:t>Durch das Erstellen des Diagramms konnten wir den Ablauf der Steuerung Schritt für Schritt durchdenken. Dabei wurden mögliche Probleme oder fehlende Funktionen frühzeitig sichtbar. Das war wichtig, damit wir vor der eigentlichen Programmierung ein gemeinsames Verständnis über die Funktionsweise der Steuerung hatten.</w:t>
+      </w:r>
+    </w:p>
+    <w:p/>
+    <w:p>
+      <w:r>
+        <w:t>Das Flow-Diagramm diente somit als Grundlage für die weitere Umsetzung. Es half uns, die Logik der Aufzugssteuerung zu planen, die einzelnen Programmteile besser einzuteilen und später gezielter umzusetzen.</w:t>
+      </w:r>
+    </w:p>
+    <w:p/>
+    <w:p/>
+    <w:p/>
+    <w:p/>
+    <w:p/>
+    <w:p/>
+    <w:p/>
+    <w:p/>
+    <w:p/>
+    <w:p/>
+    <w:p/>
+    <w:p/>
+    <w:p/>
+    <w:p/>
+    <w:p/>
+    <w:p/>
+    <w:p/>
+    <w:p/>
+    <w:p/>
+    <w:p/>
+    <w:p/>
+    <w:p/>
     <w:p/>
     <w:p>
       <w:pPr>
@@ -1695,11 +1487,11 @@
           <w:numId w:val="0"/>
         </w:numPr>
       </w:pPr>
-      <w:bookmarkStart w:id="0" w:name="_Toc230804018"/>
+      <w:bookmarkStart w:id="4" w:name="_Toc231318006"/>
       <w:r>
         <w:t>Selbständigkeitserklärung</w:t>
       </w:r>
-      <w:bookmarkEnd w:id="0"/>
+      <w:bookmarkEnd w:id="4"/>
     </w:p>
     <w:p>
       <w:r>
@@ -1742,13 +1534,16 @@
         <w:t xml:space="preserve">Landquart, </w:t>
       </w:r>
       <w:r>
-        <w:t>30</w:t>
+        <w:t>23</w:t>
       </w:r>
       <w:r>
         <w:t>.</w:t>
       </w:r>
       <w:r>
-        <w:t>05</w:t>
+        <w:t>0</w:t>
+      </w:r>
+      <w:r>
+        <w:t>6</w:t>
       </w:r>
       <w:r>
         <w:t>.202</w:t>
@@ -1864,12 +1659,11 @@
           <w:numId w:val="0"/>
         </w:numPr>
       </w:pPr>
-      <w:bookmarkStart w:id="1" w:name="_Toc230804019"/>
-      <w:r>
-        <w:lastRenderedPageBreak/>
+      <w:bookmarkStart w:id="5" w:name="_Toc231318007"/>
+      <w:r>
         <w:t>Quellenverzeichnis</w:t>
       </w:r>
-      <w:bookmarkEnd w:id="1"/>
+      <w:bookmarkEnd w:id="5"/>
     </w:p>
     <w:p>
       <w:pPr>
@@ -1878,13 +1672,13 @@
           <w:ilvl w:val="0"/>
           <w:numId w:val="0"/>
         </w:numPr>
-        <w:ind w:left="454" w:hanging="454"/>
-      </w:pPr>
-      <w:bookmarkStart w:id="2" w:name="_Toc230804020"/>
+        <w:ind w:left="454"/>
+      </w:pPr>
+      <w:bookmarkStart w:id="6" w:name="_Toc231318008"/>
       <w:r>
         <w:t>Einsatz von KI-Tools</w:t>
       </w:r>
-      <w:bookmarkEnd w:id="2"/>
+      <w:bookmarkEnd w:id="6"/>
     </w:p>
     <w:p>
       <w:pPr>
@@ -2135,12 +1929,12 @@
                   </v:formulas>
                   <v:path gradientshapeok="t" limo="10800,10800" o:connecttype="custom" o:connectlocs="@8,0;0,@9;@8,@7;@6,@9" textboxrect="@3,@3,@4,@5"/>
                 </v:shapetype>
-                <v:shape id="Flussdiagramm: Alternativer Prozess 8" o:spid="_x0000_s1026" type="#_x0000_t176" style="position:absolute;margin-left:0;margin-top:0;width:40.35pt;height:34.75pt;z-index:251658240;visibility:visible;mso-wrap-style:square;mso-width-percent:0;mso-height-percent:0;mso-wrap-distance-left:9pt;mso-wrap-distance-top:0;mso-wrap-distance-right:9pt;mso-wrap-distance-bottom:0;mso-position-horizontal:center;mso-position-horizontal-relative:right-margin-area;mso-position-vertical:center;mso-position-vertical-relative:bottom-margin-area;mso-width-percent:0;mso-height-percent:0;mso-width-relative:page;mso-height-relative:page;v-text-anchor:top" o:gfxdata="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" filled="f" fillcolor="#5c83b4" stroked="f" strokecolor="#737373">
+                <v:shape id="Flussdiagramm: Alternativer Prozess 8" o:spid="_x0000_s1026" type="#_x0000_t176" style="position:absolute;margin-left:0;margin-top:0;width:40.35pt;height:34.75pt;z-index:251658240;visibility:visible;mso-wrap-style:square;mso-width-percent:0;mso-height-percent:0;mso-wrap-distance-left:9pt;mso-wrap-distance-top:0;mso-wrap-distance-right:9pt;mso-wrap-distance-bottom:0;mso-position-horizontal:center;mso-position-horizontal-relative:right-margin-area;mso-position-vertical:center;mso-position-vertical-relative:bottom-margin-area;mso-width-percent:0;mso-height-percent:0;mso-width-relative:page;mso-height-relative:page;v-text-anchor:top" o:gfxdata="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" filled="f" fillcolor="#5c83b4" stroked="f" strokecolor="#737373">
                   <v:textbox>
                     <w:txbxContent>
                       <w:p>
                         <w:pPr>
-                          <w:pStyle w:val="Footer"/>
+                          <w:pStyle w:val="Fuzeile"/>
                           <w:pBdr>
                             <w:top w:val="single" w:sz="12" w:space="1" w:color="A5A5A5" w:themeColor="accent3"/>
                             <w:bottom w:val="single" w:sz="48" w:space="1" w:color="A5A5A5" w:themeColor="accent3"/>
@@ -2368,7 +2162,7 @@
   <w:abstractNum w:abstractNumId="1" w15:restartNumberingAfterBreak="0">
     <w:nsid w:val="5C6D1B7C"/>
     <w:multiLevelType w:val="multilevel"/>
-    <w:tmpl w:val="567EA528"/>
+    <w:tmpl w:val="23A87068"/>
     <w:lvl w:ilvl="0">
       <w:start w:val="1"/>
       <w:numFmt w:val="decimal"/>
@@ -3060,7 +2854,7 @@
     <w:autoRedefine/>
     <w:uiPriority w:val="9"/>
     <w:qFormat/>
-    <w:rsid w:val="00605776"/>
+    <w:rsid w:val="00FE4ED9"/>
     <w:pPr>
       <w:keepNext/>
       <w:keepLines/>
@@ -3073,7 +2867,7 @@
     <w:rPr>
       <w:rFonts w:eastAsiaTheme="majorEastAsia" w:cstheme="majorBidi"/>
       <w:b/>
-      <w:color w:val="538135" w:themeColor="accent6" w:themeShade="BF"/>
+      <w:color w:val="002060"/>
       <w:sz w:val="28"/>
       <w:szCs w:val="32"/>
     </w:rPr>
@@ -3239,11 +3033,11 @@
     <w:basedOn w:val="Absatz-Standardschriftart"/>
     <w:link w:val="berschrift1"/>
     <w:uiPriority w:val="9"/>
-    <w:rsid w:val="00605776"/>
+    <w:rsid w:val="00FE4ED9"/>
     <w:rPr>
       <w:rFonts w:ascii="Arial" w:eastAsiaTheme="majorEastAsia" w:hAnsi="Arial" w:cstheme="majorBidi"/>
       <w:b/>
-      <w:color w:val="538135" w:themeColor="accent6" w:themeShade="BF"/>
+      <w:color w:val="002060"/>
       <w:sz w:val="28"/>
       <w:szCs w:val="32"/>
     </w:rPr>
@@ -3583,6 +3377,20 @@
       </w:tcPr>
     </w:tblStylePr>
   </w:style>
+  <w:style w:type="paragraph" w:customStyle="1" w:styleId="isselectedend">
+    <w:name w:val="isselectedend"/>
+    <w:basedOn w:val="Standard"/>
+    <w:rsid w:val="00FE4ED9"/>
+    <w:pPr>
+      <w:spacing w:before="100" w:beforeAutospacing="1" w:after="100" w:afterAutospacing="1" w:line="240" w:lineRule="auto"/>
+    </w:pPr>
+    <w:rPr>
+      <w:rFonts w:ascii="Times New Roman" w:eastAsia="Times New Roman" w:hAnsi="Times New Roman" w:cs="Times New Roman"/>
+      <w:sz w:val="24"/>
+      <w:szCs w:val="24"/>
+      <w:lang w:eastAsia="ja-JP"/>
+    </w:rPr>
+  </w:style>
 </w:styles>
 </file>
 
@@ -3748,6 +3556,7 @@
     <w:rsid w:val="004E098E"/>
     <w:rsid w:val="004F05FE"/>
     <w:rsid w:val="0052296B"/>
+    <w:rsid w:val="005648AA"/>
     <w:rsid w:val="005843A7"/>
     <w:rsid w:val="005C5115"/>
     <w:rsid w:val="00624014"/>
@@ -4510,15 +4319,6 @@
 </file>
 
 <file path=customXml/item1.xml><?xml version="1.0" encoding="utf-8"?>
-<?mso-contentType ?>
-<FormTemplates xmlns="http://schemas.microsoft.com/sharepoint/v3/contenttype/forms">
-  <Display>DocumentLibraryForm</Display>
-  <Edit>DocumentLibraryForm</Edit>
-  <New>DocumentLibraryForm</New>
-</FormTemplates>
-</file>
-
-<file path=customXml/item2.xml><?xml version="1.0" encoding="utf-8"?>
 <p:properties xmlns:p="http://schemas.microsoft.com/office/2006/metadata/properties" xmlns:xsi="http://www.w3.org/2001/XMLSchema-instance" xmlns:pc="http://schemas.microsoft.com/office/infopath/2007/PartnerControls">
   <documentManagement>
     <TaxCatchAll xmlns="e32c9bb7-34f5-44bb-800b-35798843376c" xsi:nil="true"/>
@@ -4529,7 +4329,20 @@
 </p:properties>
 </file>
 
+<file path=customXml/item2.xml><?xml version="1.0" encoding="utf-8"?>
+<?mso-contentType ?>
+<FormTemplates xmlns="http://schemas.microsoft.com/sharepoint/v3/contenttype/forms">
+  <Display>DocumentLibraryForm</Display>
+  <Edit>DocumentLibraryForm</Edit>
+  <New>DocumentLibraryForm</New>
+</FormTemplates>
+</file>
+
 <file path=customXml/item3.xml><?xml version="1.0" encoding="utf-8"?>
+<b:Sources xmlns:b="http://schemas.openxmlformats.org/officeDocument/2006/bibliography" xmlns="http://schemas.openxmlformats.org/officeDocument/2006/bibliography" SelectedStyle="\APASixthEditionOfficeOnline.xsl" StyleName="APA" Version="6"/>
+</file>
+
+<file path=customXml/item4.xml><?xml version="1.0" encoding="utf-8"?>
 <ct:contentTypeSchema xmlns:ct="http://schemas.microsoft.com/office/2006/metadata/contentType" xmlns:ma="http://schemas.microsoft.com/office/2006/metadata/properties/metaAttributes" ct:_="" ma:_="" ma:contentTypeName="Dokument" ma:contentTypeID="0x010100D827C1AAE83348469185F4DE8D8E42AA" ma:contentTypeVersion="18" ma:contentTypeDescription="Ein neues Dokument erstellen." ma:contentTypeScope="" ma:versionID="618348fa32be16a474572d476ed91d7d">
   <xsd:schema xmlns:xsd="http://www.w3.org/2001/XMLSchema" xmlns:xs="http://www.w3.org/2001/XMLSchema" xmlns:p="http://schemas.microsoft.com/office/2006/metadata/properties" xmlns:ns2="22aa7da5-41f5-464e-85e6-b2dd1761cd70" xmlns:ns3="e32c9bb7-34f5-44bb-800b-35798843376c" targetNamespace="http://schemas.microsoft.com/office/2006/metadata/properties" ma:root="true" ma:fieldsID="348e17a0368de80907a02c9ddfbbbd22" ns2:_="" ns3:_="">
     <xsd:import namespace="22aa7da5-41f5-464e-85e6-b2dd1761cd70"/>
@@ -4784,19 +4597,7 @@
 </ct:contentTypeSchema>
 </file>
 
-<file path=customXml/item4.xml><?xml version="1.0" encoding="utf-8"?>
-<b:Sources xmlns:b="http://schemas.openxmlformats.org/officeDocument/2006/bibliography" xmlns="http://schemas.openxmlformats.org/officeDocument/2006/bibliography" SelectedStyle="\APASixthEditionOfficeOnline.xsl" StyleName="APA" Version="6"/>
-</file>
-
 <file path=customXml/itemProps1.xml><?xml version="1.0" encoding="utf-8"?>
-<ds:datastoreItem xmlns:ds="http://schemas.openxmlformats.org/officeDocument/2006/customXml" ds:itemID="{B8133326-A9D9-4C20-AED2-57D8DB38EE3B}">
-  <ds:schemaRefs>
-    <ds:schemaRef ds:uri="http://schemas.microsoft.com/sharepoint/v3/contenttype/forms"/>
-  </ds:schemaRefs>
-</ds:datastoreItem>
-</file>
-
-<file path=customXml/itemProps2.xml><?xml version="1.0" encoding="utf-8"?>
 <ds:datastoreItem xmlns:ds="http://schemas.openxmlformats.org/officeDocument/2006/customXml" ds:itemID="{AEB5EB03-E1DB-4DE6-8456-3A44BE197CDE}">
   <ds:schemaRefs>
     <ds:schemaRef ds:uri="http://schemas.microsoft.com/office/2006/metadata/properties"/>
@@ -4807,7 +4608,23 @@
 </ds:datastoreItem>
 </file>
 
+<file path=customXml/itemProps2.xml><?xml version="1.0" encoding="utf-8"?>
+<ds:datastoreItem xmlns:ds="http://schemas.openxmlformats.org/officeDocument/2006/customXml" ds:itemID="{B8133326-A9D9-4C20-AED2-57D8DB38EE3B}">
+  <ds:schemaRefs>
+    <ds:schemaRef ds:uri="http://schemas.microsoft.com/sharepoint/v3/contenttype/forms"/>
+  </ds:schemaRefs>
+</ds:datastoreItem>
+</file>
+
 <file path=customXml/itemProps3.xml><?xml version="1.0" encoding="utf-8"?>
+<ds:datastoreItem xmlns:ds="http://schemas.openxmlformats.org/officeDocument/2006/customXml" ds:itemID="{84661881-BC85-4481-9F58-A76FBE332CB1}">
+  <ds:schemaRefs>
+    <ds:schemaRef ds:uri="http://schemas.openxmlformats.org/officeDocument/2006/bibliography"/>
+  </ds:schemaRefs>
+</ds:datastoreItem>
+</file>
+
+<file path=customXml/itemProps4.xml><?xml version="1.0" encoding="utf-8"?>
 <ds:datastoreItem xmlns:ds="http://schemas.openxmlformats.org/officeDocument/2006/customXml" ds:itemID="{60D544C4-8D4D-481D-B00F-1F09332EE222}">
   <ds:schemaRefs>
     <ds:schemaRef ds:uri="http://schemas.microsoft.com/office/2006/metadata/contentType"/>
@@ -4824,12 +4641,4 @@
     <ds:schemaRef ds:uri="http://schemas.microsoft.com/internal/obd"/>
   </ds:schemaRefs>
 </ds:datastoreItem>
-</file>
-
-<file path=customXml/itemProps4.xml><?xml version="1.0" encoding="utf-8"?>
-<ds:datastoreItem xmlns:ds="http://schemas.openxmlformats.org/officeDocument/2006/customXml" ds:itemID="{84661881-BC85-4481-9F58-A76FBE332CB1}">
-  <ds:schemaRefs>
-    <ds:schemaRef ds:uri="http://schemas.openxmlformats.org/officeDocument/2006/bibliography"/>
-  </ds:schemaRefs>
-</ds:datastoreItem>
 </file>
</xml_diff>

<commit_message>
Doku weiter geschrieben, HMI-Mockup erstelt und Aufwandsübersicht ausgefüllt
</commit_message>
<xml_diff>
--- a/Doc/Aufgabenstellung/Dokumentation/Case Study Doku.docx
+++ b/Doc/Aufgabenstellung/Dokumentation/Case Study Doku.docx
@@ -539,7 +539,7 @@
           <w:rFonts w:cs="Arial"/>
           <w:b/>
           <w:bCs/>
-          <w:color w:val="538135" w:themeColor="accent6" w:themeShade="BF"/>
+          <w:color w:val="002060"/>
           <w:sz w:val="28"/>
           <w:szCs w:val="28"/>
         </w:rPr>
@@ -549,7 +549,7 @@
           <w:rFonts w:cs="Arial"/>
           <w:b/>
           <w:bCs/>
-          <w:color w:val="538135" w:themeColor="accent6" w:themeShade="BF"/>
+          <w:color w:val="002060"/>
           <w:sz w:val="28"/>
           <w:szCs w:val="28"/>
         </w:rPr>
@@ -561,7 +561,7 @@
           <w:rFonts w:cs="Arial"/>
           <w:b/>
           <w:bCs/>
-          <w:color w:val="538135" w:themeColor="accent6" w:themeShade="BF"/>
+          <w:color w:val="002060"/>
           <w:sz w:val="28"/>
           <w:szCs w:val="28"/>
         </w:rPr>
@@ -616,15 +616,9 @@
         <w:p>
           <w:pPr>
             <w:pStyle w:val="Inhaltsverzeichnisberschrift"/>
-            <w:rPr>
-              <w:b/>
-              <w:bCs/>
-            </w:rPr>
           </w:pPr>
           <w:r>
             <w:rPr>
-              <w:b/>
-              <w:bCs/>
               <w:lang w:val="de-DE"/>
             </w:rPr>
             <w:t>Inhalt</w:t>
@@ -656,7 +650,7 @@
           <w:r>
             <w:fldChar w:fldCharType="separate"/>
           </w:r>
-          <w:hyperlink w:anchor="_Toc231318002" w:history="1">
+          <w:hyperlink w:anchor="_Toc231874426" w:history="1">
             <w:r>
               <w:rPr>
                 <w:rStyle w:val="Hyperlink"/>
@@ -702,7 +696,7 @@
                 <w:noProof/>
                 <w:webHidden/>
               </w:rPr>
-              <w:instrText xml:space="preserve"> PAGEREF _Toc231318002 \h </w:instrText>
+              <w:instrText xml:space="preserve"> PAGEREF _Toc231874426 \h </w:instrText>
             </w:r>
             <w:r>
               <w:rPr>
@@ -750,7 +744,7 @@
               <w14:ligatures w14:val="standardContextual"/>
             </w:rPr>
           </w:pPr>
-          <w:hyperlink w:anchor="_Toc231318003" w:history="1">
+          <w:hyperlink w:anchor="_Toc231874427" w:history="1">
             <w:r>
               <w:rPr>
                 <w:rStyle w:val="Hyperlink"/>
@@ -796,7 +790,7 @@
                 <w:noProof/>
                 <w:webHidden/>
               </w:rPr>
-              <w:instrText xml:space="preserve"> PAGEREF _Toc231318003 \h </w:instrText>
+              <w:instrText xml:space="preserve"> PAGEREF _Toc231874427 \h </w:instrText>
             </w:r>
             <w:r>
               <w:rPr>
@@ -844,7 +838,7 @@
               <w14:ligatures w14:val="standardContextual"/>
             </w:rPr>
           </w:pPr>
-          <w:hyperlink w:anchor="_Toc231318004" w:history="1">
+          <w:hyperlink w:anchor="_Toc231874428" w:history="1">
             <w:r>
               <w:rPr>
                 <w:rStyle w:val="Hyperlink"/>
@@ -890,7 +884,7 @@
                 <w:noProof/>
                 <w:webHidden/>
               </w:rPr>
-              <w:instrText xml:space="preserve"> PAGEREF _Toc231318004 \h </w:instrText>
+              <w:instrText xml:space="preserve"> PAGEREF _Toc231874428 \h </w:instrText>
             </w:r>
             <w:r>
               <w:rPr>
@@ -938,7 +932,7 @@
               <w14:ligatures w14:val="standardContextual"/>
             </w:rPr>
           </w:pPr>
-          <w:hyperlink w:anchor="_Toc231318005" w:history="1">
+          <w:hyperlink w:anchor="_Toc231874429" w:history="1">
             <w:r>
               <w:rPr>
                 <w:rStyle w:val="Hyperlink"/>
@@ -984,7 +978,7 @@
                 <w:noProof/>
                 <w:webHidden/>
               </w:rPr>
-              <w:instrText xml:space="preserve"> PAGEREF _Toc231318005 \h </w:instrText>
+              <w:instrText xml:space="preserve"> PAGEREF _Toc231874429 \h </w:instrText>
             </w:r>
             <w:r>
               <w:rPr>
@@ -1005,6 +999,664 @@
                 <w:webHidden/>
               </w:rPr>
               <w:t>2</w:t>
+            </w:r>
+            <w:r>
+              <w:rPr>
+                <w:noProof/>
+                <w:webHidden/>
+              </w:rPr>
+              <w:fldChar w:fldCharType="end"/>
+            </w:r>
+          </w:hyperlink>
+        </w:p>
+        <w:p>
+          <w:pPr>
+            <w:pStyle w:val="Verzeichnis1"/>
+            <w:tabs>
+              <w:tab w:val="left" w:pos="480"/>
+              <w:tab w:val="right" w:leader="dot" w:pos="9628"/>
+            </w:tabs>
+            <w:rPr>
+              <w:rFonts w:asciiTheme="minorHAnsi" w:eastAsiaTheme="minorEastAsia" w:hAnsiTheme="minorHAnsi"/>
+              <w:noProof/>
+              <w:kern w:val="2"/>
+              <w:sz w:val="24"/>
+              <w:szCs w:val="24"/>
+              <w:lang w:eastAsia="ja-JP"/>
+              <w14:ligatures w14:val="standardContextual"/>
+            </w:rPr>
+          </w:pPr>
+          <w:hyperlink w:anchor="_Toc231874430" w:history="1">
+            <w:r>
+              <w:rPr>
+                <w:rStyle w:val="Hyperlink"/>
+                <w:noProof/>
+              </w:rPr>
+              <w:t>3.</w:t>
+            </w:r>
+            <w:r>
+              <w:rPr>
+                <w:rFonts w:asciiTheme="minorHAnsi" w:eastAsiaTheme="minorEastAsia" w:hAnsiTheme="minorHAnsi"/>
+                <w:noProof/>
+                <w:kern w:val="2"/>
+                <w:sz w:val="24"/>
+                <w:szCs w:val="24"/>
+                <w:lang w:eastAsia="ja-JP"/>
+                <w14:ligatures w14:val="standardContextual"/>
+              </w:rPr>
+              <w:tab/>
+            </w:r>
+            <w:r>
+              <w:rPr>
+                <w:rStyle w:val="Hyperlink"/>
+                <w:noProof/>
+              </w:rPr>
+              <w:t>Planen und Konzipieren</w:t>
+            </w:r>
+            <w:r>
+              <w:rPr>
+                <w:noProof/>
+                <w:webHidden/>
+              </w:rPr>
+              <w:tab/>
+            </w:r>
+            <w:r>
+              <w:rPr>
+                <w:noProof/>
+                <w:webHidden/>
+              </w:rPr>
+              <w:fldChar w:fldCharType="begin"/>
+            </w:r>
+            <w:r>
+              <w:rPr>
+                <w:noProof/>
+                <w:webHidden/>
+              </w:rPr>
+              <w:instrText xml:space="preserve"> PAGEREF _Toc231874430 \h </w:instrText>
+            </w:r>
+            <w:r>
+              <w:rPr>
+                <w:noProof/>
+                <w:webHidden/>
+              </w:rPr>
+            </w:r>
+            <w:r>
+              <w:rPr>
+                <w:noProof/>
+                <w:webHidden/>
+              </w:rPr>
+              <w:fldChar w:fldCharType="separate"/>
+            </w:r>
+            <w:r>
+              <w:rPr>
+                <w:noProof/>
+                <w:webHidden/>
+              </w:rPr>
+              <w:t>3</w:t>
+            </w:r>
+            <w:r>
+              <w:rPr>
+                <w:noProof/>
+                <w:webHidden/>
+              </w:rPr>
+              <w:fldChar w:fldCharType="end"/>
+            </w:r>
+          </w:hyperlink>
+        </w:p>
+        <w:p>
+          <w:pPr>
+            <w:pStyle w:val="Verzeichnis2"/>
+            <w:tabs>
+              <w:tab w:val="left" w:pos="960"/>
+              <w:tab w:val="right" w:leader="dot" w:pos="9628"/>
+            </w:tabs>
+            <w:rPr>
+              <w:rFonts w:asciiTheme="minorHAnsi" w:eastAsiaTheme="minorEastAsia" w:hAnsiTheme="minorHAnsi"/>
+              <w:noProof/>
+              <w:kern w:val="2"/>
+              <w:sz w:val="24"/>
+              <w:szCs w:val="24"/>
+              <w:lang w:eastAsia="ja-JP"/>
+              <w14:ligatures w14:val="standardContextual"/>
+            </w:rPr>
+          </w:pPr>
+          <w:hyperlink w:anchor="_Toc231874431" w:history="1">
+            <w:r>
+              <w:rPr>
+                <w:rStyle w:val="Hyperlink"/>
+                <w:noProof/>
+              </w:rPr>
+              <w:t>3.1.</w:t>
+            </w:r>
+            <w:r>
+              <w:rPr>
+                <w:rFonts w:asciiTheme="minorHAnsi" w:eastAsiaTheme="minorEastAsia" w:hAnsiTheme="minorHAnsi"/>
+                <w:noProof/>
+                <w:kern w:val="2"/>
+                <w:sz w:val="24"/>
+                <w:szCs w:val="24"/>
+                <w:lang w:eastAsia="ja-JP"/>
+                <w14:ligatures w14:val="standardContextual"/>
+              </w:rPr>
+              <w:tab/>
+            </w:r>
+            <w:r>
+              <w:rPr>
+                <w:rStyle w:val="Hyperlink"/>
+                <w:noProof/>
+              </w:rPr>
+              <w:t>Flussdiagramm</w:t>
+            </w:r>
+            <w:r>
+              <w:rPr>
+                <w:noProof/>
+                <w:webHidden/>
+              </w:rPr>
+              <w:tab/>
+            </w:r>
+            <w:r>
+              <w:rPr>
+                <w:noProof/>
+                <w:webHidden/>
+              </w:rPr>
+              <w:fldChar w:fldCharType="begin"/>
+            </w:r>
+            <w:r>
+              <w:rPr>
+                <w:noProof/>
+                <w:webHidden/>
+              </w:rPr>
+              <w:instrText xml:space="preserve"> PAGEREF _Toc231874431 \h </w:instrText>
+            </w:r>
+            <w:r>
+              <w:rPr>
+                <w:noProof/>
+                <w:webHidden/>
+              </w:rPr>
+            </w:r>
+            <w:r>
+              <w:rPr>
+                <w:noProof/>
+                <w:webHidden/>
+              </w:rPr>
+              <w:fldChar w:fldCharType="separate"/>
+            </w:r>
+            <w:r>
+              <w:rPr>
+                <w:noProof/>
+                <w:webHidden/>
+              </w:rPr>
+              <w:t>3</w:t>
+            </w:r>
+            <w:r>
+              <w:rPr>
+                <w:noProof/>
+                <w:webHidden/>
+              </w:rPr>
+              <w:fldChar w:fldCharType="end"/>
+            </w:r>
+          </w:hyperlink>
+        </w:p>
+        <w:p>
+          <w:pPr>
+            <w:pStyle w:val="Verzeichnis2"/>
+            <w:tabs>
+              <w:tab w:val="left" w:pos="960"/>
+              <w:tab w:val="right" w:leader="dot" w:pos="9628"/>
+            </w:tabs>
+            <w:rPr>
+              <w:rFonts w:asciiTheme="minorHAnsi" w:eastAsiaTheme="minorEastAsia" w:hAnsiTheme="minorHAnsi"/>
+              <w:noProof/>
+              <w:kern w:val="2"/>
+              <w:sz w:val="24"/>
+              <w:szCs w:val="24"/>
+              <w:lang w:eastAsia="ja-JP"/>
+              <w14:ligatures w14:val="standardContextual"/>
+            </w:rPr>
+          </w:pPr>
+          <w:hyperlink w:anchor="_Toc231874432" w:history="1">
+            <w:r>
+              <w:rPr>
+                <w:rStyle w:val="Hyperlink"/>
+                <w:noProof/>
+              </w:rPr>
+              <w:t>3.2.</w:t>
+            </w:r>
+            <w:r>
+              <w:rPr>
+                <w:rFonts w:asciiTheme="minorHAnsi" w:eastAsiaTheme="minorEastAsia" w:hAnsiTheme="minorHAnsi"/>
+                <w:noProof/>
+                <w:kern w:val="2"/>
+                <w:sz w:val="24"/>
+                <w:szCs w:val="24"/>
+                <w:lang w:eastAsia="ja-JP"/>
+                <w14:ligatures w14:val="standardContextual"/>
+              </w:rPr>
+              <w:tab/>
+            </w:r>
+            <w:r>
+              <w:rPr>
+                <w:rStyle w:val="Hyperlink"/>
+                <w:noProof/>
+              </w:rPr>
+              <w:t>Zustandsautomat</w:t>
+            </w:r>
+            <w:r>
+              <w:rPr>
+                <w:noProof/>
+                <w:webHidden/>
+              </w:rPr>
+              <w:tab/>
+            </w:r>
+            <w:r>
+              <w:rPr>
+                <w:noProof/>
+                <w:webHidden/>
+              </w:rPr>
+              <w:fldChar w:fldCharType="begin"/>
+            </w:r>
+            <w:r>
+              <w:rPr>
+                <w:noProof/>
+                <w:webHidden/>
+              </w:rPr>
+              <w:instrText xml:space="preserve"> PAGEREF _Toc231874432 \h </w:instrText>
+            </w:r>
+            <w:r>
+              <w:rPr>
+                <w:noProof/>
+                <w:webHidden/>
+              </w:rPr>
+            </w:r>
+            <w:r>
+              <w:rPr>
+                <w:noProof/>
+                <w:webHidden/>
+              </w:rPr>
+              <w:fldChar w:fldCharType="separate"/>
+            </w:r>
+            <w:r>
+              <w:rPr>
+                <w:noProof/>
+                <w:webHidden/>
+              </w:rPr>
+              <w:t>5</w:t>
+            </w:r>
+            <w:r>
+              <w:rPr>
+                <w:noProof/>
+                <w:webHidden/>
+              </w:rPr>
+              <w:fldChar w:fldCharType="end"/>
+            </w:r>
+          </w:hyperlink>
+        </w:p>
+        <w:p>
+          <w:pPr>
+            <w:pStyle w:val="Verzeichnis2"/>
+            <w:tabs>
+              <w:tab w:val="left" w:pos="960"/>
+              <w:tab w:val="right" w:leader="dot" w:pos="9628"/>
+            </w:tabs>
+            <w:rPr>
+              <w:rFonts w:asciiTheme="minorHAnsi" w:eastAsiaTheme="minorEastAsia" w:hAnsiTheme="minorHAnsi"/>
+              <w:noProof/>
+              <w:kern w:val="2"/>
+              <w:sz w:val="24"/>
+              <w:szCs w:val="24"/>
+              <w:lang w:eastAsia="ja-JP"/>
+              <w14:ligatures w14:val="standardContextual"/>
+            </w:rPr>
+          </w:pPr>
+          <w:hyperlink w:anchor="_Toc231874433" w:history="1">
+            <w:r>
+              <w:rPr>
+                <w:rStyle w:val="Hyperlink"/>
+                <w:noProof/>
+              </w:rPr>
+              <w:t>3.3.</w:t>
+            </w:r>
+            <w:r>
+              <w:rPr>
+                <w:rFonts w:asciiTheme="minorHAnsi" w:eastAsiaTheme="minorEastAsia" w:hAnsiTheme="minorHAnsi"/>
+                <w:noProof/>
+                <w:kern w:val="2"/>
+                <w:sz w:val="24"/>
+                <w:szCs w:val="24"/>
+                <w:lang w:eastAsia="ja-JP"/>
+                <w14:ligatures w14:val="standardContextual"/>
+              </w:rPr>
+              <w:tab/>
+            </w:r>
+            <w:r>
+              <w:rPr>
+                <w:rStyle w:val="Hyperlink"/>
+                <w:noProof/>
+              </w:rPr>
+              <w:t>Architektur der Steuerung</w:t>
+            </w:r>
+            <w:r>
+              <w:rPr>
+                <w:noProof/>
+                <w:webHidden/>
+              </w:rPr>
+              <w:tab/>
+            </w:r>
+            <w:r>
+              <w:rPr>
+                <w:noProof/>
+                <w:webHidden/>
+              </w:rPr>
+              <w:fldChar w:fldCharType="begin"/>
+            </w:r>
+            <w:r>
+              <w:rPr>
+                <w:noProof/>
+                <w:webHidden/>
+              </w:rPr>
+              <w:instrText xml:space="preserve"> PAGEREF _Toc231874433 \h </w:instrText>
+            </w:r>
+            <w:r>
+              <w:rPr>
+                <w:noProof/>
+                <w:webHidden/>
+              </w:rPr>
+            </w:r>
+            <w:r>
+              <w:rPr>
+                <w:noProof/>
+                <w:webHidden/>
+              </w:rPr>
+              <w:fldChar w:fldCharType="separate"/>
+            </w:r>
+            <w:r>
+              <w:rPr>
+                <w:noProof/>
+                <w:webHidden/>
+              </w:rPr>
+              <w:t>6</w:t>
+            </w:r>
+            <w:r>
+              <w:rPr>
+                <w:noProof/>
+                <w:webHidden/>
+              </w:rPr>
+              <w:fldChar w:fldCharType="end"/>
+            </w:r>
+          </w:hyperlink>
+        </w:p>
+        <w:p>
+          <w:pPr>
+            <w:pStyle w:val="Verzeichnis2"/>
+            <w:tabs>
+              <w:tab w:val="left" w:pos="960"/>
+              <w:tab w:val="right" w:leader="dot" w:pos="9628"/>
+            </w:tabs>
+            <w:rPr>
+              <w:rFonts w:asciiTheme="minorHAnsi" w:eastAsiaTheme="minorEastAsia" w:hAnsiTheme="minorHAnsi"/>
+              <w:noProof/>
+              <w:kern w:val="2"/>
+              <w:sz w:val="24"/>
+              <w:szCs w:val="24"/>
+              <w:lang w:eastAsia="ja-JP"/>
+              <w14:ligatures w14:val="standardContextual"/>
+            </w:rPr>
+          </w:pPr>
+          <w:hyperlink w:anchor="_Toc231874434" w:history="1">
+            <w:r>
+              <w:rPr>
+                <w:rStyle w:val="Hyperlink"/>
+                <w:noProof/>
+              </w:rPr>
+              <w:t>3.4.</w:t>
+            </w:r>
+            <w:r>
+              <w:rPr>
+                <w:rFonts w:asciiTheme="minorHAnsi" w:eastAsiaTheme="minorEastAsia" w:hAnsiTheme="minorHAnsi"/>
+                <w:noProof/>
+                <w:kern w:val="2"/>
+                <w:sz w:val="24"/>
+                <w:szCs w:val="24"/>
+                <w:lang w:eastAsia="ja-JP"/>
+                <w14:ligatures w14:val="standardContextual"/>
+              </w:rPr>
+              <w:tab/>
+            </w:r>
+            <w:r>
+              <w:rPr>
+                <w:rStyle w:val="Hyperlink"/>
+                <w:noProof/>
+              </w:rPr>
+              <w:t>HMI-Konzept</w:t>
+            </w:r>
+            <w:r>
+              <w:rPr>
+                <w:noProof/>
+                <w:webHidden/>
+              </w:rPr>
+              <w:tab/>
+            </w:r>
+            <w:r>
+              <w:rPr>
+                <w:noProof/>
+                <w:webHidden/>
+              </w:rPr>
+              <w:fldChar w:fldCharType="begin"/>
+            </w:r>
+            <w:r>
+              <w:rPr>
+                <w:noProof/>
+                <w:webHidden/>
+              </w:rPr>
+              <w:instrText xml:space="preserve"> PAGEREF _Toc231874434 \h </w:instrText>
+            </w:r>
+            <w:r>
+              <w:rPr>
+                <w:noProof/>
+                <w:webHidden/>
+              </w:rPr>
+            </w:r>
+            <w:r>
+              <w:rPr>
+                <w:noProof/>
+                <w:webHidden/>
+              </w:rPr>
+              <w:fldChar w:fldCharType="separate"/>
+            </w:r>
+            <w:r>
+              <w:rPr>
+                <w:noProof/>
+                <w:webHidden/>
+              </w:rPr>
+              <w:t>7</w:t>
+            </w:r>
+            <w:r>
+              <w:rPr>
+                <w:noProof/>
+                <w:webHidden/>
+              </w:rPr>
+              <w:fldChar w:fldCharType="end"/>
+            </w:r>
+          </w:hyperlink>
+        </w:p>
+        <w:p>
+          <w:pPr>
+            <w:pStyle w:val="Verzeichnis2"/>
+            <w:tabs>
+              <w:tab w:val="left" w:pos="960"/>
+              <w:tab w:val="right" w:leader="dot" w:pos="9628"/>
+            </w:tabs>
+            <w:rPr>
+              <w:rFonts w:asciiTheme="minorHAnsi" w:eastAsiaTheme="minorEastAsia" w:hAnsiTheme="minorHAnsi"/>
+              <w:noProof/>
+              <w:kern w:val="2"/>
+              <w:sz w:val="24"/>
+              <w:szCs w:val="24"/>
+              <w:lang w:eastAsia="ja-JP"/>
+              <w14:ligatures w14:val="standardContextual"/>
+            </w:rPr>
+          </w:pPr>
+          <w:hyperlink w:anchor="_Toc231874435" w:history="1">
+            <w:r>
+              <w:rPr>
+                <w:rStyle w:val="Hyperlink"/>
+                <w:noProof/>
+              </w:rPr>
+              <w:t>3.5.</w:t>
+            </w:r>
+            <w:r>
+              <w:rPr>
+                <w:rFonts w:asciiTheme="minorHAnsi" w:eastAsiaTheme="minorEastAsia" w:hAnsiTheme="minorHAnsi"/>
+                <w:noProof/>
+                <w:kern w:val="2"/>
+                <w:sz w:val="24"/>
+                <w:szCs w:val="24"/>
+                <w:lang w:eastAsia="ja-JP"/>
+                <w14:ligatures w14:val="standardContextual"/>
+              </w:rPr>
+              <w:tab/>
+            </w:r>
+            <w:r>
+              <w:rPr>
+                <w:rStyle w:val="Hyperlink"/>
+                <w:noProof/>
+              </w:rPr>
+              <w:t>Geplante Programmstruktur</w:t>
+            </w:r>
+            <w:r>
+              <w:rPr>
+                <w:noProof/>
+                <w:webHidden/>
+              </w:rPr>
+              <w:tab/>
+            </w:r>
+            <w:r>
+              <w:rPr>
+                <w:noProof/>
+                <w:webHidden/>
+              </w:rPr>
+              <w:fldChar w:fldCharType="begin"/>
+            </w:r>
+            <w:r>
+              <w:rPr>
+                <w:noProof/>
+                <w:webHidden/>
+              </w:rPr>
+              <w:instrText xml:space="preserve"> PAGEREF _Toc231874435 \h </w:instrText>
+            </w:r>
+            <w:r>
+              <w:rPr>
+                <w:noProof/>
+                <w:webHidden/>
+              </w:rPr>
+            </w:r>
+            <w:r>
+              <w:rPr>
+                <w:noProof/>
+                <w:webHidden/>
+              </w:rPr>
+              <w:fldChar w:fldCharType="separate"/>
+            </w:r>
+            <w:r>
+              <w:rPr>
+                <w:noProof/>
+                <w:webHidden/>
+              </w:rPr>
+              <w:t>8</w:t>
+            </w:r>
+            <w:r>
+              <w:rPr>
+                <w:noProof/>
+                <w:webHidden/>
+              </w:rPr>
+              <w:fldChar w:fldCharType="end"/>
+            </w:r>
+          </w:hyperlink>
+        </w:p>
+        <w:p>
+          <w:pPr>
+            <w:pStyle w:val="Verzeichnis1"/>
+            <w:tabs>
+              <w:tab w:val="left" w:pos="480"/>
+              <w:tab w:val="right" w:leader="dot" w:pos="9628"/>
+            </w:tabs>
+            <w:rPr>
+              <w:rFonts w:asciiTheme="minorHAnsi" w:eastAsiaTheme="minorEastAsia" w:hAnsiTheme="minorHAnsi"/>
+              <w:noProof/>
+              <w:kern w:val="2"/>
+              <w:sz w:val="24"/>
+              <w:szCs w:val="24"/>
+              <w:lang w:eastAsia="ja-JP"/>
+              <w14:ligatures w14:val="standardContextual"/>
+            </w:rPr>
+          </w:pPr>
+          <w:hyperlink w:anchor="_Toc231874436" w:history="1">
+            <w:r>
+              <w:rPr>
+                <w:rStyle w:val="Hyperlink"/>
+                <w:noProof/>
+              </w:rPr>
+              <w:t>4.</w:t>
+            </w:r>
+            <w:r>
+              <w:rPr>
+                <w:rFonts w:asciiTheme="minorHAnsi" w:eastAsiaTheme="minorEastAsia" w:hAnsiTheme="minorHAnsi"/>
+                <w:noProof/>
+                <w:kern w:val="2"/>
+                <w:sz w:val="24"/>
+                <w:szCs w:val="24"/>
+                <w:lang w:eastAsia="ja-JP"/>
+                <w14:ligatures w14:val="standardContextual"/>
+              </w:rPr>
+              <w:tab/>
+            </w:r>
+            <w:r>
+              <w:rPr>
+                <w:rStyle w:val="Hyperlink"/>
+                <w:noProof/>
+              </w:rPr>
+              <w:t>Umsetzung</w:t>
+            </w:r>
+            <w:r>
+              <w:rPr>
+                <w:noProof/>
+                <w:webHidden/>
+              </w:rPr>
+              <w:tab/>
+            </w:r>
+            <w:r>
+              <w:rPr>
+                <w:noProof/>
+                <w:webHidden/>
+              </w:rPr>
+              <w:fldChar w:fldCharType="begin"/>
+            </w:r>
+            <w:r>
+              <w:rPr>
+                <w:noProof/>
+                <w:webHidden/>
+              </w:rPr>
+              <w:instrText xml:space="preserve"> PAGEREF _Toc231874436 \h </w:instrText>
+            </w:r>
+            <w:r>
+              <w:rPr>
+                <w:noProof/>
+                <w:webHidden/>
+              </w:rPr>
+            </w:r>
+            <w:r>
+              <w:rPr>
+                <w:noProof/>
+                <w:webHidden/>
+              </w:rPr>
+              <w:fldChar w:fldCharType="separate"/>
+            </w:r>
+            <w:r>
+              <w:rPr>
+                <w:noProof/>
+                <w:webHidden/>
+              </w:rPr>
+              <w:t>8</w:t>
             </w:r>
             <w:r>
               <w:rPr>
@@ -1031,13 +1683,13 @@
               <w14:ligatures w14:val="standardContextual"/>
             </w:rPr>
           </w:pPr>
-          <w:hyperlink w:anchor="_Toc231318006" w:history="1">
+          <w:hyperlink w:anchor="_Toc231874437" w:history="1">
             <w:r>
               <w:rPr>
                 <w:rStyle w:val="Hyperlink"/>
                 <w:noProof/>
               </w:rPr>
-              <w:t>Selbständigkeitserklärung</w:t>
+              <w:t>Aufwandsübersicht</w:t>
             </w:r>
             <w:r>
               <w:rPr>
@@ -1058,7 +1710,7 @@
                 <w:noProof/>
                 <w:webHidden/>
               </w:rPr>
-              <w:instrText xml:space="preserve"> PAGEREF _Toc231318006 \h </w:instrText>
+              <w:instrText xml:space="preserve"> PAGEREF _Toc231874437 \h </w:instrText>
             </w:r>
             <w:r>
               <w:rPr>
@@ -1078,7 +1730,7 @@
                 <w:noProof/>
                 <w:webHidden/>
               </w:rPr>
-              <w:t>4</w:t>
+              <w:t>9</w:t>
             </w:r>
             <w:r>
               <w:rPr>
@@ -1105,13 +1757,13 @@
               <w14:ligatures w14:val="standardContextual"/>
             </w:rPr>
           </w:pPr>
-          <w:hyperlink w:anchor="_Toc231318007" w:history="1">
+          <w:hyperlink w:anchor="_Toc231874438" w:history="1">
             <w:r>
               <w:rPr>
                 <w:rStyle w:val="Hyperlink"/>
                 <w:noProof/>
               </w:rPr>
-              <w:t>Quellenverzeichnis</w:t>
+              <w:t>Selbständigkeitserklärung</w:t>
             </w:r>
             <w:r>
               <w:rPr>
@@ -1132,7 +1784,7 @@
                 <w:noProof/>
                 <w:webHidden/>
               </w:rPr>
-              <w:instrText xml:space="preserve"> PAGEREF _Toc231318007 \h </w:instrText>
+              <w:instrText xml:space="preserve"> PAGEREF _Toc231874438 \h </w:instrText>
             </w:r>
             <w:r>
               <w:rPr>
@@ -1152,7 +1804,7 @@
                 <w:noProof/>
                 <w:webHidden/>
               </w:rPr>
-              <w:t>5</w:t>
+              <w:t>10</w:t>
             </w:r>
             <w:r>
               <w:rPr>
@@ -1179,12 +1831,160 @@
               <w14:ligatures w14:val="standardContextual"/>
             </w:rPr>
           </w:pPr>
-          <w:hyperlink w:anchor="_Toc231318008" w:history="1">
+          <w:hyperlink w:anchor="_Toc231874439" w:history="1">
             <w:r>
               <w:rPr>
                 <w:rStyle w:val="Hyperlink"/>
                 <w:noProof/>
               </w:rPr>
+              <w:t>Abbildungsverzeichnis</w:t>
+            </w:r>
+            <w:r>
+              <w:rPr>
+                <w:noProof/>
+                <w:webHidden/>
+              </w:rPr>
+              <w:tab/>
+            </w:r>
+            <w:r>
+              <w:rPr>
+                <w:noProof/>
+                <w:webHidden/>
+              </w:rPr>
+              <w:fldChar w:fldCharType="begin"/>
+            </w:r>
+            <w:r>
+              <w:rPr>
+                <w:noProof/>
+                <w:webHidden/>
+              </w:rPr>
+              <w:instrText xml:space="preserve"> PAGEREF _Toc231874439 \h </w:instrText>
+            </w:r>
+            <w:r>
+              <w:rPr>
+                <w:noProof/>
+                <w:webHidden/>
+              </w:rPr>
+            </w:r>
+            <w:r>
+              <w:rPr>
+                <w:noProof/>
+                <w:webHidden/>
+              </w:rPr>
+              <w:fldChar w:fldCharType="separate"/>
+            </w:r>
+            <w:r>
+              <w:rPr>
+                <w:noProof/>
+                <w:webHidden/>
+              </w:rPr>
+              <w:t>11</w:t>
+            </w:r>
+            <w:r>
+              <w:rPr>
+                <w:noProof/>
+                <w:webHidden/>
+              </w:rPr>
+              <w:fldChar w:fldCharType="end"/>
+            </w:r>
+          </w:hyperlink>
+        </w:p>
+        <w:p>
+          <w:pPr>
+            <w:pStyle w:val="Verzeichnis1"/>
+            <w:tabs>
+              <w:tab w:val="right" w:leader="dot" w:pos="9628"/>
+            </w:tabs>
+            <w:rPr>
+              <w:rFonts w:asciiTheme="minorHAnsi" w:eastAsiaTheme="minorEastAsia" w:hAnsiTheme="minorHAnsi"/>
+              <w:noProof/>
+              <w:kern w:val="2"/>
+              <w:sz w:val="24"/>
+              <w:szCs w:val="24"/>
+              <w:lang w:eastAsia="ja-JP"/>
+              <w14:ligatures w14:val="standardContextual"/>
+            </w:rPr>
+          </w:pPr>
+          <w:hyperlink w:anchor="_Toc231874440" w:history="1">
+            <w:r>
+              <w:rPr>
+                <w:rStyle w:val="Hyperlink"/>
+                <w:noProof/>
+              </w:rPr>
+              <w:t>Quellenverzeichnis</w:t>
+            </w:r>
+            <w:r>
+              <w:rPr>
+                <w:noProof/>
+                <w:webHidden/>
+              </w:rPr>
+              <w:tab/>
+            </w:r>
+            <w:r>
+              <w:rPr>
+                <w:noProof/>
+                <w:webHidden/>
+              </w:rPr>
+              <w:fldChar w:fldCharType="begin"/>
+            </w:r>
+            <w:r>
+              <w:rPr>
+                <w:noProof/>
+                <w:webHidden/>
+              </w:rPr>
+              <w:instrText xml:space="preserve"> PAGEREF _Toc231874440 \h </w:instrText>
+            </w:r>
+            <w:r>
+              <w:rPr>
+                <w:noProof/>
+                <w:webHidden/>
+              </w:rPr>
+            </w:r>
+            <w:r>
+              <w:rPr>
+                <w:noProof/>
+                <w:webHidden/>
+              </w:rPr>
+              <w:fldChar w:fldCharType="separate"/>
+            </w:r>
+            <w:r>
+              <w:rPr>
+                <w:noProof/>
+                <w:webHidden/>
+              </w:rPr>
+              <w:t>12</w:t>
+            </w:r>
+            <w:r>
+              <w:rPr>
+                <w:noProof/>
+                <w:webHidden/>
+              </w:rPr>
+              <w:fldChar w:fldCharType="end"/>
+            </w:r>
+          </w:hyperlink>
+        </w:p>
+        <w:p>
+          <w:pPr>
+            <w:pStyle w:val="Verzeichnis1"/>
+            <w:tabs>
+              <w:tab w:val="right" w:leader="dot" w:pos="9628"/>
+            </w:tabs>
+            <w:rPr>
+              <w:rFonts w:asciiTheme="minorHAnsi" w:eastAsiaTheme="minorEastAsia" w:hAnsiTheme="minorHAnsi"/>
+              <w:noProof/>
+              <w:kern w:val="2"/>
+              <w:sz w:val="24"/>
+              <w:szCs w:val="24"/>
+              <w:lang w:eastAsia="ja-JP"/>
+              <w14:ligatures w14:val="standardContextual"/>
+            </w:rPr>
+          </w:pPr>
+          <w:hyperlink w:anchor="_Toc231874441" w:history="1">
+            <w:r>
+              <w:rPr>
+                <w:rStyle w:val="Hyperlink"/>
+                <w:noProof/>
+              </w:rPr>
               <w:t>Einsatz von KI-Tools</w:t>
             </w:r>
             <w:r>
@@ -1206,7 +2006,7 @@
                 <w:noProof/>
                 <w:webHidden/>
               </w:rPr>
-              <w:instrText xml:space="preserve"> PAGEREF _Toc231318008 \h </w:instrText>
+              <w:instrText xml:space="preserve"> PAGEREF _Toc231874441 \h </w:instrText>
             </w:r>
             <w:r>
               <w:rPr>
@@ -1226,7 +2026,81 @@
                 <w:noProof/>
                 <w:webHidden/>
               </w:rPr>
-              <w:t>5</w:t>
+              <w:t>13</w:t>
+            </w:r>
+            <w:r>
+              <w:rPr>
+                <w:noProof/>
+                <w:webHidden/>
+              </w:rPr>
+              <w:fldChar w:fldCharType="end"/>
+            </w:r>
+          </w:hyperlink>
+        </w:p>
+        <w:p>
+          <w:pPr>
+            <w:pStyle w:val="Verzeichnis1"/>
+            <w:tabs>
+              <w:tab w:val="right" w:leader="dot" w:pos="9628"/>
+            </w:tabs>
+            <w:rPr>
+              <w:rFonts w:asciiTheme="minorHAnsi" w:eastAsiaTheme="minorEastAsia" w:hAnsiTheme="minorHAnsi"/>
+              <w:noProof/>
+              <w:kern w:val="2"/>
+              <w:sz w:val="24"/>
+              <w:szCs w:val="24"/>
+              <w:lang w:eastAsia="ja-JP"/>
+              <w14:ligatures w14:val="standardContextual"/>
+            </w:rPr>
+          </w:pPr>
+          <w:hyperlink w:anchor="_Toc231874442" w:history="1">
+            <w:r>
+              <w:rPr>
+                <w:rStyle w:val="Hyperlink"/>
+                <w:noProof/>
+              </w:rPr>
+              <w:t>Verwendete KI-Prompts</w:t>
+            </w:r>
+            <w:r>
+              <w:rPr>
+                <w:noProof/>
+                <w:webHidden/>
+              </w:rPr>
+              <w:tab/>
+            </w:r>
+            <w:r>
+              <w:rPr>
+                <w:noProof/>
+                <w:webHidden/>
+              </w:rPr>
+              <w:fldChar w:fldCharType="begin"/>
+            </w:r>
+            <w:r>
+              <w:rPr>
+                <w:noProof/>
+                <w:webHidden/>
+              </w:rPr>
+              <w:instrText xml:space="preserve"> PAGEREF _Toc231874442 \h </w:instrText>
+            </w:r>
+            <w:r>
+              <w:rPr>
+                <w:noProof/>
+                <w:webHidden/>
+              </w:rPr>
+            </w:r>
+            <w:r>
+              <w:rPr>
+                <w:noProof/>
+                <w:webHidden/>
+              </w:rPr>
+              <w:fldChar w:fldCharType="separate"/>
+            </w:r>
+            <w:r>
+              <w:rPr>
+                <w:noProof/>
+                <w:webHidden/>
+              </w:rPr>
+              <w:t>13</w:t>
             </w:r>
             <w:r>
               <w:rPr>
@@ -1269,7 +2143,7 @@
       <w:pPr>
         <w:pStyle w:val="berschrift1"/>
       </w:pPr>
-      <w:bookmarkStart w:id="0" w:name="_Toc231318002"/>
+      <w:bookmarkStart w:id="0" w:name="_Toc231874426"/>
       <w:r>
         <w:lastRenderedPageBreak/>
         <w:t>Einleitung</w:t>
@@ -1297,7 +2171,7 @@
       <w:pPr>
         <w:pStyle w:val="berschrift1"/>
       </w:pPr>
-      <w:bookmarkStart w:id="1" w:name="_Toc231318003"/>
+      <w:bookmarkStart w:id="1" w:name="_Toc231874427"/>
       <w:r>
         <w:t>Anforderungen und Ziele</w:t>
       </w:r>
@@ -1335,7 +2209,7 @@
           <w:bCs/>
         </w:rPr>
       </w:pPr>
-      <w:bookmarkStart w:id="2" w:name="_Toc231318004"/>
+      <w:bookmarkStart w:id="2" w:name="_Toc231874428"/>
       <w:r>
         <w:rPr>
           <w:b/>
@@ -1383,7 +2257,7 @@
           <w:bCs/>
         </w:rPr>
       </w:pPr>
-      <w:bookmarkStart w:id="3" w:name="_Toc231318005"/>
+      <w:bookmarkStart w:id="3" w:name="_Toc231874429"/>
       <w:r>
         <w:rPr>
           <w:b/>
@@ -1421,57 +2295,788 @@
       <w:pPr>
         <w:pStyle w:val="berschrift1"/>
       </w:pPr>
+      <w:bookmarkStart w:id="4" w:name="_Toc231874430"/>
       <w:r>
         <w:t>Planen und Konzipieren</w:t>
       </w:r>
-    </w:p>
-    <w:p>
-      <w:r>
-        <w:t xml:space="preserve">Nachdem wir die Anforderungen sowie die Muss- und </w:t>
+      <w:bookmarkEnd w:id="4"/>
+    </w:p>
+    <w:p>
+      <w:r>
+        <w:t>Für die Umsetzung der Aufzugssteuerung wurde zuerst ein Konzept erstellt. Ziel der Planungsphase war es, die Hauptfunktion der Anlage verständlich zu strukturieren und eine klare Grundlage für die spätere SPS-Programmierung zu schaffen. Dabei wurden die Anforderungen aus der Aufgabenstellung in einzelne Teilfunktionen aufgeteilt.</w:t>
+      </w:r>
+    </w:p>
+    <w:p/>
+    <w:p>
+      <w:r>
+        <w:t>Im Zentrum der Planung standen drei Punkte: der grundsätzliche Ablauf der Steuerung, die Zustände der Anlage und die Aufteilung der einzelnen Systemkomponenten. Dadurch konnte vor der Programmierung festgelegt werden, welche Signale benötigt werden, welche Zustände die Anlage besitzen muss und wie HMI, Steuerung, Antriebe und Sensorik zusammenarbeiten.</w:t>
+      </w:r>
+    </w:p>
+    <w:p>
+      <w:pPr>
+        <w:pStyle w:val="berschrift2"/>
+        <w:rPr>
+          <w:b/>
+          <w:bCs/>
+        </w:rPr>
+      </w:pPr>
+      <w:r>
+        <w:rPr>
+          <w:b/>
+          <w:bCs/>
+        </w:rPr>
+        <w:t xml:space="preserve"> </w:t>
+      </w:r>
+      <w:bookmarkStart w:id="5" w:name="_Toc231874431"/>
+      <w:r>
+        <w:rPr>
+          <w:b/>
+          <w:bCs/>
+        </w:rPr>
+        <w:t>Flussdiagramm</w:t>
+      </w:r>
+      <w:bookmarkEnd w:id="5"/>
+    </w:p>
+    <w:p>
+      <w:r>
+        <w:t>Als erster Planungsschritt wurde ein Flussdiagramm erstellt. Dieses zeigt den grundsätzlichen Ablauf der Aufzugssteuerung. Dabei wird dargestellt, wie eine Etagenwahl erkannt wird, wie die Ziel-Etage gespeichert wird und unter welchen Bedingungen der Aufzug fahren darf.</w:t>
+      </w:r>
+    </w:p>
+    <w:p/>
+    <w:p>
+      <w:r>
+        <w:t>Wichtig ist dabei die Türverriegelung. Der Aufzug darf nur fahren, wenn die Tür geschlossen ist. Ist die Tür offen, wird zuerst der Türantrieb zum Schliessen angesteuert. Erst danach wird der Aufzugmotor aktiviert. Sobald die gewünschte Ziel-Etage erreicht ist, stoppt der Aufzug und die Tür wird geöffnet.</w:t>
+      </w:r>
+    </w:p>
+    <w:p>
+      <w:pPr>
+        <w:keepNext/>
+        <w:jc w:val="center"/>
+      </w:pPr>
+      <w:r>
+        <w:rPr>
+          <w:noProof/>
+        </w:rPr>
+        <w:lastRenderedPageBreak/>
+        <w:drawing>
+          <wp:inline distT="0" distB="0" distL="0" distR="0" wp14:anchorId="4A06998F" wp14:editId="742DDC9A">
+            <wp:extent cx="4152452" cy="8775359"/>
+            <wp:effectExtent l="0" t="0" r="635" b="635"/>
+            <wp:docPr id="842763257" name="Grafik 2"/>
+            <wp:cNvGraphicFramePr>
+              <a:graphicFrameLocks xmlns:a="http://schemas.openxmlformats.org/drawingml/2006/main" noChangeAspect="1"/>
+            </wp:cNvGraphicFramePr>
+            <a:graphic xmlns:a="http://schemas.openxmlformats.org/drawingml/2006/main">
+              <a:graphicData uri="http://schemas.openxmlformats.org/drawingml/2006/picture">
+                <pic:pic xmlns:pic="http://schemas.openxmlformats.org/drawingml/2006/picture">
+                  <pic:nvPicPr>
+                    <pic:cNvPr id="842763257" name="Grafik 842763257"/>
+                    <pic:cNvPicPr/>
+                  </pic:nvPicPr>
+                  <pic:blipFill>
+                    <a:blip r:embed="rId15">
+                      <a:extLst>
+                        <a:ext uri="{28A0092B-C50C-407E-A947-70E740481C1C}">
+                          <a14:useLocalDpi xmlns:a14="http://schemas.microsoft.com/office/drawing/2010/main" val="0"/>
+                        </a:ext>
+                      </a:extLst>
+                    </a:blip>
+                    <a:stretch>
+                      <a:fillRect/>
+                    </a:stretch>
+                  </pic:blipFill>
+                  <pic:spPr>
+                    <a:xfrm>
+                      <a:off x="0" y="0"/>
+                      <a:ext cx="4224339" cy="8927278"/>
+                    </a:xfrm>
+                    <a:prstGeom prst="rect">
+                      <a:avLst/>
+                    </a:prstGeom>
+                  </pic:spPr>
+                </pic:pic>
+              </a:graphicData>
+            </a:graphic>
+          </wp:inline>
+        </w:drawing>
+      </w:r>
+    </w:p>
+    <w:p>
+      <w:pPr>
+        <w:pStyle w:val="Beschriftung"/>
+        <w:jc w:val="center"/>
+      </w:pPr>
+      <w:bookmarkStart w:id="6" w:name="_Toc231872781"/>
+      <w:r>
+        <w:t xml:space="preserve">Abbildung </w:t>
+      </w:r>
+      <w:r>
+        <w:fldChar w:fldCharType="begin"/>
+      </w:r>
+      <w:r>
+        <w:instrText xml:space="preserve"> SEQ Abbildung \* ARABIC </w:instrText>
+      </w:r>
+      <w:r>
+        <w:fldChar w:fldCharType="separate"/>
+      </w:r>
+      <w:r>
+        <w:rPr>
+          <w:noProof/>
+        </w:rPr>
+        <w:t>1</w:t>
+      </w:r>
+      <w:r>
+        <w:fldChar w:fldCharType="end"/>
+      </w:r>
+      <w:r>
+        <w:t xml:space="preserve">: </w:t>
+      </w:r>
+      <w:r>
+        <w:t>Flussdiagramm der Aufzugssteuerung</w:t>
+      </w:r>
+      <w:bookmarkEnd w:id="6"/>
+    </w:p>
+    <w:p/>
+    <w:p>
+      <w:r>
+        <w:t>Das Flussdiagramm diente vor allem dazu, die Reihenfolge der wichtigsten Funktionen zu verstehen. Es zeigt die Grundlogik der Steuerung und half dabei, die spätere Zustandsmaschine vorzubereiten.</w:t>
+      </w:r>
+    </w:p>
+    <w:p>
+      <w:pPr>
+        <w:pStyle w:val="berschrift2"/>
+        <w:rPr>
+          <w:b/>
+          <w:bCs/>
+        </w:rPr>
+      </w:pPr>
+      <w:bookmarkStart w:id="7" w:name="_Toc231874432"/>
+      <w:r>
+        <w:rPr>
+          <w:b/>
+          <w:bCs/>
+        </w:rPr>
+        <w:t>Zustandsautomat</w:t>
+      </w:r>
+      <w:bookmarkEnd w:id="7"/>
+    </w:p>
+    <w:p>
+      <w:r>
+        <w:t xml:space="preserve">Da die Aufzugssteuerung nicht nur aus einer einfachen Schrittkette besteht, wurde zusätzlich ein Zustandsautomat erstellt. Dieser bildet die wichtigsten Betriebszustände der Anlage ab. Dazu gehören zum Beispiel Initialisierung, Warten, Fahrwunsch speichern, Tür schliessen, Fahren, Anhalten, Tür öffnen und Tür </w:t>
+      </w:r>
+      <w:proofErr w:type="gramStart"/>
+      <w:r>
+        <w:t>offen halten</w:t>
+      </w:r>
+      <w:proofErr w:type="gramEnd"/>
+      <w:r>
+        <w:t>.</w:t>
+      </w:r>
+    </w:p>
+    <w:p/>
+    <w:p>
+      <w:r>
+        <w:t>Der Zustandsautomat ist besonders wichtig für die SPS-Umsetzung. Die einzelnen Zustände können später im Programm als ENUM definiert und mit einer CASE-Struktur verarbeitet werden. Dadurch bleibt die Steuerung übersichtlich und nachvollziehbar.</w:t>
+      </w:r>
+    </w:p>
+    <w:p/>
+    <w:p>
+      <w:pPr>
+        <w:keepNext/>
+      </w:pPr>
+      <w:r>
+        <w:rPr>
+          <w:noProof/>
+        </w:rPr>
+        <w:drawing>
+          <wp:inline distT="0" distB="0" distL="0" distR="0" wp14:anchorId="4C0A0F8E" wp14:editId="1E7038F3">
+            <wp:extent cx="6187977" cy="4413380"/>
+            <wp:effectExtent l="0" t="0" r="0" b="0"/>
+            <wp:docPr id="322349841" name="Grafik 3"/>
+            <wp:cNvGraphicFramePr>
+              <a:graphicFrameLocks xmlns:a="http://schemas.openxmlformats.org/drawingml/2006/main" noChangeAspect="1"/>
+            </wp:cNvGraphicFramePr>
+            <a:graphic xmlns:a="http://schemas.openxmlformats.org/drawingml/2006/main">
+              <a:graphicData uri="http://schemas.openxmlformats.org/drawingml/2006/picture">
+                <pic:pic xmlns:pic="http://schemas.openxmlformats.org/drawingml/2006/picture">
+                  <pic:nvPicPr>
+                    <pic:cNvPr id="322349841" name="Grafik 322349841"/>
+                    <pic:cNvPicPr/>
+                  </pic:nvPicPr>
+                  <pic:blipFill>
+                    <a:blip r:embed="rId16">
+                      <a:extLst>
+                        <a:ext uri="{28A0092B-C50C-407E-A947-70E740481C1C}">
+                          <a14:useLocalDpi xmlns:a14="http://schemas.microsoft.com/office/drawing/2010/main" val="0"/>
+                        </a:ext>
+                      </a:extLst>
+                    </a:blip>
+                    <a:stretch>
+                      <a:fillRect/>
+                    </a:stretch>
+                  </pic:blipFill>
+                  <pic:spPr>
+                    <a:xfrm>
+                      <a:off x="0" y="0"/>
+                      <a:ext cx="6208644" cy="4428120"/>
+                    </a:xfrm>
+                    <a:prstGeom prst="rect">
+                      <a:avLst/>
+                    </a:prstGeom>
+                  </pic:spPr>
+                </pic:pic>
+              </a:graphicData>
+            </a:graphic>
+          </wp:inline>
+        </w:drawing>
+      </w:r>
+    </w:p>
+    <w:p>
+      <w:pPr>
+        <w:pStyle w:val="Beschriftung"/>
+        <w:jc w:val="center"/>
+      </w:pPr>
+      <w:bookmarkStart w:id="8" w:name="_Toc231872782"/>
+      <w:r>
+        <w:t xml:space="preserve">Abbildung </w:t>
+      </w:r>
+      <w:r>
+        <w:fldChar w:fldCharType="begin"/>
+      </w:r>
+      <w:r>
+        <w:instrText xml:space="preserve"> SEQ Abbildung \* ARABIC </w:instrText>
+      </w:r>
+      <w:r>
+        <w:fldChar w:fldCharType="separate"/>
+      </w:r>
+      <w:r>
+        <w:rPr>
+          <w:noProof/>
+        </w:rPr>
+        <w:t>2</w:t>
+      </w:r>
+      <w:r>
+        <w:fldChar w:fldCharType="end"/>
+      </w:r>
+      <w:r>
+        <w:t xml:space="preserve">: </w:t>
+      </w:r>
+      <w:r>
+        <w:t>Zustandsautomat der Aufzugssteuerung</w:t>
+      </w:r>
+      <w:bookmarkEnd w:id="8"/>
+    </w:p>
+    <w:p>
+      <w:r>
+        <w:t>Im Zustand „Warten / Bereit“ befindet sich der Aufzug im Stillstand und wartet auf eine Eingabe. Wird eine Etage angewählt, speichert die Steuerung die Ziel-Etage und bestimmt die Fahrtrichtung. Danach wird geprüft, ob die Tür geschlossen ist. Nur wenn diese Bedingung erfüllt ist, darf der Aufzug fahren.</w:t>
+      </w:r>
+    </w:p>
+    <w:p>
+      <w:r>
+        <w:lastRenderedPageBreak/>
+        <w:t>Wird die Ziel-Etage erreicht, wird der Aufzugmotor ausgeschaltet und die Tür geöffnet. Nach einer Wartezeit wird die Tür wieder geschlossen. Die Bonusfunktion Notstopp beziehungsweise Lichtschranke wurde im Zustandsautomaten separat gekennzeichnet, da sie nicht zur Hauptfunktion gehört, sondern als Erweiterung vorgesehen ist.</w:t>
+      </w:r>
+    </w:p>
+    <w:p>
+      <w:pPr>
+        <w:pStyle w:val="berschrift2"/>
+        <w:rPr>
+          <w:b/>
+          <w:bCs/>
+        </w:rPr>
+      </w:pPr>
+      <w:r>
+        <w:t xml:space="preserve"> </w:t>
+      </w:r>
+      <w:bookmarkStart w:id="9" w:name="_Toc231874433"/>
+      <w:r>
+        <w:rPr>
+          <w:b/>
+          <w:bCs/>
+        </w:rPr>
+        <w:t>Architektur der Steuerung</w:t>
+      </w:r>
+      <w:bookmarkEnd w:id="9"/>
+    </w:p>
+    <w:p>
+      <w:r>
+        <w:t xml:space="preserve">Neben dem Ablauf wurde auch die Architektur der Steuerung geplant. Die Architekturzeichnung zeigt, welche Hauptkomponenten im System vorhanden sind und wie sie miteinander verbunden sind. Dabei wird zwischen Hauptablauf, HMI, Aufzug-Modul, Türantrieb, Aufzugantrieb sowie Etagen- und </w:t>
       </w:r>
       <w:proofErr w:type="spellStart"/>
       <w:r>
-        <w:t>Kannziele</w:t>
+        <w:t>Türsensorik</w:t>
       </w:r>
       <w:proofErr w:type="spellEnd"/>
       <w:r>
-        <w:t xml:space="preserve"> definiert hatten, begannen wir mit der Planungs- und Konzeptionsphase. Ziel dieser Phase war es, die Funktionsweise unserer Aufzugssteuerung verständlich zu planen und eine klare Grundlage für die spätere Umsetzung zu schaffen.</w:t>
-      </w:r>
-    </w:p>
-    <w:p/>
-    <w:p>
-      <w:r>
-        <w:t>Als ersten Schritt erstellten wir ein Flussdiagramm mit Draw.io. Damit konnten wir den grundsätzlichen Ablauf der Steuerung übersichtlich darstellen. Im Flussdiagramm hielten wir fest, wie der Aufzug auf Eingaben reagieren soll, welche Entscheidungen getroffen werden müssen und in welcher Reihenfolge bestimmte Aktionen ablaufen.</w:t>
-      </w:r>
-    </w:p>
-    <w:p/>
-    <w:p>
-      <w:r>
-        <w:t>Anschliessend erstellten wir ein Zustandsdiagramm. Dieses half uns dabei, die verschiedenen Zustände der Aufzugssteuerung genauer zu definieren. Dazu gehören zum Beispiel Zustände wie Warten, Fahren, Tür öffnen oder Tür schliessen. Durch das Zustandsdiagramm konnten wir besser erkennen, wann ein Zustandswechsel stattfinden muss und welche Bedingungen dafür erfüllt sein müssen.</w:t>
-      </w:r>
-    </w:p>
-    <w:p/>
-    <w:p>
-      <w:r>
-        <w:t>Zusätzlich erstellten wir eine einfache Architekturzeichnung unseres Systems. In dieser Darstellung zeigten wir die wichtigsten Bestandteile der Anlage, wie das HMI, den Lift, die Motoren, den Bediener und die Steuerung. Dadurch wurde klarer, wie die einzelnen Komponenten miteinander verbunden sind und welche Rolle sie im Gesamtsystem übernehmen.</w:t>
-      </w:r>
-    </w:p>
-    <w:p/>
-    <w:p>
-      <w:r>
-        <w:t>Diese drei Planungsunterlagen halfen uns, die Steuerung vor der Programmierung besser zu verstehen und gemeinsam ein einheitliches Konzept zu entwickeln. Sie dienten als Grundlage für die weitere Umsetzung und erleichterten uns später das strukturierte Programmieren der Aufzugssteuerung.</w:t>
-      </w:r>
-    </w:p>
-    <w:p/>
-    <w:p/>
-    <w:p/>
-    <w:p/>
-    <w:p/>
-    <w:p/>
-    <w:p/>
-    <w:p/>
-    <w:p/>
-    <w:p/>
+        <w:t xml:space="preserve"> unterschieden.</w:t>
+      </w:r>
+    </w:p>
+    <w:p>
+      <w:pPr>
+        <w:keepNext/>
+      </w:pPr>
+      <w:r>
+        <w:rPr>
+          <w:noProof/>
+        </w:rPr>
+        <w:drawing>
+          <wp:inline distT="0" distB="0" distL="0" distR="0" wp14:anchorId="1D653FE0" wp14:editId="49FC8944">
+            <wp:extent cx="6120130" cy="4348066"/>
+            <wp:effectExtent l="0" t="0" r="1270" b="0"/>
+            <wp:docPr id="1136575472" name="Grafik 4"/>
+            <wp:cNvGraphicFramePr>
+              <a:graphicFrameLocks xmlns:a="http://schemas.openxmlformats.org/drawingml/2006/main" noChangeAspect="1"/>
+            </wp:cNvGraphicFramePr>
+            <a:graphic xmlns:a="http://schemas.openxmlformats.org/drawingml/2006/main">
+              <a:graphicData uri="http://schemas.openxmlformats.org/drawingml/2006/picture">
+                <pic:pic xmlns:pic="http://schemas.openxmlformats.org/drawingml/2006/picture">
+                  <pic:nvPicPr>
+                    <pic:cNvPr id="1136575472" name="Grafik 1136575472"/>
+                    <pic:cNvPicPr/>
+                  </pic:nvPicPr>
+                  <pic:blipFill rotWithShape="1">
+                    <a:blip r:embed="rId17">
+                      <a:extLst>
+                        <a:ext uri="{28A0092B-C50C-407E-A947-70E740481C1C}">
+                          <a14:useLocalDpi xmlns:a14="http://schemas.microsoft.com/office/drawing/2010/main" val="0"/>
+                        </a:ext>
+                      </a:extLst>
+                    </a:blip>
+                    <a:srcRect b="5917"/>
+                    <a:stretch>
+                      <a:fillRect/>
+                    </a:stretch>
+                  </pic:blipFill>
+                  <pic:spPr bwMode="auto">
+                    <a:xfrm>
+                      <a:off x="0" y="0"/>
+                      <a:ext cx="6120130" cy="4348066"/>
+                    </a:xfrm>
+                    <a:prstGeom prst="rect">
+                      <a:avLst/>
+                    </a:prstGeom>
+                    <a:ln>
+                      <a:noFill/>
+                    </a:ln>
+                    <a:extLst>
+                      <a:ext uri="{53640926-AAD7-44D8-BBD7-CCE9431645EC}">
+                        <a14:shadowObscured xmlns:a14="http://schemas.microsoft.com/office/drawing/2010/main"/>
+                      </a:ext>
+                    </a:extLst>
+                  </pic:spPr>
+                </pic:pic>
+              </a:graphicData>
+            </a:graphic>
+          </wp:inline>
+        </w:drawing>
+      </w:r>
+    </w:p>
+    <w:p>
+      <w:pPr>
+        <w:pStyle w:val="Beschriftung"/>
+        <w:jc w:val="center"/>
+      </w:pPr>
+      <w:bookmarkStart w:id="10" w:name="_Toc231872783"/>
+      <w:r>
+        <w:t xml:space="preserve">Abbildung </w:t>
+      </w:r>
+      <w:r>
+        <w:fldChar w:fldCharType="begin"/>
+      </w:r>
+      <w:r>
+        <w:instrText xml:space="preserve"> SEQ Abbildung \* ARABIC </w:instrText>
+      </w:r>
+      <w:r>
+        <w:fldChar w:fldCharType="separate"/>
+      </w:r>
+      <w:r>
+        <w:rPr>
+          <w:noProof/>
+        </w:rPr>
+        <w:t>3</w:t>
+      </w:r>
+      <w:r>
+        <w:fldChar w:fldCharType="end"/>
+      </w:r>
+      <w:r>
+        <w:t xml:space="preserve">: </w:t>
+      </w:r>
+      <w:r>
+        <w:t>Architektur der Aufzugssteuerung</w:t>
+      </w:r>
+      <w:bookmarkEnd w:id="10"/>
+    </w:p>
+    <w:p>
+      <w:r>
+        <w:t>Der Hauptablauf steuert das Aufzug-Modul. Das Aufzug-Modul koordiniert den Türantrieb, den Aufzugantrieb und die Rückmeldungen der Sensorik. Die Bedienung und Anzeige erfolgt über das HMI. Über das HMI sollen Zustände wie aktuelle Etage, Ziel-Etage, Fahrtrichtung und Türzustand sichtbar sein.</w:t>
+      </w:r>
+    </w:p>
+    <w:p/>
+    <w:p>
+      <w:r>
+        <w:t>Die Architektur hilft dabei, die spätere Programmstruktur sauber aufzubauen. Die Steuerungslogik, die HMI-Anzeige und die Hardware-Signale sollen möglichst klar getrennt werden. Dadurch wird das Programm übersichtlicher und kann einfacher getestet oder erweitert werden.</w:t>
+      </w:r>
+    </w:p>
+    <w:p/>
+    <w:p>
+      <w:pPr>
+        <w:pStyle w:val="berschrift2"/>
+        <w:rPr>
+          <w:b/>
+          <w:bCs/>
+        </w:rPr>
+      </w:pPr>
+      <w:bookmarkStart w:id="11" w:name="_Toc231874434"/>
+      <w:r>
+        <w:rPr>
+          <w:b/>
+          <w:bCs/>
+        </w:rPr>
+        <w:lastRenderedPageBreak/>
+        <w:t>HMI-Konzept</w:t>
+      </w:r>
+      <w:bookmarkEnd w:id="11"/>
+    </w:p>
+    <w:p/>
+    <w:p>
+      <w:r>
+        <w:t>Für die Visualisierung wurde geplant, die wichtigsten Zustände der Anlage auf dem HMI darzustellen. Das HMI soll nicht nur zur Anzeige dienen, sondern auch einfache Bedienfunktionen ermöglichen.</w:t>
+      </w:r>
+    </w:p>
+    <w:p/>
+    <w:p>
+      <w:r>
+        <w:t>Geplant sind folgende Anzeigen und Bedienelemente:</w:t>
+      </w:r>
+    </w:p>
+    <w:p>
+      <w:pPr>
+        <w:pStyle w:val="Listenabsatz"/>
+        <w:numPr>
+          <w:ilvl w:val="0"/>
+          <w:numId w:val="4"/>
+        </w:numPr>
+      </w:pPr>
+      <w:r>
+        <w:t>Anzeige der aktuellen Etage</w:t>
+      </w:r>
+    </w:p>
+    <w:p>
+      <w:pPr>
+        <w:pStyle w:val="Listenabsatz"/>
+        <w:numPr>
+          <w:ilvl w:val="0"/>
+          <w:numId w:val="4"/>
+        </w:numPr>
+      </w:pPr>
+      <w:r>
+        <w:t>Anzeige der gewählten Ziel-Etage</w:t>
+      </w:r>
+    </w:p>
+    <w:p>
+      <w:pPr>
+        <w:pStyle w:val="Listenabsatz"/>
+        <w:numPr>
+          <w:ilvl w:val="0"/>
+          <w:numId w:val="4"/>
+        </w:numPr>
+      </w:pPr>
+      <w:r>
+        <w:t>Anzeige der Fahrtrichtung</w:t>
+      </w:r>
+    </w:p>
+    <w:p>
+      <w:pPr>
+        <w:pStyle w:val="Listenabsatz"/>
+        <w:numPr>
+          <w:ilvl w:val="0"/>
+          <w:numId w:val="4"/>
+        </w:numPr>
+      </w:pPr>
+      <w:r>
+        <w:t>Anzeige des Türzustands</w:t>
+      </w:r>
+    </w:p>
+    <w:p>
+      <w:pPr>
+        <w:pStyle w:val="Listenabsatz"/>
+        <w:numPr>
+          <w:ilvl w:val="0"/>
+          <w:numId w:val="4"/>
+        </w:numPr>
+      </w:pPr>
+      <w:r>
+        <w:t>Anzeige von Störungen oder Notstopp als Bonusfunktion</w:t>
+      </w:r>
+    </w:p>
+    <w:p>
+      <w:pPr>
+        <w:pStyle w:val="Listenabsatz"/>
+        <w:numPr>
+          <w:ilvl w:val="0"/>
+          <w:numId w:val="4"/>
+        </w:numPr>
+      </w:pPr>
+      <w:r>
+        <w:t>Taster für die Etagenwahl</w:t>
+      </w:r>
+    </w:p>
+    <w:p>
+      <w:pPr>
+        <w:pStyle w:val="Listenabsatz"/>
+        <w:numPr>
+          <w:ilvl w:val="0"/>
+          <w:numId w:val="4"/>
+        </w:numPr>
+      </w:pPr>
+      <w:r>
+        <w:t>Taster für Tür öffnen und Tür schliessen</w:t>
+      </w:r>
+    </w:p>
+    <w:p>
+      <w:pPr>
+        <w:keepNext/>
+      </w:pPr>
+      <w:r>
+        <w:rPr>
+          <w:noProof/>
+        </w:rPr>
+        <w:drawing>
+          <wp:inline distT="0" distB="0" distL="0" distR="0" wp14:anchorId="569908E5" wp14:editId="18228DE0">
+            <wp:extent cx="6120130" cy="3980180"/>
+            <wp:effectExtent l="0" t="0" r="1270" b="0"/>
+            <wp:docPr id="206866577" name="Grafik 5"/>
+            <wp:cNvGraphicFramePr>
+              <a:graphicFrameLocks xmlns:a="http://schemas.openxmlformats.org/drawingml/2006/main" noChangeAspect="1"/>
+            </wp:cNvGraphicFramePr>
+            <a:graphic xmlns:a="http://schemas.openxmlformats.org/drawingml/2006/main">
+              <a:graphicData uri="http://schemas.openxmlformats.org/drawingml/2006/picture">
+                <pic:pic xmlns:pic="http://schemas.openxmlformats.org/drawingml/2006/picture">
+                  <pic:nvPicPr>
+                    <pic:cNvPr id="206866577" name="Grafik 206866577"/>
+                    <pic:cNvPicPr/>
+                  </pic:nvPicPr>
+                  <pic:blipFill>
+                    <a:blip r:embed="rId18">
+                      <a:extLst>
+                        <a:ext uri="{28A0092B-C50C-407E-A947-70E740481C1C}">
+                          <a14:useLocalDpi xmlns:a14="http://schemas.microsoft.com/office/drawing/2010/main" val="0"/>
+                        </a:ext>
+                      </a:extLst>
+                    </a:blip>
+                    <a:stretch>
+                      <a:fillRect/>
+                    </a:stretch>
+                  </pic:blipFill>
+                  <pic:spPr>
+                    <a:xfrm>
+                      <a:off x="0" y="0"/>
+                      <a:ext cx="6120130" cy="3980180"/>
+                    </a:xfrm>
+                    <a:prstGeom prst="rect">
+                      <a:avLst/>
+                    </a:prstGeom>
+                  </pic:spPr>
+                </pic:pic>
+              </a:graphicData>
+            </a:graphic>
+          </wp:inline>
+        </w:drawing>
+      </w:r>
+    </w:p>
+    <w:p>
+      <w:pPr>
+        <w:pStyle w:val="Beschriftung"/>
+        <w:jc w:val="center"/>
+      </w:pPr>
+      <w:bookmarkStart w:id="12" w:name="_Toc231872784"/>
+      <w:r>
+        <w:t xml:space="preserve">Abbildung </w:t>
+      </w:r>
+      <w:r>
+        <w:fldChar w:fldCharType="begin"/>
+      </w:r>
+      <w:r>
+        <w:instrText xml:space="preserve"> SEQ Abbildung \* ARABIC </w:instrText>
+      </w:r>
+      <w:r>
+        <w:fldChar w:fldCharType="separate"/>
+      </w:r>
+      <w:r>
+        <w:rPr>
+          <w:noProof/>
+        </w:rPr>
+        <w:t>4</w:t>
+      </w:r>
+      <w:r>
+        <w:fldChar w:fldCharType="end"/>
+      </w:r>
+      <w:r>
+        <w:t>: HMI-Skizze</w:t>
+      </w:r>
+      <w:bookmarkEnd w:id="12"/>
+    </w:p>
+    <w:p>
+      <w:r>
+        <w:t>Das HMI soll so aufgebaut sein, dass der Zustand der Anlage schnell erkennbar ist. Dadurch kann während der Inbetriebnahme und beim Testen kontrolliert werden, ob die SPS-Logik korrekt arbeitet.</w:t>
+      </w:r>
+    </w:p>
+    <w:p/>
+    <w:p/>
+    <w:p>
+      <w:pPr>
+        <w:pStyle w:val="berschrift2"/>
+        <w:rPr>
+          <w:b/>
+          <w:bCs/>
+        </w:rPr>
+      </w:pPr>
+      <w:bookmarkStart w:id="13" w:name="_Toc231874435"/>
+      <w:r>
+        <w:rPr>
+          <w:b/>
+          <w:bCs/>
+        </w:rPr>
+        <w:lastRenderedPageBreak/>
+        <w:t>Geplante Programmstruktur</w:t>
+      </w:r>
+      <w:bookmarkEnd w:id="13"/>
+    </w:p>
+    <w:p>
+      <w:r>
+        <w:t>Für die SPS-Programmierung ist eine klare Struktur vorgesehen. Die zentrale Steuerung soll als Zustandsautomat umgesetzt werden. Die Zustände werden mit einem ENUM abgebildet und in einer CASE-Struktur verarbeitet.</w:t>
+      </w:r>
+    </w:p>
+    <w:p/>
+    <w:p>
+      <w:r>
+        <w:t>Die wichtigsten Programmteile sind:</w:t>
+      </w:r>
+    </w:p>
+    <w:p>
+      <w:pPr>
+        <w:pStyle w:val="Listenabsatz"/>
+        <w:numPr>
+          <w:ilvl w:val="0"/>
+          <w:numId w:val="8"/>
+        </w:numPr>
+      </w:pPr>
+      <w:r>
+        <w:t>Erfassung der Eingänge</w:t>
+      </w:r>
+    </w:p>
+    <w:p>
+      <w:pPr>
+        <w:pStyle w:val="Listenabsatz"/>
+        <w:numPr>
+          <w:ilvl w:val="0"/>
+          <w:numId w:val="8"/>
+        </w:numPr>
+      </w:pPr>
+      <w:r>
+        <w:t>Flankenerkennung der Etagenwahlschalter</w:t>
+      </w:r>
+    </w:p>
+    <w:p>
+      <w:pPr>
+        <w:pStyle w:val="Listenabsatz"/>
+        <w:numPr>
+          <w:ilvl w:val="0"/>
+          <w:numId w:val="8"/>
+        </w:numPr>
+      </w:pPr>
+      <w:r>
+        <w:t>Speichern der Ziel-Etage</w:t>
+      </w:r>
+    </w:p>
+    <w:p>
+      <w:pPr>
+        <w:pStyle w:val="Listenabsatz"/>
+        <w:numPr>
+          <w:ilvl w:val="0"/>
+          <w:numId w:val="8"/>
+        </w:numPr>
+      </w:pPr>
+      <w:r>
+        <w:t>Bestimmen der Fahrtrichtung</w:t>
+      </w:r>
+    </w:p>
+    <w:p>
+      <w:pPr>
+        <w:pStyle w:val="Listenabsatz"/>
+        <w:numPr>
+          <w:ilvl w:val="0"/>
+          <w:numId w:val="8"/>
+        </w:numPr>
+      </w:pPr>
+      <w:r>
+        <w:t>Ansteuerung des Aufzugantriebs</w:t>
+      </w:r>
+    </w:p>
+    <w:p>
+      <w:pPr>
+        <w:pStyle w:val="Listenabsatz"/>
+        <w:numPr>
+          <w:ilvl w:val="0"/>
+          <w:numId w:val="8"/>
+        </w:numPr>
+      </w:pPr>
+      <w:r>
+        <w:t>Ansteuerung des Türantriebs</w:t>
+      </w:r>
+    </w:p>
+    <w:p>
+      <w:pPr>
+        <w:pStyle w:val="Listenabsatz"/>
+        <w:numPr>
+          <w:ilvl w:val="0"/>
+          <w:numId w:val="8"/>
+        </w:numPr>
+      </w:pPr>
+      <w:r>
+        <w:t>Verarbeitung der Tür- und Etagenrückmeldungen</w:t>
+      </w:r>
+    </w:p>
+    <w:p>
+      <w:pPr>
+        <w:pStyle w:val="Listenabsatz"/>
+        <w:numPr>
+          <w:ilvl w:val="0"/>
+          <w:numId w:val="8"/>
+        </w:numPr>
+      </w:pPr>
+      <w:r>
+        <w:t>Bereitstellung der HMI-Variablen</w:t>
+      </w:r>
+    </w:p>
+    <w:p>
+      <w:pPr>
+        <w:pStyle w:val="Listenabsatz"/>
+        <w:numPr>
+          <w:ilvl w:val="0"/>
+          <w:numId w:val="8"/>
+        </w:numPr>
+      </w:pPr>
+      <w:r>
+        <w:t>Verarbeitung der Bonusfunktion Notstopp, falls umgesetzt</w:t>
+      </w:r>
+    </w:p>
+    <w:p/>
+    <w:p>
+      <w:r>
+        <w:t>Durch diese Struktur kann die Hauptfunktion zuerst umgesetzt und getestet werden. Erst wenn diese zuverlässig funktioniert, werden die Bonusfunktionen ergänzt. Dieses Vorgehen entspricht dem iterativen Ansatz der Case Study: planen, umsetzen, testen, verbessern und dokumentieren.</w:t>
+      </w:r>
+    </w:p>
+    <w:p>
+      <w:pPr>
+        <w:pStyle w:val="berschrift1"/>
+      </w:pPr>
+      <w:bookmarkStart w:id="14" w:name="_Toc231874436"/>
+      <w:r>
+        <w:t>Umsetzung</w:t>
+      </w:r>
+      <w:bookmarkEnd w:id="14"/>
+    </w:p>
     <w:p/>
     <w:p/>
     <w:p/>
@@ -1493,11 +3098,809 @@
           <w:numId w:val="0"/>
         </w:numPr>
       </w:pPr>
-      <w:bookmarkStart w:id="4" w:name="_Toc231318006"/>
-      <w:r>
+    </w:p>
+    <w:p/>
+    <w:p>
+      <w:pPr>
+        <w:pStyle w:val="berschrift1"/>
+        <w:numPr>
+          <w:ilvl w:val="0"/>
+          <w:numId w:val="0"/>
+        </w:numPr>
+        <w:ind w:left="454" w:hanging="454"/>
+      </w:pPr>
+      <w:bookmarkStart w:id="15" w:name="_Toc231874437"/>
+      <w:r>
+        <w:lastRenderedPageBreak/>
+        <w:t>Aufwandsübersicht</w:t>
+      </w:r>
+      <w:bookmarkEnd w:id="15"/>
+    </w:p>
+    <w:tbl>
+      <w:tblPr>
+        <w:tblStyle w:val="Gitternetztabelle2"/>
+        <w:tblW w:w="0" w:type="auto"/>
+        <w:tblBorders>
+          <w:left w:val="single" w:sz="2" w:space="0" w:color="666666" w:themeColor="text1" w:themeTint="99"/>
+          <w:right w:val="single" w:sz="2" w:space="0" w:color="666666" w:themeColor="text1" w:themeTint="99"/>
+        </w:tblBorders>
+        <w:tblLook w:val="04A0" w:firstRow="1" w:lastRow="0" w:firstColumn="1" w:lastColumn="0" w:noHBand="0" w:noVBand="1"/>
+      </w:tblPr>
+      <w:tblGrid>
+        <w:gridCol w:w="3209"/>
+        <w:gridCol w:w="3209"/>
+        <w:gridCol w:w="3210"/>
+      </w:tblGrid>
+      <w:tr>
+        <w:trPr>
+          <w:cnfStyle w:val="100000000000" w:firstRow="1" w:lastRow="0" w:firstColumn="0" w:lastColumn="0" w:oddVBand="0" w:evenVBand="0" w:oddHBand="0" w:evenHBand="0" w:firstRowFirstColumn="0" w:firstRowLastColumn="0" w:lastRowFirstColumn="0" w:lastRowLastColumn="0"/>
+        </w:trPr>
+        <w:tc>
+          <w:tcPr>
+            <w:cnfStyle w:val="001000000000" w:firstRow="0" w:lastRow="0" w:firstColumn="1" w:lastColumn="0" w:oddVBand="0" w:evenVBand="0" w:oddHBand="0" w:evenHBand="0" w:firstRowFirstColumn="0" w:firstRowLastColumn="0" w:lastRowFirstColumn="0" w:lastRowLastColumn="0"/>
+            <w:tcW w:w="3209" w:type="dxa"/>
+            <w:tcBorders>
+              <w:top w:val="none" w:sz="0" w:space="0" w:color="auto"/>
+              <w:bottom w:val="none" w:sz="0" w:space="0" w:color="auto"/>
+              <w:right w:val="none" w:sz="0" w:space="0" w:color="auto"/>
+            </w:tcBorders>
+          </w:tcPr>
+          <w:p>
+            <w:r>
+              <w:t>Was</w:t>
+            </w:r>
+          </w:p>
+        </w:tc>
+        <w:tc>
+          <w:tcPr>
+            <w:tcW w:w="3209" w:type="dxa"/>
+            <w:tcBorders>
+              <w:top w:val="none" w:sz="0" w:space="0" w:color="auto"/>
+              <w:left w:val="none" w:sz="0" w:space="0" w:color="auto"/>
+              <w:bottom w:val="none" w:sz="0" w:space="0" w:color="auto"/>
+              <w:right w:val="none" w:sz="0" w:space="0" w:color="auto"/>
+            </w:tcBorders>
+          </w:tcPr>
+          <w:p>
+            <w:pPr>
+              <w:cnfStyle w:val="100000000000" w:firstRow="1" w:lastRow="0" w:firstColumn="0" w:lastColumn="0" w:oddVBand="0" w:evenVBand="0" w:oddHBand="0" w:evenHBand="0" w:firstRowFirstColumn="0" w:firstRowLastColumn="0" w:lastRowFirstColumn="0" w:lastRowLastColumn="0"/>
+            </w:pPr>
+            <w:r>
+              <w:t>Wer</w:t>
+            </w:r>
+          </w:p>
+        </w:tc>
+        <w:tc>
+          <w:tcPr>
+            <w:tcW w:w="3210" w:type="dxa"/>
+            <w:tcBorders>
+              <w:top w:val="none" w:sz="0" w:space="0" w:color="auto"/>
+              <w:left w:val="none" w:sz="0" w:space="0" w:color="auto"/>
+              <w:bottom w:val="none" w:sz="0" w:space="0" w:color="auto"/>
+            </w:tcBorders>
+          </w:tcPr>
+          <w:p>
+            <w:pPr>
+              <w:cnfStyle w:val="100000000000" w:firstRow="1" w:lastRow="0" w:firstColumn="0" w:lastColumn="0" w:oddVBand="0" w:evenVBand="0" w:oddHBand="0" w:evenHBand="0" w:firstRowFirstColumn="0" w:firstRowLastColumn="0" w:lastRowFirstColumn="0" w:lastRowLastColumn="0"/>
+            </w:pPr>
+            <w:r>
+              <w:t>Zeit</w:t>
+            </w:r>
+          </w:p>
+        </w:tc>
+      </w:tr>
+      <w:tr>
+        <w:trPr>
+          <w:cnfStyle w:val="000000100000" w:firstRow="0" w:lastRow="0" w:firstColumn="0" w:lastColumn="0" w:oddVBand="0" w:evenVBand="0" w:oddHBand="1" w:evenHBand="0" w:firstRowFirstColumn="0" w:firstRowLastColumn="0" w:lastRowFirstColumn="0" w:lastRowLastColumn="0"/>
+        </w:trPr>
+        <w:tc>
+          <w:tcPr>
+            <w:cnfStyle w:val="001000000000" w:firstRow="0" w:lastRow="0" w:firstColumn="1" w:lastColumn="0" w:oddVBand="0" w:evenVBand="0" w:oddHBand="0" w:evenHBand="0" w:firstRowFirstColumn="0" w:firstRowLastColumn="0" w:lastRowFirstColumn="0" w:lastRowLastColumn="0"/>
+            <w:tcW w:w="3209" w:type="dxa"/>
+          </w:tcPr>
+          <w:p>
+            <w:pPr>
+              <w:rPr>
+                <w:b w:val="0"/>
+                <w:bCs w:val="0"/>
+              </w:rPr>
+            </w:pPr>
+            <w:proofErr w:type="spellStart"/>
+            <w:r>
+              <w:rPr>
+                <w:b w:val="0"/>
+                <w:bCs w:val="0"/>
+              </w:rPr>
+              <w:t>Git</w:t>
+            </w:r>
+            <w:proofErr w:type="spellEnd"/>
+            <w:r>
+              <w:rPr>
+                <w:b w:val="0"/>
+                <w:bCs w:val="0"/>
+              </w:rPr>
+              <w:t>-Repo erstellt und</w:t>
+            </w:r>
+            <w:r>
+              <w:rPr>
+                <w:b w:val="0"/>
+                <w:bCs w:val="0"/>
+              </w:rPr>
+              <w:t xml:space="preserve"> getestet</w:t>
+            </w:r>
+          </w:p>
+        </w:tc>
+        <w:tc>
+          <w:tcPr>
+            <w:tcW w:w="3209" w:type="dxa"/>
+          </w:tcPr>
+          <w:p>
+            <w:pPr>
+              <w:cnfStyle w:val="000000100000" w:firstRow="0" w:lastRow="0" w:firstColumn="0" w:lastColumn="0" w:oddVBand="0" w:evenVBand="0" w:oddHBand="1" w:evenHBand="0" w:firstRowFirstColumn="0" w:firstRowLastColumn="0" w:lastRowFirstColumn="0" w:lastRowLastColumn="0"/>
+            </w:pPr>
+            <w:r>
+              <w:t>Hassan und Niki</w:t>
+            </w:r>
+          </w:p>
+        </w:tc>
+        <w:tc>
+          <w:tcPr>
+            <w:tcW w:w="3210" w:type="dxa"/>
+          </w:tcPr>
+          <w:p>
+            <w:pPr>
+              <w:cnfStyle w:val="000000100000" w:firstRow="0" w:lastRow="0" w:firstColumn="0" w:lastColumn="0" w:oddVBand="0" w:evenVBand="0" w:oddHBand="1" w:evenHBand="0" w:firstRowFirstColumn="0" w:firstRowLastColumn="0" w:lastRowFirstColumn="0" w:lastRowLastColumn="0"/>
+            </w:pPr>
+            <w:r>
+              <w:t>Ca 1-2h</w:t>
+            </w:r>
+          </w:p>
+        </w:tc>
+      </w:tr>
+      <w:tr>
+        <w:tc>
+          <w:tcPr>
+            <w:cnfStyle w:val="001000000000" w:firstRow="0" w:lastRow="0" w:firstColumn="1" w:lastColumn="0" w:oddVBand="0" w:evenVBand="0" w:oddHBand="0" w:evenHBand="0" w:firstRowFirstColumn="0" w:firstRowLastColumn="0" w:lastRowFirstColumn="0" w:lastRowLastColumn="0"/>
+            <w:tcW w:w="3209" w:type="dxa"/>
+          </w:tcPr>
+          <w:p>
+            <w:pPr>
+              <w:rPr>
+                <w:b w:val="0"/>
+                <w:bCs w:val="0"/>
+              </w:rPr>
+            </w:pPr>
+            <w:r>
+              <w:rPr>
+                <w:b w:val="0"/>
+                <w:bCs w:val="0"/>
+              </w:rPr>
+              <w:t>Flussdiagramm erstellt</w:t>
+            </w:r>
+          </w:p>
+        </w:tc>
+        <w:tc>
+          <w:tcPr>
+            <w:tcW w:w="3209" w:type="dxa"/>
+          </w:tcPr>
+          <w:p>
+            <w:pPr>
+              <w:cnfStyle w:val="000000000000" w:firstRow="0" w:lastRow="0" w:firstColumn="0" w:lastColumn="0" w:oddVBand="0" w:evenVBand="0" w:oddHBand="0" w:evenHBand="0" w:firstRowFirstColumn="0" w:firstRowLastColumn="0" w:lastRowFirstColumn="0" w:lastRowLastColumn="0"/>
+            </w:pPr>
+            <w:r>
+              <w:t>Hauptsächlich Niki</w:t>
+            </w:r>
+          </w:p>
+        </w:tc>
+        <w:tc>
+          <w:tcPr>
+            <w:tcW w:w="3210" w:type="dxa"/>
+          </w:tcPr>
+          <w:p>
+            <w:pPr>
+              <w:cnfStyle w:val="000000000000" w:firstRow="0" w:lastRow="0" w:firstColumn="0" w:lastColumn="0" w:oddVBand="0" w:evenVBand="0" w:oddHBand="0" w:evenHBand="0" w:firstRowFirstColumn="0" w:firstRowLastColumn="0" w:lastRowFirstColumn="0" w:lastRowLastColumn="0"/>
+            </w:pPr>
+            <w:r>
+              <w:t>2h</w:t>
+            </w:r>
+          </w:p>
+        </w:tc>
+      </w:tr>
+      <w:tr>
+        <w:trPr>
+          <w:cnfStyle w:val="000000100000" w:firstRow="0" w:lastRow="0" w:firstColumn="0" w:lastColumn="0" w:oddVBand="0" w:evenVBand="0" w:oddHBand="1" w:evenHBand="0" w:firstRowFirstColumn="0" w:firstRowLastColumn="0" w:lastRowFirstColumn="0" w:lastRowLastColumn="0"/>
+        </w:trPr>
+        <w:tc>
+          <w:tcPr>
+            <w:cnfStyle w:val="001000000000" w:firstRow="0" w:lastRow="0" w:firstColumn="1" w:lastColumn="0" w:oddVBand="0" w:evenVBand="0" w:oddHBand="0" w:evenHBand="0" w:firstRowFirstColumn="0" w:firstRowLastColumn="0" w:lastRowFirstColumn="0" w:lastRowLastColumn="0"/>
+            <w:tcW w:w="3209" w:type="dxa"/>
+          </w:tcPr>
+          <w:p>
+            <w:pPr>
+              <w:rPr>
+                <w:b w:val="0"/>
+                <w:bCs w:val="0"/>
+              </w:rPr>
+            </w:pPr>
+            <w:proofErr w:type="spellStart"/>
+            <w:r>
+              <w:rPr>
+                <w:b w:val="0"/>
+                <w:bCs w:val="0"/>
+              </w:rPr>
+              <w:t>Dokuvorlage</w:t>
+            </w:r>
+            <w:proofErr w:type="spellEnd"/>
+            <w:r>
+              <w:rPr>
+                <w:b w:val="0"/>
+                <w:bCs w:val="0"/>
+              </w:rPr>
+              <w:t xml:space="preserve"> erstellt</w:t>
+            </w:r>
+          </w:p>
+        </w:tc>
+        <w:tc>
+          <w:tcPr>
+            <w:tcW w:w="3209" w:type="dxa"/>
+          </w:tcPr>
+          <w:p>
+            <w:pPr>
+              <w:cnfStyle w:val="000000100000" w:firstRow="0" w:lastRow="0" w:firstColumn="0" w:lastColumn="0" w:oddVBand="0" w:evenVBand="0" w:oddHBand="1" w:evenHBand="0" w:firstRowFirstColumn="0" w:firstRowLastColumn="0" w:lastRowFirstColumn="0" w:lastRowLastColumn="0"/>
+              <w:rPr>
+                <w:lang w:val="fr-CH"/>
+              </w:rPr>
+            </w:pPr>
+            <w:r>
+              <w:rPr>
+                <w:lang w:val="fr-CH"/>
+              </w:rPr>
+              <w:t>Hassan</w:t>
+            </w:r>
+          </w:p>
+        </w:tc>
+        <w:tc>
+          <w:tcPr>
+            <w:tcW w:w="3210" w:type="dxa"/>
+          </w:tcPr>
+          <w:p>
+            <w:pPr>
+              <w:cnfStyle w:val="000000100000" w:firstRow="0" w:lastRow="0" w:firstColumn="0" w:lastColumn="0" w:oddVBand="0" w:evenVBand="0" w:oddHBand="1" w:evenHBand="0" w:firstRowFirstColumn="0" w:firstRowLastColumn="0" w:lastRowFirstColumn="0" w:lastRowLastColumn="0"/>
+            </w:pPr>
+            <w:r>
+              <w:t>0.5h</w:t>
+            </w:r>
+          </w:p>
+        </w:tc>
+      </w:tr>
+      <w:tr>
+        <w:tc>
+          <w:tcPr>
+            <w:cnfStyle w:val="001000000000" w:firstRow="0" w:lastRow="0" w:firstColumn="1" w:lastColumn="0" w:oddVBand="0" w:evenVBand="0" w:oddHBand="0" w:evenHBand="0" w:firstRowFirstColumn="0" w:firstRowLastColumn="0" w:lastRowFirstColumn="0" w:lastRowLastColumn="0"/>
+            <w:tcW w:w="3209" w:type="dxa"/>
+          </w:tcPr>
+          <w:p>
+            <w:pPr>
+              <w:rPr>
+                <w:b w:val="0"/>
+                <w:bCs w:val="0"/>
+              </w:rPr>
+            </w:pPr>
+            <w:r>
+              <w:rPr>
+                <w:b w:val="0"/>
+                <w:bCs w:val="0"/>
+              </w:rPr>
+              <w:t>Doku Einleitung, Ziele und Planung geschrieben</w:t>
+            </w:r>
+          </w:p>
+        </w:tc>
+        <w:tc>
+          <w:tcPr>
+            <w:tcW w:w="3209" w:type="dxa"/>
+          </w:tcPr>
+          <w:p>
+            <w:pPr>
+              <w:cnfStyle w:val="000000000000" w:firstRow="0" w:lastRow="0" w:firstColumn="0" w:lastColumn="0" w:oddVBand="0" w:evenVBand="0" w:oddHBand="0" w:evenHBand="0" w:firstRowFirstColumn="0" w:firstRowLastColumn="0" w:lastRowFirstColumn="0" w:lastRowLastColumn="0"/>
+            </w:pPr>
+            <w:r>
+              <w:t>Hassan</w:t>
+            </w:r>
+            <w:r>
+              <w:t xml:space="preserve"> und Niki</w:t>
+            </w:r>
+          </w:p>
+        </w:tc>
+        <w:tc>
+          <w:tcPr>
+            <w:tcW w:w="3210" w:type="dxa"/>
+          </w:tcPr>
+          <w:p>
+            <w:pPr>
+              <w:cnfStyle w:val="000000000000" w:firstRow="0" w:lastRow="0" w:firstColumn="0" w:lastColumn="0" w:oddVBand="0" w:evenVBand="0" w:oddHBand="0" w:evenHBand="0" w:firstRowFirstColumn="0" w:firstRowLastColumn="0" w:lastRowFirstColumn="0" w:lastRowLastColumn="0"/>
+            </w:pPr>
+            <w:r>
+              <w:t>3h</w:t>
+            </w:r>
+          </w:p>
+        </w:tc>
+      </w:tr>
+      <w:tr>
+        <w:trPr>
+          <w:cnfStyle w:val="000000100000" w:firstRow="0" w:lastRow="0" w:firstColumn="0" w:lastColumn="0" w:oddVBand="0" w:evenVBand="0" w:oddHBand="1" w:evenHBand="0" w:firstRowFirstColumn="0" w:firstRowLastColumn="0" w:lastRowFirstColumn="0" w:lastRowLastColumn="0"/>
+        </w:trPr>
+        <w:tc>
+          <w:tcPr>
+            <w:cnfStyle w:val="001000000000" w:firstRow="0" w:lastRow="0" w:firstColumn="1" w:lastColumn="0" w:oddVBand="0" w:evenVBand="0" w:oddHBand="0" w:evenHBand="0" w:firstRowFirstColumn="0" w:firstRowLastColumn="0" w:lastRowFirstColumn="0" w:lastRowLastColumn="0"/>
+            <w:tcW w:w="3209" w:type="dxa"/>
+          </w:tcPr>
+          <w:p>
+            <w:pPr>
+              <w:rPr>
+                <w:b w:val="0"/>
+                <w:bCs w:val="0"/>
+              </w:rPr>
+            </w:pPr>
+            <w:r>
+              <w:rPr>
+                <w:b w:val="0"/>
+                <w:bCs w:val="0"/>
+              </w:rPr>
+              <w:t>Zustandsautomat Vorlage erstellt</w:t>
+            </w:r>
+          </w:p>
+        </w:tc>
+        <w:tc>
+          <w:tcPr>
+            <w:tcW w:w="3209" w:type="dxa"/>
+          </w:tcPr>
+          <w:p>
+            <w:pPr>
+              <w:cnfStyle w:val="000000100000" w:firstRow="0" w:lastRow="0" w:firstColumn="0" w:lastColumn="0" w:oddVBand="0" w:evenVBand="0" w:oddHBand="1" w:evenHBand="0" w:firstRowFirstColumn="0" w:firstRowLastColumn="0" w:lastRowFirstColumn="0" w:lastRowLastColumn="0"/>
+            </w:pPr>
+            <w:r>
+              <w:t>Hassan</w:t>
+            </w:r>
+          </w:p>
+        </w:tc>
+        <w:tc>
+          <w:tcPr>
+            <w:tcW w:w="3210" w:type="dxa"/>
+          </w:tcPr>
+          <w:p>
+            <w:pPr>
+              <w:cnfStyle w:val="000000100000" w:firstRow="0" w:lastRow="0" w:firstColumn="0" w:lastColumn="0" w:oddVBand="0" w:evenVBand="0" w:oddHBand="1" w:evenHBand="0" w:firstRowFirstColumn="0" w:firstRowLastColumn="0" w:lastRowFirstColumn="0" w:lastRowLastColumn="0"/>
+            </w:pPr>
+            <w:r>
+              <w:t>1h</w:t>
+            </w:r>
+          </w:p>
+        </w:tc>
+      </w:tr>
+      <w:tr>
+        <w:tc>
+          <w:tcPr>
+            <w:cnfStyle w:val="001000000000" w:firstRow="0" w:lastRow="0" w:firstColumn="1" w:lastColumn="0" w:oddVBand="0" w:evenVBand="0" w:oddHBand="0" w:evenHBand="0" w:firstRowFirstColumn="0" w:firstRowLastColumn="0" w:lastRowFirstColumn="0" w:lastRowLastColumn="0"/>
+            <w:tcW w:w="3209" w:type="dxa"/>
+          </w:tcPr>
+          <w:p>
+            <w:pPr>
+              <w:rPr>
+                <w:b w:val="0"/>
+                <w:bCs w:val="0"/>
+              </w:rPr>
+            </w:pPr>
+            <w:r>
+              <w:rPr>
+                <w:b w:val="0"/>
+                <w:bCs w:val="0"/>
+              </w:rPr>
+              <w:t>Zustandsautomat vervollständigt</w:t>
+            </w:r>
+          </w:p>
+        </w:tc>
+        <w:tc>
+          <w:tcPr>
+            <w:tcW w:w="3209" w:type="dxa"/>
+          </w:tcPr>
+          <w:p>
+            <w:pPr>
+              <w:cnfStyle w:val="000000000000" w:firstRow="0" w:lastRow="0" w:firstColumn="0" w:lastColumn="0" w:oddVBand="0" w:evenVBand="0" w:oddHBand="0" w:evenHBand="0" w:firstRowFirstColumn="0" w:firstRowLastColumn="0" w:lastRowFirstColumn="0" w:lastRowLastColumn="0"/>
+            </w:pPr>
+            <w:r>
+              <w:t>Niki</w:t>
+            </w:r>
+          </w:p>
+        </w:tc>
+        <w:tc>
+          <w:tcPr>
+            <w:tcW w:w="3210" w:type="dxa"/>
+          </w:tcPr>
+          <w:p>
+            <w:pPr>
+              <w:cnfStyle w:val="000000000000" w:firstRow="0" w:lastRow="0" w:firstColumn="0" w:lastColumn="0" w:oddVBand="0" w:evenVBand="0" w:oddHBand="0" w:evenHBand="0" w:firstRowFirstColumn="0" w:firstRowLastColumn="0" w:lastRowFirstColumn="0" w:lastRowLastColumn="0"/>
+            </w:pPr>
+            <w:r>
+              <w:t>3h</w:t>
+            </w:r>
+          </w:p>
+        </w:tc>
+      </w:tr>
+      <w:tr>
+        <w:trPr>
+          <w:cnfStyle w:val="000000100000" w:firstRow="0" w:lastRow="0" w:firstColumn="0" w:lastColumn="0" w:oddVBand="0" w:evenVBand="0" w:oddHBand="1" w:evenHBand="0" w:firstRowFirstColumn="0" w:firstRowLastColumn="0" w:lastRowFirstColumn="0" w:lastRowLastColumn="0"/>
+        </w:trPr>
+        <w:tc>
+          <w:tcPr>
+            <w:cnfStyle w:val="001000000000" w:firstRow="0" w:lastRow="0" w:firstColumn="1" w:lastColumn="0" w:oddVBand="0" w:evenVBand="0" w:oddHBand="0" w:evenHBand="0" w:firstRowFirstColumn="0" w:firstRowLastColumn="0" w:lastRowFirstColumn="0" w:lastRowLastColumn="0"/>
+            <w:tcW w:w="3209" w:type="dxa"/>
+          </w:tcPr>
+          <w:p>
+            <w:pPr>
+              <w:rPr>
+                <w:b w:val="0"/>
+                <w:bCs w:val="0"/>
+              </w:rPr>
+            </w:pPr>
+            <w:r>
+              <w:rPr>
+                <w:b w:val="0"/>
+                <w:bCs w:val="0"/>
+              </w:rPr>
+              <w:t>Projekt Architektur</w:t>
+            </w:r>
+          </w:p>
+        </w:tc>
+        <w:tc>
+          <w:tcPr>
+            <w:tcW w:w="3209" w:type="dxa"/>
+          </w:tcPr>
+          <w:p>
+            <w:pPr>
+              <w:cnfStyle w:val="000000100000" w:firstRow="0" w:lastRow="0" w:firstColumn="0" w:lastColumn="0" w:oddVBand="0" w:evenVBand="0" w:oddHBand="1" w:evenHBand="0" w:firstRowFirstColumn="0" w:firstRowLastColumn="0" w:lastRowFirstColumn="0" w:lastRowLastColumn="0"/>
+            </w:pPr>
+            <w:r>
+              <w:t xml:space="preserve">Hassan </w:t>
+            </w:r>
+            <w:r>
+              <w:t>und Niki</w:t>
+            </w:r>
+          </w:p>
+        </w:tc>
+        <w:tc>
+          <w:tcPr>
+            <w:tcW w:w="3210" w:type="dxa"/>
+          </w:tcPr>
+          <w:p>
+            <w:pPr>
+              <w:cnfStyle w:val="000000100000" w:firstRow="0" w:lastRow="0" w:firstColumn="0" w:lastColumn="0" w:oddVBand="0" w:evenVBand="0" w:oddHBand="1" w:evenHBand="0" w:firstRowFirstColumn="0" w:firstRowLastColumn="0" w:lastRowFirstColumn="0" w:lastRowLastColumn="0"/>
+            </w:pPr>
+            <w:r>
+              <w:t>1h</w:t>
+            </w:r>
+          </w:p>
+        </w:tc>
+      </w:tr>
+      <w:tr>
+        <w:tc>
+          <w:tcPr>
+            <w:cnfStyle w:val="001000000000" w:firstRow="0" w:lastRow="0" w:firstColumn="1" w:lastColumn="0" w:oddVBand="0" w:evenVBand="0" w:oddHBand="0" w:evenHBand="0" w:firstRowFirstColumn="0" w:firstRowLastColumn="0" w:lastRowFirstColumn="0" w:lastRowLastColumn="0"/>
+            <w:tcW w:w="3209" w:type="dxa"/>
+          </w:tcPr>
+          <w:p>
+            <w:pPr>
+              <w:rPr>
+                <w:b w:val="0"/>
+                <w:bCs w:val="0"/>
+              </w:rPr>
+            </w:pPr>
+            <w:r>
+              <w:rPr>
+                <w:b w:val="0"/>
+                <w:bCs w:val="0"/>
+              </w:rPr>
+              <w:t>Säuberung Analyse</w:t>
+            </w:r>
+          </w:p>
+        </w:tc>
+        <w:tc>
+          <w:tcPr>
+            <w:tcW w:w="3209" w:type="dxa"/>
+          </w:tcPr>
+          <w:p>
+            <w:pPr>
+              <w:cnfStyle w:val="000000000000" w:firstRow="0" w:lastRow="0" w:firstColumn="0" w:lastColumn="0" w:oddVBand="0" w:evenVBand="0" w:oddHBand="0" w:evenHBand="0" w:firstRowFirstColumn="0" w:firstRowLastColumn="0" w:lastRowFirstColumn="0" w:lastRowLastColumn="0"/>
+            </w:pPr>
+            <w:r>
+              <w:t>Niki</w:t>
+            </w:r>
+          </w:p>
+        </w:tc>
+        <w:tc>
+          <w:tcPr>
+            <w:tcW w:w="3210" w:type="dxa"/>
+          </w:tcPr>
+          <w:p>
+            <w:pPr>
+              <w:cnfStyle w:val="000000000000" w:firstRow="0" w:lastRow="0" w:firstColumn="0" w:lastColumn="0" w:oddVBand="0" w:evenVBand="0" w:oddHBand="0" w:evenHBand="0" w:firstRowFirstColumn="0" w:firstRowLastColumn="0" w:lastRowFirstColumn="0" w:lastRowLastColumn="0"/>
+            </w:pPr>
+            <w:r>
+              <w:t>1h</w:t>
+            </w:r>
+          </w:p>
+        </w:tc>
+      </w:tr>
+      <w:tr>
+        <w:trPr>
+          <w:cnfStyle w:val="000000100000" w:firstRow="0" w:lastRow="0" w:firstColumn="0" w:lastColumn="0" w:oddVBand="0" w:evenVBand="0" w:oddHBand="1" w:evenHBand="0" w:firstRowFirstColumn="0" w:firstRowLastColumn="0" w:lastRowFirstColumn="0" w:lastRowLastColumn="0"/>
+        </w:trPr>
+        <w:tc>
+          <w:tcPr>
+            <w:cnfStyle w:val="001000000000" w:firstRow="0" w:lastRow="0" w:firstColumn="1" w:lastColumn="0" w:oddVBand="0" w:evenVBand="0" w:oddHBand="0" w:evenHBand="0" w:firstRowFirstColumn="0" w:firstRowLastColumn="0" w:lastRowFirstColumn="0" w:lastRowLastColumn="0"/>
+            <w:tcW w:w="3209" w:type="dxa"/>
+          </w:tcPr>
+          <w:p>
+            <w:pPr>
+              <w:rPr>
+                <w:b w:val="0"/>
+                <w:bCs w:val="0"/>
+              </w:rPr>
+            </w:pPr>
+            <w:r>
+              <w:rPr>
+                <w:b w:val="0"/>
+                <w:bCs w:val="0"/>
+              </w:rPr>
+              <w:t xml:space="preserve">LASAL-Projekt erstellt für </w:t>
+            </w:r>
+            <w:proofErr w:type="spellStart"/>
+            <w:r>
+              <w:rPr>
+                <w:b w:val="0"/>
+                <w:bCs w:val="0"/>
+              </w:rPr>
+              <w:t>Git</w:t>
+            </w:r>
+            <w:proofErr w:type="spellEnd"/>
+            <w:r>
+              <w:rPr>
+                <w:b w:val="0"/>
+                <w:bCs w:val="0"/>
+              </w:rPr>
+              <w:t>-Tests</w:t>
+            </w:r>
+          </w:p>
+        </w:tc>
+        <w:tc>
+          <w:tcPr>
+            <w:tcW w:w="3209" w:type="dxa"/>
+          </w:tcPr>
+          <w:p>
+            <w:pPr>
+              <w:cnfStyle w:val="000000100000" w:firstRow="0" w:lastRow="0" w:firstColumn="0" w:lastColumn="0" w:oddVBand="0" w:evenVBand="0" w:oddHBand="1" w:evenHBand="0" w:firstRowFirstColumn="0" w:firstRowLastColumn="0" w:lastRowFirstColumn="0" w:lastRowLastColumn="0"/>
+            </w:pPr>
+            <w:r>
+              <w:t>Hassan und Niki</w:t>
+            </w:r>
+          </w:p>
+        </w:tc>
+        <w:tc>
+          <w:tcPr>
+            <w:tcW w:w="3210" w:type="dxa"/>
+          </w:tcPr>
+          <w:p>
+            <w:pPr>
+              <w:cnfStyle w:val="000000100000" w:firstRow="0" w:lastRow="0" w:firstColumn="0" w:lastColumn="0" w:oddVBand="0" w:evenVBand="0" w:oddHBand="1" w:evenHBand="0" w:firstRowFirstColumn="0" w:firstRowLastColumn="0" w:lastRowFirstColumn="0" w:lastRowLastColumn="0"/>
+            </w:pPr>
+            <w:r>
+              <w:t>0.5h</w:t>
+            </w:r>
+          </w:p>
+        </w:tc>
+      </w:tr>
+      <w:tr>
+        <w:tc>
+          <w:tcPr>
+            <w:cnfStyle w:val="001000000000" w:firstRow="0" w:lastRow="0" w:firstColumn="1" w:lastColumn="0" w:oddVBand="0" w:evenVBand="0" w:oddHBand="0" w:evenHBand="0" w:firstRowFirstColumn="0" w:firstRowLastColumn="0" w:lastRowFirstColumn="0" w:lastRowLastColumn="0"/>
+            <w:tcW w:w="3209" w:type="dxa"/>
+          </w:tcPr>
+          <w:p>
+            <w:pPr>
+              <w:rPr>
+                <w:b w:val="0"/>
+                <w:bCs w:val="0"/>
+              </w:rPr>
+            </w:pPr>
+            <w:r>
+              <w:rPr>
+                <w:b w:val="0"/>
+                <w:bCs w:val="0"/>
+              </w:rPr>
+              <w:t xml:space="preserve">Testklasse für </w:t>
+            </w:r>
+            <w:proofErr w:type="spellStart"/>
+            <w:r>
+              <w:rPr>
+                <w:b w:val="0"/>
+                <w:bCs w:val="0"/>
+              </w:rPr>
+              <w:t>Git</w:t>
+            </w:r>
+            <w:proofErr w:type="spellEnd"/>
+            <w:r>
+              <w:rPr>
+                <w:b w:val="0"/>
+                <w:bCs w:val="0"/>
+              </w:rPr>
+              <w:t>-Test</w:t>
+            </w:r>
+          </w:p>
+        </w:tc>
+        <w:tc>
+          <w:tcPr>
+            <w:tcW w:w="3209" w:type="dxa"/>
+          </w:tcPr>
+          <w:p>
+            <w:pPr>
+              <w:cnfStyle w:val="000000000000" w:firstRow="0" w:lastRow="0" w:firstColumn="0" w:lastColumn="0" w:oddVBand="0" w:evenVBand="0" w:oddHBand="0" w:evenHBand="0" w:firstRowFirstColumn="0" w:firstRowLastColumn="0" w:lastRowFirstColumn="0" w:lastRowLastColumn="0"/>
+            </w:pPr>
+            <w:r>
+              <w:t>Hassan</w:t>
+            </w:r>
+          </w:p>
+        </w:tc>
+        <w:tc>
+          <w:tcPr>
+            <w:tcW w:w="3210" w:type="dxa"/>
+          </w:tcPr>
+          <w:p>
+            <w:pPr>
+              <w:cnfStyle w:val="000000000000" w:firstRow="0" w:lastRow="0" w:firstColumn="0" w:lastColumn="0" w:oddVBand="0" w:evenVBand="0" w:oddHBand="0" w:evenHBand="0" w:firstRowFirstColumn="0" w:firstRowLastColumn="0" w:lastRowFirstColumn="0" w:lastRowLastColumn="0"/>
+            </w:pPr>
+            <w:r>
+              <w:t>0.5h</w:t>
+            </w:r>
+          </w:p>
+        </w:tc>
+      </w:tr>
+      <w:tr>
+        <w:trPr>
+          <w:cnfStyle w:val="000000100000" w:firstRow="0" w:lastRow="0" w:firstColumn="0" w:lastColumn="0" w:oddVBand="0" w:evenVBand="0" w:oddHBand="1" w:evenHBand="0" w:firstRowFirstColumn="0" w:firstRowLastColumn="0" w:lastRowFirstColumn="0" w:lastRowLastColumn="0"/>
+        </w:trPr>
+        <w:tc>
+          <w:tcPr>
+            <w:cnfStyle w:val="001000000000" w:firstRow="0" w:lastRow="0" w:firstColumn="1" w:lastColumn="0" w:oddVBand="0" w:evenVBand="0" w:oddHBand="0" w:evenHBand="0" w:firstRowFirstColumn="0" w:firstRowLastColumn="0" w:lastRowFirstColumn="0" w:lastRowLastColumn="0"/>
+            <w:tcW w:w="3209" w:type="dxa"/>
+          </w:tcPr>
+          <w:p>
+            <w:pPr>
+              <w:rPr>
+                <w:b w:val="0"/>
+                <w:bCs w:val="0"/>
+              </w:rPr>
+            </w:pPr>
+            <w:r>
+              <w:rPr>
+                <w:b w:val="0"/>
+                <w:bCs w:val="0"/>
+              </w:rPr>
+              <w:t>Steuerung geholt und erfolglos getestet</w:t>
+            </w:r>
+          </w:p>
+        </w:tc>
+        <w:tc>
+          <w:tcPr>
+            <w:tcW w:w="3209" w:type="dxa"/>
+          </w:tcPr>
+          <w:p>
+            <w:pPr>
+              <w:cnfStyle w:val="000000100000" w:firstRow="0" w:lastRow="0" w:firstColumn="0" w:lastColumn="0" w:oddVBand="0" w:evenVBand="0" w:oddHBand="1" w:evenHBand="0" w:firstRowFirstColumn="0" w:firstRowLastColumn="0" w:lastRowFirstColumn="0" w:lastRowLastColumn="0"/>
+            </w:pPr>
+            <w:r>
+              <w:t>Hassan</w:t>
+            </w:r>
+          </w:p>
+        </w:tc>
+        <w:tc>
+          <w:tcPr>
+            <w:tcW w:w="3210" w:type="dxa"/>
+          </w:tcPr>
+          <w:p>
+            <w:pPr>
+              <w:cnfStyle w:val="000000100000" w:firstRow="0" w:lastRow="0" w:firstColumn="0" w:lastColumn="0" w:oddVBand="0" w:evenVBand="0" w:oddHBand="1" w:evenHBand="0" w:firstRowFirstColumn="0" w:firstRowLastColumn="0" w:lastRowFirstColumn="0" w:lastRowLastColumn="0"/>
+            </w:pPr>
+            <w:r>
+              <w:t>2h+</w:t>
+            </w:r>
+          </w:p>
+        </w:tc>
+      </w:tr>
+      <w:tr>
+        <w:tc>
+          <w:tcPr>
+            <w:cnfStyle w:val="001000000000" w:firstRow="0" w:lastRow="0" w:firstColumn="1" w:lastColumn="0" w:oddVBand="0" w:evenVBand="0" w:oddHBand="0" w:evenHBand="0" w:firstRowFirstColumn="0" w:firstRowLastColumn="0" w:lastRowFirstColumn="0" w:lastRowLastColumn="0"/>
+            <w:tcW w:w="3209" w:type="dxa"/>
+          </w:tcPr>
+          <w:p>
+            <w:pPr>
+              <w:rPr>
+                <w:b w:val="0"/>
+                <w:bCs w:val="0"/>
+              </w:rPr>
+            </w:pPr>
+            <w:r>
+              <w:rPr>
+                <w:b w:val="0"/>
+                <w:bCs w:val="0"/>
+              </w:rPr>
+              <w:t>Gesamt Doku</w:t>
+            </w:r>
+          </w:p>
+        </w:tc>
+        <w:tc>
+          <w:tcPr>
+            <w:tcW w:w="3209" w:type="dxa"/>
+          </w:tcPr>
+          <w:p>
+            <w:pPr>
+              <w:cnfStyle w:val="000000000000" w:firstRow="0" w:lastRow="0" w:firstColumn="0" w:lastColumn="0" w:oddVBand="0" w:evenVBand="0" w:oddHBand="0" w:evenHBand="0" w:firstRowFirstColumn="0" w:firstRowLastColumn="0" w:lastRowFirstColumn="0" w:lastRowLastColumn="0"/>
+            </w:pPr>
+            <w:r>
+              <w:t>Hassan und Niki</w:t>
+            </w:r>
+          </w:p>
+        </w:tc>
+        <w:tc>
+          <w:tcPr>
+            <w:tcW w:w="3210" w:type="dxa"/>
+          </w:tcPr>
+          <w:p>
+            <w:pPr>
+              <w:cnfStyle w:val="000000000000" w:firstRow="0" w:lastRow="0" w:firstColumn="0" w:lastColumn="0" w:oddVBand="0" w:evenVBand="0" w:oddHBand="0" w:evenHBand="0" w:firstRowFirstColumn="0" w:firstRowLastColumn="0" w:lastRowFirstColumn="0" w:lastRowLastColumn="0"/>
+            </w:pPr>
+            <w:r>
+              <w:t>5h+ bis jetzt</w:t>
+            </w:r>
+          </w:p>
+        </w:tc>
+      </w:tr>
+    </w:tbl>
+    <w:p/>
+    <w:p>
+      <w:r>
+        <w:t>Gesamtaufwand: 14.5h</w:t>
+      </w:r>
+    </w:p>
+    <w:p/>
+    <w:p/>
+    <w:p/>
+    <w:p/>
+    <w:p/>
+    <w:p/>
+    <w:p/>
+    <w:p/>
+    <w:p/>
+    <w:p/>
+    <w:p/>
+    <w:p/>
+    <w:p/>
+    <w:p/>
+    <w:p/>
+    <w:p/>
+    <w:p>
+      <w:pPr>
+        <w:pStyle w:val="berschrift1"/>
+        <w:numPr>
+          <w:ilvl w:val="0"/>
+          <w:numId w:val="0"/>
+        </w:numPr>
+      </w:pPr>
+      <w:bookmarkStart w:id="16" w:name="_Toc231874438"/>
+      <w:r>
+        <w:lastRenderedPageBreak/>
         <w:t>Selbständigkeitserklärung</w:t>
       </w:r>
-      <w:bookmarkEnd w:id="4"/>
+      <w:bookmarkEnd w:id="16"/>
     </w:p>
     <w:p>
       <w:r>
@@ -1564,6 +3967,11 @@
       </w:r>
     </w:p>
     <w:p>
+      <w:pPr>
+        <w:rPr>
+          <w:noProof/>
+        </w:rPr>
+      </w:pPr>
       <w:r>
         <w:rPr>
           <w:noProof/>
@@ -1584,7 +3992,7 @@
                     <pic:cNvPicPr/>
                   </pic:nvPicPr>
                   <pic:blipFill>
-                    <a:blip r:embed="rId15"/>
+                    <a:blip r:embed="rId19"/>
                     <a:stretch>
                       <a:fillRect/>
                     </a:stretch>
@@ -1630,7 +4038,7 @@
                     <pic:cNvPicPr/>
                   </pic:nvPicPr>
                   <pic:blipFill>
-                    <a:blip r:embed="rId16" cstate="print">
+                    <a:blip r:embed="rId20" cstate="print">
                       <a:extLst>
                         <a:ext uri="{28A0092B-C50C-407E-A947-70E740481C1C}">
                           <a14:useLocalDpi xmlns:a14="http://schemas.microsoft.com/office/drawing/2010/main" val="0"/>
@@ -1659,18 +4067,373 @@
     </w:p>
     <w:p>
       <w:pPr>
+        <w:rPr>
+          <w:noProof/>
+        </w:rPr>
+      </w:pPr>
+    </w:p>
+    <w:p>
+      <w:pPr>
+        <w:rPr>
+          <w:noProof/>
+        </w:rPr>
+      </w:pPr>
+    </w:p>
+    <w:p>
+      <w:pPr>
         <w:pStyle w:val="berschrift1"/>
         <w:numPr>
           <w:ilvl w:val="0"/>
           <w:numId w:val="0"/>
         </w:numPr>
-      </w:pPr>
-      <w:bookmarkStart w:id="5" w:name="_Toc231318007"/>
-      <w:r>
-        <w:t>Quellenverzeichnis</w:t>
-      </w:r>
-      <w:bookmarkEnd w:id="5"/>
-    </w:p>
+        <w:ind w:left="454" w:hanging="454"/>
+      </w:pPr>
+      <w:bookmarkStart w:id="17" w:name="_Toc231874439"/>
+      <w:r>
+        <w:lastRenderedPageBreak/>
+        <w:t>Abbildungsverzeichnis</w:t>
+      </w:r>
+      <w:bookmarkEnd w:id="17"/>
+    </w:p>
+    <w:p>
+      <w:pPr>
+        <w:pStyle w:val="Abbildungsverzeichnis"/>
+        <w:tabs>
+          <w:tab w:val="right" w:leader="dot" w:pos="9628"/>
+        </w:tabs>
+        <w:rPr>
+          <w:rFonts w:asciiTheme="minorHAnsi" w:eastAsiaTheme="minorEastAsia" w:hAnsiTheme="minorHAnsi"/>
+          <w:noProof/>
+          <w:kern w:val="2"/>
+          <w:sz w:val="24"/>
+          <w:szCs w:val="24"/>
+          <w:lang w:eastAsia="ja-JP"/>
+          <w14:ligatures w14:val="standardContextual"/>
+        </w:rPr>
+      </w:pPr>
+      <w:r>
+        <w:fldChar w:fldCharType="begin"/>
+      </w:r>
+      <w:r>
+        <w:instrText xml:space="preserve"> TOC \h \z \c "Abbildung" </w:instrText>
+      </w:r>
+      <w:r>
+        <w:fldChar w:fldCharType="separate"/>
+      </w:r>
+      <w:hyperlink w:anchor="_Toc231872781" w:history="1">
+        <w:r>
+          <w:rPr>
+            <w:rStyle w:val="Hyperlink"/>
+            <w:noProof/>
+          </w:rPr>
+          <w:t>Abbildung 1: Flussdiagramm der Aufzugssteuerung</w:t>
+        </w:r>
+        <w:r>
+          <w:rPr>
+            <w:noProof/>
+            <w:webHidden/>
+          </w:rPr>
+          <w:tab/>
+        </w:r>
+        <w:r>
+          <w:rPr>
+            <w:noProof/>
+            <w:webHidden/>
+          </w:rPr>
+          <w:fldChar w:fldCharType="begin"/>
+        </w:r>
+        <w:r>
+          <w:rPr>
+            <w:noProof/>
+            <w:webHidden/>
+          </w:rPr>
+          <w:instrText xml:space="preserve"> PAGEREF _Toc231872781 \h </w:instrText>
+        </w:r>
+        <w:r>
+          <w:rPr>
+            <w:noProof/>
+            <w:webHidden/>
+          </w:rPr>
+        </w:r>
+        <w:r>
+          <w:rPr>
+            <w:noProof/>
+            <w:webHidden/>
+          </w:rPr>
+          <w:fldChar w:fldCharType="separate"/>
+        </w:r>
+        <w:r>
+          <w:rPr>
+            <w:noProof/>
+            <w:webHidden/>
+          </w:rPr>
+          <w:t>4</w:t>
+        </w:r>
+        <w:r>
+          <w:rPr>
+            <w:noProof/>
+            <w:webHidden/>
+          </w:rPr>
+          <w:fldChar w:fldCharType="end"/>
+        </w:r>
+      </w:hyperlink>
+    </w:p>
+    <w:p>
+      <w:pPr>
+        <w:pStyle w:val="Abbildungsverzeichnis"/>
+        <w:tabs>
+          <w:tab w:val="right" w:leader="dot" w:pos="9628"/>
+        </w:tabs>
+        <w:rPr>
+          <w:rFonts w:asciiTheme="minorHAnsi" w:eastAsiaTheme="minorEastAsia" w:hAnsiTheme="minorHAnsi"/>
+          <w:noProof/>
+          <w:kern w:val="2"/>
+          <w:sz w:val="24"/>
+          <w:szCs w:val="24"/>
+          <w:lang w:eastAsia="ja-JP"/>
+          <w14:ligatures w14:val="standardContextual"/>
+        </w:rPr>
+      </w:pPr>
+      <w:hyperlink w:anchor="_Toc231872782" w:history="1">
+        <w:r>
+          <w:rPr>
+            <w:rStyle w:val="Hyperlink"/>
+            <w:noProof/>
+          </w:rPr>
+          <w:t>Abbildung 2: Zustandsautomat der Aufzugssteuerung</w:t>
+        </w:r>
+        <w:r>
+          <w:rPr>
+            <w:noProof/>
+            <w:webHidden/>
+          </w:rPr>
+          <w:tab/>
+        </w:r>
+        <w:r>
+          <w:rPr>
+            <w:noProof/>
+            <w:webHidden/>
+          </w:rPr>
+          <w:fldChar w:fldCharType="begin"/>
+        </w:r>
+        <w:r>
+          <w:rPr>
+            <w:noProof/>
+            <w:webHidden/>
+          </w:rPr>
+          <w:instrText xml:space="preserve"> PAGEREF _Toc231872782 \h </w:instrText>
+        </w:r>
+        <w:r>
+          <w:rPr>
+            <w:noProof/>
+            <w:webHidden/>
+          </w:rPr>
+        </w:r>
+        <w:r>
+          <w:rPr>
+            <w:noProof/>
+            <w:webHidden/>
+          </w:rPr>
+          <w:fldChar w:fldCharType="separate"/>
+        </w:r>
+        <w:r>
+          <w:rPr>
+            <w:noProof/>
+            <w:webHidden/>
+          </w:rPr>
+          <w:t>5</w:t>
+        </w:r>
+        <w:r>
+          <w:rPr>
+            <w:noProof/>
+            <w:webHidden/>
+          </w:rPr>
+          <w:fldChar w:fldCharType="end"/>
+        </w:r>
+      </w:hyperlink>
+    </w:p>
+    <w:p>
+      <w:pPr>
+        <w:pStyle w:val="Abbildungsverzeichnis"/>
+        <w:tabs>
+          <w:tab w:val="right" w:leader="dot" w:pos="9628"/>
+        </w:tabs>
+        <w:rPr>
+          <w:rFonts w:asciiTheme="minorHAnsi" w:eastAsiaTheme="minorEastAsia" w:hAnsiTheme="minorHAnsi"/>
+          <w:noProof/>
+          <w:kern w:val="2"/>
+          <w:sz w:val="24"/>
+          <w:szCs w:val="24"/>
+          <w:lang w:eastAsia="ja-JP"/>
+          <w14:ligatures w14:val="standardContextual"/>
+        </w:rPr>
+      </w:pPr>
+      <w:hyperlink w:anchor="_Toc231872783" w:history="1">
+        <w:r>
+          <w:rPr>
+            <w:rStyle w:val="Hyperlink"/>
+            <w:noProof/>
+          </w:rPr>
+          <w:t>Abbildung 3: Architektur der Aufzugssteuerung</w:t>
+        </w:r>
+        <w:r>
+          <w:rPr>
+            <w:noProof/>
+            <w:webHidden/>
+          </w:rPr>
+          <w:tab/>
+        </w:r>
+        <w:r>
+          <w:rPr>
+            <w:noProof/>
+            <w:webHidden/>
+          </w:rPr>
+          <w:fldChar w:fldCharType="begin"/>
+        </w:r>
+        <w:r>
+          <w:rPr>
+            <w:noProof/>
+            <w:webHidden/>
+          </w:rPr>
+          <w:instrText xml:space="preserve"> PAGEREF _Toc231872783 \h </w:instrText>
+        </w:r>
+        <w:r>
+          <w:rPr>
+            <w:noProof/>
+            <w:webHidden/>
+          </w:rPr>
+        </w:r>
+        <w:r>
+          <w:rPr>
+            <w:noProof/>
+            <w:webHidden/>
+          </w:rPr>
+          <w:fldChar w:fldCharType="separate"/>
+        </w:r>
+        <w:r>
+          <w:rPr>
+            <w:noProof/>
+            <w:webHidden/>
+          </w:rPr>
+          <w:t>6</w:t>
+        </w:r>
+        <w:r>
+          <w:rPr>
+            <w:noProof/>
+            <w:webHidden/>
+          </w:rPr>
+          <w:fldChar w:fldCharType="end"/>
+        </w:r>
+      </w:hyperlink>
+    </w:p>
+    <w:p>
+      <w:pPr>
+        <w:pStyle w:val="Abbildungsverzeichnis"/>
+        <w:tabs>
+          <w:tab w:val="right" w:leader="dot" w:pos="9628"/>
+        </w:tabs>
+        <w:rPr>
+          <w:rFonts w:asciiTheme="minorHAnsi" w:eastAsiaTheme="minorEastAsia" w:hAnsiTheme="minorHAnsi"/>
+          <w:noProof/>
+          <w:kern w:val="2"/>
+          <w:sz w:val="24"/>
+          <w:szCs w:val="24"/>
+          <w:lang w:eastAsia="ja-JP"/>
+          <w14:ligatures w14:val="standardContextual"/>
+        </w:rPr>
+      </w:pPr>
+      <w:hyperlink w:anchor="_Toc231872784" w:history="1">
+        <w:r>
+          <w:rPr>
+            <w:rStyle w:val="Hyperlink"/>
+            <w:noProof/>
+          </w:rPr>
+          <w:t>Abbildung 4: HMI-Skizze</w:t>
+        </w:r>
+        <w:r>
+          <w:rPr>
+            <w:noProof/>
+            <w:webHidden/>
+          </w:rPr>
+          <w:tab/>
+        </w:r>
+        <w:r>
+          <w:rPr>
+            <w:noProof/>
+            <w:webHidden/>
+          </w:rPr>
+          <w:fldChar w:fldCharType="begin"/>
+        </w:r>
+        <w:r>
+          <w:rPr>
+            <w:noProof/>
+            <w:webHidden/>
+          </w:rPr>
+          <w:instrText xml:space="preserve"> PAGEREF _Toc231872784 \h </w:instrText>
+        </w:r>
+        <w:r>
+          <w:rPr>
+            <w:noProof/>
+            <w:webHidden/>
+          </w:rPr>
+        </w:r>
+        <w:r>
+          <w:rPr>
+            <w:noProof/>
+            <w:webHidden/>
+          </w:rPr>
+          <w:fldChar w:fldCharType="separate"/>
+        </w:r>
+        <w:r>
+          <w:rPr>
+            <w:noProof/>
+            <w:webHidden/>
+          </w:rPr>
+          <w:t>7</w:t>
+        </w:r>
+        <w:r>
+          <w:rPr>
+            <w:noProof/>
+            <w:webHidden/>
+          </w:rPr>
+          <w:fldChar w:fldCharType="end"/>
+        </w:r>
+      </w:hyperlink>
+    </w:p>
+    <w:p>
+      <w:r>
+        <w:fldChar w:fldCharType="end"/>
+      </w:r>
+    </w:p>
+    <w:p/>
+    <w:p/>
+    <w:p/>
+    <w:p/>
+    <w:p/>
+    <w:p/>
+    <w:p/>
+    <w:p/>
+    <w:p/>
+    <w:p/>
+    <w:p/>
+    <w:p/>
+    <w:p/>
+    <w:p/>
+    <w:p/>
+    <w:p/>
+    <w:p/>
+    <w:p/>
+    <w:p/>
+    <w:p/>
+    <w:p/>
+    <w:p/>
+    <w:p/>
+    <w:p/>
+    <w:p/>
+    <w:p/>
+    <w:p/>
+    <w:p/>
+    <w:p/>
     <w:p>
       <w:pPr>
         <w:pStyle w:val="berschrift1"/>
@@ -1678,69 +4441,251 @@
           <w:ilvl w:val="0"/>
           <w:numId w:val="0"/>
         </w:numPr>
-        <w:ind w:left="454"/>
-      </w:pPr>
-      <w:bookmarkStart w:id="6" w:name="_Toc231318008"/>
-      <w:r>
+      </w:pPr>
+      <w:bookmarkStart w:id="18" w:name="_Toc231874440"/>
+      <w:r>
+        <w:lastRenderedPageBreak/>
+        <w:t>Quellenverzeichnis</w:t>
+      </w:r>
+      <w:bookmarkEnd w:id="18"/>
+    </w:p>
+    <w:p>
+      <w:r>
+        <w:t>[1] Modul Steuerungstechnik II: Wegleitung zu Case Study Steuerungstechnik, Case Study IV, 2026. Unterrichtsunterlage.</w:t>
+      </w:r>
+    </w:p>
+    <w:p>
+      <w:r>
+        <w:t>[2] Modul Steuerungstechnik II: Bewertung Case Study IV Steuerungstechnik II, Bewertungsraster zur Case Study IV, 20.05.2026. Unterrichtsunterlage.</w:t>
+      </w:r>
+    </w:p>
+    <w:p>
+      <w:r>
+        <w:t xml:space="preserve">[3] Modul Steuerungstechnik II: </w:t>
+      </w:r>
+      <w:proofErr w:type="gramStart"/>
+      <w:r>
+        <w:t>SPS Namenskonventionen</w:t>
+      </w:r>
+      <w:proofErr w:type="gramEnd"/>
+      <w:r>
+        <w:t xml:space="preserve"> – </w:t>
+      </w:r>
+      <w:proofErr w:type="spellStart"/>
+      <w:r>
+        <w:t>Cheatsheet</w:t>
+      </w:r>
+      <w:proofErr w:type="spellEnd"/>
+      <w:r>
+        <w:t>, 2026. Unterrichtsunterlage.</w:t>
+      </w:r>
+    </w:p>
+    <w:p>
+      <w:r>
+        <w:t xml:space="preserve">[4] Modul Steuerungstechnik II: SCL / ST </w:t>
+      </w:r>
+      <w:proofErr w:type="spellStart"/>
+      <w:r>
+        <w:t>Cheatsheet</w:t>
+      </w:r>
+      <w:proofErr w:type="spellEnd"/>
+      <w:r>
+        <w:t xml:space="preserve"> – </w:t>
+      </w:r>
+      <w:proofErr w:type="spellStart"/>
+      <w:r>
+        <w:t>Sigmatek</w:t>
+      </w:r>
+      <w:proofErr w:type="spellEnd"/>
+      <w:r>
+        <w:t xml:space="preserve"> SPS, 2026. Unterrichtsunterlage.</w:t>
+      </w:r>
+    </w:p>
+    <w:p>
+      <w:r>
+        <w:t xml:space="preserve">[5] Modul Steuerungstechnik II: Datentypen </w:t>
+      </w:r>
+      <w:proofErr w:type="spellStart"/>
+      <w:r>
+        <w:t>Sigmatec</w:t>
+      </w:r>
+      <w:proofErr w:type="spellEnd"/>
+      <w:r>
+        <w:t xml:space="preserve"> Steuerungen, 2026. Unterrichtsunterlage.</w:t>
+      </w:r>
+    </w:p>
+    <w:p>
+      <w:r>
+        <w:t>[6] Modul Steuerungstechnik II: Programmieren in Structured Text, 31.03.2023. Unterrichtsunterlage.</w:t>
+      </w:r>
+    </w:p>
+    <w:p>
+      <w:r>
+        <w:t>[7] Modul Steuerungstechnik II: Anleitung LASAL &amp; VISU Designer, 2026. Unterrichtsunterlage.</w:t>
+      </w:r>
+    </w:p>
+    <w:p>
+      <w:r>
+        <w:t xml:space="preserve">[8] Modul Steuerungstechnik II: Anleitung – Debugger in LASAL / </w:t>
+      </w:r>
+      <w:proofErr w:type="spellStart"/>
+      <w:r>
+        <w:t>Sigmatec</w:t>
+      </w:r>
+      <w:proofErr w:type="spellEnd"/>
+      <w:r>
+        <w:t xml:space="preserve"> SCL, 2026. Unterrichtsunterlage.</w:t>
+      </w:r>
+    </w:p>
+    <w:p>
+      <w:r>
+        <w:t xml:space="preserve">[9] Modul Steuerungstechnik II: IBW </w:t>
+      </w:r>
+      <w:proofErr w:type="spellStart"/>
+      <w:r>
+        <w:t>Sigmatek</w:t>
+      </w:r>
+      <w:proofErr w:type="spellEnd"/>
+      <w:r>
+        <w:t xml:space="preserve"> Anleitung Motoren, 2026. Unterrichtsunterlage.</w:t>
+      </w:r>
+    </w:p>
+    <w:p>
+      <w:r>
+        <w:t>[10] SIGMATEK GmbH &amp; Co KG: LASAL CLASS 2 / VISU Designer Entwicklungsumgebung, verwendete Softwar</w:t>
+      </w:r>
+      <w:r>
+        <w:t>e</w:t>
+      </w:r>
+      <w:r>
+        <w:t xml:space="preserve"> für SPS-Programmierung und HMI-Visualisierung, 2026.</w:t>
+      </w:r>
+    </w:p>
+    <w:p>
+      <w:r>
+        <w:t>[11] diagrams.net / draw.io: Erstellung der Diagramme und Skizzen für Flussdiagramm, Zustandsautomat, Architekturzeichnung und HMI-Wireframe. https://www.diagrams.net/, verwendet im Juni 2026.</w:t>
+      </w:r>
+    </w:p>
+    <w:p>
+      <w:r>
+        <w:t>[12] GitHub: Versionsverwaltung des Projektstands und der Dokumentationsdateien. https://github.com/, verwendet im Juni 2026.</w:t>
+      </w:r>
+    </w:p>
+    <w:p>
+      <w:r>
+        <w:t>[13] OpenAI ChatGPT: Unterstützung bei der sprachlichen Überarbeitung der Dokumentation, bei der Strukturierung der Anforderungen, bei der Ausarbeitung des Planungskapitels sowie bei Vorschlägen für Zustandsautomat, Architekturzeichnung und HMI-Skizze. Verwendet im Juni 2026.</w:t>
+      </w:r>
+    </w:p>
+    <w:p>
+      <w:r>
+        <w:t>[14] GitHub Copilot: Unterstützung bei Codevorschlägen, Fehlersuche und technischen Formulierungsvarianten während der Projektarbeit. Verwendet im Juni 2026.</w:t>
+      </w:r>
+    </w:p>
+    <w:p/>
+    <w:p/>
+    <w:p/>
+    <w:p/>
+    <w:p/>
+    <w:p/>
+    <w:p/>
+    <w:p/>
+    <w:p/>
+    <w:p/>
+    <w:p>
+      <w:pPr>
+        <w:pStyle w:val="berschrift1"/>
+        <w:numPr>
+          <w:ilvl w:val="0"/>
+          <w:numId w:val="0"/>
+        </w:numPr>
+        <w:ind w:left="454" w:hanging="454"/>
+      </w:pPr>
+      <w:bookmarkStart w:id="19" w:name="_Toc231874441"/>
+      <w:r>
+        <w:lastRenderedPageBreak/>
         <w:t>Einsatz von KI-Tools</w:t>
       </w:r>
-      <w:bookmarkEnd w:id="6"/>
-    </w:p>
+      <w:bookmarkEnd w:id="19"/>
+    </w:p>
+    <w:p>
+      <w:r>
+        <w:t>Während der Bearbeitung wurden KI-Tools unterstützend eingesetzt. OpenAI ChatGPT wurde für die sprachliche Überarbeitung einzelner Dokumentationsabschnitte, die Strukturierung der Anforderungen sowie für Vorschläge zu Planung, Zustandsautomat, Architekturzeichnung und HMI-Skizze verwendet. Die vorgeschlagenen Inhalte wurden überprüft, angepasst und mit der eigenen Aufgabenstellung abgeglichen.</w:t>
+      </w:r>
+    </w:p>
+    <w:p/>
+    <w:p>
+      <w:r>
+        <w:t xml:space="preserve">GitHub Copilot wurde unterstützend bei der Programmierung, bei Codevorschlägen und bei der Fehlersuche eingesetzt. Die Vorschläge wurden nicht unverändert übernommen, sondern geprüft und an die verwendete SIGMATEK-SPS, die geplante State </w:t>
+      </w:r>
+      <w:proofErr w:type="spellStart"/>
+      <w:r>
+        <w:t>Machine</w:t>
+      </w:r>
+      <w:proofErr w:type="spellEnd"/>
+      <w:r>
+        <w:t xml:space="preserve"> und die vorhandene Projektstruktur angepasst.</w:t>
+      </w:r>
+    </w:p>
+    <w:p/>
+    <w:p>
+      <w:r>
+        <w:t>Die fachlichen Entscheidungen, die Projektidee, die Anforderungen, die Planung, die Umsetzung und die Tests wurden von der Projektgruppe kontrolliert und verantwortet. KI-Tools dienten ausschliesslich als Hilfsmittel zur Unterstützung bei Formulierung, Strukturierung und technischer Ausarbeitung.</w:t>
+      </w:r>
+    </w:p>
+    <w:p>
+      <w:pPr>
+        <w:pStyle w:val="berschrift1"/>
+        <w:numPr>
+          <w:ilvl w:val="0"/>
+          <w:numId w:val="0"/>
+        </w:numPr>
+        <w:ind w:left="454" w:hanging="454"/>
+      </w:pPr>
+      <w:bookmarkStart w:id="20" w:name="_Toc231874442"/>
+      <w:r>
+        <w:t>Verwendete KI-Prompts</w:t>
+      </w:r>
+      <w:bookmarkEnd w:id="20"/>
+    </w:p>
+    <w:p>
+      <w:pPr>
+        <w:pStyle w:val="Listenabsatz"/>
+        <w:numPr>
+          <w:ilvl w:val="6"/>
+          <w:numId w:val="1"/>
+        </w:numPr>
+      </w:pPr>
+      <w:r>
+        <w:t>Für die Erstellung der HMI-Skizze wurde folgender Prompt verwendet:</w:t>
+      </w:r>
+    </w:p>
+    <w:p/>
+    <w:p>
+      <w:r>
+        <w:t>„</w:t>
+      </w:r>
+      <w:r>
+        <w:t>Erstelle eine einfache HMI-Skizze als Wireframe für eine SPS-Aufzugssteuerung mit vier Etagen. Die Skizze soll für ein 1024x600-HMI geeignet sein und schlicht, übersichtlich und technisch wirken. Links soll ein einfacher Lift mit vier Etagen und einer Kabine dargestellt werden. Daneben sollen vier Etagenwahltaster für Etage 1 bis 4 sichtbar sein. Rechts sollen Statusfelder für aktuelle Etage, Ziel-Etage, Fahrtrichtung und Türzustand dargestellt werden. Zusätzlich sollen zwei einfache Taster für „Tür Auf“ und „Tür Zu“ vorhanden sein. Ein kleiner Bereich für Störung/Bonus soll „Notstopp“ und „Lichtschranke“ enthalten. Die Darstellung soll nicht fotorealistisch sein, sondern wie eine technische Konzeptskizze für eine Projektdokumentation aussehen.</w:t>
+      </w:r>
+      <w:r>
+        <w:t>“</w:t>
+      </w:r>
+    </w:p>
+    <w:p/>
+    <w:p>
+      <w:r>
+        <w:t>Die erzeugte Skizze wurde geprüft und an die eigene Projektstruktur angepasst.</w:t>
+      </w:r>
+    </w:p>
+    <w:p/>
     <w:p>
       <w:pPr>
         <w:spacing w:after="160"/>
       </w:pPr>
-      <w:r>
-        <w:t>Während der Bearbeitung wurden KI-Tools unterstützend eingesetzt. GitHub Copilot wurde vor allem bei der Umsetzung des Codes, beim Erstellen von Testskripten und bei der Fehlersuche verwendet. Besonders beim Test des externen SSD1306-Displays half Copilot dabei, einen ersten Testcode zu erstellen und mögliche Fehlerquellen schneller zu erkennen.</w:t>
-      </w:r>
-    </w:p>
-    <w:p>
-      <w:pPr>
-        <w:spacing w:after="160"/>
-      </w:pPr>
-      <w:r>
-        <w:t xml:space="preserve">Die Vorschläge von Copilot wurden nicht unverändert übernommen, sondern geprüft, angepasst und mit dem eigenen Projekt abgeglichen. Dadurch konnte der Code besser verstanden und gezielt auf die eigene State </w:t>
-      </w:r>
-      <w:proofErr w:type="spellStart"/>
-      <w:r>
-        <w:t>Machine</w:t>
-      </w:r>
-      <w:proofErr w:type="spellEnd"/>
-      <w:r>
-        <w:t xml:space="preserve"> sowie die verwendete Hardware angepasst werden. Auch bei Problemen mit Bibliotheken, I2C-Erkennung und Display-Ausgabe war Copilot hilfreich, da verschiedene Lösungsansätze schneller ausprobiert werden konnten.</w:t>
-      </w:r>
-    </w:p>
-    <w:p>
-      <w:pPr>
-        <w:spacing w:after="160"/>
-      </w:pPr>
-      <w:r>
-        <w:t xml:space="preserve">Zusätzlich wurden KI-Tools zur sprachlichen Unterstützung verwendet. Dabei wurden Formulierungen verbessert, Texte gekürzt, Rechtschreibung korrigiert und einzelne Kapitel </w:t>
-      </w:r>
-      <w:r>
-        <w:lastRenderedPageBreak/>
-        <w:t>verständlicher formuliert. Die Inhalte wurden jedoch von uns überprüft und an unser eigenes Projekt angepasst.</w:t>
-      </w:r>
-    </w:p>
-    <w:p>
-      <w:pPr>
-        <w:spacing w:after="160"/>
-      </w:pPr>
-      <w:r>
-        <w:t xml:space="preserve">Der Einsatz von KI-Tools diente somit als Unterstützung bei Programmierung, Fehlersuche und sprachlicher Ausarbeitung. Die Projektidee, Planung, State </w:t>
-      </w:r>
-      <w:proofErr w:type="spellStart"/>
-      <w:r>
-        <w:t>Machine</w:t>
-      </w:r>
-      <w:proofErr w:type="spellEnd"/>
-      <w:r>
-        <w:t>, Tests und finale Umsetzung wurden von uns kontrolliert und auf das eigene Projekt übertragen.</w:t>
-      </w:r>
     </w:p>
     <w:sectPr>
-      <w:headerReference w:type="first" r:id="rId17"/>
-      <w:footerReference w:type="first" r:id="rId18"/>
+      <w:headerReference w:type="first" r:id="rId21"/>
+      <w:footerReference w:type="first" r:id="rId22"/>
       <w:pgSz w:w="11906" w:h="16838"/>
       <w:pgMar w:top="1418" w:right="1134" w:bottom="1134" w:left="1134" w:header="709" w:footer="709" w:gutter="0"/>
       <w:pgNumType w:start="1"/>
@@ -2081,10 +5026,10 @@
 <file path=word/numbering.xml><?xml version="1.0" encoding="utf-8"?>
 <w:numbering xmlns:wpc="http://schemas.microsoft.com/office/word/2010/wordprocessingCanvas" xmlns:cx="http://schemas.microsoft.com/office/drawing/2014/chartex" xmlns:cx1="http://schemas.microsoft.com/office/drawing/2015/9/8/chartex" xmlns:cx2="http://schemas.microsoft.com/office/drawing/2015/10/21/chartex" xmlns:cx3="http://schemas.microsoft.com/office/drawing/2016/5/9/chartex" xmlns:cx4="http://schemas.microsoft.com/office/drawing/2016/5/10/chartex" xmlns:cx5="http://schemas.microsoft.com/office/drawing/2016/5/11/chartex" xmlns:cx6="http://schemas.microsoft.com/office/drawing/2016/5/12/chartex" xmlns:cx7="http://schemas.microsoft.com/office/drawing/2016/5/13/chartex" xmlns:cx8="http://schemas.microsoft.com/office/drawing/2016/5/14/chartex" xmlns:mc="http://schemas.openxmlformats.org/markup-compatibility/2006" xmlns:aink="http://schemas.microsoft.com/office/drawing/2016/ink" xmlns:am3d="http://schemas.microsoft.com/office/drawing/2017/model3d" xmlns:o="urn:schemas-microsoft-com:office:office" xmlns:oel="http://schemas.microsoft.com/office/2019/extlst" xmlns:r="http://schemas.openxmlformats.org/officeDocument/2006/relationships" xmlns:m="http://schemas.openxmlformats.org/officeDocument/2006/math" xmlns:v="urn:schemas-microsoft-com:vml" xmlns:wp14="http://schemas.microsoft.com/office/word/2010/wordprocessingDrawing" xmlns:wp="http://schemas.openxmlformats.org/drawingml/2006/wordprocessingDrawing" xmlns:w10="urn:schemas-microsoft-com:office:word" xmlns:w="http://schemas.openxmlformats.org/wordprocessingml/2006/main" xmlns:w14="http://schemas.microsoft.com/office/word/2010/wordml" xmlns:w15="http://schemas.microsoft.com/office/word/2012/wordml" xmlns:w16cex="http://schemas.microsoft.com/office/word/2018/wordml/cex" xmlns:w16cid="http://schemas.microsoft.com/office/word/2016/wordml/cid" xmlns:w16="http://schemas.microsoft.com/office/word/2018/wordml" xmlns:w16du="http://schemas.microsoft.com/office/word/2023/wordml/word16du" xmlns:w16sdtdh="http://schemas.microsoft.com/office/word/2020/wordml/sdtdatahash" xmlns:w16sdtfl="http://schemas.microsoft.com/office/word/2024/wordml/sdtformatlock" xmlns:w16se="http://schemas.microsoft.com/office/word/2015/wordml/symex" xmlns:wpg="http://schemas.microsoft.com/office/word/2010/wordprocessingGroup" xmlns:wpi="http://schemas.microsoft.com/office/word/2010/wordprocessingInk" xmlns:wne="http://schemas.microsoft.com/office/word/2006/wordml" xmlns:wps="http://schemas.microsoft.com/office/word/2010/wordprocessingShape" mc:Ignorable="w14 w15 w16se w16cid w16 w16cex w16sdtdh w16sdtfl w16du wp14">
   <w:abstractNum w:abstractNumId="0" w15:restartNumberingAfterBreak="0">
-    <w:nsid w:val="49976B79"/>
+    <w:nsid w:val="0DFC3FF3"/>
     <w:multiLevelType w:val="hybridMultilevel"/>
-    <w:tmpl w:val="5D6C7A5C"/>
-    <w:lvl w:ilvl="0" w:tplc="718806F6">
+    <w:tmpl w:val="A62A4A68"/>
+    <w:lvl w:ilvl="0" w:tplc="F546FE26">
       <w:start w:val="1"/>
       <w:numFmt w:val="decimal"/>
       <w:lvlText w:val="%1.)"/>
@@ -2170,9 +5115,436 @@
     </w:lvl>
   </w:abstractNum>
   <w:abstractNum w:abstractNumId="1" w15:restartNumberingAfterBreak="0">
+    <w:nsid w:val="2140438B"/>
+    <w:multiLevelType w:val="hybridMultilevel"/>
+    <w:tmpl w:val="C36C9EC0"/>
+    <w:lvl w:ilvl="0" w:tplc="B6928B58">
+      <w:numFmt w:val="bullet"/>
+      <w:lvlText w:val="-"/>
+      <w:lvlJc w:val="left"/>
+      <w:pPr>
+        <w:ind w:left="720" w:hanging="360"/>
+      </w:pPr>
+      <w:rPr>
+        <w:rFonts w:ascii="Arial" w:eastAsiaTheme="minorHAnsi" w:hAnsi="Arial" w:cs="Arial" w:hint="default"/>
+      </w:rPr>
+    </w:lvl>
+    <w:lvl w:ilvl="1" w:tplc="04070003" w:tentative="1">
+      <w:start w:val="1"/>
+      <w:numFmt w:val="bullet"/>
+      <w:lvlText w:val="o"/>
+      <w:lvlJc w:val="left"/>
+      <w:pPr>
+        <w:ind w:left="1440" w:hanging="360"/>
+      </w:pPr>
+      <w:rPr>
+        <w:rFonts w:ascii="Courier New" w:hAnsi="Courier New" w:cs="Courier New" w:hint="default"/>
+      </w:rPr>
+    </w:lvl>
+    <w:lvl w:ilvl="2" w:tplc="04070005" w:tentative="1">
+      <w:start w:val="1"/>
+      <w:numFmt w:val="bullet"/>
+      <w:lvlText w:val=""/>
+      <w:lvlJc w:val="left"/>
+      <w:pPr>
+        <w:ind w:left="2160" w:hanging="360"/>
+      </w:pPr>
+      <w:rPr>
+        <w:rFonts w:ascii="Wingdings" w:hAnsi="Wingdings" w:hint="default"/>
+      </w:rPr>
+    </w:lvl>
+    <w:lvl w:ilvl="3" w:tplc="04070001" w:tentative="1">
+      <w:start w:val="1"/>
+      <w:numFmt w:val="bullet"/>
+      <w:lvlText w:val=""/>
+      <w:lvlJc w:val="left"/>
+      <w:pPr>
+        <w:ind w:left="2880" w:hanging="360"/>
+      </w:pPr>
+      <w:rPr>
+        <w:rFonts w:ascii="Symbol" w:hAnsi="Symbol" w:hint="default"/>
+      </w:rPr>
+    </w:lvl>
+    <w:lvl w:ilvl="4" w:tplc="04070003" w:tentative="1">
+      <w:start w:val="1"/>
+      <w:numFmt w:val="bullet"/>
+      <w:lvlText w:val="o"/>
+      <w:lvlJc w:val="left"/>
+      <w:pPr>
+        <w:ind w:left="3600" w:hanging="360"/>
+      </w:pPr>
+      <w:rPr>
+        <w:rFonts w:ascii="Courier New" w:hAnsi="Courier New" w:cs="Courier New" w:hint="default"/>
+      </w:rPr>
+    </w:lvl>
+    <w:lvl w:ilvl="5" w:tplc="04070005" w:tentative="1">
+      <w:start w:val="1"/>
+      <w:numFmt w:val="bullet"/>
+      <w:lvlText w:val=""/>
+      <w:lvlJc w:val="left"/>
+      <w:pPr>
+        <w:ind w:left="4320" w:hanging="360"/>
+      </w:pPr>
+      <w:rPr>
+        <w:rFonts w:ascii="Wingdings" w:hAnsi="Wingdings" w:hint="default"/>
+      </w:rPr>
+    </w:lvl>
+    <w:lvl w:ilvl="6" w:tplc="04070001" w:tentative="1">
+      <w:start w:val="1"/>
+      <w:numFmt w:val="bullet"/>
+      <w:lvlText w:val=""/>
+      <w:lvlJc w:val="left"/>
+      <w:pPr>
+        <w:ind w:left="5040" w:hanging="360"/>
+      </w:pPr>
+      <w:rPr>
+        <w:rFonts w:ascii="Symbol" w:hAnsi="Symbol" w:hint="default"/>
+      </w:rPr>
+    </w:lvl>
+    <w:lvl w:ilvl="7" w:tplc="04070003" w:tentative="1">
+      <w:start w:val="1"/>
+      <w:numFmt w:val="bullet"/>
+      <w:lvlText w:val="o"/>
+      <w:lvlJc w:val="left"/>
+      <w:pPr>
+        <w:ind w:left="5760" w:hanging="360"/>
+      </w:pPr>
+      <w:rPr>
+        <w:rFonts w:ascii="Courier New" w:hAnsi="Courier New" w:cs="Courier New" w:hint="default"/>
+      </w:rPr>
+    </w:lvl>
+    <w:lvl w:ilvl="8" w:tplc="04070005" w:tentative="1">
+      <w:start w:val="1"/>
+      <w:numFmt w:val="bullet"/>
+      <w:lvlText w:val=""/>
+      <w:lvlJc w:val="left"/>
+      <w:pPr>
+        <w:ind w:left="6480" w:hanging="360"/>
+      </w:pPr>
+      <w:rPr>
+        <w:rFonts w:ascii="Wingdings" w:hAnsi="Wingdings" w:hint="default"/>
+      </w:rPr>
+    </w:lvl>
+  </w:abstractNum>
+  <w:abstractNum w:abstractNumId="2" w15:restartNumberingAfterBreak="0">
+    <w:nsid w:val="3ABA2A9B"/>
+    <w:multiLevelType w:val="hybridMultilevel"/>
+    <w:tmpl w:val="524C7C72"/>
+    <w:lvl w:ilvl="0" w:tplc="04070001">
+      <w:start w:val="1"/>
+      <w:numFmt w:val="bullet"/>
+      <w:lvlText w:val=""/>
+      <w:lvlJc w:val="left"/>
+      <w:pPr>
+        <w:ind w:left="1080" w:hanging="360"/>
+      </w:pPr>
+      <w:rPr>
+        <w:rFonts w:ascii="Symbol" w:hAnsi="Symbol" w:hint="default"/>
+      </w:rPr>
+    </w:lvl>
+    <w:lvl w:ilvl="1" w:tplc="04070003" w:tentative="1">
+      <w:start w:val="1"/>
+      <w:numFmt w:val="bullet"/>
+      <w:lvlText w:val="o"/>
+      <w:lvlJc w:val="left"/>
+      <w:pPr>
+        <w:ind w:left="1800" w:hanging="360"/>
+      </w:pPr>
+      <w:rPr>
+        <w:rFonts w:ascii="Courier New" w:hAnsi="Courier New" w:cs="Courier New" w:hint="default"/>
+      </w:rPr>
+    </w:lvl>
+    <w:lvl w:ilvl="2" w:tplc="04070005" w:tentative="1">
+      <w:start w:val="1"/>
+      <w:numFmt w:val="bullet"/>
+      <w:lvlText w:val=""/>
+      <w:lvlJc w:val="left"/>
+      <w:pPr>
+        <w:ind w:left="2520" w:hanging="360"/>
+      </w:pPr>
+      <w:rPr>
+        <w:rFonts w:ascii="Wingdings" w:hAnsi="Wingdings" w:hint="default"/>
+      </w:rPr>
+    </w:lvl>
+    <w:lvl w:ilvl="3" w:tplc="04070001" w:tentative="1">
+      <w:start w:val="1"/>
+      <w:numFmt w:val="bullet"/>
+      <w:lvlText w:val=""/>
+      <w:lvlJc w:val="left"/>
+      <w:pPr>
+        <w:ind w:left="3240" w:hanging="360"/>
+      </w:pPr>
+      <w:rPr>
+        <w:rFonts w:ascii="Symbol" w:hAnsi="Symbol" w:hint="default"/>
+      </w:rPr>
+    </w:lvl>
+    <w:lvl w:ilvl="4" w:tplc="04070003" w:tentative="1">
+      <w:start w:val="1"/>
+      <w:numFmt w:val="bullet"/>
+      <w:lvlText w:val="o"/>
+      <w:lvlJc w:val="left"/>
+      <w:pPr>
+        <w:ind w:left="3960" w:hanging="360"/>
+      </w:pPr>
+      <w:rPr>
+        <w:rFonts w:ascii="Courier New" w:hAnsi="Courier New" w:cs="Courier New" w:hint="default"/>
+      </w:rPr>
+    </w:lvl>
+    <w:lvl w:ilvl="5" w:tplc="04070005" w:tentative="1">
+      <w:start w:val="1"/>
+      <w:numFmt w:val="bullet"/>
+      <w:lvlText w:val=""/>
+      <w:lvlJc w:val="left"/>
+      <w:pPr>
+        <w:ind w:left="4680" w:hanging="360"/>
+      </w:pPr>
+      <w:rPr>
+        <w:rFonts w:ascii="Wingdings" w:hAnsi="Wingdings" w:hint="default"/>
+      </w:rPr>
+    </w:lvl>
+    <w:lvl w:ilvl="6" w:tplc="04070001" w:tentative="1">
+      <w:start w:val="1"/>
+      <w:numFmt w:val="bullet"/>
+      <w:lvlText w:val=""/>
+      <w:lvlJc w:val="left"/>
+      <w:pPr>
+        <w:ind w:left="5400" w:hanging="360"/>
+      </w:pPr>
+      <w:rPr>
+        <w:rFonts w:ascii="Symbol" w:hAnsi="Symbol" w:hint="default"/>
+      </w:rPr>
+    </w:lvl>
+    <w:lvl w:ilvl="7" w:tplc="04070003" w:tentative="1">
+      <w:start w:val="1"/>
+      <w:numFmt w:val="bullet"/>
+      <w:lvlText w:val="o"/>
+      <w:lvlJc w:val="left"/>
+      <w:pPr>
+        <w:ind w:left="6120" w:hanging="360"/>
+      </w:pPr>
+      <w:rPr>
+        <w:rFonts w:ascii="Courier New" w:hAnsi="Courier New" w:cs="Courier New" w:hint="default"/>
+      </w:rPr>
+    </w:lvl>
+    <w:lvl w:ilvl="8" w:tplc="04070005" w:tentative="1">
+      <w:start w:val="1"/>
+      <w:numFmt w:val="bullet"/>
+      <w:lvlText w:val=""/>
+      <w:lvlJc w:val="left"/>
+      <w:pPr>
+        <w:ind w:left="6840" w:hanging="360"/>
+      </w:pPr>
+      <w:rPr>
+        <w:rFonts w:ascii="Wingdings" w:hAnsi="Wingdings" w:hint="default"/>
+      </w:rPr>
+    </w:lvl>
+  </w:abstractNum>
+  <w:abstractNum w:abstractNumId="3" w15:restartNumberingAfterBreak="0">
+    <w:nsid w:val="49976B79"/>
+    <w:multiLevelType w:val="hybridMultilevel"/>
+    <w:tmpl w:val="5D6C7A5C"/>
+    <w:lvl w:ilvl="0" w:tplc="718806F6">
+      <w:start w:val="1"/>
+      <w:numFmt w:val="decimal"/>
+      <w:lvlText w:val="%1.)"/>
+      <w:lvlJc w:val="left"/>
+      <w:pPr>
+        <w:ind w:left="720" w:hanging="360"/>
+      </w:pPr>
+      <w:rPr>
+        <w:rFonts w:hint="default"/>
+      </w:rPr>
+    </w:lvl>
+    <w:lvl w:ilvl="1" w:tplc="04070019" w:tentative="1">
+      <w:start w:val="1"/>
+      <w:numFmt w:val="lowerLetter"/>
+      <w:lvlText w:val="%2."/>
+      <w:lvlJc w:val="left"/>
+      <w:pPr>
+        <w:ind w:left="1440" w:hanging="360"/>
+      </w:pPr>
+    </w:lvl>
+    <w:lvl w:ilvl="2" w:tplc="0407001B" w:tentative="1">
+      <w:start w:val="1"/>
+      <w:numFmt w:val="lowerRoman"/>
+      <w:lvlText w:val="%3."/>
+      <w:lvlJc w:val="right"/>
+      <w:pPr>
+        <w:ind w:left="2160" w:hanging="180"/>
+      </w:pPr>
+    </w:lvl>
+    <w:lvl w:ilvl="3" w:tplc="0407000F" w:tentative="1">
+      <w:start w:val="1"/>
+      <w:numFmt w:val="decimal"/>
+      <w:lvlText w:val="%4."/>
+      <w:lvlJc w:val="left"/>
+      <w:pPr>
+        <w:ind w:left="2880" w:hanging="360"/>
+      </w:pPr>
+    </w:lvl>
+    <w:lvl w:ilvl="4" w:tplc="04070019" w:tentative="1">
+      <w:start w:val="1"/>
+      <w:numFmt w:val="lowerLetter"/>
+      <w:lvlText w:val="%5."/>
+      <w:lvlJc w:val="left"/>
+      <w:pPr>
+        <w:ind w:left="3600" w:hanging="360"/>
+      </w:pPr>
+    </w:lvl>
+    <w:lvl w:ilvl="5" w:tplc="0407001B" w:tentative="1">
+      <w:start w:val="1"/>
+      <w:numFmt w:val="lowerRoman"/>
+      <w:lvlText w:val="%6."/>
+      <w:lvlJc w:val="right"/>
+      <w:pPr>
+        <w:ind w:left="4320" w:hanging="180"/>
+      </w:pPr>
+    </w:lvl>
+    <w:lvl w:ilvl="6" w:tplc="0407000F" w:tentative="1">
+      <w:start w:val="1"/>
+      <w:numFmt w:val="decimal"/>
+      <w:lvlText w:val="%7."/>
+      <w:lvlJc w:val="left"/>
+      <w:pPr>
+        <w:ind w:left="5040" w:hanging="360"/>
+      </w:pPr>
+    </w:lvl>
+    <w:lvl w:ilvl="7" w:tplc="04070019" w:tentative="1">
+      <w:start w:val="1"/>
+      <w:numFmt w:val="lowerLetter"/>
+      <w:lvlText w:val="%8."/>
+      <w:lvlJc w:val="left"/>
+      <w:pPr>
+        <w:ind w:left="5760" w:hanging="360"/>
+      </w:pPr>
+    </w:lvl>
+    <w:lvl w:ilvl="8" w:tplc="0407001B" w:tentative="1">
+      <w:start w:val="1"/>
+      <w:numFmt w:val="lowerRoman"/>
+      <w:lvlText w:val="%9."/>
+      <w:lvlJc w:val="right"/>
+      <w:pPr>
+        <w:ind w:left="6480" w:hanging="180"/>
+      </w:pPr>
+    </w:lvl>
+  </w:abstractNum>
+  <w:abstractNum w:abstractNumId="4" w15:restartNumberingAfterBreak="0">
+    <w:nsid w:val="50231D63"/>
+    <w:multiLevelType w:val="hybridMultilevel"/>
+    <w:tmpl w:val="065A1DFC"/>
+    <w:lvl w:ilvl="0" w:tplc="04070001">
+      <w:start w:val="1"/>
+      <w:numFmt w:val="bullet"/>
+      <w:lvlText w:val=""/>
+      <w:lvlJc w:val="left"/>
+      <w:pPr>
+        <w:ind w:left="720" w:hanging="360"/>
+      </w:pPr>
+      <w:rPr>
+        <w:rFonts w:ascii="Symbol" w:hAnsi="Symbol" w:hint="default"/>
+      </w:rPr>
+    </w:lvl>
+    <w:lvl w:ilvl="1" w:tplc="04070003" w:tentative="1">
+      <w:start w:val="1"/>
+      <w:numFmt w:val="bullet"/>
+      <w:lvlText w:val="o"/>
+      <w:lvlJc w:val="left"/>
+      <w:pPr>
+        <w:ind w:left="1440" w:hanging="360"/>
+      </w:pPr>
+      <w:rPr>
+        <w:rFonts w:ascii="Courier New" w:hAnsi="Courier New" w:cs="Courier New" w:hint="default"/>
+      </w:rPr>
+    </w:lvl>
+    <w:lvl w:ilvl="2" w:tplc="04070005" w:tentative="1">
+      <w:start w:val="1"/>
+      <w:numFmt w:val="bullet"/>
+      <w:lvlText w:val=""/>
+      <w:lvlJc w:val="left"/>
+      <w:pPr>
+        <w:ind w:left="2160" w:hanging="360"/>
+      </w:pPr>
+      <w:rPr>
+        <w:rFonts w:ascii="Wingdings" w:hAnsi="Wingdings" w:hint="default"/>
+      </w:rPr>
+    </w:lvl>
+    <w:lvl w:ilvl="3" w:tplc="04070001" w:tentative="1">
+      <w:start w:val="1"/>
+      <w:numFmt w:val="bullet"/>
+      <w:lvlText w:val=""/>
+      <w:lvlJc w:val="left"/>
+      <w:pPr>
+        <w:ind w:left="2880" w:hanging="360"/>
+      </w:pPr>
+      <w:rPr>
+        <w:rFonts w:ascii="Symbol" w:hAnsi="Symbol" w:hint="default"/>
+      </w:rPr>
+    </w:lvl>
+    <w:lvl w:ilvl="4" w:tplc="04070003" w:tentative="1">
+      <w:start w:val="1"/>
+      <w:numFmt w:val="bullet"/>
+      <w:lvlText w:val="o"/>
+      <w:lvlJc w:val="left"/>
+      <w:pPr>
+        <w:ind w:left="3600" w:hanging="360"/>
+      </w:pPr>
+      <w:rPr>
+        <w:rFonts w:ascii="Courier New" w:hAnsi="Courier New" w:cs="Courier New" w:hint="default"/>
+      </w:rPr>
+    </w:lvl>
+    <w:lvl w:ilvl="5" w:tplc="04070005" w:tentative="1">
+      <w:start w:val="1"/>
+      <w:numFmt w:val="bullet"/>
+      <w:lvlText w:val=""/>
+      <w:lvlJc w:val="left"/>
+      <w:pPr>
+        <w:ind w:left="4320" w:hanging="360"/>
+      </w:pPr>
+      <w:rPr>
+        <w:rFonts w:ascii="Wingdings" w:hAnsi="Wingdings" w:hint="default"/>
+      </w:rPr>
+    </w:lvl>
+    <w:lvl w:ilvl="6" w:tplc="04070001" w:tentative="1">
+      <w:start w:val="1"/>
+      <w:numFmt w:val="bullet"/>
+      <w:lvlText w:val=""/>
+      <w:lvlJc w:val="left"/>
+      <w:pPr>
+        <w:ind w:left="5040" w:hanging="360"/>
+      </w:pPr>
+      <w:rPr>
+        <w:rFonts w:ascii="Symbol" w:hAnsi="Symbol" w:hint="default"/>
+      </w:rPr>
+    </w:lvl>
+    <w:lvl w:ilvl="7" w:tplc="04070003" w:tentative="1">
+      <w:start w:val="1"/>
+      <w:numFmt w:val="bullet"/>
+      <w:lvlText w:val="o"/>
+      <w:lvlJc w:val="left"/>
+      <w:pPr>
+        <w:ind w:left="5760" w:hanging="360"/>
+      </w:pPr>
+      <w:rPr>
+        <w:rFonts w:ascii="Courier New" w:hAnsi="Courier New" w:cs="Courier New" w:hint="default"/>
+      </w:rPr>
+    </w:lvl>
+    <w:lvl w:ilvl="8" w:tplc="04070005" w:tentative="1">
+      <w:start w:val="1"/>
+      <w:numFmt w:val="bullet"/>
+      <w:lvlText w:val=""/>
+      <w:lvlJc w:val="left"/>
+      <w:pPr>
+        <w:ind w:left="6480" w:hanging="360"/>
+      </w:pPr>
+      <w:rPr>
+        <w:rFonts w:ascii="Wingdings" w:hAnsi="Wingdings" w:hint="default"/>
+      </w:rPr>
+    </w:lvl>
+  </w:abstractNum>
+  <w:abstractNum w:abstractNumId="5" w15:restartNumberingAfterBreak="0">
     <w:nsid w:val="5C6D1B7C"/>
     <w:multiLevelType w:val="multilevel"/>
-    <w:tmpl w:val="23A87068"/>
+    <w:tmpl w:val="F9CA7330"/>
     <w:lvl w:ilvl="0">
       <w:start w:val="1"/>
       <w:numFmt w:val="decimal"/>
@@ -2200,6 +5572,8 @@
       </w:pPr>
       <w:rPr>
         <w:rFonts w:hint="default"/>
+        <w:b/>
+        <w:bCs/>
         <w:color w:val="000000" w:themeColor="text1"/>
       </w:rPr>
     </w:lvl>
@@ -2257,7 +5631,7 @@
       <w:lvlText w:val="%7."/>
       <w:lvlJc w:val="left"/>
       <w:pPr>
-        <w:ind w:left="2520" w:hanging="360"/>
+        <w:ind w:left="360" w:hanging="360"/>
       </w:pPr>
       <w:rPr>
         <w:rFonts w:hint="default"/>
@@ -2288,7 +5662,231 @@
       </w:rPr>
     </w:lvl>
   </w:abstractNum>
-  <w:abstractNum w:abstractNumId="2" w15:restartNumberingAfterBreak="0">
+  <w:abstractNum w:abstractNumId="6" w15:restartNumberingAfterBreak="0">
+    <w:nsid w:val="5FB0358A"/>
+    <w:multiLevelType w:val="hybridMultilevel"/>
+    <w:tmpl w:val="19F65B8A"/>
+    <w:lvl w:ilvl="0" w:tplc="B6928B58">
+      <w:numFmt w:val="bullet"/>
+      <w:lvlText w:val="-"/>
+      <w:lvlJc w:val="left"/>
+      <w:pPr>
+        <w:ind w:left="720" w:hanging="360"/>
+      </w:pPr>
+      <w:rPr>
+        <w:rFonts w:ascii="Arial" w:eastAsiaTheme="minorHAnsi" w:hAnsi="Arial" w:cs="Arial" w:hint="default"/>
+      </w:rPr>
+    </w:lvl>
+    <w:lvl w:ilvl="1" w:tplc="04070003" w:tentative="1">
+      <w:start w:val="1"/>
+      <w:numFmt w:val="bullet"/>
+      <w:lvlText w:val="o"/>
+      <w:lvlJc w:val="left"/>
+      <w:pPr>
+        <w:ind w:left="1440" w:hanging="360"/>
+      </w:pPr>
+      <w:rPr>
+        <w:rFonts w:ascii="Courier New" w:hAnsi="Courier New" w:cs="Courier New" w:hint="default"/>
+      </w:rPr>
+    </w:lvl>
+    <w:lvl w:ilvl="2" w:tplc="04070005" w:tentative="1">
+      <w:start w:val="1"/>
+      <w:numFmt w:val="bullet"/>
+      <w:lvlText w:val=""/>
+      <w:lvlJc w:val="left"/>
+      <w:pPr>
+        <w:ind w:left="2160" w:hanging="360"/>
+      </w:pPr>
+      <w:rPr>
+        <w:rFonts w:ascii="Wingdings" w:hAnsi="Wingdings" w:hint="default"/>
+      </w:rPr>
+    </w:lvl>
+    <w:lvl w:ilvl="3" w:tplc="04070001" w:tentative="1">
+      <w:start w:val="1"/>
+      <w:numFmt w:val="bullet"/>
+      <w:lvlText w:val=""/>
+      <w:lvlJc w:val="left"/>
+      <w:pPr>
+        <w:ind w:left="2880" w:hanging="360"/>
+      </w:pPr>
+      <w:rPr>
+        <w:rFonts w:ascii="Symbol" w:hAnsi="Symbol" w:hint="default"/>
+      </w:rPr>
+    </w:lvl>
+    <w:lvl w:ilvl="4" w:tplc="04070003" w:tentative="1">
+      <w:start w:val="1"/>
+      <w:numFmt w:val="bullet"/>
+      <w:lvlText w:val="o"/>
+      <w:lvlJc w:val="left"/>
+      <w:pPr>
+        <w:ind w:left="3600" w:hanging="360"/>
+      </w:pPr>
+      <w:rPr>
+        <w:rFonts w:ascii="Courier New" w:hAnsi="Courier New" w:cs="Courier New" w:hint="default"/>
+      </w:rPr>
+    </w:lvl>
+    <w:lvl w:ilvl="5" w:tplc="04070005" w:tentative="1">
+      <w:start w:val="1"/>
+      <w:numFmt w:val="bullet"/>
+      <w:lvlText w:val=""/>
+      <w:lvlJc w:val="left"/>
+      <w:pPr>
+        <w:ind w:left="4320" w:hanging="360"/>
+      </w:pPr>
+      <w:rPr>
+        <w:rFonts w:ascii="Wingdings" w:hAnsi="Wingdings" w:hint="default"/>
+      </w:rPr>
+    </w:lvl>
+    <w:lvl w:ilvl="6" w:tplc="04070001" w:tentative="1">
+      <w:start w:val="1"/>
+      <w:numFmt w:val="bullet"/>
+      <w:lvlText w:val=""/>
+      <w:lvlJc w:val="left"/>
+      <w:pPr>
+        <w:ind w:left="5040" w:hanging="360"/>
+      </w:pPr>
+      <w:rPr>
+        <w:rFonts w:ascii="Symbol" w:hAnsi="Symbol" w:hint="default"/>
+      </w:rPr>
+    </w:lvl>
+    <w:lvl w:ilvl="7" w:tplc="04070003" w:tentative="1">
+      <w:start w:val="1"/>
+      <w:numFmt w:val="bullet"/>
+      <w:lvlText w:val="o"/>
+      <w:lvlJc w:val="left"/>
+      <w:pPr>
+        <w:ind w:left="5760" w:hanging="360"/>
+      </w:pPr>
+      <w:rPr>
+        <w:rFonts w:ascii="Courier New" w:hAnsi="Courier New" w:cs="Courier New" w:hint="default"/>
+      </w:rPr>
+    </w:lvl>
+    <w:lvl w:ilvl="8" w:tplc="04070005" w:tentative="1">
+      <w:start w:val="1"/>
+      <w:numFmt w:val="bullet"/>
+      <w:lvlText w:val=""/>
+      <w:lvlJc w:val="left"/>
+      <w:pPr>
+        <w:ind w:left="6480" w:hanging="360"/>
+      </w:pPr>
+      <w:rPr>
+        <w:rFonts w:ascii="Wingdings" w:hAnsi="Wingdings" w:hint="default"/>
+      </w:rPr>
+    </w:lvl>
+  </w:abstractNum>
+  <w:abstractNum w:abstractNumId="7" w15:restartNumberingAfterBreak="0">
+    <w:nsid w:val="70B05398"/>
+    <w:multiLevelType w:val="hybridMultilevel"/>
+    <w:tmpl w:val="4A3417A8"/>
+    <w:lvl w:ilvl="0" w:tplc="B6928B58">
+      <w:numFmt w:val="bullet"/>
+      <w:lvlText w:val="-"/>
+      <w:lvlJc w:val="left"/>
+      <w:pPr>
+        <w:ind w:left="720" w:hanging="360"/>
+      </w:pPr>
+      <w:rPr>
+        <w:rFonts w:ascii="Arial" w:eastAsiaTheme="minorHAnsi" w:hAnsi="Arial" w:cs="Arial" w:hint="default"/>
+      </w:rPr>
+    </w:lvl>
+    <w:lvl w:ilvl="1" w:tplc="04070003" w:tentative="1">
+      <w:start w:val="1"/>
+      <w:numFmt w:val="bullet"/>
+      <w:lvlText w:val="o"/>
+      <w:lvlJc w:val="left"/>
+      <w:pPr>
+        <w:ind w:left="1440" w:hanging="360"/>
+      </w:pPr>
+      <w:rPr>
+        <w:rFonts w:ascii="Courier New" w:hAnsi="Courier New" w:cs="Courier New" w:hint="default"/>
+      </w:rPr>
+    </w:lvl>
+    <w:lvl w:ilvl="2" w:tplc="04070005" w:tentative="1">
+      <w:start w:val="1"/>
+      <w:numFmt w:val="bullet"/>
+      <w:lvlText w:val=""/>
+      <w:lvlJc w:val="left"/>
+      <w:pPr>
+        <w:ind w:left="2160" w:hanging="360"/>
+      </w:pPr>
+      <w:rPr>
+        <w:rFonts w:ascii="Wingdings" w:hAnsi="Wingdings" w:hint="default"/>
+      </w:rPr>
+    </w:lvl>
+    <w:lvl w:ilvl="3" w:tplc="04070001" w:tentative="1">
+      <w:start w:val="1"/>
+      <w:numFmt w:val="bullet"/>
+      <w:lvlText w:val=""/>
+      <w:lvlJc w:val="left"/>
+      <w:pPr>
+        <w:ind w:left="2880" w:hanging="360"/>
+      </w:pPr>
+      <w:rPr>
+        <w:rFonts w:ascii="Symbol" w:hAnsi="Symbol" w:hint="default"/>
+      </w:rPr>
+    </w:lvl>
+    <w:lvl w:ilvl="4" w:tplc="04070003" w:tentative="1">
+      <w:start w:val="1"/>
+      <w:numFmt w:val="bullet"/>
+      <w:lvlText w:val="o"/>
+      <w:lvlJc w:val="left"/>
+      <w:pPr>
+        <w:ind w:left="3600" w:hanging="360"/>
+      </w:pPr>
+      <w:rPr>
+        <w:rFonts w:ascii="Courier New" w:hAnsi="Courier New" w:cs="Courier New" w:hint="default"/>
+      </w:rPr>
+    </w:lvl>
+    <w:lvl w:ilvl="5" w:tplc="04070005" w:tentative="1">
+      <w:start w:val="1"/>
+      <w:numFmt w:val="bullet"/>
+      <w:lvlText w:val=""/>
+      <w:lvlJc w:val="left"/>
+      <w:pPr>
+        <w:ind w:left="4320" w:hanging="360"/>
+      </w:pPr>
+      <w:rPr>
+        <w:rFonts w:ascii="Wingdings" w:hAnsi="Wingdings" w:hint="default"/>
+      </w:rPr>
+    </w:lvl>
+    <w:lvl w:ilvl="6" w:tplc="04070001" w:tentative="1">
+      <w:start w:val="1"/>
+      <w:numFmt w:val="bullet"/>
+      <w:lvlText w:val=""/>
+      <w:lvlJc w:val="left"/>
+      <w:pPr>
+        <w:ind w:left="5040" w:hanging="360"/>
+      </w:pPr>
+      <w:rPr>
+        <w:rFonts w:ascii="Symbol" w:hAnsi="Symbol" w:hint="default"/>
+      </w:rPr>
+    </w:lvl>
+    <w:lvl w:ilvl="7" w:tplc="04070003" w:tentative="1">
+      <w:start w:val="1"/>
+      <w:numFmt w:val="bullet"/>
+      <w:lvlText w:val="o"/>
+      <w:lvlJc w:val="left"/>
+      <w:pPr>
+        <w:ind w:left="5760" w:hanging="360"/>
+      </w:pPr>
+      <w:rPr>
+        <w:rFonts w:ascii="Courier New" w:hAnsi="Courier New" w:cs="Courier New" w:hint="default"/>
+      </w:rPr>
+    </w:lvl>
+    <w:lvl w:ilvl="8" w:tplc="04070005" w:tentative="1">
+      <w:start w:val="1"/>
+      <w:numFmt w:val="bullet"/>
+      <w:lvlText w:val=""/>
+      <w:lvlJc w:val="left"/>
+      <w:pPr>
+        <w:ind w:left="6480" w:hanging="360"/>
+      </w:pPr>
+      <w:rPr>
+        <w:rFonts w:ascii="Wingdings" w:hAnsi="Wingdings" w:hint="default"/>
+      </w:rPr>
+    </w:lvl>
+  </w:abstractNum>
+  <w:abstractNum w:abstractNumId="8" w15:restartNumberingAfterBreak="0">
     <w:nsid w:val="7A893294"/>
     <w:multiLevelType w:val="multilevel"/>
     <w:tmpl w:val="0FE637C0"/>
@@ -2438,13 +6036,31 @@
     </w:lvl>
   </w:abstractNum>
   <w:num w:numId="1" w16cid:durableId="1251894831">
+    <w:abstractNumId w:val="5"/>
+  </w:num>
+  <w:num w:numId="2" w16cid:durableId="211425722">
+    <w:abstractNumId w:val="3"/>
+  </w:num>
+  <w:num w:numId="3" w16cid:durableId="701054990">
+    <w:abstractNumId w:val="8"/>
+  </w:num>
+  <w:num w:numId="4" w16cid:durableId="82730095">
+    <w:abstractNumId w:val="4"/>
+  </w:num>
+  <w:num w:numId="5" w16cid:durableId="1967541271">
+    <w:abstractNumId w:val="6"/>
+  </w:num>
+  <w:num w:numId="6" w16cid:durableId="798649531">
     <w:abstractNumId w:val="1"/>
   </w:num>
-  <w:num w:numId="2" w16cid:durableId="211425722">
+  <w:num w:numId="7" w16cid:durableId="92366478">
+    <w:abstractNumId w:val="7"/>
+  </w:num>
+  <w:num w:numId="8" w16cid:durableId="608006199">
+    <w:abstractNumId w:val="2"/>
+  </w:num>
+  <w:num w:numId="9" w16cid:durableId="879364005">
     <w:abstractNumId w:val="0"/>
-  </w:num>
-  <w:num w:numId="3" w16cid:durableId="701054990">
-    <w:abstractNumId w:val="2"/>
   </w:num>
   <w:numIdMacAtCleanup w:val="2"/>
 </w:numbering>
@@ -2934,7 +6550,6 @@
   <w:style w:type="character" w:default="1" w:styleId="Absatz-Standardschriftart">
     <w:name w:val="Default Paragraph Font"/>
     <w:uiPriority w:val="1"/>
-    <w:semiHidden/>
     <w:unhideWhenUsed/>
   </w:style>
   <w:style w:type="table" w:default="1" w:styleId="NormaleTabelle">
@@ -3401,6 +7016,276 @@
       <w:lang w:eastAsia="ja-JP"/>
     </w:rPr>
   </w:style>
+  <w:style w:type="table" w:styleId="EinfacheTabelle5">
+    <w:name w:val="Plain Table 5"/>
+    <w:basedOn w:val="NormaleTabelle"/>
+    <w:uiPriority w:val="45"/>
+    <w:rsid w:val="002533FB"/>
+    <w:pPr>
+      <w:spacing w:after="0" w:line="240" w:lineRule="auto"/>
+    </w:pPr>
+    <w:tblPr>
+      <w:tblStyleRowBandSize w:val="1"/>
+      <w:tblStyleColBandSize w:val="1"/>
+    </w:tblPr>
+    <w:tblStylePr w:type="firstRow">
+      <w:rPr>
+        <w:rFonts w:asciiTheme="majorHAnsi" w:eastAsiaTheme="majorEastAsia" w:hAnsiTheme="majorHAnsi" w:cstheme="majorBidi"/>
+        <w:i/>
+        <w:iCs/>
+        <w:sz w:val="26"/>
+      </w:rPr>
+      <w:tblPr/>
+      <w:tcPr>
+        <w:tcBorders>
+          <w:bottom w:val="single" w:sz="4" w:space="0" w:color="7F7F7F" w:themeColor="text1" w:themeTint="80"/>
+        </w:tcBorders>
+        <w:shd w:val="clear" w:color="auto" w:fill="FFFFFF" w:themeFill="background1"/>
+      </w:tcPr>
+    </w:tblStylePr>
+    <w:tblStylePr w:type="lastRow">
+      <w:rPr>
+        <w:rFonts w:asciiTheme="majorHAnsi" w:eastAsiaTheme="majorEastAsia" w:hAnsiTheme="majorHAnsi" w:cstheme="majorBidi"/>
+        <w:i/>
+        <w:iCs/>
+        <w:sz w:val="26"/>
+      </w:rPr>
+      <w:tblPr/>
+      <w:tcPr>
+        <w:tcBorders>
+          <w:top w:val="single" w:sz="4" w:space="0" w:color="7F7F7F" w:themeColor="text1" w:themeTint="80"/>
+        </w:tcBorders>
+        <w:shd w:val="clear" w:color="auto" w:fill="FFFFFF" w:themeFill="background1"/>
+      </w:tcPr>
+    </w:tblStylePr>
+    <w:tblStylePr w:type="firstCol">
+      <w:pPr>
+        <w:jc w:val="right"/>
+      </w:pPr>
+      <w:rPr>
+        <w:rFonts w:asciiTheme="majorHAnsi" w:eastAsiaTheme="majorEastAsia" w:hAnsiTheme="majorHAnsi" w:cstheme="majorBidi"/>
+        <w:i/>
+        <w:iCs/>
+        <w:sz w:val="26"/>
+      </w:rPr>
+      <w:tblPr/>
+      <w:tcPr>
+        <w:tcBorders>
+          <w:right w:val="single" w:sz="4" w:space="0" w:color="7F7F7F" w:themeColor="text1" w:themeTint="80"/>
+        </w:tcBorders>
+        <w:shd w:val="clear" w:color="auto" w:fill="FFFFFF" w:themeFill="background1"/>
+      </w:tcPr>
+    </w:tblStylePr>
+    <w:tblStylePr w:type="lastCol">
+      <w:rPr>
+        <w:rFonts w:asciiTheme="majorHAnsi" w:eastAsiaTheme="majorEastAsia" w:hAnsiTheme="majorHAnsi" w:cstheme="majorBidi"/>
+        <w:i/>
+        <w:iCs/>
+        <w:sz w:val="26"/>
+      </w:rPr>
+      <w:tblPr/>
+      <w:tcPr>
+        <w:tcBorders>
+          <w:left w:val="single" w:sz="4" w:space="0" w:color="7F7F7F" w:themeColor="text1" w:themeTint="80"/>
+        </w:tcBorders>
+        <w:shd w:val="clear" w:color="auto" w:fill="FFFFFF" w:themeFill="background1"/>
+      </w:tcPr>
+    </w:tblStylePr>
+    <w:tblStylePr w:type="band1Vert">
+      <w:tblPr/>
+      <w:tcPr>
+        <w:shd w:val="clear" w:color="auto" w:fill="F2F2F2" w:themeFill="background1" w:themeFillShade="F2"/>
+      </w:tcPr>
+    </w:tblStylePr>
+    <w:tblStylePr w:type="band1Horz">
+      <w:tblPr/>
+      <w:tcPr>
+        <w:shd w:val="clear" w:color="auto" w:fill="F2F2F2" w:themeFill="background1" w:themeFillShade="F2"/>
+      </w:tcPr>
+    </w:tblStylePr>
+    <w:tblStylePr w:type="neCell">
+      <w:tblPr/>
+      <w:tcPr>
+        <w:tcBorders>
+          <w:left w:val="nil"/>
+        </w:tcBorders>
+      </w:tcPr>
+    </w:tblStylePr>
+    <w:tblStylePr w:type="nwCell">
+      <w:tblPr/>
+      <w:tcPr>
+        <w:tcBorders>
+          <w:right w:val="nil"/>
+        </w:tcBorders>
+      </w:tcPr>
+    </w:tblStylePr>
+    <w:tblStylePr w:type="seCell">
+      <w:tblPr/>
+      <w:tcPr>
+        <w:tcBorders>
+          <w:left w:val="nil"/>
+        </w:tcBorders>
+      </w:tcPr>
+    </w:tblStylePr>
+    <w:tblStylePr w:type="swCell">
+      <w:tblPr/>
+      <w:tcPr>
+        <w:tcBorders>
+          <w:right w:val="nil"/>
+        </w:tcBorders>
+      </w:tcPr>
+    </w:tblStylePr>
+  </w:style>
+  <w:style w:type="table" w:styleId="Gitternetztabelle2Akzent3">
+    <w:name w:val="Grid Table 2 Accent 3"/>
+    <w:basedOn w:val="NormaleTabelle"/>
+    <w:uiPriority w:val="47"/>
+    <w:rsid w:val="002533FB"/>
+    <w:pPr>
+      <w:spacing w:after="0" w:line="240" w:lineRule="auto"/>
+    </w:pPr>
+    <w:tblPr>
+      <w:tblStyleRowBandSize w:val="1"/>
+      <w:tblStyleColBandSize w:val="1"/>
+      <w:tblBorders>
+        <w:top w:val="single" w:sz="2" w:space="0" w:color="C9C9C9" w:themeColor="accent3" w:themeTint="99"/>
+        <w:bottom w:val="single" w:sz="2" w:space="0" w:color="C9C9C9" w:themeColor="accent3" w:themeTint="99"/>
+        <w:insideH w:val="single" w:sz="2" w:space="0" w:color="C9C9C9" w:themeColor="accent3" w:themeTint="99"/>
+        <w:insideV w:val="single" w:sz="2" w:space="0" w:color="C9C9C9" w:themeColor="accent3" w:themeTint="99"/>
+      </w:tblBorders>
+    </w:tblPr>
+    <w:tblStylePr w:type="firstRow">
+      <w:rPr>
+        <w:b/>
+        <w:bCs/>
+      </w:rPr>
+      <w:tblPr/>
+      <w:tcPr>
+        <w:tcBorders>
+          <w:top w:val="nil"/>
+          <w:bottom w:val="single" w:sz="12" w:space="0" w:color="C9C9C9" w:themeColor="accent3" w:themeTint="99"/>
+          <w:insideH w:val="nil"/>
+          <w:insideV w:val="nil"/>
+        </w:tcBorders>
+        <w:shd w:val="clear" w:color="auto" w:fill="FFFFFF" w:themeFill="background1"/>
+      </w:tcPr>
+    </w:tblStylePr>
+    <w:tblStylePr w:type="lastRow">
+      <w:rPr>
+        <w:b/>
+        <w:bCs/>
+      </w:rPr>
+      <w:tblPr/>
+      <w:tcPr>
+        <w:tcBorders>
+          <w:top w:val="double" w:sz="2" w:space="0" w:color="C9C9C9" w:themeColor="accent3" w:themeTint="99"/>
+          <w:bottom w:val="nil"/>
+          <w:insideH w:val="nil"/>
+          <w:insideV w:val="nil"/>
+        </w:tcBorders>
+        <w:shd w:val="clear" w:color="auto" w:fill="FFFFFF" w:themeFill="background1"/>
+      </w:tcPr>
+    </w:tblStylePr>
+    <w:tblStylePr w:type="firstCol">
+      <w:rPr>
+        <w:b/>
+        <w:bCs/>
+      </w:rPr>
+    </w:tblStylePr>
+    <w:tblStylePr w:type="lastCol">
+      <w:rPr>
+        <w:b/>
+        <w:bCs/>
+      </w:rPr>
+    </w:tblStylePr>
+    <w:tblStylePr w:type="band1Vert">
+      <w:tblPr/>
+      <w:tcPr>
+        <w:shd w:val="clear" w:color="auto" w:fill="EDEDED" w:themeFill="accent3" w:themeFillTint="33"/>
+      </w:tcPr>
+    </w:tblStylePr>
+    <w:tblStylePr w:type="band1Horz">
+      <w:tblPr/>
+      <w:tcPr>
+        <w:shd w:val="clear" w:color="auto" w:fill="EDEDED" w:themeFill="accent3" w:themeFillTint="33"/>
+      </w:tcPr>
+    </w:tblStylePr>
+  </w:style>
+  <w:style w:type="table" w:styleId="Gitternetztabelle2">
+    <w:name w:val="Grid Table 2"/>
+    <w:basedOn w:val="NormaleTabelle"/>
+    <w:uiPriority w:val="47"/>
+    <w:rsid w:val="002533FB"/>
+    <w:pPr>
+      <w:spacing w:after="0" w:line="240" w:lineRule="auto"/>
+    </w:pPr>
+    <w:tblPr>
+      <w:tblStyleRowBandSize w:val="1"/>
+      <w:tblStyleColBandSize w:val="1"/>
+      <w:tblBorders>
+        <w:top w:val="single" w:sz="2" w:space="0" w:color="666666" w:themeColor="text1" w:themeTint="99"/>
+        <w:bottom w:val="single" w:sz="2" w:space="0" w:color="666666" w:themeColor="text1" w:themeTint="99"/>
+        <w:insideH w:val="single" w:sz="2" w:space="0" w:color="666666" w:themeColor="text1" w:themeTint="99"/>
+        <w:insideV w:val="single" w:sz="2" w:space="0" w:color="666666" w:themeColor="text1" w:themeTint="99"/>
+      </w:tblBorders>
+    </w:tblPr>
+    <w:tblStylePr w:type="firstRow">
+      <w:rPr>
+        <w:b/>
+        <w:bCs/>
+      </w:rPr>
+      <w:tblPr/>
+      <w:tcPr>
+        <w:tcBorders>
+          <w:top w:val="nil"/>
+          <w:bottom w:val="single" w:sz="12" w:space="0" w:color="666666" w:themeColor="text1" w:themeTint="99"/>
+          <w:insideH w:val="nil"/>
+          <w:insideV w:val="nil"/>
+        </w:tcBorders>
+        <w:shd w:val="clear" w:color="auto" w:fill="FFFFFF" w:themeFill="background1"/>
+      </w:tcPr>
+    </w:tblStylePr>
+    <w:tblStylePr w:type="lastRow">
+      <w:rPr>
+        <w:b/>
+        <w:bCs/>
+      </w:rPr>
+      <w:tblPr/>
+      <w:tcPr>
+        <w:tcBorders>
+          <w:top w:val="double" w:sz="2" w:space="0" w:color="666666" w:themeColor="text1" w:themeTint="99"/>
+          <w:bottom w:val="nil"/>
+          <w:insideH w:val="nil"/>
+          <w:insideV w:val="nil"/>
+        </w:tcBorders>
+        <w:shd w:val="clear" w:color="auto" w:fill="FFFFFF" w:themeFill="background1"/>
+      </w:tcPr>
+    </w:tblStylePr>
+    <w:tblStylePr w:type="firstCol">
+      <w:rPr>
+        <w:b/>
+        <w:bCs/>
+      </w:rPr>
+    </w:tblStylePr>
+    <w:tblStylePr w:type="lastCol">
+      <w:rPr>
+        <w:b/>
+        <w:bCs/>
+      </w:rPr>
+    </w:tblStylePr>
+    <w:tblStylePr w:type="band1Vert">
+      <w:tblPr/>
+      <w:tcPr>
+        <w:shd w:val="clear" w:color="auto" w:fill="CCCCCC" w:themeFill="text1" w:themeFillTint="33"/>
+      </w:tcPr>
+    </w:tblStylePr>
+    <w:tblStylePr w:type="band1Horz">
+      <w:tblPr/>
+      <w:tcPr>
+        <w:shd w:val="clear" w:color="auto" w:fill="CCCCCC" w:themeFill="text1" w:themeFillTint="33"/>
+      </w:tcPr>
+    </w:tblStylePr>
+  </w:style>
 </w:styles>
 </file>
 
@@ -3446,12 +7331,19 @@
     <w:pitch w:val="variable"/>
     <w:sig w:usb0="E0002EFF" w:usb1="C000785B" w:usb2="00000009" w:usb3="00000000" w:csb0="000001FF" w:csb1="00000000"/>
   </w:font>
-  <w:font w:name="Symbol">
-    <w:panose1 w:val="05050102010706020507"/>
-    <w:charset w:val="02"/>
-    <w:family w:val="decorative"/>
+  <w:font w:name="Arial">
+    <w:panose1 w:val="020B0604020202020204"/>
+    <w:charset w:val="00"/>
+    <w:family w:val="swiss"/>
     <w:pitch w:val="variable"/>
-    <w:sig w:usb0="00000000" w:usb1="10000000" w:usb2="00000000" w:usb3="00000000" w:csb0="80000000" w:csb1="00000000"/>
+    <w:sig w:usb0="E0002AFF" w:usb1="C0007843" w:usb2="00000009" w:usb3="00000000" w:csb0="000001FF" w:csb1="00000000"/>
+  </w:font>
+  <w:font w:name="Calibri">
+    <w:panose1 w:val="020F0502020204030204"/>
+    <w:charset w:val="00"/>
+    <w:family w:val="swiss"/>
+    <w:pitch w:val="variable"/>
+    <w:sig w:usb0="E4002EFF" w:usb1="C200247B" w:usb2="00000009" w:usb3="00000000" w:csb0="000001FF" w:csb1="00000000"/>
   </w:font>
   <w:font w:name="Courier New">
     <w:panose1 w:val="02070309020205020404"/>
@@ -3462,24 +7354,17 @@
   </w:font>
   <w:font w:name="Wingdings">
     <w:panose1 w:val="05000000000000000000"/>
+    <w:charset w:val="4D"/>
+    <w:family w:val="decorative"/>
+    <w:pitch w:val="variable"/>
+    <w:sig w:usb0="00000003" w:usb1="00000000" w:usb2="00000000" w:usb3="00000000" w:csb0="80000001" w:csb1="00000000"/>
+  </w:font>
+  <w:font w:name="Symbol">
+    <w:panose1 w:val="05050102010706020507"/>
     <w:charset w:val="02"/>
-    <w:family w:val="auto"/>
+    <w:family w:val="decorative"/>
     <w:pitch w:val="variable"/>
     <w:sig w:usb0="00000000" w:usb1="10000000" w:usb2="00000000" w:usb3="00000000" w:csb0="80000000" w:csb1="00000000"/>
-  </w:font>
-  <w:font w:name="Calibri">
-    <w:panose1 w:val="020F0502020204030204"/>
-    <w:charset w:val="00"/>
-    <w:family w:val="swiss"/>
-    <w:pitch w:val="variable"/>
-    <w:sig w:usb0="E4002EFF" w:usb1="C200247B" w:usb2="00000009" w:usb3="00000000" w:csb0="000001FF" w:csb1="00000000"/>
-  </w:font>
-  <w:font w:name="Arial">
-    <w:panose1 w:val="020B0604020202020204"/>
-    <w:charset w:val="00"/>
-    <w:family w:val="swiss"/>
-    <w:pitch w:val="variable"/>
-    <w:sig w:usb0="E0002AFF" w:usb1="C0007843" w:usb2="00000009" w:usb3="00000000" w:csb0="000001FF" w:csb1="00000000"/>
   </w:font>
   <w:font w:name="Yu Gothic Light">
     <w:altName w:val="游ゴシック Light"/>
@@ -3561,6 +7446,7 @@
     <w:rsid w:val="003D0A8C"/>
     <w:rsid w:val="004173C7"/>
     <w:rsid w:val="00446E52"/>
+    <w:rsid w:val="004B575C"/>
     <w:rsid w:val="004C73A9"/>
     <w:rsid w:val="004D67E1"/>
     <w:rsid w:val="004D79EA"/>
@@ -3594,6 +7480,7 @@
     <w:rsid w:val="00DB2476"/>
     <w:rsid w:val="00DC6FD5"/>
     <w:rsid w:val="00DD05D6"/>
+    <w:rsid w:val="00E049DB"/>
     <w:rsid w:val="00E57D66"/>
     <w:rsid w:val="00E75FA9"/>
     <w:rsid w:val="00EA64B7"/>
@@ -4330,10 +8217,6 @@
 </file>
 
 <file path=customXml/item1.xml><?xml version="1.0" encoding="utf-8"?>
-<b:Sources xmlns:b="http://schemas.openxmlformats.org/officeDocument/2006/bibliography" xmlns="http://schemas.openxmlformats.org/officeDocument/2006/bibliography" SelectedStyle="\APASixthEditionOfficeOnline.xsl" StyleName="APA" Version="6"/>
-</file>
-
-<file path=customXml/item2.xml><?xml version="1.0" encoding="utf-8"?>
 <?mso-contentType ?>
 <FormTemplates xmlns="http://schemas.microsoft.com/sharepoint/v3/contenttype/forms">
   <Display>DocumentLibraryForm</Display>
@@ -4342,18 +8225,11 @@
 </FormTemplates>
 </file>
 
-<file path=customXml/item3.xml><?xml version="1.0" encoding="utf-8"?>
-<p:properties xmlns:p="http://schemas.microsoft.com/office/2006/metadata/properties" xmlns:xsi="http://www.w3.org/2001/XMLSchema-instance" xmlns:pc="http://schemas.microsoft.com/office/infopath/2007/PartnerControls">
-  <documentManagement>
-    <TaxCatchAll xmlns="e32c9bb7-34f5-44bb-800b-35798843376c" xsi:nil="true"/>
-    <lcf76f155ced4ddcb4097134ff3c332f xmlns="22aa7da5-41f5-464e-85e6-b2dd1761cd70">
-      <Terms xmlns="http://schemas.microsoft.com/office/infopath/2007/PartnerControls"/>
-    </lcf76f155ced4ddcb4097134ff3c332f>
-  </documentManagement>
-</p:properties>
+<file path=customXml/item2.xml><?xml version="1.0" encoding="utf-8"?>
+<b:Sources xmlns:b="http://schemas.openxmlformats.org/officeDocument/2006/bibliography" xmlns="http://schemas.openxmlformats.org/officeDocument/2006/bibliography" SelectedStyle="\APASixthEditionOfficeOnline.xsl" StyleName="APA" Version="6"/>
 </file>
 
-<file path=customXml/item4.xml><?xml version="1.0" encoding="utf-8"?>
+<file path=customXml/item3.xml><?xml version="1.0" encoding="utf-8"?>
 <ct:contentTypeSchema xmlns:ct="http://schemas.microsoft.com/office/2006/metadata/contentType" xmlns:ma="http://schemas.microsoft.com/office/2006/metadata/properties/metaAttributes" ct:_="" ma:_="" ma:contentTypeName="Dokument" ma:contentTypeID="0x010100D827C1AAE83348469185F4DE8D8E42AA" ma:contentTypeVersion="18" ma:contentTypeDescription="Ein neues Dokument erstellen." ma:contentTypeScope="" ma:versionID="618348fa32be16a474572d476ed91d7d">
   <xsd:schema xmlns:xsd="http://www.w3.org/2001/XMLSchema" xmlns:xs="http://www.w3.org/2001/XMLSchema" xmlns:p="http://schemas.microsoft.com/office/2006/metadata/properties" xmlns:ns2="22aa7da5-41f5-464e-85e6-b2dd1761cd70" xmlns:ns3="e32c9bb7-34f5-44bb-800b-35798843376c" targetNamespace="http://schemas.microsoft.com/office/2006/metadata/properties" ma:root="true" ma:fieldsID="348e17a0368de80907a02c9ddfbbbd22" ns2:_="" ns3:_="">
     <xsd:import namespace="22aa7da5-41f5-464e-85e6-b2dd1761cd70"/>
@@ -4608,7 +8484,26 @@
 </ct:contentTypeSchema>
 </file>
 
+<file path=customXml/item4.xml><?xml version="1.0" encoding="utf-8"?>
+<p:properties xmlns:p="http://schemas.microsoft.com/office/2006/metadata/properties" xmlns:xsi="http://www.w3.org/2001/XMLSchema-instance" xmlns:pc="http://schemas.microsoft.com/office/infopath/2007/PartnerControls">
+  <documentManagement>
+    <TaxCatchAll xmlns="e32c9bb7-34f5-44bb-800b-35798843376c" xsi:nil="true"/>
+    <lcf76f155ced4ddcb4097134ff3c332f xmlns="22aa7da5-41f5-464e-85e6-b2dd1761cd70">
+      <Terms xmlns="http://schemas.microsoft.com/office/infopath/2007/PartnerControls"/>
+    </lcf76f155ced4ddcb4097134ff3c332f>
+  </documentManagement>
+</p:properties>
+</file>
+
 <file path=customXml/itemProps1.xml><?xml version="1.0" encoding="utf-8"?>
+<ds:datastoreItem xmlns:ds="http://schemas.openxmlformats.org/officeDocument/2006/customXml" ds:itemID="{B8133326-A9D9-4C20-AED2-57D8DB38EE3B}">
+  <ds:schemaRefs>
+    <ds:schemaRef ds:uri="http://schemas.microsoft.com/sharepoint/v3/contenttype/forms"/>
+  </ds:schemaRefs>
+</ds:datastoreItem>
+</file>
+
+<file path=customXml/itemProps2.xml><?xml version="1.0" encoding="utf-8"?>
 <ds:datastoreItem xmlns:ds="http://schemas.openxmlformats.org/officeDocument/2006/customXml" ds:itemID="{84661881-BC85-4481-9F58-A76FBE332CB1}">
   <ds:schemaRefs>
     <ds:schemaRef ds:uri="http://schemas.openxmlformats.org/officeDocument/2006/bibliography"/>
@@ -4616,26 +8511,7 @@
 </ds:datastoreItem>
 </file>
 
-<file path=customXml/itemProps2.xml><?xml version="1.0" encoding="utf-8"?>
-<ds:datastoreItem xmlns:ds="http://schemas.openxmlformats.org/officeDocument/2006/customXml" ds:itemID="{B8133326-A9D9-4C20-AED2-57D8DB38EE3B}">
-  <ds:schemaRefs>
-    <ds:schemaRef ds:uri="http://schemas.microsoft.com/sharepoint/v3/contenttype/forms"/>
-  </ds:schemaRefs>
-</ds:datastoreItem>
-</file>
-
 <file path=customXml/itemProps3.xml><?xml version="1.0" encoding="utf-8"?>
-<ds:datastoreItem xmlns:ds="http://schemas.openxmlformats.org/officeDocument/2006/customXml" ds:itemID="{AEB5EB03-E1DB-4DE6-8456-3A44BE197CDE}">
-  <ds:schemaRefs>
-    <ds:schemaRef ds:uri="http://schemas.microsoft.com/office/2006/metadata/properties"/>
-    <ds:schemaRef ds:uri="http://schemas.microsoft.com/office/infopath/2007/PartnerControls"/>
-    <ds:schemaRef ds:uri="e32c9bb7-34f5-44bb-800b-35798843376c"/>
-    <ds:schemaRef ds:uri="22aa7da5-41f5-464e-85e6-b2dd1761cd70"/>
-  </ds:schemaRefs>
-</ds:datastoreItem>
-</file>
-
-<file path=customXml/itemProps4.xml><?xml version="1.0" encoding="utf-8"?>
 <ds:datastoreItem xmlns:ds="http://schemas.openxmlformats.org/officeDocument/2006/customXml" ds:itemID="{60D544C4-8D4D-481D-B00F-1F09332EE222}">
   <ds:schemaRefs>
     <ds:schemaRef ds:uri="http://schemas.microsoft.com/office/2006/metadata/contentType"/>
@@ -4652,4 +8528,15 @@
     <ds:schemaRef ds:uri="http://schemas.microsoft.com/internal/obd"/>
   </ds:schemaRefs>
 </ds:datastoreItem>
+</file>
+
+<file path=customXml/itemProps4.xml><?xml version="1.0" encoding="utf-8"?>
+<ds:datastoreItem xmlns:ds="http://schemas.openxmlformats.org/officeDocument/2006/customXml" ds:itemID="{AEB5EB03-E1DB-4DE6-8456-3A44BE197CDE}">
+  <ds:schemaRefs>
+    <ds:schemaRef ds:uri="http://schemas.microsoft.com/office/2006/metadata/properties"/>
+    <ds:schemaRef ds:uri="http://schemas.microsoft.com/office/infopath/2007/PartnerControls"/>
+    <ds:schemaRef ds:uri="e32c9bb7-34f5-44bb-800b-35798843376c"/>
+    <ds:schemaRef ds:uri="22aa7da5-41f5-464e-85e6-b2dd1761cd70"/>
+  </ds:schemaRefs>
+</ds:datastoreItem>
 </file>
</xml_diff>

<commit_message>
Dokumentation weiter geschrieben und Präsentation erstellt
</commit_message>
<xml_diff>
--- a/Doc/Aufgabenstellung/Dokumentation/Case Study Doku.docx
+++ b/Doc/Aufgabenstellung/Dokumentation/Case Study Doku.docx
@@ -145,12 +145,6 @@
         </w:p>
         <w:p>
           <w:pPr>
-            <w:jc w:val="center"/>
-          </w:pPr>
-        </w:p>
-        <w:p>
-          <w:pPr>
-            <w:jc w:val="center"/>
             <w:rPr>
               <w:rFonts w:cs="Arial"/>
               <w:b/>
@@ -168,7 +162,6 @@
           <w:noProof/>
         </w:rPr>
         <w:id w:val="1621874640"/>
-        <w:showingPlcHdr/>
         <w:picture/>
       </w:sdtPr>
       <w:sdtContent>
@@ -188,10 +181,10 @@
               <w:noProof/>
             </w:rPr>
             <w:drawing>
-              <wp:inline distT="0" distB="0" distL="0" distR="0" wp14:anchorId="3F2F730F" wp14:editId="2875FEE4">
-                <wp:extent cx="914400" cy="914400"/>
-                <wp:effectExtent l="0" t="0" r="0" b="0"/>
-                <wp:docPr id="1185383256" name="Bild 1"/>
+              <wp:inline distT="0" distB="0" distL="0" distR="0" wp14:anchorId="0D1A6742" wp14:editId="7F420425">
+                <wp:extent cx="6120130" cy="3596640"/>
+                <wp:effectExtent l="0" t="0" r="1270" b="0"/>
+                <wp:docPr id="1593791034" name="Grafik 1"/>
                 <wp:cNvGraphicFramePr>
                   <a:graphicFrameLocks xmlns:a="http://schemas.openxmlformats.org/drawingml/2006/main" noChangeAspect="1"/>
                 </wp:cNvGraphicFramePr>
@@ -199,36 +192,23 @@
                   <a:graphicData uri="http://schemas.openxmlformats.org/drawingml/2006/picture">
                     <pic:pic xmlns:pic="http://schemas.openxmlformats.org/drawingml/2006/picture">
                       <pic:nvPicPr>
-                        <pic:cNvPr id="0" name="Picture 1"/>
-                        <pic:cNvPicPr>
-                          <a:picLocks noChangeAspect="1" noChangeArrowheads="1"/>
-                        </pic:cNvPicPr>
+                        <pic:cNvPr id="1593791034" name=""/>
+                        <pic:cNvPicPr/>
                       </pic:nvPicPr>
                       <pic:blipFill>
-                        <a:blip r:embed="rId12">
-                          <a:extLst>
-                            <a:ext uri="{28A0092B-C50C-407E-A947-70E740481C1C}">
-                              <a14:useLocalDpi xmlns:a14="http://schemas.microsoft.com/office/drawing/2010/main" val="0"/>
-                            </a:ext>
-                          </a:extLst>
-                        </a:blip>
-                        <a:srcRect/>
+                        <a:blip r:embed="rId12"/>
                         <a:stretch>
                           <a:fillRect/>
                         </a:stretch>
                       </pic:blipFill>
-                      <pic:spPr bwMode="auto">
+                      <pic:spPr>
                         <a:xfrm>
                           <a:off x="0" y="0"/>
-                          <a:ext cx="914400" cy="914400"/>
+                          <a:ext cx="6120130" cy="3596640"/>
                         </a:xfrm>
                         <a:prstGeom prst="rect">
                           <a:avLst/>
                         </a:prstGeom>
-                        <a:noFill/>
-                        <a:ln>
-                          <a:noFill/>
-                        </a:ln>
                       </pic:spPr>
                     </pic:pic>
                   </a:graphicData>
@@ -242,110 +222,7 @@
     <w:p>
       <w:pPr>
         <w:rPr>
-          <w:rFonts w:cs="Arial"/>
-          <w:b/>
-          <w:bCs/>
-          <w:sz w:val="28"/>
-          <w:szCs w:val="28"/>
-        </w:rPr>
-      </w:pPr>
-    </w:p>
-    <w:p>
-      <w:pPr>
-        <w:rPr>
-          <w:rFonts w:cs="Arial"/>
-          <w:b/>
-          <w:bCs/>
-          <w:sz w:val="28"/>
-          <w:szCs w:val="28"/>
-        </w:rPr>
-      </w:pPr>
-    </w:p>
-    <w:p>
-      <w:pPr>
-        <w:rPr>
-          <w:rFonts w:cs="Arial"/>
-          <w:b/>
-          <w:bCs/>
-          <w:sz w:val="28"/>
-          <w:szCs w:val="28"/>
-        </w:rPr>
-      </w:pPr>
-    </w:p>
-    <w:p>
-      <w:pPr>
-        <w:rPr>
-          <w:rFonts w:cs="Arial"/>
-          <w:b/>
-          <w:bCs/>
-          <w:sz w:val="28"/>
-          <w:szCs w:val="28"/>
-        </w:rPr>
-      </w:pPr>
-    </w:p>
-    <w:p>
-      <w:pPr>
-        <w:rPr>
-          <w:rFonts w:cs="Arial"/>
-          <w:b/>
-          <w:bCs/>
-          <w:sz w:val="28"/>
-          <w:szCs w:val="28"/>
-        </w:rPr>
-      </w:pPr>
-    </w:p>
-    <w:p>
-      <w:pPr>
-        <w:rPr>
-          <w:rFonts w:cs="Arial"/>
-          <w:b/>
-          <w:bCs/>
-          <w:sz w:val="28"/>
-          <w:szCs w:val="28"/>
-        </w:rPr>
-      </w:pPr>
-    </w:p>
-    <w:p>
-      <w:pPr>
-        <w:rPr>
-          <w:rFonts w:cs="Arial"/>
-          <w:b/>
-          <w:bCs/>
-          <w:sz w:val="28"/>
-          <w:szCs w:val="28"/>
-        </w:rPr>
-      </w:pPr>
-    </w:p>
-    <w:p>
-      <w:pPr>
-        <w:rPr>
-          <w:rFonts w:cs="Arial"/>
-          <w:b/>
-          <w:bCs/>
-          <w:sz w:val="28"/>
-          <w:szCs w:val="28"/>
-        </w:rPr>
-      </w:pPr>
-    </w:p>
-    <w:p>
-      <w:pPr>
-        <w:rPr>
-          <w:rFonts w:cs="Arial"/>
-          <w:b/>
-          <w:bCs/>
-          <w:sz w:val="28"/>
-          <w:szCs w:val="28"/>
-        </w:rPr>
-      </w:pPr>
-    </w:p>
-    <w:p>
-      <w:pPr>
-        <w:rPr>
-          <w:rFonts w:cs="Arial"/>
-          <w:b/>
-          <w:bCs/>
-          <w:sz w:val="28"/>
-          <w:szCs w:val="28"/>
+          <w:noProof/>
         </w:rPr>
       </w:pPr>
     </w:p>
@@ -650,10 +527,11 @@
           <w:r>
             <w:fldChar w:fldCharType="separate"/>
           </w:r>
-          <w:hyperlink w:anchor="_Toc231874426" w:history="1">
+          <w:hyperlink w:anchor="_Toc233042300" w:history="1">
             <w:r>
               <w:rPr>
                 <w:rStyle w:val="Hyperlink"/>
+                <w:bCs/>
                 <w:noProof/>
               </w:rPr>
               <w:t>1.</w:t>
@@ -696,7 +574,7 @@
                 <w:noProof/>
                 <w:webHidden/>
               </w:rPr>
-              <w:instrText xml:space="preserve"> PAGEREF _Toc231874426 \h </w:instrText>
+              <w:instrText xml:space="preserve"> PAGEREF _Toc233042300 \h </w:instrText>
             </w:r>
             <w:r>
               <w:rPr>
@@ -744,10 +622,11 @@
               <w14:ligatures w14:val="standardContextual"/>
             </w:rPr>
           </w:pPr>
-          <w:hyperlink w:anchor="_Toc231874427" w:history="1">
+          <w:hyperlink w:anchor="_Toc233042301" w:history="1">
             <w:r>
               <w:rPr>
                 <w:rStyle w:val="Hyperlink"/>
+                <w:bCs/>
                 <w:noProof/>
               </w:rPr>
               <w:t>2.</w:t>
@@ -790,7 +669,7 @@
                 <w:noProof/>
                 <w:webHidden/>
               </w:rPr>
-              <w:instrText xml:space="preserve"> PAGEREF _Toc231874427 \h </w:instrText>
+              <w:instrText xml:space="preserve"> PAGEREF _Toc233042301 \h </w:instrText>
             </w:r>
             <w:r>
               <w:rPr>
@@ -838,10 +717,11 @@
               <w14:ligatures w14:val="standardContextual"/>
             </w:rPr>
           </w:pPr>
-          <w:hyperlink w:anchor="_Toc231874428" w:history="1">
+          <w:hyperlink w:anchor="_Toc233042302" w:history="1">
             <w:r>
               <w:rPr>
                 <w:rStyle w:val="Hyperlink"/>
+                <w:bCs/>
                 <w:noProof/>
               </w:rPr>
               <w:t>2.1.</w:t>
@@ -861,6 +741,7 @@
             <w:r>
               <w:rPr>
                 <w:rStyle w:val="Hyperlink"/>
+                <w:bCs/>
                 <w:noProof/>
               </w:rPr>
               <w:t>Muss-Ziele</w:t>
@@ -884,7 +765,7 @@
                 <w:noProof/>
                 <w:webHidden/>
               </w:rPr>
-              <w:instrText xml:space="preserve"> PAGEREF _Toc231874428 \h </w:instrText>
+              <w:instrText xml:space="preserve"> PAGEREF _Toc233042302 \h </w:instrText>
             </w:r>
             <w:r>
               <w:rPr>
@@ -932,10 +813,11 @@
               <w14:ligatures w14:val="standardContextual"/>
             </w:rPr>
           </w:pPr>
-          <w:hyperlink w:anchor="_Toc231874429" w:history="1">
+          <w:hyperlink w:anchor="_Toc233042303" w:history="1">
             <w:r>
               <w:rPr>
                 <w:rStyle w:val="Hyperlink"/>
+                <w:bCs/>
                 <w:noProof/>
               </w:rPr>
               <w:t>2.2.</w:t>
@@ -955,6 +837,7 @@
             <w:r>
               <w:rPr>
                 <w:rStyle w:val="Hyperlink"/>
+                <w:bCs/>
                 <w:noProof/>
               </w:rPr>
               <w:t>Kann-Ziele / Bonus-Ziele</w:t>
@@ -978,7 +861,7 @@
                 <w:noProof/>
                 <w:webHidden/>
               </w:rPr>
-              <w:instrText xml:space="preserve"> PAGEREF _Toc231874429 \h </w:instrText>
+              <w:instrText xml:space="preserve"> PAGEREF _Toc233042303 \h </w:instrText>
             </w:r>
             <w:r>
               <w:rPr>
@@ -1026,10 +909,11 @@
               <w14:ligatures w14:val="standardContextual"/>
             </w:rPr>
           </w:pPr>
-          <w:hyperlink w:anchor="_Toc231874430" w:history="1">
+          <w:hyperlink w:anchor="_Toc233042304" w:history="1">
             <w:r>
               <w:rPr>
                 <w:rStyle w:val="Hyperlink"/>
+                <w:bCs/>
                 <w:noProof/>
               </w:rPr>
               <w:t>3.</w:t>
@@ -1072,7 +956,7 @@
                 <w:noProof/>
                 <w:webHidden/>
               </w:rPr>
-              <w:instrText xml:space="preserve"> PAGEREF _Toc231874430 \h </w:instrText>
+              <w:instrText xml:space="preserve"> PAGEREF _Toc233042304 \h </w:instrText>
             </w:r>
             <w:r>
               <w:rPr>
@@ -1120,10 +1004,11 @@
               <w14:ligatures w14:val="standardContextual"/>
             </w:rPr>
           </w:pPr>
-          <w:hyperlink w:anchor="_Toc231874431" w:history="1">
+          <w:hyperlink w:anchor="_Toc233042305" w:history="1">
             <w:r>
               <w:rPr>
                 <w:rStyle w:val="Hyperlink"/>
+                <w:bCs/>
                 <w:noProof/>
               </w:rPr>
               <w:t>3.1.</w:t>
@@ -1143,6 +1028,7 @@
             <w:r>
               <w:rPr>
                 <w:rStyle w:val="Hyperlink"/>
+                <w:bCs/>
                 <w:noProof/>
               </w:rPr>
               <w:t>Flussdiagramm</w:t>
@@ -1166,7 +1052,7 @@
                 <w:noProof/>
                 <w:webHidden/>
               </w:rPr>
-              <w:instrText xml:space="preserve"> PAGEREF _Toc231874431 \h </w:instrText>
+              <w:instrText xml:space="preserve"> PAGEREF _Toc233042305 \h </w:instrText>
             </w:r>
             <w:r>
               <w:rPr>
@@ -1214,10 +1100,11 @@
               <w14:ligatures w14:val="standardContextual"/>
             </w:rPr>
           </w:pPr>
-          <w:hyperlink w:anchor="_Toc231874432" w:history="1">
+          <w:hyperlink w:anchor="_Toc233042306" w:history="1">
             <w:r>
               <w:rPr>
                 <w:rStyle w:val="Hyperlink"/>
+                <w:bCs/>
                 <w:noProof/>
               </w:rPr>
               <w:t>3.2.</w:t>
@@ -1237,6 +1124,7 @@
             <w:r>
               <w:rPr>
                 <w:rStyle w:val="Hyperlink"/>
+                <w:bCs/>
                 <w:noProof/>
               </w:rPr>
               <w:t>Zustandsautomat</w:t>
@@ -1260,7 +1148,7 @@
                 <w:noProof/>
                 <w:webHidden/>
               </w:rPr>
-              <w:instrText xml:space="preserve"> PAGEREF _Toc231874432 \h </w:instrText>
+              <w:instrText xml:space="preserve"> PAGEREF _Toc233042306 \h </w:instrText>
             </w:r>
             <w:r>
               <w:rPr>
@@ -1308,10 +1196,11 @@
               <w14:ligatures w14:val="standardContextual"/>
             </w:rPr>
           </w:pPr>
-          <w:hyperlink w:anchor="_Toc231874433" w:history="1">
+          <w:hyperlink w:anchor="_Toc233042307" w:history="1">
             <w:r>
               <w:rPr>
                 <w:rStyle w:val="Hyperlink"/>
+                <w:bCs/>
                 <w:noProof/>
               </w:rPr>
               <w:t>3.3.</w:t>
@@ -1331,6 +1220,7 @@
             <w:r>
               <w:rPr>
                 <w:rStyle w:val="Hyperlink"/>
+                <w:bCs/>
                 <w:noProof/>
               </w:rPr>
               <w:t>Architektur der Steuerung</w:t>
@@ -1354,7 +1244,7 @@
                 <w:noProof/>
                 <w:webHidden/>
               </w:rPr>
-              <w:instrText xml:space="preserve"> PAGEREF _Toc231874433 \h </w:instrText>
+              <w:instrText xml:space="preserve"> PAGEREF _Toc233042307 \h </w:instrText>
             </w:r>
             <w:r>
               <w:rPr>
@@ -1402,10 +1292,11 @@
               <w14:ligatures w14:val="standardContextual"/>
             </w:rPr>
           </w:pPr>
-          <w:hyperlink w:anchor="_Toc231874434" w:history="1">
+          <w:hyperlink w:anchor="_Toc233042308" w:history="1">
             <w:r>
               <w:rPr>
                 <w:rStyle w:val="Hyperlink"/>
+                <w:bCs/>
                 <w:noProof/>
               </w:rPr>
               <w:t>3.4.</w:t>
@@ -1425,6 +1316,7 @@
             <w:r>
               <w:rPr>
                 <w:rStyle w:val="Hyperlink"/>
+                <w:bCs/>
                 <w:noProof/>
               </w:rPr>
               <w:t>HMI-Konzept</w:t>
@@ -1448,7 +1340,7 @@
                 <w:noProof/>
                 <w:webHidden/>
               </w:rPr>
-              <w:instrText xml:space="preserve"> PAGEREF _Toc231874434 \h </w:instrText>
+              <w:instrText xml:space="preserve"> PAGEREF _Toc233042308 \h </w:instrText>
             </w:r>
             <w:r>
               <w:rPr>
@@ -1496,10 +1388,11 @@
               <w14:ligatures w14:val="standardContextual"/>
             </w:rPr>
           </w:pPr>
-          <w:hyperlink w:anchor="_Toc231874435" w:history="1">
+          <w:hyperlink w:anchor="_Toc233042309" w:history="1">
             <w:r>
               <w:rPr>
                 <w:rStyle w:val="Hyperlink"/>
+                <w:bCs/>
                 <w:noProof/>
               </w:rPr>
               <w:t>3.5.</w:t>
@@ -1519,6 +1412,7 @@
             <w:r>
               <w:rPr>
                 <w:rStyle w:val="Hyperlink"/>
+                <w:bCs/>
                 <w:noProof/>
               </w:rPr>
               <w:t>Geplante Programmstruktur</w:t>
@@ -1542,7 +1436,7 @@
                 <w:noProof/>
                 <w:webHidden/>
               </w:rPr>
-              <w:instrText xml:space="preserve"> PAGEREF _Toc231874435 \h </w:instrText>
+              <w:instrText xml:space="preserve"> PAGEREF _Toc233042309 \h </w:instrText>
             </w:r>
             <w:r>
               <w:rPr>
@@ -1590,10 +1484,11 @@
               <w14:ligatures w14:val="standardContextual"/>
             </w:rPr>
           </w:pPr>
-          <w:hyperlink w:anchor="_Toc231874436" w:history="1">
+          <w:hyperlink w:anchor="_Toc233042310" w:history="1">
             <w:r>
               <w:rPr>
                 <w:rStyle w:val="Hyperlink"/>
+                <w:bCs/>
                 <w:noProof/>
               </w:rPr>
               <w:t>4.</w:t>
@@ -1636,7 +1531,7 @@
                 <w:noProof/>
                 <w:webHidden/>
               </w:rPr>
-              <w:instrText xml:space="preserve"> PAGEREF _Toc231874436 \h </w:instrText>
+              <w:instrText xml:space="preserve"> PAGEREF _Toc233042310 \h </w:instrText>
             </w:r>
             <w:r>
               <w:rPr>
@@ -1657,6 +1552,1241 @@
                 <w:webHidden/>
               </w:rPr>
               <w:t>8</w:t>
+            </w:r>
+            <w:r>
+              <w:rPr>
+                <w:noProof/>
+                <w:webHidden/>
+              </w:rPr>
+              <w:fldChar w:fldCharType="end"/>
+            </w:r>
+          </w:hyperlink>
+        </w:p>
+        <w:p>
+          <w:pPr>
+            <w:pStyle w:val="Verzeichnis2"/>
+            <w:tabs>
+              <w:tab w:val="left" w:pos="960"/>
+              <w:tab w:val="right" w:leader="dot" w:pos="9628"/>
+            </w:tabs>
+            <w:rPr>
+              <w:rFonts w:asciiTheme="minorHAnsi" w:eastAsiaTheme="minorEastAsia" w:hAnsiTheme="minorHAnsi"/>
+              <w:noProof/>
+              <w:kern w:val="2"/>
+              <w:sz w:val="24"/>
+              <w:szCs w:val="24"/>
+              <w:lang w:eastAsia="ja-JP"/>
+              <w14:ligatures w14:val="standardContextual"/>
+            </w:rPr>
+          </w:pPr>
+          <w:hyperlink w:anchor="_Toc233042311" w:history="1">
+            <w:r>
+              <w:rPr>
+                <w:rStyle w:val="Hyperlink"/>
+                <w:bCs/>
+                <w:noProof/>
+              </w:rPr>
+              <w:t>4.1.</w:t>
+            </w:r>
+            <w:r>
+              <w:rPr>
+                <w:rFonts w:asciiTheme="minorHAnsi" w:eastAsiaTheme="minorEastAsia" w:hAnsiTheme="minorHAnsi"/>
+                <w:noProof/>
+                <w:kern w:val="2"/>
+                <w:sz w:val="24"/>
+                <w:szCs w:val="24"/>
+                <w:lang w:eastAsia="ja-JP"/>
+                <w14:ligatures w14:val="standardContextual"/>
+              </w:rPr>
+              <w:tab/>
+            </w:r>
+            <w:r>
+              <w:rPr>
+                <w:rStyle w:val="Hyperlink"/>
+                <w:noProof/>
+              </w:rPr>
+              <w:t>Aufbau des SPS-Projekt</w:t>
+            </w:r>
+            <w:r>
+              <w:rPr>
+                <w:noProof/>
+                <w:webHidden/>
+              </w:rPr>
+              <w:tab/>
+            </w:r>
+            <w:r>
+              <w:rPr>
+                <w:noProof/>
+                <w:webHidden/>
+              </w:rPr>
+              <w:fldChar w:fldCharType="begin"/>
+            </w:r>
+            <w:r>
+              <w:rPr>
+                <w:noProof/>
+                <w:webHidden/>
+              </w:rPr>
+              <w:instrText xml:space="preserve"> PAGEREF _Toc233042311 \h </w:instrText>
+            </w:r>
+            <w:r>
+              <w:rPr>
+                <w:noProof/>
+                <w:webHidden/>
+              </w:rPr>
+            </w:r>
+            <w:r>
+              <w:rPr>
+                <w:noProof/>
+                <w:webHidden/>
+              </w:rPr>
+              <w:fldChar w:fldCharType="separate"/>
+            </w:r>
+            <w:r>
+              <w:rPr>
+                <w:noProof/>
+                <w:webHidden/>
+              </w:rPr>
+              <w:t>8</w:t>
+            </w:r>
+            <w:r>
+              <w:rPr>
+                <w:noProof/>
+                <w:webHidden/>
+              </w:rPr>
+              <w:fldChar w:fldCharType="end"/>
+            </w:r>
+          </w:hyperlink>
+        </w:p>
+        <w:p>
+          <w:pPr>
+            <w:pStyle w:val="Verzeichnis2"/>
+            <w:tabs>
+              <w:tab w:val="left" w:pos="960"/>
+              <w:tab w:val="right" w:leader="dot" w:pos="9628"/>
+            </w:tabs>
+            <w:rPr>
+              <w:rFonts w:asciiTheme="minorHAnsi" w:eastAsiaTheme="minorEastAsia" w:hAnsiTheme="minorHAnsi"/>
+              <w:noProof/>
+              <w:kern w:val="2"/>
+              <w:sz w:val="24"/>
+              <w:szCs w:val="24"/>
+              <w:lang w:eastAsia="ja-JP"/>
+              <w14:ligatures w14:val="standardContextual"/>
+            </w:rPr>
+          </w:pPr>
+          <w:hyperlink w:anchor="_Toc233042312" w:history="1">
+            <w:r>
+              <w:rPr>
+                <w:rStyle w:val="Hyperlink"/>
+                <w:bCs/>
+                <w:noProof/>
+              </w:rPr>
+              <w:t>4.2.</w:t>
+            </w:r>
+            <w:r>
+              <w:rPr>
+                <w:rFonts w:asciiTheme="minorHAnsi" w:eastAsiaTheme="minorEastAsia" w:hAnsiTheme="minorHAnsi"/>
+                <w:noProof/>
+                <w:kern w:val="2"/>
+                <w:sz w:val="24"/>
+                <w:szCs w:val="24"/>
+                <w:lang w:eastAsia="ja-JP"/>
+                <w14:ligatures w14:val="standardContextual"/>
+              </w:rPr>
+              <w:tab/>
+            </w:r>
+            <w:r>
+              <w:rPr>
+                <w:rStyle w:val="Hyperlink"/>
+                <w:noProof/>
+              </w:rPr>
+              <w:t>Versionsverwaltung und Git-Test</w:t>
+            </w:r>
+            <w:r>
+              <w:rPr>
+                <w:noProof/>
+                <w:webHidden/>
+              </w:rPr>
+              <w:tab/>
+            </w:r>
+            <w:r>
+              <w:rPr>
+                <w:noProof/>
+                <w:webHidden/>
+              </w:rPr>
+              <w:fldChar w:fldCharType="begin"/>
+            </w:r>
+            <w:r>
+              <w:rPr>
+                <w:noProof/>
+                <w:webHidden/>
+              </w:rPr>
+              <w:instrText xml:space="preserve"> PAGEREF _Toc233042312 \h </w:instrText>
+            </w:r>
+            <w:r>
+              <w:rPr>
+                <w:noProof/>
+                <w:webHidden/>
+              </w:rPr>
+            </w:r>
+            <w:r>
+              <w:rPr>
+                <w:noProof/>
+                <w:webHidden/>
+              </w:rPr>
+              <w:fldChar w:fldCharType="separate"/>
+            </w:r>
+            <w:r>
+              <w:rPr>
+                <w:noProof/>
+                <w:webHidden/>
+              </w:rPr>
+              <w:t>8</w:t>
+            </w:r>
+            <w:r>
+              <w:rPr>
+                <w:noProof/>
+                <w:webHidden/>
+              </w:rPr>
+              <w:fldChar w:fldCharType="end"/>
+            </w:r>
+          </w:hyperlink>
+        </w:p>
+        <w:p>
+          <w:pPr>
+            <w:pStyle w:val="Verzeichnis2"/>
+            <w:tabs>
+              <w:tab w:val="left" w:pos="960"/>
+              <w:tab w:val="right" w:leader="dot" w:pos="9628"/>
+            </w:tabs>
+            <w:rPr>
+              <w:rFonts w:asciiTheme="minorHAnsi" w:eastAsiaTheme="minorEastAsia" w:hAnsiTheme="minorHAnsi"/>
+              <w:noProof/>
+              <w:kern w:val="2"/>
+              <w:sz w:val="24"/>
+              <w:szCs w:val="24"/>
+              <w:lang w:eastAsia="ja-JP"/>
+              <w14:ligatures w14:val="standardContextual"/>
+            </w:rPr>
+          </w:pPr>
+          <w:hyperlink w:anchor="_Toc233042313" w:history="1">
+            <w:r>
+              <w:rPr>
+                <w:rStyle w:val="Hyperlink"/>
+                <w:bCs/>
+                <w:noProof/>
+              </w:rPr>
+              <w:t>4.3.</w:t>
+            </w:r>
+            <w:r>
+              <w:rPr>
+                <w:rFonts w:asciiTheme="minorHAnsi" w:eastAsiaTheme="minorEastAsia" w:hAnsiTheme="minorHAnsi"/>
+                <w:noProof/>
+                <w:kern w:val="2"/>
+                <w:sz w:val="24"/>
+                <w:szCs w:val="24"/>
+                <w:lang w:eastAsia="ja-JP"/>
+                <w14:ligatures w14:val="standardContextual"/>
+              </w:rPr>
+              <w:tab/>
+            </w:r>
+            <w:r>
+              <w:rPr>
+                <w:rStyle w:val="Hyperlink"/>
+                <w:noProof/>
+              </w:rPr>
+              <w:t>Aufbau der Architektur im SPS-Projekt</w:t>
+            </w:r>
+            <w:r>
+              <w:rPr>
+                <w:noProof/>
+                <w:webHidden/>
+              </w:rPr>
+              <w:tab/>
+            </w:r>
+            <w:r>
+              <w:rPr>
+                <w:noProof/>
+                <w:webHidden/>
+              </w:rPr>
+              <w:fldChar w:fldCharType="begin"/>
+            </w:r>
+            <w:r>
+              <w:rPr>
+                <w:noProof/>
+                <w:webHidden/>
+              </w:rPr>
+              <w:instrText xml:space="preserve"> PAGEREF _Toc233042313 \h </w:instrText>
+            </w:r>
+            <w:r>
+              <w:rPr>
+                <w:noProof/>
+                <w:webHidden/>
+              </w:rPr>
+            </w:r>
+            <w:r>
+              <w:rPr>
+                <w:noProof/>
+                <w:webHidden/>
+              </w:rPr>
+              <w:fldChar w:fldCharType="separate"/>
+            </w:r>
+            <w:r>
+              <w:rPr>
+                <w:noProof/>
+                <w:webHidden/>
+              </w:rPr>
+              <w:t>8</w:t>
+            </w:r>
+            <w:r>
+              <w:rPr>
+                <w:noProof/>
+                <w:webHidden/>
+              </w:rPr>
+              <w:fldChar w:fldCharType="end"/>
+            </w:r>
+          </w:hyperlink>
+        </w:p>
+        <w:p>
+          <w:pPr>
+            <w:pStyle w:val="Verzeichnis2"/>
+            <w:tabs>
+              <w:tab w:val="left" w:pos="960"/>
+              <w:tab w:val="right" w:leader="dot" w:pos="9628"/>
+            </w:tabs>
+            <w:rPr>
+              <w:rFonts w:asciiTheme="minorHAnsi" w:eastAsiaTheme="minorEastAsia" w:hAnsiTheme="minorHAnsi"/>
+              <w:noProof/>
+              <w:kern w:val="2"/>
+              <w:sz w:val="24"/>
+              <w:szCs w:val="24"/>
+              <w:lang w:eastAsia="ja-JP"/>
+              <w14:ligatures w14:val="standardContextual"/>
+            </w:rPr>
+          </w:pPr>
+          <w:hyperlink w:anchor="_Toc233042314" w:history="1">
+            <w:r>
+              <w:rPr>
+                <w:rStyle w:val="Hyperlink"/>
+                <w:bCs/>
+                <w:noProof/>
+              </w:rPr>
+              <w:t>4.4.</w:t>
+            </w:r>
+            <w:r>
+              <w:rPr>
+                <w:rFonts w:asciiTheme="minorHAnsi" w:eastAsiaTheme="minorEastAsia" w:hAnsiTheme="minorHAnsi"/>
+                <w:noProof/>
+                <w:kern w:val="2"/>
+                <w:sz w:val="24"/>
+                <w:szCs w:val="24"/>
+                <w:lang w:eastAsia="ja-JP"/>
+                <w14:ligatures w14:val="standardContextual"/>
+              </w:rPr>
+              <w:tab/>
+            </w:r>
+            <w:r>
+              <w:rPr>
+                <w:rStyle w:val="Hyperlink"/>
+                <w:noProof/>
+              </w:rPr>
+              <w:t>Motoranbindung und Motion-Grundlage</w:t>
+            </w:r>
+            <w:r>
+              <w:rPr>
+                <w:noProof/>
+                <w:webHidden/>
+              </w:rPr>
+              <w:tab/>
+            </w:r>
+            <w:r>
+              <w:rPr>
+                <w:noProof/>
+                <w:webHidden/>
+              </w:rPr>
+              <w:fldChar w:fldCharType="begin"/>
+            </w:r>
+            <w:r>
+              <w:rPr>
+                <w:noProof/>
+                <w:webHidden/>
+              </w:rPr>
+              <w:instrText xml:space="preserve"> PAGEREF _Toc233042314 \h </w:instrText>
+            </w:r>
+            <w:r>
+              <w:rPr>
+                <w:noProof/>
+                <w:webHidden/>
+              </w:rPr>
+            </w:r>
+            <w:r>
+              <w:rPr>
+                <w:noProof/>
+                <w:webHidden/>
+              </w:rPr>
+              <w:fldChar w:fldCharType="separate"/>
+            </w:r>
+            <w:r>
+              <w:rPr>
+                <w:noProof/>
+                <w:webHidden/>
+              </w:rPr>
+              <w:t>8</w:t>
+            </w:r>
+            <w:r>
+              <w:rPr>
+                <w:noProof/>
+                <w:webHidden/>
+              </w:rPr>
+              <w:fldChar w:fldCharType="end"/>
+            </w:r>
+          </w:hyperlink>
+        </w:p>
+        <w:p>
+          <w:pPr>
+            <w:pStyle w:val="Verzeichnis2"/>
+            <w:tabs>
+              <w:tab w:val="left" w:pos="960"/>
+              <w:tab w:val="right" w:leader="dot" w:pos="9628"/>
+            </w:tabs>
+            <w:rPr>
+              <w:rFonts w:asciiTheme="minorHAnsi" w:eastAsiaTheme="minorEastAsia" w:hAnsiTheme="minorHAnsi"/>
+              <w:noProof/>
+              <w:kern w:val="2"/>
+              <w:sz w:val="24"/>
+              <w:szCs w:val="24"/>
+              <w:lang w:eastAsia="ja-JP"/>
+              <w14:ligatures w14:val="standardContextual"/>
+            </w:rPr>
+          </w:pPr>
+          <w:hyperlink w:anchor="_Toc233042315" w:history="1">
+            <w:r>
+              <w:rPr>
+                <w:rStyle w:val="Hyperlink"/>
+                <w:bCs/>
+                <w:noProof/>
+              </w:rPr>
+              <w:t>4.5.</w:t>
+            </w:r>
+            <w:r>
+              <w:rPr>
+                <w:rFonts w:asciiTheme="minorHAnsi" w:eastAsiaTheme="minorEastAsia" w:hAnsiTheme="minorHAnsi"/>
+                <w:noProof/>
+                <w:kern w:val="2"/>
+                <w:sz w:val="24"/>
+                <w:szCs w:val="24"/>
+                <w:lang w:eastAsia="ja-JP"/>
+                <w14:ligatures w14:val="standardContextual"/>
+              </w:rPr>
+              <w:tab/>
+            </w:r>
+            <w:r>
+              <w:rPr>
+                <w:rStyle w:val="Hyperlink"/>
+                <w:noProof/>
+              </w:rPr>
+              <w:t>Aufbau der Sensorik und Hilfsklassen</w:t>
+            </w:r>
+            <w:r>
+              <w:rPr>
+                <w:noProof/>
+                <w:webHidden/>
+              </w:rPr>
+              <w:tab/>
+            </w:r>
+            <w:r>
+              <w:rPr>
+                <w:noProof/>
+                <w:webHidden/>
+              </w:rPr>
+              <w:fldChar w:fldCharType="begin"/>
+            </w:r>
+            <w:r>
+              <w:rPr>
+                <w:noProof/>
+                <w:webHidden/>
+              </w:rPr>
+              <w:instrText xml:space="preserve"> PAGEREF _Toc233042315 \h </w:instrText>
+            </w:r>
+            <w:r>
+              <w:rPr>
+                <w:noProof/>
+                <w:webHidden/>
+              </w:rPr>
+            </w:r>
+            <w:r>
+              <w:rPr>
+                <w:noProof/>
+                <w:webHidden/>
+              </w:rPr>
+              <w:fldChar w:fldCharType="separate"/>
+            </w:r>
+            <w:r>
+              <w:rPr>
+                <w:noProof/>
+                <w:webHidden/>
+              </w:rPr>
+              <w:t>8</w:t>
+            </w:r>
+            <w:r>
+              <w:rPr>
+                <w:noProof/>
+                <w:webHidden/>
+              </w:rPr>
+              <w:fldChar w:fldCharType="end"/>
+            </w:r>
+          </w:hyperlink>
+        </w:p>
+        <w:p>
+          <w:pPr>
+            <w:pStyle w:val="Verzeichnis2"/>
+            <w:tabs>
+              <w:tab w:val="left" w:pos="960"/>
+              <w:tab w:val="right" w:leader="dot" w:pos="9628"/>
+            </w:tabs>
+            <w:rPr>
+              <w:rFonts w:asciiTheme="minorHAnsi" w:eastAsiaTheme="minorEastAsia" w:hAnsiTheme="minorHAnsi"/>
+              <w:noProof/>
+              <w:kern w:val="2"/>
+              <w:sz w:val="24"/>
+              <w:szCs w:val="24"/>
+              <w:lang w:eastAsia="ja-JP"/>
+              <w14:ligatures w14:val="standardContextual"/>
+            </w:rPr>
+          </w:pPr>
+          <w:hyperlink w:anchor="_Toc233042316" w:history="1">
+            <w:r>
+              <w:rPr>
+                <w:rStyle w:val="Hyperlink"/>
+                <w:bCs/>
+                <w:noProof/>
+              </w:rPr>
+              <w:t>4.6.</w:t>
+            </w:r>
+            <w:r>
+              <w:rPr>
+                <w:rFonts w:asciiTheme="minorHAnsi" w:eastAsiaTheme="minorEastAsia" w:hAnsiTheme="minorHAnsi"/>
+                <w:noProof/>
+                <w:kern w:val="2"/>
+                <w:sz w:val="24"/>
+                <w:szCs w:val="24"/>
+                <w:lang w:eastAsia="ja-JP"/>
+                <w14:ligatures w14:val="standardContextual"/>
+              </w:rPr>
+              <w:tab/>
+            </w:r>
+            <w:r>
+              <w:rPr>
+                <w:rStyle w:val="Hyperlink"/>
+                <w:noProof/>
+              </w:rPr>
+              <w:t>Umsetzung der Hauptsteuerung</w:t>
+            </w:r>
+            <w:r>
+              <w:rPr>
+                <w:noProof/>
+                <w:webHidden/>
+              </w:rPr>
+              <w:tab/>
+            </w:r>
+            <w:r>
+              <w:rPr>
+                <w:noProof/>
+                <w:webHidden/>
+              </w:rPr>
+              <w:fldChar w:fldCharType="begin"/>
+            </w:r>
+            <w:r>
+              <w:rPr>
+                <w:noProof/>
+                <w:webHidden/>
+              </w:rPr>
+              <w:instrText xml:space="preserve"> PAGEREF _Toc233042316 \h </w:instrText>
+            </w:r>
+            <w:r>
+              <w:rPr>
+                <w:noProof/>
+                <w:webHidden/>
+              </w:rPr>
+            </w:r>
+            <w:r>
+              <w:rPr>
+                <w:noProof/>
+                <w:webHidden/>
+              </w:rPr>
+              <w:fldChar w:fldCharType="separate"/>
+            </w:r>
+            <w:r>
+              <w:rPr>
+                <w:noProof/>
+                <w:webHidden/>
+              </w:rPr>
+              <w:t>8</w:t>
+            </w:r>
+            <w:r>
+              <w:rPr>
+                <w:noProof/>
+                <w:webHidden/>
+              </w:rPr>
+              <w:fldChar w:fldCharType="end"/>
+            </w:r>
+          </w:hyperlink>
+        </w:p>
+        <w:p>
+          <w:pPr>
+            <w:pStyle w:val="Verzeichnis2"/>
+            <w:tabs>
+              <w:tab w:val="left" w:pos="960"/>
+              <w:tab w:val="right" w:leader="dot" w:pos="9628"/>
+            </w:tabs>
+            <w:rPr>
+              <w:rFonts w:asciiTheme="minorHAnsi" w:eastAsiaTheme="minorEastAsia" w:hAnsiTheme="minorHAnsi"/>
+              <w:noProof/>
+              <w:kern w:val="2"/>
+              <w:sz w:val="24"/>
+              <w:szCs w:val="24"/>
+              <w:lang w:eastAsia="ja-JP"/>
+              <w14:ligatures w14:val="standardContextual"/>
+            </w:rPr>
+          </w:pPr>
+          <w:hyperlink w:anchor="_Toc233042317" w:history="1">
+            <w:r>
+              <w:rPr>
+                <w:rStyle w:val="Hyperlink"/>
+                <w:bCs/>
+                <w:noProof/>
+              </w:rPr>
+              <w:t>4.7.</w:t>
+            </w:r>
+            <w:r>
+              <w:rPr>
+                <w:rFonts w:asciiTheme="minorHAnsi" w:eastAsiaTheme="minorEastAsia" w:hAnsiTheme="minorHAnsi"/>
+                <w:noProof/>
+                <w:kern w:val="2"/>
+                <w:sz w:val="24"/>
+                <w:szCs w:val="24"/>
+                <w:lang w:eastAsia="ja-JP"/>
+                <w14:ligatures w14:val="standardContextual"/>
+              </w:rPr>
+              <w:tab/>
+            </w:r>
+            <w:r>
+              <w:rPr>
+                <w:rStyle w:val="Hyperlink"/>
+                <w:noProof/>
+              </w:rPr>
+              <w:t>Schrittkette der Aufzugsteuerung</w:t>
+            </w:r>
+            <w:r>
+              <w:rPr>
+                <w:noProof/>
+                <w:webHidden/>
+              </w:rPr>
+              <w:tab/>
+            </w:r>
+            <w:r>
+              <w:rPr>
+                <w:noProof/>
+                <w:webHidden/>
+              </w:rPr>
+              <w:fldChar w:fldCharType="begin"/>
+            </w:r>
+            <w:r>
+              <w:rPr>
+                <w:noProof/>
+                <w:webHidden/>
+              </w:rPr>
+              <w:instrText xml:space="preserve"> PAGEREF _Toc233042317 \h </w:instrText>
+            </w:r>
+            <w:r>
+              <w:rPr>
+                <w:noProof/>
+                <w:webHidden/>
+              </w:rPr>
+            </w:r>
+            <w:r>
+              <w:rPr>
+                <w:noProof/>
+                <w:webHidden/>
+              </w:rPr>
+              <w:fldChar w:fldCharType="separate"/>
+            </w:r>
+            <w:r>
+              <w:rPr>
+                <w:noProof/>
+                <w:webHidden/>
+              </w:rPr>
+              <w:t>8</w:t>
+            </w:r>
+            <w:r>
+              <w:rPr>
+                <w:noProof/>
+                <w:webHidden/>
+              </w:rPr>
+              <w:fldChar w:fldCharType="end"/>
+            </w:r>
+          </w:hyperlink>
+        </w:p>
+        <w:p>
+          <w:pPr>
+            <w:pStyle w:val="Verzeichnis2"/>
+            <w:tabs>
+              <w:tab w:val="left" w:pos="960"/>
+              <w:tab w:val="right" w:leader="dot" w:pos="9628"/>
+            </w:tabs>
+            <w:rPr>
+              <w:rFonts w:asciiTheme="minorHAnsi" w:eastAsiaTheme="minorEastAsia" w:hAnsiTheme="minorHAnsi"/>
+              <w:noProof/>
+              <w:kern w:val="2"/>
+              <w:sz w:val="24"/>
+              <w:szCs w:val="24"/>
+              <w:lang w:eastAsia="ja-JP"/>
+              <w14:ligatures w14:val="standardContextual"/>
+            </w:rPr>
+          </w:pPr>
+          <w:hyperlink w:anchor="_Toc233042318" w:history="1">
+            <w:r>
+              <w:rPr>
+                <w:rStyle w:val="Hyperlink"/>
+                <w:bCs/>
+                <w:noProof/>
+              </w:rPr>
+              <w:t>4.8.</w:t>
+            </w:r>
+            <w:r>
+              <w:rPr>
+                <w:rFonts w:asciiTheme="minorHAnsi" w:eastAsiaTheme="minorEastAsia" w:hAnsiTheme="minorHAnsi"/>
+                <w:noProof/>
+                <w:kern w:val="2"/>
+                <w:sz w:val="24"/>
+                <w:szCs w:val="24"/>
+                <w:lang w:eastAsia="ja-JP"/>
+                <w14:ligatures w14:val="standardContextual"/>
+              </w:rPr>
+              <w:tab/>
+            </w:r>
+            <w:r>
+              <w:rPr>
+                <w:rStyle w:val="Hyperlink"/>
+                <w:noProof/>
+              </w:rPr>
+              <w:t>Ansteuerung von Aufzug- und Türantrieb</w:t>
+            </w:r>
+            <w:r>
+              <w:rPr>
+                <w:noProof/>
+                <w:webHidden/>
+              </w:rPr>
+              <w:tab/>
+            </w:r>
+            <w:r>
+              <w:rPr>
+                <w:noProof/>
+                <w:webHidden/>
+              </w:rPr>
+              <w:fldChar w:fldCharType="begin"/>
+            </w:r>
+            <w:r>
+              <w:rPr>
+                <w:noProof/>
+                <w:webHidden/>
+              </w:rPr>
+              <w:instrText xml:space="preserve"> PAGEREF _Toc233042318 \h </w:instrText>
+            </w:r>
+            <w:r>
+              <w:rPr>
+                <w:noProof/>
+                <w:webHidden/>
+              </w:rPr>
+            </w:r>
+            <w:r>
+              <w:rPr>
+                <w:noProof/>
+                <w:webHidden/>
+              </w:rPr>
+              <w:fldChar w:fldCharType="separate"/>
+            </w:r>
+            <w:r>
+              <w:rPr>
+                <w:noProof/>
+                <w:webHidden/>
+              </w:rPr>
+              <w:t>8</w:t>
+            </w:r>
+            <w:r>
+              <w:rPr>
+                <w:noProof/>
+                <w:webHidden/>
+              </w:rPr>
+              <w:fldChar w:fldCharType="end"/>
+            </w:r>
+          </w:hyperlink>
+        </w:p>
+        <w:p>
+          <w:pPr>
+            <w:pStyle w:val="Verzeichnis2"/>
+            <w:tabs>
+              <w:tab w:val="left" w:pos="960"/>
+              <w:tab w:val="right" w:leader="dot" w:pos="9628"/>
+            </w:tabs>
+            <w:rPr>
+              <w:rFonts w:asciiTheme="minorHAnsi" w:eastAsiaTheme="minorEastAsia" w:hAnsiTheme="minorHAnsi"/>
+              <w:noProof/>
+              <w:kern w:val="2"/>
+              <w:sz w:val="24"/>
+              <w:szCs w:val="24"/>
+              <w:lang w:eastAsia="ja-JP"/>
+              <w14:ligatures w14:val="standardContextual"/>
+            </w:rPr>
+          </w:pPr>
+          <w:hyperlink w:anchor="_Toc233042319" w:history="1">
+            <w:r>
+              <w:rPr>
+                <w:rStyle w:val="Hyperlink"/>
+                <w:bCs/>
+                <w:noProof/>
+              </w:rPr>
+              <w:t>4.9.</w:t>
+            </w:r>
+            <w:r>
+              <w:rPr>
+                <w:rFonts w:asciiTheme="minorHAnsi" w:eastAsiaTheme="minorEastAsia" w:hAnsiTheme="minorHAnsi"/>
+                <w:noProof/>
+                <w:kern w:val="2"/>
+                <w:sz w:val="24"/>
+                <w:szCs w:val="24"/>
+                <w:lang w:eastAsia="ja-JP"/>
+                <w14:ligatures w14:val="standardContextual"/>
+              </w:rPr>
+              <w:tab/>
+            </w:r>
+            <w:r>
+              <w:rPr>
+                <w:rStyle w:val="Hyperlink"/>
+                <w:noProof/>
+              </w:rPr>
+              <w:t>HMI-Anbindung und Visualisierung</w:t>
+            </w:r>
+            <w:r>
+              <w:rPr>
+                <w:noProof/>
+                <w:webHidden/>
+              </w:rPr>
+              <w:tab/>
+            </w:r>
+            <w:r>
+              <w:rPr>
+                <w:noProof/>
+                <w:webHidden/>
+              </w:rPr>
+              <w:fldChar w:fldCharType="begin"/>
+            </w:r>
+            <w:r>
+              <w:rPr>
+                <w:noProof/>
+                <w:webHidden/>
+              </w:rPr>
+              <w:instrText xml:space="preserve"> PAGEREF _Toc233042319 \h </w:instrText>
+            </w:r>
+            <w:r>
+              <w:rPr>
+                <w:noProof/>
+                <w:webHidden/>
+              </w:rPr>
+            </w:r>
+            <w:r>
+              <w:rPr>
+                <w:noProof/>
+                <w:webHidden/>
+              </w:rPr>
+              <w:fldChar w:fldCharType="separate"/>
+            </w:r>
+            <w:r>
+              <w:rPr>
+                <w:noProof/>
+                <w:webHidden/>
+              </w:rPr>
+              <w:t>8</w:t>
+            </w:r>
+            <w:r>
+              <w:rPr>
+                <w:noProof/>
+                <w:webHidden/>
+              </w:rPr>
+              <w:fldChar w:fldCharType="end"/>
+            </w:r>
+          </w:hyperlink>
+        </w:p>
+        <w:p>
+          <w:pPr>
+            <w:pStyle w:val="Verzeichnis2"/>
+            <w:tabs>
+              <w:tab w:val="left" w:pos="960"/>
+              <w:tab w:val="right" w:leader="dot" w:pos="9628"/>
+            </w:tabs>
+            <w:rPr>
+              <w:rFonts w:asciiTheme="minorHAnsi" w:eastAsiaTheme="minorEastAsia" w:hAnsiTheme="minorHAnsi"/>
+              <w:noProof/>
+              <w:kern w:val="2"/>
+              <w:sz w:val="24"/>
+              <w:szCs w:val="24"/>
+              <w:lang w:eastAsia="ja-JP"/>
+              <w14:ligatures w14:val="standardContextual"/>
+            </w:rPr>
+          </w:pPr>
+          <w:hyperlink w:anchor="_Toc233042320" w:history="1">
+            <w:r>
+              <w:rPr>
+                <w:rStyle w:val="Hyperlink"/>
+                <w:bCs/>
+                <w:noProof/>
+              </w:rPr>
+              <w:t>4.10.</w:t>
+            </w:r>
+            <w:r>
+              <w:rPr>
+                <w:rFonts w:asciiTheme="minorHAnsi" w:eastAsiaTheme="minorEastAsia" w:hAnsiTheme="minorHAnsi"/>
+                <w:noProof/>
+                <w:kern w:val="2"/>
+                <w:sz w:val="24"/>
+                <w:szCs w:val="24"/>
+                <w:lang w:eastAsia="ja-JP"/>
+                <w14:ligatures w14:val="standardContextual"/>
+              </w:rPr>
+              <w:tab/>
+            </w:r>
+            <w:r>
+              <w:rPr>
+                <w:rStyle w:val="Hyperlink"/>
+                <w:noProof/>
+              </w:rPr>
+              <w:t>Testen, Bugfixes und Zusammenführung der Branches</w:t>
+            </w:r>
+            <w:r>
+              <w:rPr>
+                <w:noProof/>
+                <w:webHidden/>
+              </w:rPr>
+              <w:tab/>
+            </w:r>
+            <w:r>
+              <w:rPr>
+                <w:noProof/>
+                <w:webHidden/>
+              </w:rPr>
+              <w:fldChar w:fldCharType="begin"/>
+            </w:r>
+            <w:r>
+              <w:rPr>
+                <w:noProof/>
+                <w:webHidden/>
+              </w:rPr>
+              <w:instrText xml:space="preserve"> PAGEREF _Toc233042320 \h </w:instrText>
+            </w:r>
+            <w:r>
+              <w:rPr>
+                <w:noProof/>
+                <w:webHidden/>
+              </w:rPr>
+            </w:r>
+            <w:r>
+              <w:rPr>
+                <w:noProof/>
+                <w:webHidden/>
+              </w:rPr>
+              <w:fldChar w:fldCharType="separate"/>
+            </w:r>
+            <w:r>
+              <w:rPr>
+                <w:noProof/>
+                <w:webHidden/>
+              </w:rPr>
+              <w:t>8</w:t>
+            </w:r>
+            <w:r>
+              <w:rPr>
+                <w:noProof/>
+                <w:webHidden/>
+              </w:rPr>
+              <w:fldChar w:fldCharType="end"/>
+            </w:r>
+          </w:hyperlink>
+        </w:p>
+        <w:p>
+          <w:pPr>
+            <w:pStyle w:val="Verzeichnis1"/>
+            <w:tabs>
+              <w:tab w:val="left" w:pos="480"/>
+              <w:tab w:val="right" w:leader="dot" w:pos="9628"/>
+            </w:tabs>
+            <w:rPr>
+              <w:rFonts w:asciiTheme="minorHAnsi" w:eastAsiaTheme="minorEastAsia" w:hAnsiTheme="minorHAnsi"/>
+              <w:noProof/>
+              <w:kern w:val="2"/>
+              <w:sz w:val="24"/>
+              <w:szCs w:val="24"/>
+              <w:lang w:eastAsia="ja-JP"/>
+              <w14:ligatures w14:val="standardContextual"/>
+            </w:rPr>
+          </w:pPr>
+          <w:hyperlink w:anchor="_Toc233042321" w:history="1">
+            <w:r>
+              <w:rPr>
+                <w:rStyle w:val="Hyperlink"/>
+                <w:bCs/>
+                <w:noProof/>
+              </w:rPr>
+              <w:t>5.</w:t>
+            </w:r>
+            <w:r>
+              <w:rPr>
+                <w:rFonts w:asciiTheme="minorHAnsi" w:eastAsiaTheme="minorEastAsia" w:hAnsiTheme="minorHAnsi"/>
+                <w:noProof/>
+                <w:kern w:val="2"/>
+                <w:sz w:val="24"/>
+                <w:szCs w:val="24"/>
+                <w:lang w:eastAsia="ja-JP"/>
+                <w14:ligatures w14:val="standardContextual"/>
+              </w:rPr>
+              <w:tab/>
+            </w:r>
+            <w:r>
+              <w:rPr>
+                <w:rStyle w:val="Hyperlink"/>
+                <w:noProof/>
+              </w:rPr>
+              <w:t>Schlussteil</w:t>
+            </w:r>
+            <w:r>
+              <w:rPr>
+                <w:noProof/>
+                <w:webHidden/>
+              </w:rPr>
+              <w:tab/>
+            </w:r>
+            <w:r>
+              <w:rPr>
+                <w:noProof/>
+                <w:webHidden/>
+              </w:rPr>
+              <w:fldChar w:fldCharType="begin"/>
+            </w:r>
+            <w:r>
+              <w:rPr>
+                <w:noProof/>
+                <w:webHidden/>
+              </w:rPr>
+              <w:instrText xml:space="preserve"> PAGEREF _Toc233042321 \h </w:instrText>
+            </w:r>
+            <w:r>
+              <w:rPr>
+                <w:noProof/>
+                <w:webHidden/>
+              </w:rPr>
+            </w:r>
+            <w:r>
+              <w:rPr>
+                <w:noProof/>
+                <w:webHidden/>
+              </w:rPr>
+              <w:fldChar w:fldCharType="separate"/>
+            </w:r>
+            <w:r>
+              <w:rPr>
+                <w:noProof/>
+                <w:webHidden/>
+              </w:rPr>
+              <w:t>9</w:t>
+            </w:r>
+            <w:r>
+              <w:rPr>
+                <w:noProof/>
+                <w:webHidden/>
+              </w:rPr>
+              <w:fldChar w:fldCharType="end"/>
+            </w:r>
+          </w:hyperlink>
+        </w:p>
+        <w:p>
+          <w:pPr>
+            <w:pStyle w:val="Verzeichnis2"/>
+            <w:tabs>
+              <w:tab w:val="left" w:pos="960"/>
+              <w:tab w:val="right" w:leader="dot" w:pos="9628"/>
+            </w:tabs>
+            <w:rPr>
+              <w:rFonts w:asciiTheme="minorHAnsi" w:eastAsiaTheme="minorEastAsia" w:hAnsiTheme="minorHAnsi"/>
+              <w:noProof/>
+              <w:kern w:val="2"/>
+              <w:sz w:val="24"/>
+              <w:szCs w:val="24"/>
+              <w:lang w:eastAsia="ja-JP"/>
+              <w14:ligatures w14:val="standardContextual"/>
+            </w:rPr>
+          </w:pPr>
+          <w:hyperlink w:anchor="_Toc233042322" w:history="1">
+            <w:r>
+              <w:rPr>
+                <w:rStyle w:val="Hyperlink"/>
+                <w:bCs/>
+                <w:noProof/>
+              </w:rPr>
+              <w:t>5.1.</w:t>
+            </w:r>
+            <w:r>
+              <w:rPr>
+                <w:rFonts w:asciiTheme="minorHAnsi" w:eastAsiaTheme="minorEastAsia" w:hAnsiTheme="minorHAnsi"/>
+                <w:noProof/>
+                <w:kern w:val="2"/>
+                <w:sz w:val="24"/>
+                <w:szCs w:val="24"/>
+                <w:lang w:eastAsia="ja-JP"/>
+                <w14:ligatures w14:val="standardContextual"/>
+              </w:rPr>
+              <w:tab/>
+            </w:r>
+            <w:r>
+              <w:rPr>
+                <w:rStyle w:val="Hyperlink"/>
+                <w:noProof/>
+              </w:rPr>
+              <w:t>Niklaus</w:t>
+            </w:r>
+            <w:r>
+              <w:rPr>
+                <w:noProof/>
+                <w:webHidden/>
+              </w:rPr>
+              <w:tab/>
+            </w:r>
+            <w:r>
+              <w:rPr>
+                <w:noProof/>
+                <w:webHidden/>
+              </w:rPr>
+              <w:fldChar w:fldCharType="begin"/>
+            </w:r>
+            <w:r>
+              <w:rPr>
+                <w:noProof/>
+                <w:webHidden/>
+              </w:rPr>
+              <w:instrText xml:space="preserve"> PAGEREF _Toc233042322 \h </w:instrText>
+            </w:r>
+            <w:r>
+              <w:rPr>
+                <w:noProof/>
+                <w:webHidden/>
+              </w:rPr>
+            </w:r>
+            <w:r>
+              <w:rPr>
+                <w:noProof/>
+                <w:webHidden/>
+              </w:rPr>
+              <w:fldChar w:fldCharType="separate"/>
+            </w:r>
+            <w:r>
+              <w:rPr>
+                <w:noProof/>
+                <w:webHidden/>
+              </w:rPr>
+              <w:t>9</w:t>
+            </w:r>
+            <w:r>
+              <w:rPr>
+                <w:noProof/>
+                <w:webHidden/>
+              </w:rPr>
+              <w:fldChar w:fldCharType="end"/>
+            </w:r>
+          </w:hyperlink>
+        </w:p>
+        <w:p>
+          <w:pPr>
+            <w:pStyle w:val="Verzeichnis2"/>
+            <w:tabs>
+              <w:tab w:val="left" w:pos="960"/>
+              <w:tab w:val="right" w:leader="dot" w:pos="9628"/>
+            </w:tabs>
+            <w:rPr>
+              <w:rFonts w:asciiTheme="minorHAnsi" w:eastAsiaTheme="minorEastAsia" w:hAnsiTheme="minorHAnsi"/>
+              <w:noProof/>
+              <w:kern w:val="2"/>
+              <w:sz w:val="24"/>
+              <w:szCs w:val="24"/>
+              <w:lang w:eastAsia="ja-JP"/>
+              <w14:ligatures w14:val="standardContextual"/>
+            </w:rPr>
+          </w:pPr>
+          <w:hyperlink w:anchor="_Toc233042323" w:history="1">
+            <w:r>
+              <w:rPr>
+                <w:rStyle w:val="Hyperlink"/>
+                <w:bCs/>
+                <w:noProof/>
+              </w:rPr>
+              <w:t>5.2.</w:t>
+            </w:r>
+            <w:r>
+              <w:rPr>
+                <w:rFonts w:asciiTheme="minorHAnsi" w:eastAsiaTheme="minorEastAsia" w:hAnsiTheme="minorHAnsi"/>
+                <w:noProof/>
+                <w:kern w:val="2"/>
+                <w:sz w:val="24"/>
+                <w:szCs w:val="24"/>
+                <w:lang w:eastAsia="ja-JP"/>
+                <w14:ligatures w14:val="standardContextual"/>
+              </w:rPr>
+              <w:tab/>
+            </w:r>
+            <w:r>
+              <w:rPr>
+                <w:rStyle w:val="Hyperlink"/>
+                <w:noProof/>
+              </w:rPr>
+              <w:t>Hassan</w:t>
+            </w:r>
+            <w:r>
+              <w:rPr>
+                <w:noProof/>
+                <w:webHidden/>
+              </w:rPr>
+              <w:tab/>
+            </w:r>
+            <w:r>
+              <w:rPr>
+                <w:noProof/>
+                <w:webHidden/>
+              </w:rPr>
+              <w:fldChar w:fldCharType="begin"/>
+            </w:r>
+            <w:r>
+              <w:rPr>
+                <w:noProof/>
+                <w:webHidden/>
+              </w:rPr>
+              <w:instrText xml:space="preserve"> PAGEREF _Toc233042323 \h </w:instrText>
+            </w:r>
+            <w:r>
+              <w:rPr>
+                <w:noProof/>
+                <w:webHidden/>
+              </w:rPr>
+            </w:r>
+            <w:r>
+              <w:rPr>
+                <w:noProof/>
+                <w:webHidden/>
+              </w:rPr>
+              <w:fldChar w:fldCharType="separate"/>
+            </w:r>
+            <w:r>
+              <w:rPr>
+                <w:noProof/>
+                <w:webHidden/>
+              </w:rPr>
+              <w:t>9</w:t>
             </w:r>
             <w:r>
               <w:rPr>
@@ -1683,7 +2813,7 @@
               <w14:ligatures w14:val="standardContextual"/>
             </w:rPr>
           </w:pPr>
-          <w:hyperlink w:anchor="_Toc231874437" w:history="1">
+          <w:hyperlink w:anchor="_Toc233042324" w:history="1">
             <w:r>
               <w:rPr>
                 <w:rStyle w:val="Hyperlink"/>
@@ -1710,7 +2840,7 @@
                 <w:noProof/>
                 <w:webHidden/>
               </w:rPr>
-              <w:instrText xml:space="preserve"> PAGEREF _Toc231874437 \h </w:instrText>
+              <w:instrText xml:space="preserve"> PAGEREF _Toc233042324 \h </w:instrText>
             </w:r>
             <w:r>
               <w:rPr>
@@ -1757,7 +2887,7 @@
               <w14:ligatures w14:val="standardContextual"/>
             </w:rPr>
           </w:pPr>
-          <w:hyperlink w:anchor="_Toc231874438" w:history="1">
+          <w:hyperlink w:anchor="_Toc233042325" w:history="1">
             <w:r>
               <w:rPr>
                 <w:rStyle w:val="Hyperlink"/>
@@ -1784,7 +2914,7 @@
                 <w:noProof/>
                 <w:webHidden/>
               </w:rPr>
-              <w:instrText xml:space="preserve"> PAGEREF _Toc231874438 \h </w:instrText>
+              <w:instrText xml:space="preserve"> PAGEREF _Toc233042325 \h </w:instrText>
             </w:r>
             <w:r>
               <w:rPr>
@@ -1804,7 +2934,7 @@
                 <w:noProof/>
                 <w:webHidden/>
               </w:rPr>
-              <w:t>10</w:t>
+              <w:t>12</w:t>
             </w:r>
             <w:r>
               <w:rPr>
@@ -1831,7 +2961,7 @@
               <w14:ligatures w14:val="standardContextual"/>
             </w:rPr>
           </w:pPr>
-          <w:hyperlink w:anchor="_Toc231874439" w:history="1">
+          <w:hyperlink w:anchor="_Toc233042326" w:history="1">
             <w:r>
               <w:rPr>
                 <w:rStyle w:val="Hyperlink"/>
@@ -1858,7 +2988,7 @@
                 <w:noProof/>
                 <w:webHidden/>
               </w:rPr>
-              <w:instrText xml:space="preserve"> PAGEREF _Toc231874439 \h </w:instrText>
+              <w:instrText xml:space="preserve"> PAGEREF _Toc233042326 \h </w:instrText>
             </w:r>
             <w:r>
               <w:rPr>
@@ -1878,7 +3008,7 @@
                 <w:noProof/>
                 <w:webHidden/>
               </w:rPr>
-              <w:t>11</w:t>
+              <w:t>13</w:t>
             </w:r>
             <w:r>
               <w:rPr>
@@ -1905,7 +3035,7 @@
               <w14:ligatures w14:val="standardContextual"/>
             </w:rPr>
           </w:pPr>
-          <w:hyperlink w:anchor="_Toc231874440" w:history="1">
+          <w:hyperlink w:anchor="_Toc233042327" w:history="1">
             <w:r>
               <w:rPr>
                 <w:rStyle w:val="Hyperlink"/>
@@ -1932,7 +3062,7 @@
                 <w:noProof/>
                 <w:webHidden/>
               </w:rPr>
-              <w:instrText xml:space="preserve"> PAGEREF _Toc231874440 \h </w:instrText>
+              <w:instrText xml:space="preserve"> PAGEREF _Toc233042327 \h </w:instrText>
             </w:r>
             <w:r>
               <w:rPr>
@@ -1952,7 +3082,7 @@
                 <w:noProof/>
                 <w:webHidden/>
               </w:rPr>
-              <w:t>12</w:t>
+              <w:t>14</w:t>
             </w:r>
             <w:r>
               <w:rPr>
@@ -1979,7 +3109,7 @@
               <w14:ligatures w14:val="standardContextual"/>
             </w:rPr>
           </w:pPr>
-          <w:hyperlink w:anchor="_Toc231874441" w:history="1">
+          <w:hyperlink w:anchor="_Toc233042328" w:history="1">
             <w:r>
               <w:rPr>
                 <w:rStyle w:val="Hyperlink"/>
@@ -2006,7 +3136,7 @@
                 <w:noProof/>
                 <w:webHidden/>
               </w:rPr>
-              <w:instrText xml:space="preserve"> PAGEREF _Toc231874441 \h </w:instrText>
+              <w:instrText xml:space="preserve"> PAGEREF _Toc233042328 \h </w:instrText>
             </w:r>
             <w:r>
               <w:rPr>
@@ -2026,7 +3156,7 @@
                 <w:noProof/>
                 <w:webHidden/>
               </w:rPr>
-              <w:t>13</w:t>
+              <w:t>16</w:t>
             </w:r>
             <w:r>
               <w:rPr>
@@ -2053,7 +3183,7 @@
               <w14:ligatures w14:val="standardContextual"/>
             </w:rPr>
           </w:pPr>
-          <w:hyperlink w:anchor="_Toc231874442" w:history="1">
+          <w:hyperlink w:anchor="_Toc233042329" w:history="1">
             <w:r>
               <w:rPr>
                 <w:rStyle w:val="Hyperlink"/>
@@ -2080,7 +3210,7 @@
                 <w:noProof/>
                 <w:webHidden/>
               </w:rPr>
-              <w:instrText xml:space="preserve"> PAGEREF _Toc231874442 \h </w:instrText>
+              <w:instrText xml:space="preserve"> PAGEREF _Toc233042329 \h </w:instrText>
             </w:r>
             <w:r>
               <w:rPr>
@@ -2100,7 +3230,7 @@
                 <w:noProof/>
                 <w:webHidden/>
               </w:rPr>
-              <w:t>13</w:t>
+              <w:t>16</w:t>
             </w:r>
             <w:r>
               <w:rPr>
@@ -2143,7 +3273,7 @@
       <w:pPr>
         <w:pStyle w:val="berschrift1"/>
       </w:pPr>
-      <w:bookmarkStart w:id="0" w:name="_Toc231874426"/>
+      <w:bookmarkStart w:id="0" w:name="_Toc233042300"/>
       <w:r>
         <w:lastRenderedPageBreak/>
         <w:t>Einleitung</w:t>
@@ -2171,7 +3301,7 @@
       <w:pPr>
         <w:pStyle w:val="berschrift1"/>
       </w:pPr>
-      <w:bookmarkStart w:id="1" w:name="_Toc231874427"/>
+      <w:bookmarkStart w:id="1" w:name="_Toc233042301"/>
       <w:r>
         <w:t>Anforderungen und Ziele</w:t>
       </w:r>
@@ -2205,14 +3335,13 @@
       <w:pPr>
         <w:pStyle w:val="berschrift2"/>
         <w:rPr>
-          <w:b/>
+          <w:b w:val="0"/>
           <w:bCs/>
         </w:rPr>
       </w:pPr>
-      <w:bookmarkStart w:id="2" w:name="_Toc231874428"/>
+      <w:bookmarkStart w:id="2" w:name="_Toc233042302"/>
       <w:r>
         <w:rPr>
-          <w:b/>
           <w:bCs/>
         </w:rPr>
         <w:t>Muss-Ziele</w:t>
@@ -2253,14 +3382,13 @@
       <w:pPr>
         <w:pStyle w:val="berschrift2"/>
         <w:rPr>
-          <w:b/>
+          <w:b w:val="0"/>
           <w:bCs/>
         </w:rPr>
       </w:pPr>
-      <w:bookmarkStart w:id="3" w:name="_Toc231874429"/>
+      <w:bookmarkStart w:id="3" w:name="_Toc233042303"/>
       <w:r>
         <w:rPr>
-          <w:b/>
           <w:bCs/>
         </w:rPr>
         <w:t>Kann-Ziele / Bonus-Ziele</w:t>
@@ -2295,7 +3423,7 @@
       <w:pPr>
         <w:pStyle w:val="berschrift1"/>
       </w:pPr>
-      <w:bookmarkStart w:id="4" w:name="_Toc231874430"/>
+      <w:bookmarkStart w:id="4" w:name="_Toc233042304"/>
       <w:r>
         <w:t>Planen und Konzipieren</w:t>
       </w:r>
@@ -2316,21 +3444,19 @@
       <w:pPr>
         <w:pStyle w:val="berschrift2"/>
         <w:rPr>
-          <w:b/>
+          <w:b w:val="0"/>
           <w:bCs/>
         </w:rPr>
       </w:pPr>
       <w:r>
         <w:rPr>
-          <w:b/>
           <w:bCs/>
         </w:rPr>
         <w:t xml:space="preserve"> </w:t>
       </w:r>
-      <w:bookmarkStart w:id="5" w:name="_Toc231874431"/>
+      <w:bookmarkStart w:id="5" w:name="_Toc233042305"/>
       <w:r>
         <w:rPr>
-          <w:b/>
           <w:bCs/>
         </w:rPr>
         <w:t>Flussdiagramm</w:t>
@@ -2406,18 +3532,31 @@
         <w:pStyle w:val="Beschriftung"/>
         <w:jc w:val="center"/>
       </w:pPr>
-      <w:bookmarkStart w:id="6" w:name="_Toc231872781"/>
+      <w:bookmarkStart w:id="6" w:name="_Toc233046549"/>
       <w:r>
         <w:t xml:space="preserve">Abbildung </w:t>
       </w:r>
-      <w:fldSimple w:instr=" SEQ Abbildung \* ARABIC ">
-        <w:r>
-          <w:rPr>
-            <w:noProof/>
-          </w:rPr>
-          <w:t>1</w:t>
-        </w:r>
-      </w:fldSimple>
+      <w:r>
+        <w:fldChar w:fldCharType="begin"/>
+      </w:r>
+      <w:r>
+        <w:instrText xml:space="preserve"> SEQ Abbildung \* ARABIC </w:instrText>
+      </w:r>
+      <w:r>
+        <w:fldChar w:fldCharType="separate"/>
+      </w:r>
+      <w:r>
+        <w:rPr>
+          <w:noProof/>
+        </w:rPr>
+        <w:t>1</w:t>
+      </w:r>
+      <w:r>
+        <w:rPr>
+          <w:noProof/>
+        </w:rPr>
+        <w:fldChar w:fldCharType="end"/>
+      </w:r>
       <w:r>
         <w:t xml:space="preserve">: </w:t>
       </w:r>
@@ -2436,14 +3575,13 @@
       <w:pPr>
         <w:pStyle w:val="berschrift2"/>
         <w:rPr>
-          <w:b/>
+          <w:b w:val="0"/>
           <w:bCs/>
         </w:rPr>
       </w:pPr>
-      <w:bookmarkStart w:id="7" w:name="_Toc231874432"/>
+      <w:bookmarkStart w:id="7" w:name="_Toc233042306"/>
       <w:r>
         <w:rPr>
-          <w:b/>
           <w:bCs/>
         </w:rPr>
         <w:t>Zustandsautomat</w:t>
@@ -2524,18 +3662,31 @@
         <w:pStyle w:val="Beschriftung"/>
         <w:jc w:val="center"/>
       </w:pPr>
-      <w:bookmarkStart w:id="8" w:name="_Toc231872782"/>
+      <w:bookmarkStart w:id="8" w:name="_Toc233046550"/>
       <w:r>
         <w:t xml:space="preserve">Abbildung </w:t>
       </w:r>
-      <w:fldSimple w:instr=" SEQ Abbildung \* ARABIC ">
-        <w:r>
-          <w:rPr>
-            <w:noProof/>
-          </w:rPr>
-          <w:t>2</w:t>
-        </w:r>
-      </w:fldSimple>
+      <w:r>
+        <w:fldChar w:fldCharType="begin"/>
+      </w:r>
+      <w:r>
+        <w:instrText xml:space="preserve"> SEQ Abbildung \* ARABIC </w:instrText>
+      </w:r>
+      <w:r>
+        <w:fldChar w:fldCharType="separate"/>
+      </w:r>
+      <w:r>
+        <w:rPr>
+          <w:noProof/>
+        </w:rPr>
+        <w:t>2</w:t>
+      </w:r>
+      <w:r>
+        <w:rPr>
+          <w:noProof/>
+        </w:rPr>
+        <w:fldChar w:fldCharType="end"/>
+      </w:r>
       <w:r>
         <w:t xml:space="preserve">: </w:t>
       </w:r>
@@ -2559,17 +3710,16 @@
       <w:pPr>
         <w:pStyle w:val="berschrift2"/>
         <w:rPr>
-          <w:b/>
+          <w:b w:val="0"/>
           <w:bCs/>
         </w:rPr>
       </w:pPr>
       <w:r>
         <w:t xml:space="preserve"> </w:t>
       </w:r>
-      <w:bookmarkStart w:id="9" w:name="_Toc231874433"/>
+      <w:bookmarkStart w:id="9" w:name="_Toc233042307"/>
       <w:r>
         <w:rPr>
-          <w:b/>
           <w:bCs/>
         </w:rPr>
         <w:t>Architektur der Steuerung</w:t>
@@ -2654,18 +3804,31 @@
         <w:pStyle w:val="Beschriftung"/>
         <w:jc w:val="center"/>
       </w:pPr>
-      <w:bookmarkStart w:id="10" w:name="_Toc231872783"/>
+      <w:bookmarkStart w:id="10" w:name="_Toc233046551"/>
       <w:r>
         <w:t xml:space="preserve">Abbildung </w:t>
       </w:r>
-      <w:fldSimple w:instr=" SEQ Abbildung \* ARABIC ">
-        <w:r>
-          <w:rPr>
-            <w:noProof/>
-          </w:rPr>
-          <w:t>3</w:t>
-        </w:r>
-      </w:fldSimple>
+      <w:r>
+        <w:fldChar w:fldCharType="begin"/>
+      </w:r>
+      <w:r>
+        <w:instrText xml:space="preserve"> SEQ Abbildung \* ARABIC </w:instrText>
+      </w:r>
+      <w:r>
+        <w:fldChar w:fldCharType="separate"/>
+      </w:r>
+      <w:r>
+        <w:rPr>
+          <w:noProof/>
+        </w:rPr>
+        <w:t>3</w:t>
+      </w:r>
+      <w:r>
+        <w:rPr>
+          <w:noProof/>
+        </w:rPr>
+        <w:fldChar w:fldCharType="end"/>
+      </w:r>
       <w:r>
         <w:t xml:space="preserve">: </w:t>
       </w:r>
@@ -2690,14 +3853,13 @@
       <w:pPr>
         <w:pStyle w:val="berschrift2"/>
         <w:rPr>
-          <w:b/>
+          <w:b w:val="0"/>
           <w:bCs/>
         </w:rPr>
       </w:pPr>
-      <w:bookmarkStart w:id="11" w:name="_Toc231874434"/>
+      <w:bookmarkStart w:id="11" w:name="_Toc233042308"/>
       <w:r>
         <w:rPr>
-          <w:b/>
           <w:bCs/>
         </w:rPr>
         <w:lastRenderedPageBreak/>
@@ -2857,18 +4019,31 @@
         <w:pStyle w:val="Beschriftung"/>
         <w:jc w:val="center"/>
       </w:pPr>
-      <w:bookmarkStart w:id="12" w:name="_Toc231872784"/>
+      <w:bookmarkStart w:id="12" w:name="_Toc233046552"/>
       <w:r>
         <w:t xml:space="preserve">Abbildung </w:t>
       </w:r>
-      <w:fldSimple w:instr=" SEQ Abbildung \* ARABIC ">
-        <w:r>
-          <w:rPr>
-            <w:noProof/>
-          </w:rPr>
-          <w:t>4</w:t>
-        </w:r>
-      </w:fldSimple>
+      <w:r>
+        <w:fldChar w:fldCharType="begin"/>
+      </w:r>
+      <w:r>
+        <w:instrText xml:space="preserve"> SEQ Abbildung \* ARABIC </w:instrText>
+      </w:r>
+      <w:r>
+        <w:fldChar w:fldCharType="separate"/>
+      </w:r>
+      <w:r>
+        <w:rPr>
+          <w:noProof/>
+        </w:rPr>
+        <w:t>4</w:t>
+      </w:r>
+      <w:r>
+        <w:rPr>
+          <w:noProof/>
+        </w:rPr>
+        <w:fldChar w:fldCharType="end"/>
+      </w:r>
       <w:r>
         <w:t>: HMI-Skizze</w:t>
       </w:r>
@@ -2885,14 +4060,13 @@
       <w:pPr>
         <w:pStyle w:val="berschrift2"/>
         <w:rPr>
-          <w:b/>
+          <w:b w:val="0"/>
           <w:bCs/>
         </w:rPr>
       </w:pPr>
-      <w:bookmarkStart w:id="13" w:name="_Toc231874435"/>
+      <w:bookmarkStart w:id="13" w:name="_Toc233042309"/>
       <w:r>
         <w:rPr>
-          <w:b/>
           <w:bCs/>
         </w:rPr>
         <w:lastRenderedPageBreak/>
@@ -3029,21 +4203,924 @@
       <w:pPr>
         <w:pStyle w:val="berschrift1"/>
       </w:pPr>
-      <w:bookmarkStart w:id="14" w:name="_Toc231874436"/>
+      <w:bookmarkStart w:id="14" w:name="_Toc233042310"/>
       <w:r>
         <w:t>Umsetzung</w:t>
       </w:r>
       <w:bookmarkEnd w:id="14"/>
     </w:p>
+    <w:p>
+      <w:pPr>
+        <w:pStyle w:val="berschrift2"/>
+      </w:pPr>
+      <w:bookmarkStart w:id="15" w:name="_Toc233042311"/>
+      <w:r>
+        <w:t>Aufbau des SPS-Projekt</w:t>
+      </w:r>
+      <w:bookmarkEnd w:id="15"/>
+    </w:p>
+    <w:p>
+      <w:r>
+        <w:t xml:space="preserve">Nachdem die Analyse und die Planung abgeschlossen waren, wurde als erster Umsetzungsschritt das SPS-Projekt aufgebaut. Dafür wurde im LASAL </w:t>
+      </w:r>
+      <w:proofErr w:type="spellStart"/>
+      <w:r>
+        <w:t>Machine</w:t>
+      </w:r>
+      <w:proofErr w:type="spellEnd"/>
+      <w:r>
+        <w:t xml:space="preserve"> Manager eine neue Solution erstellt, in der die CP112-Steuerung und das HMI gemeinsam verwaltet werden. Damit war die Grundstruktur vorhanden, um später die SPS-Logik, die Antriebe und die Visualisierung im gleichen Projekt weiterzuentwickeln.</w:t>
+      </w:r>
+    </w:p>
+    <w:p/>
+    <w:p>
+      <w:r>
+        <w:t xml:space="preserve">Anschliessend wurde das Projekt in das gemeinsame GitHub-Repository hochgeladen, auf das beide Projektmitglieder Zugriff hatten. Die Repository-Struktur wurde in die Ordner Doc und </w:t>
+      </w:r>
+      <w:proofErr w:type="spellStart"/>
+      <w:r>
+        <w:t>src</w:t>
+      </w:r>
+      <w:proofErr w:type="spellEnd"/>
+      <w:r>
+        <w:t xml:space="preserve"> aufgeteilt. Im Ordner Doc wurden die Dokumentation, Aufgabenstellung und Analyse abgelegt. Im Ordner </w:t>
+      </w:r>
+      <w:proofErr w:type="spellStart"/>
+      <w:r>
+        <w:t>src</w:t>
+      </w:r>
+      <w:proofErr w:type="spellEnd"/>
+      <w:r>
+        <w:t xml:space="preserve"> befanden sich die LASAL-Projektdateien für SPS und HMI. Zusätzlich wurden eine .gitignore- und eine .</w:t>
+      </w:r>
+      <w:proofErr w:type="spellStart"/>
+      <w:r>
+        <w:t>gitattributes</w:t>
+      </w:r>
+      <w:proofErr w:type="spellEnd"/>
+      <w:r>
+        <w:t>-Datei ergänzt, damit die LASAL-Dateien sauber versioniert werden konnten.</w:t>
+      </w:r>
+    </w:p>
+    <w:p/>
+    <w:p/>
+    <w:p/>
+    <w:p>
+      <w:pPr>
+        <w:keepNext/>
+      </w:pPr>
+      <w:r>
+        <w:rPr>
+          <w:noProof/>
+        </w:rPr>
+        <w:lastRenderedPageBreak/>
+        <w:drawing>
+          <wp:inline distT="0" distB="0" distL="0" distR="0" wp14:anchorId="54625FE5" wp14:editId="029A37F3">
+            <wp:extent cx="6120130" cy="1140460"/>
+            <wp:effectExtent l="0" t="0" r="1270" b="2540"/>
+            <wp:docPr id="1795454183" name="Grafik 2" descr="Benutzeranhang"/>
+            <wp:cNvGraphicFramePr>
+              <a:graphicFrameLocks xmlns:a="http://schemas.openxmlformats.org/drawingml/2006/main" noChangeAspect="1"/>
+            </wp:cNvGraphicFramePr>
+            <a:graphic xmlns:a="http://schemas.openxmlformats.org/drawingml/2006/main">
+              <a:graphicData uri="http://schemas.openxmlformats.org/drawingml/2006/picture">
+                <pic:pic xmlns:pic="http://schemas.openxmlformats.org/drawingml/2006/picture">
+                  <pic:nvPicPr>
+                    <pic:cNvPr id="0" name="Picture 5" descr="Benutzeranhang"/>
+                    <pic:cNvPicPr>
+                      <a:picLocks noChangeAspect="1" noChangeArrowheads="1"/>
+                    </pic:cNvPicPr>
+                  </pic:nvPicPr>
+                  <pic:blipFill>
+                    <a:blip r:embed="rId19" cstate="print">
+                      <a:extLst>
+                        <a:ext uri="{28A0092B-C50C-407E-A947-70E740481C1C}">
+                          <a14:useLocalDpi xmlns:a14="http://schemas.microsoft.com/office/drawing/2010/main" val="0"/>
+                        </a:ext>
+                      </a:extLst>
+                    </a:blip>
+                    <a:srcRect/>
+                    <a:stretch>
+                      <a:fillRect/>
+                    </a:stretch>
+                  </pic:blipFill>
+                  <pic:spPr bwMode="auto">
+                    <a:xfrm>
+                      <a:off x="0" y="0"/>
+                      <a:ext cx="6120130" cy="1140460"/>
+                    </a:xfrm>
+                    <a:prstGeom prst="rect">
+                      <a:avLst/>
+                    </a:prstGeom>
+                    <a:noFill/>
+                    <a:ln>
+                      <a:noFill/>
+                    </a:ln>
+                  </pic:spPr>
+                </pic:pic>
+              </a:graphicData>
+            </a:graphic>
+          </wp:inline>
+        </w:drawing>
+      </w:r>
+    </w:p>
+    <w:p>
+      <w:pPr>
+        <w:pStyle w:val="Beschriftung"/>
+        <w:jc w:val="center"/>
+      </w:pPr>
+      <w:bookmarkStart w:id="16" w:name="_Toc233046553"/>
+      <w:r>
+        <w:t xml:space="preserve">Abbildung </w:t>
+      </w:r>
+      <w:r>
+        <w:fldChar w:fldCharType="begin"/>
+      </w:r>
+      <w:r>
+        <w:instrText xml:space="preserve"> SEQ Abbildung \* ARABIC </w:instrText>
+      </w:r>
+      <w:r>
+        <w:fldChar w:fldCharType="separate"/>
+      </w:r>
+      <w:r>
+        <w:rPr>
+          <w:noProof/>
+        </w:rPr>
+        <w:t>5</w:t>
+      </w:r>
+      <w:r>
+        <w:fldChar w:fldCharType="end"/>
+      </w:r>
+      <w:r>
+        <w:t xml:space="preserve">: </w:t>
+      </w:r>
+      <w:r>
+        <w:t>Ordnerstruktur des GitHub-</w:t>
+      </w:r>
+      <w:proofErr w:type="spellStart"/>
+      <w:r>
+        <w:t>Repositorys</w:t>
+      </w:r>
+      <w:bookmarkEnd w:id="16"/>
+      <w:proofErr w:type="spellEnd"/>
+    </w:p>
+    <w:p>
+      <w:pPr>
+        <w:pStyle w:val="berschrift2"/>
+      </w:pPr>
+      <w:bookmarkStart w:id="17" w:name="_Toc233042312"/>
+      <w:r>
+        <w:t>Versionsverwaltung und Git-Test</w:t>
+      </w:r>
+      <w:bookmarkEnd w:id="17"/>
+    </w:p>
+    <w:p>
+      <w:r>
+        <w:t xml:space="preserve">Nachdem das Repository erstellt war, wurde es auf den verschiedenen Arbeitsrechnern sowie auf einer Virtual </w:t>
+      </w:r>
+      <w:proofErr w:type="spellStart"/>
+      <w:r>
+        <w:t>Machine</w:t>
+      </w:r>
+      <w:proofErr w:type="spellEnd"/>
+      <w:r>
+        <w:t xml:space="preserve"> geklont. Damit wurde überprüft, ob alle Projektdateien korrekt heruntergeladen werden und ob die Zusammenarbeit über Git funktioniert. Der Test war erfolgreich, sodass beide Projektmitglieder mit dem gleichen Projektstand weiterarbeiten konnten.</w:t>
+      </w:r>
+    </w:p>
+    <w:p>
+      <w:pPr>
+        <w:pStyle w:val="berschrift2"/>
+      </w:pPr>
+      <w:bookmarkStart w:id="18" w:name="_Toc233042313"/>
+      <w:r>
+        <w:t>Aufbau der Architektur im SPS-Projekt</w:t>
+      </w:r>
+      <w:bookmarkEnd w:id="18"/>
+    </w:p>
+    <w:p>
+      <w:r>
+        <w:t>n</w:t>
+      </w:r>
+      <w:r>
+        <w:t xml:space="preserve">ach dem erfolgreichen Git-Test wurde die in der Analyse geplante Softwarearchitektur in LASAL übernommen. Dafür wurden die grundlegenden Klassen des SPS-Projekts erstellt und im Hauptnetzwerk miteinander verbunden. Dazu gehörten unter anderem die HMI-Klasse, der Hauptablauf, das Aufzugmodul, die Etagen- und </w:t>
+      </w:r>
+      <w:proofErr w:type="spellStart"/>
+      <w:r>
+        <w:t>Türsensorik</w:t>
+      </w:r>
+      <w:proofErr w:type="spellEnd"/>
+      <w:r>
+        <w:t xml:space="preserve"> sowie die Antriebe.</w:t>
+      </w:r>
+    </w:p>
+    <w:p/>
+    <w:p>
+      <w:r>
+        <w:t>Im Hauptnetzwerk ist ersichtlich, wie die einzelnen Bausteine miteinander kommunizieren. Die Eingänge der Etagenwahlschalter werden an die HMI-Klasse weitergegeben. Von dort gelangen die Anforderungen zum Hauptablauf und anschliessend zum Aufzugmodul. Das Aufzugmodul koordiniert die Sensorik, die Türsteuerung und den Aufzugantrieb.</w:t>
+      </w:r>
+    </w:p>
+    <w:p>
+      <w:pPr>
+        <w:rPr>
+          <w:noProof/>
+        </w:rPr>
+      </w:pPr>
+      <w:r>
+        <w:t>Dieser Schritt wurde gemeinsam durchgeführt, damit die Programmstruktur von Anfang an für beide Projektmitglieder verständlich war. Dadurch entstand eine klare Grundlage für die spätere Umsetzung der einzelnen Funktionen.</w:t>
+      </w:r>
+      <w:r>
+        <w:rPr>
+          <w:noProof/>
+        </w:rPr>
+        <w:t xml:space="preserve"> </w:t>
+      </w:r>
+    </w:p>
+    <w:p>
+      <w:pPr>
+        <w:keepNext/>
+        <w:jc w:val="center"/>
+      </w:pPr>
+      <w:r>
+        <w:rPr>
+          <w:noProof/>
+        </w:rPr>
+        <w:drawing>
+          <wp:inline distT="0" distB="0" distL="0" distR="0" wp14:anchorId="61599171" wp14:editId="2098023A">
+            <wp:extent cx="5000099" cy="2847703"/>
+            <wp:effectExtent l="0" t="0" r="3810" b="0"/>
+            <wp:docPr id="1140017191" name="Grafik 3" descr="Benutzeranhang"/>
+            <wp:cNvGraphicFramePr>
+              <a:graphicFrameLocks xmlns:a="http://schemas.openxmlformats.org/drawingml/2006/main" noChangeAspect="1"/>
+            </wp:cNvGraphicFramePr>
+            <a:graphic xmlns:a="http://schemas.openxmlformats.org/drawingml/2006/main">
+              <a:graphicData uri="http://schemas.openxmlformats.org/drawingml/2006/picture">
+                <pic:pic xmlns:pic="http://schemas.openxmlformats.org/drawingml/2006/picture">
+                  <pic:nvPicPr>
+                    <pic:cNvPr id="0" name="Picture 7" descr="Benutzeranhang"/>
+                    <pic:cNvPicPr>
+                      <a:picLocks noChangeAspect="1" noChangeArrowheads="1"/>
+                    </pic:cNvPicPr>
+                  </pic:nvPicPr>
+                  <pic:blipFill>
+                    <a:blip r:embed="rId20" cstate="print">
+                      <a:extLst>
+                        <a:ext uri="{28A0092B-C50C-407E-A947-70E740481C1C}">
+                          <a14:useLocalDpi xmlns:a14="http://schemas.microsoft.com/office/drawing/2010/main" val="0"/>
+                        </a:ext>
+                      </a:extLst>
+                    </a:blip>
+                    <a:srcRect/>
+                    <a:stretch>
+                      <a:fillRect/>
+                    </a:stretch>
+                  </pic:blipFill>
+                  <pic:spPr bwMode="auto">
+                    <a:xfrm>
+                      <a:off x="0" y="0"/>
+                      <a:ext cx="5113226" cy="2912132"/>
+                    </a:xfrm>
+                    <a:prstGeom prst="rect">
+                      <a:avLst/>
+                    </a:prstGeom>
+                    <a:noFill/>
+                    <a:ln>
+                      <a:noFill/>
+                    </a:ln>
+                  </pic:spPr>
+                </pic:pic>
+              </a:graphicData>
+            </a:graphic>
+          </wp:inline>
+        </w:drawing>
+      </w:r>
+    </w:p>
+    <w:p>
+      <w:pPr>
+        <w:pStyle w:val="Beschriftung"/>
+        <w:jc w:val="center"/>
+      </w:pPr>
+      <w:bookmarkStart w:id="19" w:name="_Toc233046554"/>
+      <w:r>
+        <w:t xml:space="preserve">Abbildung </w:t>
+      </w:r>
+      <w:r>
+        <w:fldChar w:fldCharType="begin"/>
+      </w:r>
+      <w:r>
+        <w:instrText xml:space="preserve"> SEQ Abbildung \* ARABIC </w:instrText>
+      </w:r>
+      <w:r>
+        <w:fldChar w:fldCharType="separate"/>
+      </w:r>
+      <w:r>
+        <w:rPr>
+          <w:noProof/>
+        </w:rPr>
+        <w:t>6</w:t>
+      </w:r>
+      <w:r>
+        <w:fldChar w:fldCharType="end"/>
+      </w:r>
+      <w:r>
+        <w:t>:</w:t>
+      </w:r>
+      <w:r>
+        <w:t>Hauptnetzwerk der SPS-Architektur in LASAL</w:t>
+      </w:r>
+      <w:bookmarkEnd w:id="19"/>
+    </w:p>
+    <w:p>
+      <w:pPr>
+        <w:pStyle w:val="berschrift2"/>
+      </w:pPr>
+      <w:bookmarkStart w:id="20" w:name="_Toc233042314"/>
+      <w:r>
+        <w:lastRenderedPageBreak/>
+        <w:t>Motoranbindung und Motion-Grundlage</w:t>
+      </w:r>
+      <w:bookmarkEnd w:id="20"/>
+    </w:p>
+    <w:p>
+      <w:r>
+        <w:t>Für die Motoranbindung wurden die Unterlagen des Dozenten als Grundlage verwendet. Die vorhandenen Beispiele und Vorgaben zur Motion-Ansteuerung wurden auf unser SPS-Projekt übertragen und an unsere Aufzugsteuerung angepasst. Dabei wurden die benötigten Motion-Objekte, Achsen und Motorbausteine in das LASAL-Projekt eingebunden.</w:t>
+      </w:r>
+    </w:p>
+    <w:p/>
+    <w:p>
+      <w:r>
+        <w:t>Die Motoranbindung wurde zuerst als Grundlage umgesetzt, damit später der Aufzugantrieb und der Türantrieb getrennt angesteuert werden konnten. Dabei war wichtig, dass beide Bewegungsrichtungen vorbereitet werden: eine positive und eine negative Fahrtrichtung.</w:t>
+      </w:r>
+    </w:p>
+    <w:p/>
+    <w:p>
+      <w:r>
+        <w:t xml:space="preserve">Während der Arbeit traten Probleme mit Git auf. Einige Treiber- und Motion-Dateien wurden durch die .gitignore-Datei nicht richtig </w:t>
+      </w:r>
+      <w:r>
+        <w:t>mit versioniert</w:t>
+      </w:r>
+      <w:r>
+        <w:t>. Dadurch fehlten nach dem Pull auf einem anderen Rechner wichtige Dateien für die Motoranbindung. Das Problem wurde gelöst, indem die betroffenen Einträge in der .gitignore-Datei angepasst wurden. Anschliessend wurde eine vorherige funktionierende Version wiederhergestellt und die benötigten Dateien wurden korrekt ins Repository übernommen.</w:t>
+      </w:r>
+    </w:p>
+    <w:p>
+      <w:pPr>
+        <w:keepNext/>
+        <w:jc w:val="center"/>
+      </w:pPr>
+      <w:r>
+        <w:drawing>
+          <wp:inline distT="0" distB="0" distL="0" distR="0" wp14:anchorId="28922B00" wp14:editId="7FCAB585">
+            <wp:extent cx="5886995" cy="4137660"/>
+            <wp:effectExtent l="0" t="0" r="6350" b="2540"/>
+            <wp:docPr id="1370523707" name="Grafik 1"/>
+            <wp:cNvGraphicFramePr>
+              <a:graphicFrameLocks xmlns:a="http://schemas.openxmlformats.org/drawingml/2006/main" noChangeAspect="1"/>
+            </wp:cNvGraphicFramePr>
+            <a:graphic xmlns:a="http://schemas.openxmlformats.org/drawingml/2006/main">
+              <a:graphicData uri="http://schemas.openxmlformats.org/drawingml/2006/picture">
+                <pic:pic xmlns:pic="http://schemas.openxmlformats.org/drawingml/2006/picture">
+                  <pic:nvPicPr>
+                    <pic:cNvPr id="1370523707" name=""/>
+                    <pic:cNvPicPr/>
+                  </pic:nvPicPr>
+                  <pic:blipFill rotWithShape="1">
+                    <a:blip r:embed="rId21"/>
+                    <a:srcRect r="3809"/>
+                    <a:stretch>
+                      <a:fillRect/>
+                    </a:stretch>
+                  </pic:blipFill>
+                  <pic:spPr bwMode="auto">
+                    <a:xfrm>
+                      <a:off x="0" y="0"/>
+                      <a:ext cx="5886995" cy="4137660"/>
+                    </a:xfrm>
+                    <a:prstGeom prst="rect">
+                      <a:avLst/>
+                    </a:prstGeom>
+                    <a:ln>
+                      <a:noFill/>
+                    </a:ln>
+                    <a:extLst>
+                      <a:ext uri="{53640926-AAD7-44D8-BBD7-CCE9431645EC}">
+                        <a14:shadowObscured xmlns:a14="http://schemas.microsoft.com/office/drawing/2010/main"/>
+                      </a:ext>
+                    </a:extLst>
+                  </pic:spPr>
+                </pic:pic>
+              </a:graphicData>
+            </a:graphic>
+          </wp:inline>
+        </w:drawing>
+      </w:r>
+    </w:p>
+    <w:p>
+      <w:pPr>
+        <w:pStyle w:val="Beschriftung"/>
+        <w:jc w:val="center"/>
+      </w:pPr>
+      <w:bookmarkStart w:id="21" w:name="_Toc233046555"/>
+      <w:r>
+        <w:t xml:space="preserve">Abbildung </w:t>
+      </w:r>
+      <w:r>
+        <w:fldChar w:fldCharType="begin"/>
+      </w:r>
+      <w:r>
+        <w:instrText xml:space="preserve"> SEQ Abbildung \* ARABIC </w:instrText>
+      </w:r>
+      <w:r>
+        <w:fldChar w:fldCharType="separate"/>
+      </w:r>
+      <w:r>
+        <w:rPr>
+          <w:noProof/>
+        </w:rPr>
+        <w:t>7</w:t>
+      </w:r>
+      <w:r>
+        <w:fldChar w:fldCharType="end"/>
+      </w:r>
+      <w:r>
+        <w:t xml:space="preserve">: </w:t>
+      </w:r>
+      <w:r>
+        <w:t>Eingebundene Motion-Objekte für die Motoranbindung</w:t>
+      </w:r>
+      <w:bookmarkEnd w:id="21"/>
+    </w:p>
+    <w:p/>
+    <w:p/>
+    <w:p>
+      <w:pPr>
+        <w:pStyle w:val="berschrift2"/>
+      </w:pPr>
+      <w:bookmarkStart w:id="22" w:name="_Toc233042315"/>
+      <w:r>
+        <w:lastRenderedPageBreak/>
+        <w:t>Aufbau der Sensorik und Hilfsklassen</w:t>
+      </w:r>
+      <w:bookmarkEnd w:id="22"/>
+    </w:p>
+    <w:p/>
+    <w:p>
+      <w:pPr>
+        <w:pStyle w:val="berschrift2"/>
+      </w:pPr>
+      <w:bookmarkStart w:id="23" w:name="_Toc233042316"/>
+      <w:r>
+        <w:t>Umsetzung der Hauptsteuerung</w:t>
+      </w:r>
+      <w:bookmarkEnd w:id="23"/>
+    </w:p>
+    <w:p/>
+    <w:p>
+      <w:pPr>
+        <w:pStyle w:val="berschrift2"/>
+      </w:pPr>
+      <w:bookmarkStart w:id="24" w:name="_Toc233042317"/>
+      <w:r>
+        <w:t>Schrittkette der Aufzugsteuerung</w:t>
+      </w:r>
+      <w:bookmarkEnd w:id="24"/>
+    </w:p>
+    <w:p/>
+    <w:p>
+      <w:pPr>
+        <w:pStyle w:val="berschrift2"/>
+      </w:pPr>
+      <w:bookmarkStart w:id="25" w:name="_Toc233042318"/>
+      <w:r>
+        <w:t>Ansteuerung von Aufzug- und Türantrieb</w:t>
+      </w:r>
+      <w:bookmarkEnd w:id="25"/>
+    </w:p>
+    <w:p/>
+    <w:p>
+      <w:pPr>
+        <w:pStyle w:val="berschrift2"/>
+      </w:pPr>
+      <w:r>
+        <w:t xml:space="preserve"> Bonus: Lichtschranke und Notstoppfunktion</w:t>
+      </w:r>
+    </w:p>
+    <w:p/>
+    <w:p>
+      <w:pPr>
+        <w:pStyle w:val="berschrift2"/>
+      </w:pPr>
+      <w:bookmarkStart w:id="26" w:name="_Toc233042319"/>
+      <w:r>
+        <w:t>HMI-Anbindung und Visualisierung</w:t>
+      </w:r>
+      <w:bookmarkEnd w:id="26"/>
+    </w:p>
+    <w:p>
+      <w:r>
+        <w:t>Die HMI-Anbindung wurde hauptsächlich im Branch feature/VISU umgesetzt. Als Grundlage diente das HMI-Mockup aus der Analyse. Die geplanten Bedienelemente und Anzeigen wurden in LASAL VISU Designer nachgebaut und schrittweise mit der SPS verbunden.</w:t>
+      </w:r>
+    </w:p>
+    <w:p/>
+    <w:p>
+      <w:r>
+        <w:t xml:space="preserve">Die Visualisierung wurde laufend an den aktuellen Stand der Steuerung angepasst. Sobald neue Funktionen in der SPS vorhanden waren, wurde gemeinsam besprochen, welche Werte und Schnittstellen für das HMI benötigt werden. Danach wurden die entsprechenden Server und Variablen erstellt und in der Visualisierung verwendet. Dazu </w:t>
+      </w:r>
+      <w:proofErr w:type="gramStart"/>
+      <w:r>
+        <w:t>gehörten</w:t>
+      </w:r>
+      <w:proofErr w:type="gramEnd"/>
+      <w:r>
+        <w:t xml:space="preserve"> unter anderem die Etagenwahl, die aktuelle Etage, die Fahrtrichtung, der Türstatus sowie die Bedienung für Tür auf und Tür zu.</w:t>
+      </w:r>
+    </w:p>
+    <w:p/>
+    <w:p>
+      <w:r>
+        <w:t xml:space="preserve">Da noch wenig Erfahrung mit dem HMI-Design vorhanden war, mussten viele Elemente zuerst ausprobiert und getestet werden. Besonders die Anbindung der Variablen, </w:t>
+      </w:r>
+      <w:proofErr w:type="spellStart"/>
+      <w:r>
+        <w:t>Textschemes</w:t>
+      </w:r>
+      <w:proofErr w:type="spellEnd"/>
+      <w:r>
+        <w:t xml:space="preserve"> und Statusanzeigen wurde schrittweise aufgebaut. Durch dieses Vorgehen konnte die Visualisierung nach und nach erweitert werden, bis die wichtigsten Zustände der Aufzugsteuerung am HMI sichtbar und bedienbar waren.</w:t>
+      </w:r>
+    </w:p>
+    <w:p>
+      <w:pPr>
+        <w:keepNext/>
+        <w:jc w:val="center"/>
+      </w:pPr>
+      <w:r>
+        <w:rPr>
+          <w:noProof/>
+        </w:rPr>
+        <w:drawing>
+          <wp:inline distT="0" distB="0" distL="0" distR="0" wp14:anchorId="3A7978D5" wp14:editId="0C5F5264">
+            <wp:extent cx="3512034" cy="2063931"/>
+            <wp:effectExtent l="0" t="0" r="6350" b="0"/>
+            <wp:docPr id="1564949847" name="Grafik 1"/>
+            <wp:cNvGraphicFramePr>
+              <a:graphicFrameLocks xmlns:a="http://schemas.openxmlformats.org/drawingml/2006/main" noChangeAspect="1"/>
+            </wp:cNvGraphicFramePr>
+            <a:graphic xmlns:a="http://schemas.openxmlformats.org/drawingml/2006/main">
+              <a:graphicData uri="http://schemas.openxmlformats.org/drawingml/2006/picture">
+                <pic:pic xmlns:pic="http://schemas.openxmlformats.org/drawingml/2006/picture">
+                  <pic:nvPicPr>
+                    <pic:cNvPr id="1593791034" name=""/>
+                    <pic:cNvPicPr/>
+                  </pic:nvPicPr>
+                  <pic:blipFill>
+                    <a:blip r:embed="rId12"/>
+                    <a:stretch>
+                      <a:fillRect/>
+                    </a:stretch>
+                  </pic:blipFill>
+                  <pic:spPr>
+                    <a:xfrm>
+                      <a:off x="0" y="0"/>
+                      <a:ext cx="3544102" cy="2082777"/>
+                    </a:xfrm>
+                    <a:prstGeom prst="rect">
+                      <a:avLst/>
+                    </a:prstGeom>
+                  </pic:spPr>
+                </pic:pic>
+              </a:graphicData>
+            </a:graphic>
+          </wp:inline>
+        </w:drawing>
+      </w:r>
+    </w:p>
+    <w:p>
+      <w:pPr>
+        <w:pStyle w:val="Beschriftung"/>
+        <w:jc w:val="center"/>
+      </w:pPr>
+      <w:bookmarkStart w:id="27" w:name="_Toc233046556"/>
+      <w:r>
+        <w:t xml:space="preserve">Abbildung </w:t>
+      </w:r>
+      <w:r>
+        <w:fldChar w:fldCharType="begin"/>
+      </w:r>
+      <w:r>
+        <w:instrText xml:space="preserve"> SEQ Abbildung \* ARABIC </w:instrText>
+      </w:r>
+      <w:r>
+        <w:fldChar w:fldCharType="separate"/>
+      </w:r>
+      <w:r>
+        <w:rPr>
+          <w:noProof/>
+        </w:rPr>
+        <w:t>8</w:t>
+      </w:r>
+      <w:r>
+        <w:fldChar w:fldCharType="end"/>
+      </w:r>
+      <w:r>
+        <w:t>: Ergebnis HMI</w:t>
+      </w:r>
+      <w:bookmarkEnd w:id="27"/>
+    </w:p>
+    <w:p>
+      <w:pPr>
+        <w:pStyle w:val="berschrift2"/>
+      </w:pPr>
+      <w:r>
+        <w:lastRenderedPageBreak/>
+        <w:t xml:space="preserve"> </w:t>
+      </w:r>
+      <w:bookmarkStart w:id="28" w:name="_Toc233042320"/>
+      <w:r>
+        <w:t xml:space="preserve">Testen, Bugfixes und Zusammenführung der </w:t>
+      </w:r>
+      <w:proofErr w:type="spellStart"/>
+      <w:r>
+        <w:t>Branches</w:t>
+      </w:r>
+      <w:bookmarkEnd w:id="28"/>
+      <w:proofErr w:type="spellEnd"/>
+    </w:p>
+    <w:p>
+      <w:r>
+        <w:t xml:space="preserve">Zu Beginn wurde der Grundstand auf dem main-Branch erstellt. Danach wurden für die parallele Arbeit eigene </w:t>
+      </w:r>
+      <w:proofErr w:type="spellStart"/>
+      <w:r>
+        <w:t>Branches</w:t>
+      </w:r>
+      <w:proofErr w:type="spellEnd"/>
+      <w:r>
+        <w:t xml:space="preserve"> abgeleitet. Auf dem Branch feature/Janett wurde hauptsächlich die Steuerungslogik entwickelt. Auf dem Branch feature/VISU wurde die HMI-Visualisierung aufgebaut und angebunden. Dadurch konnten beide Projektmitglieder gleichzeitig am Projekt arbeiten, ohne sich gegenseitig direkt zu überschreiben.</w:t>
+      </w:r>
+    </w:p>
+    <w:p/>
+    <w:p>
+      <w:r>
+        <w:t xml:space="preserve">Damit die Visualisierung immer zum aktuellen Stand der Steuerung passte, wurden Änderungen aus feature/Janett regelmässig in feature/VISU übernommen. Dadurch konnten neue Funktionen der Steuerung direkt im HMI angebunden und getestet werden. Die Commit-Historie zeigt mehrere Merge-Schritte zwischen den beiden </w:t>
+      </w:r>
+      <w:proofErr w:type="spellStart"/>
+      <w:r>
+        <w:t>Branches</w:t>
+      </w:r>
+      <w:proofErr w:type="spellEnd"/>
+      <w:r>
+        <w:t>, weil Steuerung und HMI laufend aufeinander abgestimmt werden mussten.</w:t>
+      </w:r>
+    </w:p>
+    <w:p/>
+    <w:p>
+      <w:r>
+        <w:t xml:space="preserve">Nach dem Einbau neuer Funktionen wurde jeweils direkt getestet. Je nach Funktion erfolgte der Test entweder an der Steuerung, in der Simulation oder über das HMI. Dabei wurden zum Beispiel die Etagenwahl, die Fahrtrichtung, der Türstatus und die Reaktion auf Bedienbefehle überprüft. Gefundene Fehler wurden im Team besprochen und anschliessend direkt korrigiert. So konnten Bugfixes laufend in die Entwicklung einfliessen, bevor die </w:t>
+      </w:r>
+      <w:proofErr w:type="spellStart"/>
+      <w:r>
+        <w:t>Branches</w:t>
+      </w:r>
+      <w:proofErr w:type="spellEnd"/>
+      <w:r>
+        <w:t xml:space="preserve"> wieder zusammengeführt wurden.</w:t>
+      </w:r>
+    </w:p>
+    <w:p>
+      <w:pPr>
+        <w:keepNext/>
+      </w:pPr>
+      <w:r>
+        <w:drawing>
+          <wp:inline distT="0" distB="0" distL="0" distR="0" wp14:anchorId="59FE6A08" wp14:editId="18D8119F">
+            <wp:extent cx="6120130" cy="2075815"/>
+            <wp:effectExtent l="0" t="0" r="1270" b="0"/>
+            <wp:docPr id="1957456886" name="Grafik 1"/>
+            <wp:cNvGraphicFramePr>
+              <a:graphicFrameLocks xmlns:a="http://schemas.openxmlformats.org/drawingml/2006/main" noChangeAspect="1"/>
+            </wp:cNvGraphicFramePr>
+            <a:graphic xmlns:a="http://schemas.openxmlformats.org/drawingml/2006/main">
+              <a:graphicData uri="http://schemas.openxmlformats.org/drawingml/2006/picture">
+                <pic:pic xmlns:pic="http://schemas.openxmlformats.org/drawingml/2006/picture">
+                  <pic:nvPicPr>
+                    <pic:cNvPr id="1957456886" name=""/>
+                    <pic:cNvPicPr/>
+                  </pic:nvPicPr>
+                  <pic:blipFill rotWithShape="1">
+                    <a:blip r:embed="rId22"/>
+                    <a:srcRect t="10512"/>
+                    <a:stretch>
+                      <a:fillRect/>
+                    </a:stretch>
+                  </pic:blipFill>
+                  <pic:spPr bwMode="auto">
+                    <a:xfrm>
+                      <a:off x="0" y="0"/>
+                      <a:ext cx="6120130" cy="2075815"/>
+                    </a:xfrm>
+                    <a:prstGeom prst="rect">
+                      <a:avLst/>
+                    </a:prstGeom>
+                    <a:ln>
+                      <a:noFill/>
+                    </a:ln>
+                    <a:extLst>
+                      <a:ext uri="{53640926-AAD7-44D8-BBD7-CCE9431645EC}">
+                        <a14:shadowObscured xmlns:a14="http://schemas.microsoft.com/office/drawing/2010/main"/>
+                      </a:ext>
+                    </a:extLst>
+                  </pic:spPr>
+                </pic:pic>
+              </a:graphicData>
+            </a:graphic>
+          </wp:inline>
+        </w:drawing>
+      </w:r>
+    </w:p>
+    <w:p>
+      <w:pPr>
+        <w:pStyle w:val="Beschriftung"/>
+        <w:jc w:val="center"/>
+      </w:pPr>
+      <w:bookmarkStart w:id="29" w:name="_Toc233046557"/>
+      <w:r>
+        <w:t xml:space="preserve">Abbildung </w:t>
+      </w:r>
+      <w:r>
+        <w:fldChar w:fldCharType="begin"/>
+      </w:r>
+      <w:r>
+        <w:instrText xml:space="preserve"> SEQ Abbildung \* ARABIC </w:instrText>
+      </w:r>
+      <w:r>
+        <w:fldChar w:fldCharType="separate"/>
+      </w:r>
+      <w:r>
+        <w:rPr>
+          <w:noProof/>
+        </w:rPr>
+        <w:t>9</w:t>
+      </w:r>
+      <w:r>
+        <w:fldChar w:fldCharType="end"/>
+      </w:r>
+      <w:r>
+        <w:t>: Git-Network</w:t>
+      </w:r>
+      <w:bookmarkEnd w:id="29"/>
+    </w:p>
+    <w:p/>
+    <w:p/>
+    <w:p/>
+    <w:p/>
+    <w:p/>
     <w:p/>
     <w:p>
       <w:pPr>
         <w:pStyle w:val="berschrift1"/>
       </w:pPr>
-      <w:r>
+      <w:bookmarkStart w:id="30" w:name="_Toc233042321"/>
+      <w:r>
+        <w:lastRenderedPageBreak/>
         <w:t>Schlussteil</w:t>
       </w:r>
-    </w:p>
+      <w:bookmarkEnd w:id="30"/>
+    </w:p>
+    <w:p>
+      <w:r>
+        <w:t>Die Case Study war für uns sehr lehrreich, da wir eine komplette Steuerung von der Analyse bis zur Umsetzung gemeinsam entwickeln konnten. Besonders interessant war, dass wir das Wissen aus Steuerungstechnik 1 und 2 praktisch anwenden konnten. Dadurch konnten wir Schritt für Schritt nachvollziehen, wie aus einer geplanten Architektur eine funktionierende Steuerung entsteht.</w:t>
+      </w:r>
+    </w:p>
+    <w:p/>
+    <w:p>
+      <w:r>
+        <w:t xml:space="preserve">Die Zusammenarbeit im Team hat gut funktioniert, da wir die Aufgaben sinnvoll aufgeteilt und uns regelmässig abgesprochen haben. So konnten wir parallel an der Steuerung, der HMI-Visualisierung und der Dokumentation arbeiten. Auch die Zusammenarbeit mit Git war für uns ein wichtiger Bestandteil des Projekts. Obwohl es zwischendurch Probleme mit </w:t>
+      </w:r>
+      <w:proofErr w:type="spellStart"/>
+      <w:r>
+        <w:t>Branches</w:t>
+      </w:r>
+      <w:proofErr w:type="spellEnd"/>
+      <w:r>
+        <w:t xml:space="preserve">, </w:t>
+      </w:r>
+      <w:proofErr w:type="spellStart"/>
+      <w:r>
+        <w:t>Pulls</w:t>
+      </w:r>
+      <w:proofErr w:type="spellEnd"/>
+      <w:r>
+        <w:t xml:space="preserve">, </w:t>
+      </w:r>
+      <w:proofErr w:type="spellStart"/>
+      <w:r>
+        <w:t>Pushes</w:t>
+      </w:r>
+      <w:proofErr w:type="spellEnd"/>
+      <w:r>
+        <w:t xml:space="preserve"> und fehlenden Dateien gab, konnten wir diese gemeinsam lösen und daraus viel lernen.</w:t>
+      </w:r>
+    </w:p>
+    <w:p/>
+    <w:p>
+      <w:r>
+        <w:t>Technisch war vor allem die Anbindung der Motoren und die Arbeit mit Motion sehr spannend. Dabei konnten wir besser verstehen, wie Antriebe in ein SPS-Projekt eingebunden und später von der Steuerungslogik verwendet werden. Insgesamt hat uns die Case Study gezeigt, wie wichtig eine saubere Planung, klare Schnittstellen und regelmässiges Testen sind. Trotz einiger Herausforderungen hat das Projekt Spass gemacht und war für uns ein wertvoller Lernprozess.</w:t>
+      </w:r>
+    </w:p>
+    <w:p>
+      <w:pPr>
+        <w:pStyle w:val="berschrift2"/>
+      </w:pPr>
+      <w:bookmarkStart w:id="31" w:name="_Toc233042322"/>
+      <w:r>
+        <w:t>Niklaus</w:t>
+      </w:r>
+      <w:bookmarkEnd w:id="31"/>
+    </w:p>
+    <w:p/>
+    <w:p/>
+    <w:p/>
+    <w:p/>
+    <w:p/>
+    <w:p/>
+    <w:p/>
+    <w:p/>
+    <w:p/>
+    <w:p/>
+    <w:p/>
+    <w:p/>
+    <w:p/>
+    <w:p/>
+    <w:p/>
+    <w:p/>
+    <w:p>
+      <w:pPr>
+        <w:pStyle w:val="berschrift2"/>
+      </w:pPr>
+      <w:bookmarkStart w:id="32" w:name="_Toc233042323"/>
+      <w:r>
+        <w:lastRenderedPageBreak/>
+        <w:t>Hassan</w:t>
+      </w:r>
+      <w:bookmarkEnd w:id="32"/>
+    </w:p>
+    <w:p>
+      <w:r>
+        <w:t>Ich persönlich habe die Case Study als sehr positiv und lehrreich erlebt. Besonders motivierend war für mich zu sehen, wie sich aus einer ersten Idee Schritt für Schritt eine funktionierende Steuerung entwickelt hat. Am Anfang bestand das Projekt vor allem aus Planung, Skizzen und einzelnen Überlegungen. Mit der Zeit wurden daraus konkrete Klassen, Verbindungen, HMI-Elemente und eine Steuerungslogik, die getestet werden konnte.</w:t>
+      </w:r>
+    </w:p>
+    <w:p/>
+    <w:p>
+      <w:r>
+        <w:t>Für mich war auch die Zusammenarbeit im Team sehr wertvoll. Mein Teammitglied hatte bereits mehr Erfahrung im Entwerfen von Steuerungen aus seinem beruflichen Umfeld. Davon konnte ich stark profitieren, da ich dadurch viele Zusammenhänge besser verstehen konnte. Gleichzeitig konnte ich meine eigenen Aufgaben, besonders im Bereich HMI und Visualisierung, selbstständig bearbeiten und weiterentwickeln.</w:t>
+      </w:r>
+    </w:p>
+    <w:p/>
+    <w:p>
+      <w:r>
+        <w:t>Spannend war auch, dass wir nicht immer am gleichen Ort gearbeitet haben. Teilweise arbeitete jeder an einem anderen Teil des Projekts, und trotzdem entstand am Ende ein gemeinsames Ergebnis. Durch die Abstimmung über Git, die gemeinsamen Besprechungen und das laufende Testen konnten wir die einzelnen Teile zusammenführen. Insgesamt war die Case Study für mich eine gute Erfahrung, weil ich viel über SPS-Programmierung, HMI-Anbindung, Git und die Zusammenarbeit in einem technischen Projekt gelernt habe.</w:t>
+      </w:r>
+    </w:p>
+    <w:p/>
+    <w:p/>
+    <w:p/>
+    <w:p/>
+    <w:p/>
+    <w:p/>
+    <w:p/>
+    <w:p/>
+    <w:p/>
+    <w:p/>
+    <w:p/>
+    <w:p/>
+    <w:p/>
+    <w:p/>
+    <w:p/>
+    <w:p/>
+    <w:p/>
+    <w:p/>
+    <w:p/>
+    <w:p/>
+    <w:p/>
+    <w:p/>
+    <w:p/>
+    <w:p/>
+    <w:p/>
+    <w:p/>
+    <w:p/>
+    <w:p/>
+    <w:p/>
+    <w:p/>
+    <w:p/>
+    <w:p/>
+    <w:p/>
+    <w:p/>
+    <w:p/>
+    <w:p/>
+    <w:p/>
+    <w:p/>
+    <w:p/>
     <w:p/>
     <w:p/>
     <w:p/>
@@ -3067,11 +5144,12 @@
         </w:numPr>
         <w:ind w:left="454" w:hanging="454"/>
       </w:pPr>
-      <w:bookmarkStart w:id="15" w:name="_Toc231874437"/>
-      <w:r>
+      <w:bookmarkStart w:id="33" w:name="_Toc233042324"/>
+      <w:r>
+        <w:lastRenderedPageBreak/>
         <w:t>Aufwandsübersicht</w:t>
       </w:r>
-      <w:bookmarkEnd w:id="15"/>
+      <w:bookmarkEnd w:id="33"/>
     </w:p>
     <w:tbl>
       <w:tblPr>
@@ -3162,21 +5240,12 @@
                 <w:bCs w:val="0"/>
               </w:rPr>
             </w:pPr>
-            <w:proofErr w:type="spellStart"/>
-            <w:r>
-              <w:rPr>
-                <w:b w:val="0"/>
-                <w:bCs w:val="0"/>
-              </w:rPr>
-              <w:t>Git</w:t>
-            </w:r>
-            <w:proofErr w:type="spellEnd"/>
-            <w:r>
-              <w:rPr>
-                <w:b w:val="0"/>
-                <w:bCs w:val="0"/>
-              </w:rPr>
-              <w:t>-Repo erstellt und</w:t>
+            <w:r>
+              <w:rPr>
+                <w:b w:val="0"/>
+                <w:bCs w:val="0"/>
+              </w:rPr>
+              <w:t>Git-Repo erstellt und</w:t>
             </w:r>
             <w:r>
               <w:rPr>
@@ -3608,23 +5677,7 @@
                 <w:b w:val="0"/>
                 <w:bCs w:val="0"/>
               </w:rPr>
-              <w:t xml:space="preserve">LASAL-Projekt erstellt für </w:t>
-            </w:r>
-            <w:proofErr w:type="spellStart"/>
-            <w:r>
-              <w:rPr>
-                <w:b w:val="0"/>
-                <w:bCs w:val="0"/>
-              </w:rPr>
-              <w:t>Git</w:t>
-            </w:r>
-            <w:proofErr w:type="spellEnd"/>
-            <w:r>
-              <w:rPr>
-                <w:b w:val="0"/>
-                <w:bCs w:val="0"/>
-              </w:rPr>
-              <w:t>-Tests</w:t>
+              <w:t>LASAL-Projekt erstellt für Git-Tests</w:t>
             </w:r>
           </w:p>
         </w:tc>
@@ -3673,23 +5726,7 @@
                 <w:b w:val="0"/>
                 <w:bCs w:val="0"/>
               </w:rPr>
-              <w:t xml:space="preserve">Testklasse für </w:t>
-            </w:r>
-            <w:proofErr w:type="spellStart"/>
-            <w:r>
-              <w:rPr>
-                <w:b w:val="0"/>
-                <w:bCs w:val="0"/>
-              </w:rPr>
-              <w:t>Git</w:t>
-            </w:r>
-            <w:proofErr w:type="spellEnd"/>
-            <w:r>
-              <w:rPr>
-                <w:b w:val="0"/>
-                <w:bCs w:val="0"/>
-              </w:rPr>
-              <w:t>-Test</w:t>
+              <w:t>Testklasse für Git-Test</w:t>
             </w:r>
           </w:p>
         </w:tc>
@@ -3963,21 +6000,12 @@
                 <w:bCs w:val="0"/>
               </w:rPr>
             </w:pPr>
-            <w:proofErr w:type="spellStart"/>
-            <w:r>
-              <w:rPr>
-                <w:b w:val="0"/>
-                <w:bCs w:val="0"/>
-              </w:rPr>
-              <w:t>Git</w:t>
-            </w:r>
-            <w:proofErr w:type="spellEnd"/>
-            <w:r>
-              <w:rPr>
-                <w:b w:val="0"/>
-                <w:bCs w:val="0"/>
-              </w:rPr>
-              <w:t xml:space="preserve"> </w:t>
+            <w:r>
+              <w:rPr>
+                <w:b w:val="0"/>
+                <w:bCs w:val="0"/>
+              </w:rPr>
+              <w:t xml:space="preserve">Git </w:t>
             </w:r>
             <w:proofErr w:type="spellStart"/>
             <w:r>
@@ -4484,7 +6512,6 @@
                 <w:b w:val="0"/>
                 <w:bCs w:val="0"/>
               </w:rPr>
-              <w:lastRenderedPageBreak/>
               <w:t>VISU getestet</w:t>
             </w:r>
           </w:p>
@@ -4586,6 +6613,7 @@
                 <w:b w:val="0"/>
                 <w:bCs w:val="0"/>
               </w:rPr>
+              <w:lastRenderedPageBreak/>
               <w:t>VISU nach Skizze editiert und Knöpfe mit Server hinterlegt</w:t>
             </w:r>
           </w:p>
@@ -5876,6 +7904,29 @@
                 <w:bCs w:val="0"/>
               </w:rPr>
             </w:pPr>
+            <w:r>
+              <w:rPr>
+                <w:b w:val="0"/>
+                <w:bCs w:val="0"/>
+              </w:rPr>
+              <w:t xml:space="preserve">Bugfix </w:t>
+            </w:r>
+            <w:proofErr w:type="spellStart"/>
+            <w:r>
+              <w:rPr>
+                <w:b w:val="0"/>
+                <w:bCs w:val="0"/>
+              </w:rPr>
+              <w:t>Cycletask</w:t>
+            </w:r>
+            <w:proofErr w:type="spellEnd"/>
+            <w:r>
+              <w:rPr>
+                <w:b w:val="0"/>
+                <w:bCs w:val="0"/>
+              </w:rPr>
+              <w:t xml:space="preserve"> </w:t>
+            </w:r>
           </w:p>
         </w:tc>
         <w:tc>
@@ -5886,6 +7937,9 @@
             <w:pPr>
               <w:cnfStyle w:val="000000100000" w:firstRow="0" w:lastRow="0" w:firstColumn="0" w:lastColumn="0" w:oddVBand="0" w:evenVBand="0" w:oddHBand="1" w:evenHBand="0" w:firstRowFirstColumn="0" w:firstRowLastColumn="0" w:lastRowFirstColumn="0" w:lastRowLastColumn="0"/>
             </w:pPr>
+            <w:r>
+              <w:t>Niki</w:t>
+            </w:r>
           </w:p>
         </w:tc>
         <w:tc>
@@ -5912,6 +7966,335 @@
                 <w:bCs w:val="0"/>
               </w:rPr>
             </w:pPr>
+            <w:proofErr w:type="spellStart"/>
+            <w:r>
+              <w:rPr>
+                <w:b w:val="0"/>
+                <w:bCs w:val="0"/>
+              </w:rPr>
+              <w:lastRenderedPageBreak/>
+              <w:t>sZieletage</w:t>
+            </w:r>
+            <w:proofErr w:type="spellEnd"/>
+            <w:r>
+              <w:rPr>
+                <w:b w:val="0"/>
+                <w:bCs w:val="0"/>
+              </w:rPr>
+              <w:t xml:space="preserve"> mit Logik und Visualisierung implementiert</w:t>
+            </w:r>
+          </w:p>
+        </w:tc>
+        <w:tc>
+          <w:tcPr>
+            <w:tcW w:w="3209" w:type="dxa"/>
+          </w:tcPr>
+          <w:p>
+            <w:pPr>
+              <w:cnfStyle w:val="000000000000" w:firstRow="0" w:lastRow="0" w:firstColumn="0" w:lastColumn="0" w:oddVBand="0" w:evenVBand="0" w:oddHBand="0" w:evenHBand="0" w:firstRowFirstColumn="0" w:firstRowLastColumn="0" w:lastRowFirstColumn="0" w:lastRowLastColumn="0"/>
+            </w:pPr>
+            <w:r>
+              <w:t>Hassan</w:t>
+            </w:r>
+          </w:p>
+        </w:tc>
+        <w:tc>
+          <w:tcPr>
+            <w:tcW w:w="3210" w:type="dxa"/>
+          </w:tcPr>
+          <w:p>
+            <w:pPr>
+              <w:cnfStyle w:val="000000000000" w:firstRow="0" w:lastRow="0" w:firstColumn="0" w:lastColumn="0" w:oddVBand="0" w:evenVBand="0" w:oddHBand="0" w:evenHBand="0" w:firstRowFirstColumn="0" w:firstRowLastColumn="0" w:lastRowFirstColumn="0" w:lastRowLastColumn="0"/>
+            </w:pPr>
+            <w:r>
+              <w:t>1h</w:t>
+            </w:r>
+          </w:p>
+        </w:tc>
+      </w:tr>
+      <w:tr>
+        <w:trPr>
+          <w:cnfStyle w:val="000000100000" w:firstRow="0" w:lastRow="0" w:firstColumn="0" w:lastColumn="0" w:oddVBand="0" w:evenVBand="0" w:oddHBand="1" w:evenHBand="0" w:firstRowFirstColumn="0" w:firstRowLastColumn="0" w:lastRowFirstColumn="0" w:lastRowLastColumn="0"/>
+        </w:trPr>
+        <w:tc>
+          <w:tcPr>
+            <w:cnfStyle w:val="001000000000" w:firstRow="0" w:lastRow="0" w:firstColumn="1" w:lastColumn="0" w:oddVBand="0" w:evenVBand="0" w:oddHBand="0" w:evenHBand="0" w:firstRowFirstColumn="0" w:firstRowLastColumn="0" w:lastRowFirstColumn="0" w:lastRowLastColumn="0"/>
+            <w:tcW w:w="3209" w:type="dxa"/>
+          </w:tcPr>
+          <w:p>
+            <w:pPr>
+              <w:rPr>
+                <w:b w:val="0"/>
+                <w:bCs w:val="0"/>
+              </w:rPr>
+            </w:pPr>
+            <w:r>
+              <w:rPr>
+                <w:b w:val="0"/>
+                <w:bCs w:val="0"/>
+              </w:rPr>
+              <w:t>LED für Zieletage implementiert</w:t>
+            </w:r>
+          </w:p>
+        </w:tc>
+        <w:tc>
+          <w:tcPr>
+            <w:tcW w:w="3209" w:type="dxa"/>
+          </w:tcPr>
+          <w:p>
+            <w:pPr>
+              <w:cnfStyle w:val="000000100000" w:firstRow="0" w:lastRow="0" w:firstColumn="0" w:lastColumn="0" w:oddVBand="0" w:evenVBand="0" w:oddHBand="1" w:evenHBand="0" w:firstRowFirstColumn="0" w:firstRowLastColumn="0" w:lastRowFirstColumn="0" w:lastRowLastColumn="0"/>
+            </w:pPr>
+            <w:r>
+              <w:t>Hassan</w:t>
+            </w:r>
+          </w:p>
+        </w:tc>
+        <w:tc>
+          <w:tcPr>
+            <w:tcW w:w="3210" w:type="dxa"/>
+          </w:tcPr>
+          <w:p>
+            <w:pPr>
+              <w:cnfStyle w:val="000000100000" w:firstRow="0" w:lastRow="0" w:firstColumn="0" w:lastColumn="0" w:oddVBand="0" w:evenVBand="0" w:oddHBand="1" w:evenHBand="0" w:firstRowFirstColumn="0" w:firstRowLastColumn="0" w:lastRowFirstColumn="0" w:lastRowLastColumn="0"/>
+            </w:pPr>
+            <w:r>
+              <w:t>1h</w:t>
+            </w:r>
+          </w:p>
+        </w:tc>
+      </w:tr>
+      <w:tr>
+        <w:tc>
+          <w:tcPr>
+            <w:cnfStyle w:val="001000000000" w:firstRow="0" w:lastRow="0" w:firstColumn="1" w:lastColumn="0" w:oddVBand="0" w:evenVBand="0" w:oddHBand="0" w:evenHBand="0" w:firstRowFirstColumn="0" w:firstRowLastColumn="0" w:lastRowFirstColumn="0" w:lastRowLastColumn="0"/>
+            <w:tcW w:w="3209" w:type="dxa"/>
+          </w:tcPr>
+          <w:p>
+            <w:pPr>
+              <w:rPr>
+                <w:b w:val="0"/>
+                <w:bCs w:val="0"/>
+              </w:rPr>
+            </w:pPr>
+            <w:r>
+              <w:rPr>
+                <w:b w:val="0"/>
+                <w:bCs w:val="0"/>
+              </w:rPr>
+              <w:t xml:space="preserve">Debugging </w:t>
+            </w:r>
+            <w:proofErr w:type="spellStart"/>
+            <w:r>
+              <w:rPr>
+                <w:b w:val="0"/>
+                <w:bCs w:val="0"/>
+              </w:rPr>
+              <w:t>Safetycard</w:t>
+            </w:r>
+            <w:proofErr w:type="spellEnd"/>
+            <w:r>
+              <w:rPr>
+                <w:b w:val="0"/>
+                <w:bCs w:val="0"/>
+              </w:rPr>
+              <w:t xml:space="preserve"> und Lichtschranke</w:t>
+            </w:r>
+          </w:p>
+        </w:tc>
+        <w:tc>
+          <w:tcPr>
+            <w:tcW w:w="3209" w:type="dxa"/>
+          </w:tcPr>
+          <w:p>
+            <w:pPr>
+              <w:cnfStyle w:val="000000000000" w:firstRow="0" w:lastRow="0" w:firstColumn="0" w:lastColumn="0" w:oddVBand="0" w:evenVBand="0" w:oddHBand="0" w:evenHBand="0" w:firstRowFirstColumn="0" w:firstRowLastColumn="0" w:lastRowFirstColumn="0" w:lastRowLastColumn="0"/>
+            </w:pPr>
+            <w:r>
+              <w:t>Hassan</w:t>
+            </w:r>
+          </w:p>
+        </w:tc>
+        <w:tc>
+          <w:tcPr>
+            <w:tcW w:w="3210" w:type="dxa"/>
+          </w:tcPr>
+          <w:p>
+            <w:pPr>
+              <w:cnfStyle w:val="000000000000" w:firstRow="0" w:lastRow="0" w:firstColumn="0" w:lastColumn="0" w:oddVBand="0" w:evenVBand="0" w:oddHBand="0" w:evenHBand="0" w:firstRowFirstColumn="0" w:firstRowLastColumn="0" w:lastRowFirstColumn="0" w:lastRowLastColumn="0"/>
+            </w:pPr>
+            <w:r>
+              <w:t>2h</w:t>
+            </w:r>
+          </w:p>
+        </w:tc>
+      </w:tr>
+      <w:tr>
+        <w:trPr>
+          <w:cnfStyle w:val="000000100000" w:firstRow="0" w:lastRow="0" w:firstColumn="0" w:lastColumn="0" w:oddVBand="0" w:evenVBand="0" w:oddHBand="1" w:evenHBand="0" w:firstRowFirstColumn="0" w:firstRowLastColumn="0" w:lastRowFirstColumn="0" w:lastRowLastColumn="0"/>
+        </w:trPr>
+        <w:tc>
+          <w:tcPr>
+            <w:cnfStyle w:val="001000000000" w:firstRow="0" w:lastRow="0" w:firstColumn="1" w:lastColumn="0" w:oddVBand="0" w:evenVBand="0" w:oddHBand="0" w:evenHBand="0" w:firstRowFirstColumn="0" w:firstRowLastColumn="0" w:lastRowFirstColumn="0" w:lastRowLastColumn="0"/>
+            <w:tcW w:w="3209" w:type="dxa"/>
+          </w:tcPr>
+          <w:p>
+            <w:pPr>
+              <w:rPr>
+                <w:b w:val="0"/>
+                <w:bCs w:val="0"/>
+              </w:rPr>
+            </w:pPr>
+            <w:r>
+              <w:rPr>
+                <w:b w:val="0"/>
+                <w:bCs w:val="0"/>
+              </w:rPr>
+              <w:t>Status LED für Störungen erstellt</w:t>
+            </w:r>
+          </w:p>
+        </w:tc>
+        <w:tc>
+          <w:tcPr>
+            <w:tcW w:w="3209" w:type="dxa"/>
+          </w:tcPr>
+          <w:p>
+            <w:pPr>
+              <w:cnfStyle w:val="000000100000" w:firstRow="0" w:lastRow="0" w:firstColumn="0" w:lastColumn="0" w:oddVBand="0" w:evenVBand="0" w:oddHBand="1" w:evenHBand="0" w:firstRowFirstColumn="0" w:firstRowLastColumn="0" w:lastRowFirstColumn="0" w:lastRowLastColumn="0"/>
+            </w:pPr>
+            <w:r>
+              <w:t>Hassan</w:t>
+            </w:r>
+          </w:p>
+        </w:tc>
+        <w:tc>
+          <w:tcPr>
+            <w:tcW w:w="3210" w:type="dxa"/>
+          </w:tcPr>
+          <w:p>
+            <w:pPr>
+              <w:cnfStyle w:val="000000100000" w:firstRow="0" w:lastRow="0" w:firstColumn="0" w:lastColumn="0" w:oddVBand="0" w:evenVBand="0" w:oddHBand="1" w:evenHBand="0" w:firstRowFirstColumn="0" w:firstRowLastColumn="0" w:lastRowFirstColumn="0" w:lastRowLastColumn="0"/>
+            </w:pPr>
+            <w:r>
+              <w:t>1h</w:t>
+            </w:r>
+          </w:p>
+        </w:tc>
+      </w:tr>
+      <w:tr>
+        <w:tc>
+          <w:tcPr>
+            <w:cnfStyle w:val="001000000000" w:firstRow="0" w:lastRow="0" w:firstColumn="1" w:lastColumn="0" w:oddVBand="0" w:evenVBand="0" w:oddHBand="0" w:evenHBand="0" w:firstRowFirstColumn="0" w:firstRowLastColumn="0" w:lastRowFirstColumn="0" w:lastRowLastColumn="0"/>
+            <w:tcW w:w="3209" w:type="dxa"/>
+          </w:tcPr>
+          <w:p>
+            <w:pPr>
+              <w:rPr>
+                <w:b w:val="0"/>
+                <w:bCs w:val="0"/>
+              </w:rPr>
+            </w:pPr>
+            <w:r>
+              <w:rPr>
+                <w:b w:val="0"/>
+                <w:bCs w:val="0"/>
+              </w:rPr>
+              <w:t>Logik für die Status Leds verbessert</w:t>
+            </w:r>
+          </w:p>
+        </w:tc>
+        <w:tc>
+          <w:tcPr>
+            <w:tcW w:w="3209" w:type="dxa"/>
+          </w:tcPr>
+          <w:p>
+            <w:pPr>
+              <w:cnfStyle w:val="000000000000" w:firstRow="0" w:lastRow="0" w:firstColumn="0" w:lastColumn="0" w:oddVBand="0" w:evenVBand="0" w:oddHBand="0" w:evenHBand="0" w:firstRowFirstColumn="0" w:firstRowLastColumn="0" w:lastRowFirstColumn="0" w:lastRowLastColumn="0"/>
+            </w:pPr>
+            <w:r>
+              <w:t>Hassan</w:t>
+            </w:r>
+          </w:p>
+        </w:tc>
+        <w:tc>
+          <w:tcPr>
+            <w:tcW w:w="3210" w:type="dxa"/>
+          </w:tcPr>
+          <w:p>
+            <w:pPr>
+              <w:cnfStyle w:val="000000000000" w:firstRow="0" w:lastRow="0" w:firstColumn="0" w:lastColumn="0" w:oddVBand="0" w:evenVBand="0" w:oddHBand="0" w:evenHBand="0" w:firstRowFirstColumn="0" w:firstRowLastColumn="0" w:lastRowFirstColumn="0" w:lastRowLastColumn="0"/>
+            </w:pPr>
+            <w:r>
+              <w:t>0.5h</w:t>
+            </w:r>
+          </w:p>
+        </w:tc>
+      </w:tr>
+      <w:tr>
+        <w:trPr>
+          <w:cnfStyle w:val="000000100000" w:firstRow="0" w:lastRow="0" w:firstColumn="0" w:lastColumn="0" w:oddVBand="0" w:evenVBand="0" w:oddHBand="1" w:evenHBand="0" w:firstRowFirstColumn="0" w:firstRowLastColumn="0" w:lastRowFirstColumn="0" w:lastRowLastColumn="0"/>
+        </w:trPr>
+        <w:tc>
+          <w:tcPr>
+            <w:cnfStyle w:val="001000000000" w:firstRow="0" w:lastRow="0" w:firstColumn="1" w:lastColumn="0" w:oddVBand="0" w:evenVBand="0" w:oddHBand="0" w:evenHBand="0" w:firstRowFirstColumn="0" w:firstRowLastColumn="0" w:lastRowFirstColumn="0" w:lastRowLastColumn="0"/>
+            <w:tcW w:w="3209" w:type="dxa"/>
+          </w:tcPr>
+          <w:p>
+            <w:pPr>
+              <w:rPr>
+                <w:b w:val="0"/>
+                <w:bCs w:val="0"/>
+              </w:rPr>
+            </w:pPr>
+            <w:r>
+              <w:rPr>
+                <w:b w:val="0"/>
+                <w:bCs w:val="0"/>
+              </w:rPr>
+              <w:t>Präsentation</w:t>
+            </w:r>
+          </w:p>
+        </w:tc>
+        <w:tc>
+          <w:tcPr>
+            <w:tcW w:w="3209" w:type="dxa"/>
+          </w:tcPr>
+          <w:p>
+            <w:pPr>
+              <w:cnfStyle w:val="000000100000" w:firstRow="0" w:lastRow="0" w:firstColumn="0" w:lastColumn="0" w:oddVBand="0" w:evenVBand="0" w:oddHBand="1" w:evenHBand="0" w:firstRowFirstColumn="0" w:firstRowLastColumn="0" w:lastRowFirstColumn="0" w:lastRowLastColumn="0"/>
+            </w:pPr>
+            <w:r>
+              <w:t>Hassan und Niki</w:t>
+            </w:r>
+          </w:p>
+        </w:tc>
+        <w:tc>
+          <w:tcPr>
+            <w:tcW w:w="3210" w:type="dxa"/>
+          </w:tcPr>
+          <w:p>
+            <w:pPr>
+              <w:cnfStyle w:val="000000100000" w:firstRow="0" w:lastRow="0" w:firstColumn="0" w:lastColumn="0" w:oddVBand="0" w:evenVBand="0" w:oddHBand="1" w:evenHBand="0" w:firstRowFirstColumn="0" w:firstRowLastColumn="0" w:lastRowFirstColumn="0" w:lastRowLastColumn="0"/>
+            </w:pPr>
+            <w:r>
+              <w:t>1h</w:t>
+            </w:r>
+          </w:p>
+        </w:tc>
+      </w:tr>
+      <w:tr>
+        <w:tc>
+          <w:tcPr>
+            <w:cnfStyle w:val="001000000000" w:firstRow="0" w:lastRow="0" w:firstColumn="1" w:lastColumn="0" w:oddVBand="0" w:evenVBand="0" w:oddHBand="0" w:evenHBand="0" w:firstRowFirstColumn="0" w:firstRowLastColumn="0" w:lastRowFirstColumn="0" w:lastRowLastColumn="0"/>
+            <w:tcW w:w="3209" w:type="dxa"/>
+          </w:tcPr>
+          <w:p>
+            <w:pPr>
+              <w:rPr>
+                <w:b w:val="0"/>
+                <w:bCs w:val="0"/>
+              </w:rPr>
+            </w:pPr>
             <w:r>
               <w:rPr>
                 <w:b w:val="0"/>
@@ -5943,7 +8326,10 @@
               <w:cnfStyle w:val="000000000000" w:firstRow="0" w:lastRow="0" w:firstColumn="0" w:lastColumn="0" w:oddVBand="0" w:evenVBand="0" w:oddHBand="0" w:evenHBand="0" w:firstRowFirstColumn="0" w:firstRowLastColumn="0" w:lastRowFirstColumn="0" w:lastRowLastColumn="0"/>
             </w:pPr>
             <w:r>
-              <w:t>7</w:t>
+              <w:t>1</w:t>
+            </w:r>
+            <w:r>
+              <w:t>5</w:t>
             </w:r>
             <w:r>
               <w:t>h+ bis jetzt</w:t>
@@ -5953,17 +8339,21 @@
       </w:tr>
     </w:tbl>
     <w:p/>
-    <w:p/>
-    <w:p/>
-    <w:p/>
-    <w:p/>
-    <w:p/>
-    <w:p/>
-    <w:p/>
-    <w:p/>
-    <w:p/>
-    <w:p/>
-    <w:p/>
+    <w:p>
+      <w:pPr>
+        <w:rPr>
+          <w:b/>
+          <w:bCs/>
+        </w:rPr>
+      </w:pPr>
+      <w:r>
+        <w:rPr>
+          <w:b/>
+          <w:bCs/>
+        </w:rPr>
+        <w:t xml:space="preserve">Gesamtaufwand in Stunden: </w:t>
+      </w:r>
+    </w:p>
     <w:p/>
     <w:p/>
     <w:p/>
@@ -5995,12 +8385,12 @@
           <w:numId w:val="0"/>
         </w:numPr>
       </w:pPr>
-      <w:bookmarkStart w:id="16" w:name="_Toc231874438"/>
+      <w:bookmarkStart w:id="34" w:name="_Toc233042325"/>
       <w:r>
         <w:lastRenderedPageBreak/>
         <w:t>Selbständigkeitserklärung</w:t>
       </w:r>
-      <w:bookmarkEnd w:id="16"/>
+      <w:bookmarkEnd w:id="34"/>
     </w:p>
     <w:p>
       <w:r>
@@ -6092,7 +8482,7 @@
                     <pic:cNvPicPr/>
                   </pic:nvPicPr>
                   <pic:blipFill>
-                    <a:blip r:embed="rId19"/>
+                    <a:blip r:embed="rId23"/>
                     <a:stretch>
                       <a:fillRect/>
                     </a:stretch>
@@ -6138,7 +8528,7 @@
                     <pic:cNvPicPr/>
                   </pic:nvPicPr>
                   <pic:blipFill>
-                    <a:blip r:embed="rId20" cstate="print">
+                    <a:blip r:embed="rId24" cstate="print">
                       <a:extLst>
                         <a:ext uri="{28A0092B-C50C-407E-A947-70E740481C1C}">
                           <a14:useLocalDpi xmlns:a14="http://schemas.microsoft.com/office/drawing/2010/main" val="0"/>
@@ -6181,20 +8571,6 @@
     </w:p>
     <w:p>
       <w:pPr>
-        <w:rPr>
-          <w:noProof/>
-        </w:rPr>
-      </w:pPr>
-    </w:p>
-    <w:p>
-      <w:pPr>
-        <w:rPr>
-          <w:noProof/>
-        </w:rPr>
-      </w:pPr>
-    </w:p>
-    <w:p>
-      <w:pPr>
         <w:pStyle w:val="berschrift1"/>
         <w:numPr>
           <w:ilvl w:val="0"/>
@@ -6202,11 +8578,12 @@
         </w:numPr>
         <w:ind w:left="454" w:hanging="454"/>
       </w:pPr>
-      <w:bookmarkStart w:id="17" w:name="_Toc231874439"/>
-      <w:r>
+      <w:bookmarkStart w:id="35" w:name="_Toc233042326"/>
+      <w:r>
+        <w:lastRenderedPageBreak/>
         <w:t>Abbildungsverzeichnis</w:t>
       </w:r>
-      <w:bookmarkEnd w:id="17"/>
+      <w:bookmarkEnd w:id="35"/>
     </w:p>
     <w:p>
       <w:pPr>
@@ -6233,7 +8610,7 @@
       <w:r>
         <w:fldChar w:fldCharType="separate"/>
       </w:r>
-      <w:hyperlink w:anchor="_Toc231872781" w:history="1">
+      <w:hyperlink w:anchor="_Toc233046549" w:history="1">
         <w:r>
           <w:rPr>
             <w:rStyle w:val="Hyperlink"/>
@@ -6260,7 +8637,7 @@
             <w:noProof/>
             <w:webHidden/>
           </w:rPr>
-          <w:instrText xml:space="preserve"> PAGEREF _Toc231872781 \h </w:instrText>
+          <w:instrText xml:space="preserve"> PAGEREF _Toc233046549 \h </w:instrText>
         </w:r>
         <w:r>
           <w:rPr>
@@ -6307,7 +8684,7 @@
           <w14:ligatures w14:val="standardContextual"/>
         </w:rPr>
       </w:pPr>
-      <w:hyperlink w:anchor="_Toc231872782" w:history="1">
+      <w:hyperlink w:anchor="_Toc233046550" w:history="1">
         <w:r>
           <w:rPr>
             <w:rStyle w:val="Hyperlink"/>
@@ -6334,7 +8711,7 @@
             <w:noProof/>
             <w:webHidden/>
           </w:rPr>
-          <w:instrText xml:space="preserve"> PAGEREF _Toc231872782 \h </w:instrText>
+          <w:instrText xml:space="preserve"> PAGEREF _Toc233046550 \h </w:instrText>
         </w:r>
         <w:r>
           <w:rPr>
@@ -6381,7 +8758,7 @@
           <w14:ligatures w14:val="standardContextual"/>
         </w:rPr>
       </w:pPr>
-      <w:hyperlink w:anchor="_Toc231872783" w:history="1">
+      <w:hyperlink w:anchor="_Toc233046551" w:history="1">
         <w:r>
           <w:rPr>
             <w:rStyle w:val="Hyperlink"/>
@@ -6408,7 +8785,7 @@
             <w:noProof/>
             <w:webHidden/>
           </w:rPr>
-          <w:instrText xml:space="preserve"> PAGEREF _Toc231872783 \h </w:instrText>
+          <w:instrText xml:space="preserve"> PAGEREF _Toc233046551 \h </w:instrText>
         </w:r>
         <w:r>
           <w:rPr>
@@ -6455,7 +8832,7 @@
           <w14:ligatures w14:val="standardContextual"/>
         </w:rPr>
       </w:pPr>
-      <w:hyperlink w:anchor="_Toc231872784" w:history="1">
+      <w:hyperlink w:anchor="_Toc233046552" w:history="1">
         <w:r>
           <w:rPr>
             <w:rStyle w:val="Hyperlink"/>
@@ -6482,7 +8859,7 @@
             <w:noProof/>
             <w:webHidden/>
           </w:rPr>
-          <w:instrText xml:space="preserve"> PAGEREF _Toc231872784 \h </w:instrText>
+          <w:instrText xml:space="preserve"> PAGEREF _Toc233046552 \h </w:instrText>
         </w:r>
         <w:r>
           <w:rPr>
@@ -6514,16 +8891,380 @@
       </w:hyperlink>
     </w:p>
     <w:p>
+      <w:pPr>
+        <w:pStyle w:val="Abbildungsverzeichnis"/>
+        <w:tabs>
+          <w:tab w:val="right" w:leader="dot" w:pos="9628"/>
+        </w:tabs>
+        <w:rPr>
+          <w:rFonts w:asciiTheme="minorHAnsi" w:eastAsiaTheme="minorEastAsia" w:hAnsiTheme="minorHAnsi"/>
+          <w:noProof/>
+          <w:kern w:val="2"/>
+          <w:sz w:val="24"/>
+          <w:szCs w:val="24"/>
+          <w:lang w:eastAsia="ja-JP"/>
+          <w14:ligatures w14:val="standardContextual"/>
+        </w:rPr>
+      </w:pPr>
+      <w:hyperlink w:anchor="_Toc233046553" w:history="1">
+        <w:r>
+          <w:rPr>
+            <w:rStyle w:val="Hyperlink"/>
+            <w:noProof/>
+          </w:rPr>
+          <w:t>Abbildung 5: Ordnerstruktur des GitHub-Repositorys</w:t>
+        </w:r>
+        <w:r>
+          <w:rPr>
+            <w:noProof/>
+            <w:webHidden/>
+          </w:rPr>
+          <w:tab/>
+        </w:r>
+        <w:r>
+          <w:rPr>
+            <w:noProof/>
+            <w:webHidden/>
+          </w:rPr>
+          <w:fldChar w:fldCharType="begin"/>
+        </w:r>
+        <w:r>
+          <w:rPr>
+            <w:noProof/>
+            <w:webHidden/>
+          </w:rPr>
+          <w:instrText xml:space="preserve"> PAGEREF _Toc233046553 \h </w:instrText>
+        </w:r>
+        <w:r>
+          <w:rPr>
+            <w:noProof/>
+            <w:webHidden/>
+          </w:rPr>
+        </w:r>
+        <w:r>
+          <w:rPr>
+            <w:noProof/>
+            <w:webHidden/>
+          </w:rPr>
+          <w:fldChar w:fldCharType="separate"/>
+        </w:r>
+        <w:r>
+          <w:rPr>
+            <w:noProof/>
+            <w:webHidden/>
+          </w:rPr>
+          <w:t>9</w:t>
+        </w:r>
+        <w:r>
+          <w:rPr>
+            <w:noProof/>
+            <w:webHidden/>
+          </w:rPr>
+          <w:fldChar w:fldCharType="end"/>
+        </w:r>
+      </w:hyperlink>
+    </w:p>
+    <w:p>
+      <w:pPr>
+        <w:pStyle w:val="Abbildungsverzeichnis"/>
+        <w:tabs>
+          <w:tab w:val="right" w:leader="dot" w:pos="9628"/>
+        </w:tabs>
+        <w:rPr>
+          <w:rFonts w:asciiTheme="minorHAnsi" w:eastAsiaTheme="minorEastAsia" w:hAnsiTheme="minorHAnsi"/>
+          <w:noProof/>
+          <w:kern w:val="2"/>
+          <w:sz w:val="24"/>
+          <w:szCs w:val="24"/>
+          <w:lang w:eastAsia="ja-JP"/>
+          <w14:ligatures w14:val="standardContextual"/>
+        </w:rPr>
+      </w:pPr>
+      <w:hyperlink w:anchor="_Toc233046554" w:history="1">
+        <w:r>
+          <w:rPr>
+            <w:rStyle w:val="Hyperlink"/>
+            <w:noProof/>
+          </w:rPr>
+          <w:t>Abbildung 6:Hauptnetzwerk der SPS-Architektur in LASAL</w:t>
+        </w:r>
+        <w:r>
+          <w:rPr>
+            <w:noProof/>
+            <w:webHidden/>
+          </w:rPr>
+          <w:tab/>
+        </w:r>
+        <w:r>
+          <w:rPr>
+            <w:noProof/>
+            <w:webHidden/>
+          </w:rPr>
+          <w:fldChar w:fldCharType="begin"/>
+        </w:r>
+        <w:r>
+          <w:rPr>
+            <w:noProof/>
+            <w:webHidden/>
+          </w:rPr>
+          <w:instrText xml:space="preserve"> PAGEREF _Toc233046554 \h </w:instrText>
+        </w:r>
+        <w:r>
+          <w:rPr>
+            <w:noProof/>
+            <w:webHidden/>
+          </w:rPr>
+        </w:r>
+        <w:r>
+          <w:rPr>
+            <w:noProof/>
+            <w:webHidden/>
+          </w:rPr>
+          <w:fldChar w:fldCharType="separate"/>
+        </w:r>
+        <w:r>
+          <w:rPr>
+            <w:noProof/>
+            <w:webHidden/>
+          </w:rPr>
+          <w:t>9</w:t>
+        </w:r>
+        <w:r>
+          <w:rPr>
+            <w:noProof/>
+            <w:webHidden/>
+          </w:rPr>
+          <w:fldChar w:fldCharType="end"/>
+        </w:r>
+      </w:hyperlink>
+    </w:p>
+    <w:p>
+      <w:pPr>
+        <w:pStyle w:val="Abbildungsverzeichnis"/>
+        <w:tabs>
+          <w:tab w:val="right" w:leader="dot" w:pos="9628"/>
+        </w:tabs>
+        <w:rPr>
+          <w:rFonts w:asciiTheme="minorHAnsi" w:eastAsiaTheme="minorEastAsia" w:hAnsiTheme="minorHAnsi"/>
+          <w:noProof/>
+          <w:kern w:val="2"/>
+          <w:sz w:val="24"/>
+          <w:szCs w:val="24"/>
+          <w:lang w:eastAsia="ja-JP"/>
+          <w14:ligatures w14:val="standardContextual"/>
+        </w:rPr>
+      </w:pPr>
+      <w:hyperlink w:anchor="_Toc233046555" w:history="1">
+        <w:r>
+          <w:rPr>
+            <w:rStyle w:val="Hyperlink"/>
+            <w:noProof/>
+          </w:rPr>
+          <w:t>Abbildung 7: Eingebundene Motion-Objekte für die Motoranbindung</w:t>
+        </w:r>
+        <w:r>
+          <w:rPr>
+            <w:noProof/>
+            <w:webHidden/>
+          </w:rPr>
+          <w:tab/>
+        </w:r>
+        <w:r>
+          <w:rPr>
+            <w:noProof/>
+            <w:webHidden/>
+          </w:rPr>
+          <w:fldChar w:fldCharType="begin"/>
+        </w:r>
+        <w:r>
+          <w:rPr>
+            <w:noProof/>
+            <w:webHidden/>
+          </w:rPr>
+          <w:instrText xml:space="preserve"> PAGEREF _Toc233046555 \h </w:instrText>
+        </w:r>
+        <w:r>
+          <w:rPr>
+            <w:noProof/>
+            <w:webHidden/>
+          </w:rPr>
+        </w:r>
+        <w:r>
+          <w:rPr>
+            <w:noProof/>
+            <w:webHidden/>
+          </w:rPr>
+          <w:fldChar w:fldCharType="separate"/>
+        </w:r>
+        <w:r>
+          <w:rPr>
+            <w:noProof/>
+            <w:webHidden/>
+          </w:rPr>
+          <w:t>10</w:t>
+        </w:r>
+        <w:r>
+          <w:rPr>
+            <w:noProof/>
+            <w:webHidden/>
+          </w:rPr>
+          <w:fldChar w:fldCharType="end"/>
+        </w:r>
+      </w:hyperlink>
+    </w:p>
+    <w:p>
+      <w:pPr>
+        <w:pStyle w:val="Abbildungsverzeichnis"/>
+        <w:tabs>
+          <w:tab w:val="right" w:leader="dot" w:pos="9628"/>
+        </w:tabs>
+        <w:rPr>
+          <w:rFonts w:asciiTheme="minorHAnsi" w:eastAsiaTheme="minorEastAsia" w:hAnsiTheme="minorHAnsi"/>
+          <w:noProof/>
+          <w:kern w:val="2"/>
+          <w:sz w:val="24"/>
+          <w:szCs w:val="24"/>
+          <w:lang w:eastAsia="ja-JP"/>
+          <w14:ligatures w14:val="standardContextual"/>
+        </w:rPr>
+      </w:pPr>
+      <w:hyperlink w:anchor="_Toc233046556" w:history="1">
+        <w:r>
+          <w:rPr>
+            <w:rStyle w:val="Hyperlink"/>
+            <w:noProof/>
+          </w:rPr>
+          <w:t>Abbildung 8: Ergebnis HMI</w:t>
+        </w:r>
+        <w:r>
+          <w:rPr>
+            <w:noProof/>
+            <w:webHidden/>
+          </w:rPr>
+          <w:tab/>
+        </w:r>
+        <w:r>
+          <w:rPr>
+            <w:noProof/>
+            <w:webHidden/>
+          </w:rPr>
+          <w:fldChar w:fldCharType="begin"/>
+        </w:r>
+        <w:r>
+          <w:rPr>
+            <w:noProof/>
+            <w:webHidden/>
+          </w:rPr>
+          <w:instrText xml:space="preserve"> PAGEREF _Toc233046556 \h </w:instrText>
+        </w:r>
+        <w:r>
+          <w:rPr>
+            <w:noProof/>
+            <w:webHidden/>
+          </w:rPr>
+        </w:r>
+        <w:r>
+          <w:rPr>
+            <w:noProof/>
+            <w:webHidden/>
+          </w:rPr>
+          <w:fldChar w:fldCharType="separate"/>
+        </w:r>
+        <w:r>
+          <w:rPr>
+            <w:noProof/>
+            <w:webHidden/>
+          </w:rPr>
+          <w:t>11</w:t>
+        </w:r>
+        <w:r>
+          <w:rPr>
+            <w:noProof/>
+            <w:webHidden/>
+          </w:rPr>
+          <w:fldChar w:fldCharType="end"/>
+        </w:r>
+      </w:hyperlink>
+    </w:p>
+    <w:p>
+      <w:pPr>
+        <w:pStyle w:val="Abbildungsverzeichnis"/>
+        <w:tabs>
+          <w:tab w:val="right" w:leader="dot" w:pos="9628"/>
+        </w:tabs>
+        <w:rPr>
+          <w:rFonts w:asciiTheme="minorHAnsi" w:eastAsiaTheme="minorEastAsia" w:hAnsiTheme="minorHAnsi"/>
+          <w:noProof/>
+          <w:kern w:val="2"/>
+          <w:sz w:val="24"/>
+          <w:szCs w:val="24"/>
+          <w:lang w:eastAsia="ja-JP"/>
+          <w14:ligatures w14:val="standardContextual"/>
+        </w:rPr>
+      </w:pPr>
+      <w:hyperlink w:anchor="_Toc233046557" w:history="1">
+        <w:r>
+          <w:rPr>
+            <w:rStyle w:val="Hyperlink"/>
+            <w:noProof/>
+          </w:rPr>
+          <w:t>Abbildung 9: Git-Network</w:t>
+        </w:r>
+        <w:r>
+          <w:rPr>
+            <w:noProof/>
+            <w:webHidden/>
+          </w:rPr>
+          <w:tab/>
+        </w:r>
+        <w:r>
+          <w:rPr>
+            <w:noProof/>
+            <w:webHidden/>
+          </w:rPr>
+          <w:fldChar w:fldCharType="begin"/>
+        </w:r>
+        <w:r>
+          <w:rPr>
+            <w:noProof/>
+            <w:webHidden/>
+          </w:rPr>
+          <w:instrText xml:space="preserve"> PAGEREF _Toc233046557 \h </w:instrText>
+        </w:r>
+        <w:r>
+          <w:rPr>
+            <w:noProof/>
+            <w:webHidden/>
+          </w:rPr>
+        </w:r>
+        <w:r>
+          <w:rPr>
+            <w:noProof/>
+            <w:webHidden/>
+          </w:rPr>
+          <w:fldChar w:fldCharType="separate"/>
+        </w:r>
+        <w:r>
+          <w:rPr>
+            <w:noProof/>
+            <w:webHidden/>
+          </w:rPr>
+          <w:t>12</w:t>
+        </w:r>
+        <w:r>
+          <w:rPr>
+            <w:noProof/>
+            <w:webHidden/>
+          </w:rPr>
+          <w:fldChar w:fldCharType="end"/>
+        </w:r>
+      </w:hyperlink>
+    </w:p>
+    <w:p>
       <w:r>
         <w:fldChar w:fldCharType="end"/>
       </w:r>
     </w:p>
-    <w:p/>
-    <w:p/>
-    <w:p/>
-    <w:p/>
-    <w:p/>
-    <w:p/>
     <w:p/>
     <w:p/>
     <w:p/>
@@ -6558,11 +9299,12 @@
           <w:numId w:val="0"/>
         </w:numPr>
       </w:pPr>
-      <w:bookmarkStart w:id="18" w:name="_Toc231874440"/>
-      <w:r>
+      <w:bookmarkStart w:id="36" w:name="_Toc233042327"/>
+      <w:r>
+        <w:lastRenderedPageBreak/>
         <w:t>Quellenverzeichnis</w:t>
       </w:r>
-      <w:bookmarkEnd w:id="18"/>
+      <w:bookmarkEnd w:id="36"/>
     </w:p>
     <w:p>
       <w:r>
@@ -6690,9 +9432,6 @@
         <w:t>[14] GitHub Copilot: Unterstützung bei Codevorschlägen, Fehlersuche und technischen Formulierungsvarianten während der Projektarbeit. Verwendet im Juni 2026.</w:t>
       </w:r>
     </w:p>
-    <w:p/>
-    <w:p/>
-    <w:p/>
     <w:p/>
     <w:p/>
     <w:p/>
@@ -6712,11 +9451,12 @@
         </w:numPr>
         <w:ind w:left="454" w:hanging="454"/>
       </w:pPr>
-      <w:bookmarkStart w:id="19" w:name="_Toc231874441"/>
-      <w:r>
+      <w:bookmarkStart w:id="37" w:name="_Toc233042328"/>
+      <w:r>
+        <w:lastRenderedPageBreak/>
         <w:t>Einsatz von KI-Tools</w:t>
       </w:r>
-      <w:bookmarkEnd w:id="19"/>
+      <w:bookmarkEnd w:id="37"/>
     </w:p>
     <w:p>
       <w:r>
@@ -6752,11 +9492,11 @@
         </w:numPr>
         <w:ind w:left="454" w:hanging="454"/>
       </w:pPr>
-      <w:bookmarkStart w:id="20" w:name="_Toc231874442"/>
+      <w:bookmarkStart w:id="38" w:name="_Toc233042329"/>
       <w:r>
         <w:t>Verwendete KI-Prompts</w:t>
       </w:r>
-      <w:bookmarkEnd w:id="20"/>
+      <w:bookmarkEnd w:id="38"/>
     </w:p>
     <w:p>
       <w:pPr>
@@ -6795,8 +9535,8 @@
       </w:pPr>
     </w:p>
     <w:sectPr>
-      <w:headerReference w:type="first" r:id="rId21"/>
-      <w:footerReference w:type="first" r:id="rId22"/>
+      <w:headerReference w:type="first" r:id="rId25"/>
+      <w:footerReference w:type="first" r:id="rId26"/>
       <w:pgSz w:w="11906" w:h="16838"/>
       <w:pgMar w:top="1418" w:right="1134" w:bottom="1134" w:left="1134" w:header="709" w:footer="709" w:gutter="0"/>
       <w:pgNumType w:start="1"/>
@@ -8617,7 +11357,7 @@
     <w:uiPriority w:val="9"/>
     <w:unhideWhenUsed/>
     <w:qFormat/>
-    <w:rsid w:val="00172D2C"/>
+    <w:rsid w:val="003950AD"/>
     <w:pPr>
       <w:keepNext/>
       <w:keepLines/>
@@ -8630,6 +11370,7 @@
     </w:pPr>
     <w:rPr>
       <w:rFonts w:eastAsiaTheme="majorEastAsia" w:cstheme="majorBidi"/>
+      <w:b/>
       <w:color w:val="000000" w:themeColor="text1"/>
       <w:sz w:val="24"/>
       <w:szCs w:val="26"/>
@@ -8784,9 +11525,10 @@
     <w:basedOn w:val="Absatz-Standardschriftart"/>
     <w:link w:val="berschrift2"/>
     <w:uiPriority w:val="9"/>
-    <w:rsid w:val="00172D2C"/>
+    <w:rsid w:val="003950AD"/>
     <w:rPr>
       <w:rFonts w:ascii="Arial" w:eastAsiaTheme="majorEastAsia" w:hAnsi="Arial" w:cstheme="majorBidi"/>
+      <w:b/>
       <w:color w:val="000000" w:themeColor="text1"/>
       <w:sz w:val="24"/>
       <w:szCs w:val="26"/>
@@ -9548,6 +12290,7 @@
     <w:rsid w:val="00250F02"/>
     <w:rsid w:val="00310995"/>
     <w:rsid w:val="003123B7"/>
+    <w:rsid w:val="00315C55"/>
     <w:rsid w:val="003239CA"/>
     <w:rsid w:val="00350C15"/>
     <w:rsid w:val="003510E2"/>
@@ -10336,6 +13079,10 @@
 </file>
 
 <file path=customXml/item1.xml><?xml version="1.0" encoding="utf-8"?>
+<b:Sources xmlns:b="http://schemas.openxmlformats.org/officeDocument/2006/bibliography" xmlns="http://schemas.openxmlformats.org/officeDocument/2006/bibliography" SelectedStyle="\APASixthEditionOfficeOnline.xsl" StyleName="APA" Version="6"/>
+</file>
+
+<file path=customXml/item2.xml><?xml version="1.0" encoding="utf-8"?>
 <?mso-contentType ?>
 <FormTemplates xmlns="http://schemas.microsoft.com/sharepoint/v3/contenttype/forms">
   <Display>DocumentLibraryForm</Display>
@@ -10344,11 +13091,18 @@
 </FormTemplates>
 </file>
 
-<file path=customXml/item2.xml><?xml version="1.0" encoding="utf-8"?>
-<b:Sources xmlns:b="http://schemas.openxmlformats.org/officeDocument/2006/bibliography" xmlns="http://schemas.openxmlformats.org/officeDocument/2006/bibliography" SelectedStyle="\APASixthEditionOfficeOnline.xsl" StyleName="APA" Version="6"/>
+<file path=customXml/item3.xml><?xml version="1.0" encoding="utf-8"?>
+<p:properties xmlns:p="http://schemas.microsoft.com/office/2006/metadata/properties" xmlns:xsi="http://www.w3.org/2001/XMLSchema-instance" xmlns:pc="http://schemas.microsoft.com/office/infopath/2007/PartnerControls">
+  <documentManagement>
+    <TaxCatchAll xmlns="e32c9bb7-34f5-44bb-800b-35798843376c" xsi:nil="true"/>
+    <lcf76f155ced4ddcb4097134ff3c332f xmlns="22aa7da5-41f5-464e-85e6-b2dd1761cd70">
+      <Terms xmlns="http://schemas.microsoft.com/office/infopath/2007/PartnerControls"/>
+    </lcf76f155ced4ddcb4097134ff3c332f>
+  </documentManagement>
+</p:properties>
 </file>
 
-<file path=customXml/item3.xml><?xml version="1.0" encoding="utf-8"?>
+<file path=customXml/item4.xml><?xml version="1.0" encoding="utf-8"?>
 <ct:contentTypeSchema xmlns:ct="http://schemas.microsoft.com/office/2006/metadata/contentType" xmlns:ma="http://schemas.microsoft.com/office/2006/metadata/properties/metaAttributes" ct:_="" ma:_="" ma:contentTypeName="Dokument" ma:contentTypeID="0x010100D827C1AAE83348469185F4DE8D8E42AA" ma:contentTypeVersion="18" ma:contentTypeDescription="Ein neues Dokument erstellen." ma:contentTypeScope="" ma:versionID="618348fa32be16a474572d476ed91d7d">
   <xsd:schema xmlns:xsd="http://www.w3.org/2001/XMLSchema" xmlns:xs="http://www.w3.org/2001/XMLSchema" xmlns:p="http://schemas.microsoft.com/office/2006/metadata/properties" xmlns:ns2="22aa7da5-41f5-464e-85e6-b2dd1761cd70" xmlns:ns3="e32c9bb7-34f5-44bb-800b-35798843376c" targetNamespace="http://schemas.microsoft.com/office/2006/metadata/properties" ma:root="true" ma:fieldsID="348e17a0368de80907a02c9ddfbbbd22" ns2:_="" ns3:_="">
     <xsd:import namespace="22aa7da5-41f5-464e-85e6-b2dd1761cd70"/>
@@ -10603,18 +13357,15 @@
 </ct:contentTypeSchema>
 </file>
 
-<file path=customXml/item4.xml><?xml version="1.0" encoding="utf-8"?>
-<p:properties xmlns:p="http://schemas.microsoft.com/office/2006/metadata/properties" xmlns:xsi="http://www.w3.org/2001/XMLSchema-instance" xmlns:pc="http://schemas.microsoft.com/office/infopath/2007/PartnerControls">
-  <documentManagement>
-    <TaxCatchAll xmlns="e32c9bb7-34f5-44bb-800b-35798843376c" xsi:nil="true"/>
-    <lcf76f155ced4ddcb4097134ff3c332f xmlns="22aa7da5-41f5-464e-85e6-b2dd1761cd70">
-      <Terms xmlns="http://schemas.microsoft.com/office/infopath/2007/PartnerControls"/>
-    </lcf76f155ced4ddcb4097134ff3c332f>
-  </documentManagement>
-</p:properties>
+<file path=customXml/itemProps1.xml><?xml version="1.0" encoding="utf-8"?>
+<ds:datastoreItem xmlns:ds="http://schemas.openxmlformats.org/officeDocument/2006/customXml" ds:itemID="{84661881-BC85-4481-9F58-A76FBE332CB1}">
+  <ds:schemaRefs>
+    <ds:schemaRef ds:uri="http://schemas.openxmlformats.org/officeDocument/2006/bibliography"/>
+  </ds:schemaRefs>
+</ds:datastoreItem>
 </file>
 
-<file path=customXml/itemProps1.xml><?xml version="1.0" encoding="utf-8"?>
+<file path=customXml/itemProps2.xml><?xml version="1.0" encoding="utf-8"?>
 <ds:datastoreItem xmlns:ds="http://schemas.openxmlformats.org/officeDocument/2006/customXml" ds:itemID="{B8133326-A9D9-4C20-AED2-57D8DB38EE3B}">
   <ds:schemaRefs>
     <ds:schemaRef ds:uri="http://schemas.microsoft.com/sharepoint/v3/contenttype/forms"/>
@@ -10622,15 +13373,18 @@
 </ds:datastoreItem>
 </file>
 
-<file path=customXml/itemProps2.xml><?xml version="1.0" encoding="utf-8"?>
-<ds:datastoreItem xmlns:ds="http://schemas.openxmlformats.org/officeDocument/2006/customXml" ds:itemID="{84661881-BC85-4481-9F58-A76FBE332CB1}">
+<file path=customXml/itemProps3.xml><?xml version="1.0" encoding="utf-8"?>
+<ds:datastoreItem xmlns:ds="http://schemas.openxmlformats.org/officeDocument/2006/customXml" ds:itemID="{AEB5EB03-E1DB-4DE6-8456-3A44BE197CDE}">
   <ds:schemaRefs>
-    <ds:schemaRef ds:uri="http://schemas.openxmlformats.org/officeDocument/2006/bibliography"/>
+    <ds:schemaRef ds:uri="http://schemas.microsoft.com/office/2006/metadata/properties"/>
+    <ds:schemaRef ds:uri="http://schemas.microsoft.com/office/infopath/2007/PartnerControls"/>
+    <ds:schemaRef ds:uri="e32c9bb7-34f5-44bb-800b-35798843376c"/>
+    <ds:schemaRef ds:uri="22aa7da5-41f5-464e-85e6-b2dd1761cd70"/>
   </ds:schemaRefs>
 </ds:datastoreItem>
 </file>
 
-<file path=customXml/itemProps3.xml><?xml version="1.0" encoding="utf-8"?>
+<file path=customXml/itemProps4.xml><?xml version="1.0" encoding="utf-8"?>
 <ds:datastoreItem xmlns:ds="http://schemas.openxmlformats.org/officeDocument/2006/customXml" ds:itemID="{60D544C4-8D4D-481D-B00F-1F09332EE222}">
   <ds:schemaRefs>
     <ds:schemaRef ds:uri="http://schemas.microsoft.com/office/2006/metadata/contentType"/>
@@ -10647,15 +13401,4 @@
     <ds:schemaRef ds:uri="http://schemas.microsoft.com/internal/obd"/>
   </ds:schemaRefs>
 </ds:datastoreItem>
-</file>
-
-<file path=customXml/itemProps4.xml><?xml version="1.0" encoding="utf-8"?>
-<ds:datastoreItem xmlns:ds="http://schemas.openxmlformats.org/officeDocument/2006/customXml" ds:itemID="{AEB5EB03-E1DB-4DE6-8456-3A44BE197CDE}">
-  <ds:schemaRefs>
-    <ds:schemaRef ds:uri="http://schemas.microsoft.com/office/2006/metadata/properties"/>
-    <ds:schemaRef ds:uri="http://schemas.microsoft.com/office/infopath/2007/PartnerControls"/>
-    <ds:schemaRef ds:uri="e32c9bb7-34f5-44bb-800b-35798843376c"/>
-    <ds:schemaRef ds:uri="22aa7da5-41f5-464e-85e6-b2dd1761cd70"/>
-  </ds:schemaRefs>
-</ds:datastoreItem>
 </file>
</xml_diff>